<commit_message>
docs: Plan de Pruebas definido y escrito en el informe
</commit_message>
<xml_diff>
--- a/plantilla_iso29119.docx
+++ b/plantilla_iso29119.docx
@@ -119,7 +119,6 @@
               <w:rPr>
                 <w:b/>
                 <w:bCs/>
-                <w:color w:val="1A1A2E"/>
                 <w:sz w:val="20"/>
                 <w:szCs w:val="20"/>
               </w:rPr>
@@ -149,7 +148,6 @@
               <w:rPr>
                 <w:i/>
                 <w:iCs/>
-                <w:color w:val="AAAAAA"/>
                 <w:sz w:val="20"/>
                 <w:szCs w:val="20"/>
               </w:rPr>
@@ -181,21 +179,10 @@
               <w:rPr>
                 <w:b/>
                 <w:bCs/>
-                <w:color w:val="1A1A2E"/>
-                <w:sz w:val="20"/>
-                <w:szCs w:val="20"/>
-              </w:rPr>
-              <w:t>Tester</w:t>
-            </w:r>
-            <w:r>
-              <w:rPr>
-                <w:b/>
-                <w:bCs/>
-                <w:color w:val="1A1A2E"/>
-                <w:sz w:val="20"/>
-                <w:szCs w:val="20"/>
-              </w:rPr>
-              <w:t xml:space="preserve"> – Alumno </w:t>
+                <w:sz w:val="20"/>
+                <w:szCs w:val="20"/>
+              </w:rPr>
+              <w:t xml:space="preserve">Tester – Alumno </w:t>
             </w:r>
           </w:p>
         </w:tc>
@@ -221,7 +208,6 @@
               <w:rPr>
                 <w:i/>
                 <w:iCs/>
-                <w:color w:val="AAAAAA"/>
                 <w:sz w:val="20"/>
                 <w:szCs w:val="20"/>
               </w:rPr>
@@ -253,7 +239,6 @@
               <w:rPr>
                 <w:b/>
                 <w:bCs/>
-                <w:color w:val="1A1A2E"/>
                 <w:sz w:val="20"/>
                 <w:szCs w:val="20"/>
               </w:rPr>
@@ -283,7 +268,6 @@
               <w:rPr>
                 <w:i/>
                 <w:iCs/>
-                <w:color w:val="AAAAAA"/>
                 <w:sz w:val="20"/>
                 <w:szCs w:val="20"/>
               </w:rPr>
@@ -315,7 +299,6 @@
               <w:rPr>
                 <w:b/>
                 <w:bCs/>
-                <w:color w:val="1A1A2E"/>
                 <w:sz w:val="20"/>
                 <w:szCs w:val="20"/>
               </w:rPr>
@@ -345,51 +328,10 @@
               <w:rPr>
                 <w:i/>
                 <w:iCs/>
-                <w:color w:val="AAAAAA"/>
-                <w:sz w:val="20"/>
-                <w:szCs w:val="20"/>
-              </w:rPr>
-              <w:t>17</w:t>
-            </w:r>
-            <w:r>
-              <w:rPr>
-                <w:i/>
-                <w:iCs/>
-                <w:color w:val="AAAAAA"/>
-                <w:sz w:val="20"/>
-                <w:szCs w:val="20"/>
-              </w:rPr>
-              <w:t>/</w:t>
-            </w:r>
-            <w:r>
-              <w:rPr>
-                <w:i/>
-                <w:iCs/>
-                <w:color w:val="AAAAAA"/>
-                <w:sz w:val="20"/>
-                <w:szCs w:val="20"/>
-              </w:rPr>
-              <w:t>04</w:t>
-            </w:r>
-            <w:r>
-              <w:rPr>
-                <w:i/>
-                <w:iCs/>
-                <w:color w:val="AAAAAA"/>
-                <w:sz w:val="20"/>
-                <w:szCs w:val="20"/>
-              </w:rPr>
-              <w:t>/</w:t>
-            </w:r>
-            <w:r>
-              <w:rPr>
-                <w:i/>
-                <w:iCs/>
-                <w:color w:val="AAAAAA"/>
-                <w:sz w:val="20"/>
-                <w:szCs w:val="20"/>
-              </w:rPr>
-              <w:t>2026</w:t>
+                <w:sz w:val="20"/>
+                <w:szCs w:val="20"/>
+              </w:rPr>
+              <w:t>17/04/2026</w:t>
             </w:r>
           </w:p>
         </w:tc>
@@ -417,7 +359,6 @@
               <w:rPr>
                 <w:b/>
                 <w:bCs/>
-                <w:color w:val="1A1A2E"/>
                 <w:sz w:val="20"/>
                 <w:szCs w:val="20"/>
               </w:rPr>
@@ -447,7 +388,6 @@
               <w:rPr>
                 <w:i/>
                 <w:iCs/>
-                <w:color w:val="AAAAAA"/>
                 <w:sz w:val="20"/>
                 <w:szCs w:val="20"/>
               </w:rPr>
@@ -479,7 +419,6 @@
               <w:rPr>
                 <w:b/>
                 <w:bCs/>
-                <w:color w:val="1A1A2E"/>
                 <w:sz w:val="20"/>
                 <w:szCs w:val="20"/>
               </w:rPr>
@@ -509,11 +448,19 @@
               <w:rPr>
                 <w:i/>
                 <w:iCs/>
-                <w:color w:val="AAAAAA"/>
-                <w:sz w:val="20"/>
-                <w:szCs w:val="20"/>
-              </w:rPr>
-              <w:t>v1.0</w:t>
+                <w:sz w:val="20"/>
+                <w:szCs w:val="20"/>
+              </w:rPr>
+              <w:t>v1.</w:t>
+            </w:r>
+            <w:r>
+              <w:rPr>
+                <w:i/>
+                <w:iCs/>
+                <w:sz w:val="20"/>
+                <w:szCs w:val="20"/>
+              </w:rPr>
+              <w:t>1</w:t>
             </w:r>
           </w:p>
         </w:tc>
@@ -541,7 +488,6 @@
               <w:rPr>
                 <w:b/>
                 <w:bCs/>
-                <w:color w:val="1A1A2E"/>
                 <w:sz w:val="20"/>
                 <w:szCs w:val="20"/>
               </w:rPr>
@@ -576,7 +522,6 @@
               <w:rPr>
                 <w:i/>
                 <w:iCs/>
-                <w:color w:val="AAAAAA"/>
                 <w:sz w:val="20"/>
                 <w:szCs w:val="20"/>
               </w:rPr>
@@ -586,7 +531,6 @@
               <w:rPr>
                 <w:i/>
                 <w:iCs/>
-                <w:color w:val="AAAAAA"/>
                 <w:sz w:val="20"/>
                 <w:szCs w:val="20"/>
               </w:rPr>
@@ -714,6 +658,9 @@
     <w:p>
       <w:pPr>
         <w:pStyle w:val="Ttulo2"/>
+        <w:rPr>
+          <w:color w:val="auto"/>
+        </w:rPr>
       </w:pPr>
       <w:r>
         <w:t>1.1 Identificación y Alcance</w:t>
@@ -763,7 +710,6 @@
               <w:rPr>
                 <w:b/>
                 <w:bCs/>
-                <w:color w:val="1A1A2E"/>
                 <w:sz w:val="20"/>
                 <w:szCs w:val="20"/>
               </w:rPr>
@@ -793,7 +739,6 @@
               <w:rPr>
                 <w:i/>
                 <w:iCs/>
-                <w:color w:val="AAAAAA"/>
                 <w:sz w:val="20"/>
                 <w:szCs w:val="20"/>
               </w:rPr>
@@ -825,7 +770,6 @@
               <w:rPr>
                 <w:b/>
                 <w:bCs/>
-                <w:color w:val="1A1A2E"/>
                 <w:sz w:val="20"/>
                 <w:szCs w:val="20"/>
               </w:rPr>
@@ -855,7 +799,6 @@
               <w:rPr>
                 <w:i/>
                 <w:iCs/>
-                <w:color w:val="AAAAAA"/>
                 <w:sz w:val="20"/>
                 <w:szCs w:val="20"/>
               </w:rPr>
@@ -887,7 +830,6 @@
               <w:rPr>
                 <w:b/>
                 <w:bCs/>
-                <w:color w:val="1A1A2E"/>
                 <w:sz w:val="20"/>
                 <w:szCs w:val="20"/>
               </w:rPr>
@@ -917,11 +859,37 @@
               <w:rPr>
                 <w:i/>
                 <w:iCs/>
-                <w:color w:val="AAAAAA"/>
-                <w:sz w:val="20"/>
-                <w:szCs w:val="20"/>
-              </w:rPr>
-              <w:t>Indicad el nombre del proyecto y la clase principal</w:t>
+                <w:sz w:val="20"/>
+                <w:szCs w:val="20"/>
+              </w:rPr>
+              <w:t xml:space="preserve">Validador de Formulario </w:t>
+            </w:r>
+            <w:r>
+              <w:rPr>
+                <w:i/>
+                <w:iCs/>
+                <w:sz w:val="20"/>
+                <w:szCs w:val="20"/>
+              </w:rPr>
+              <w:t>–</w:t>
+            </w:r>
+            <w:r>
+              <w:rPr>
+                <w:i/>
+                <w:iCs/>
+                <w:sz w:val="20"/>
+                <w:szCs w:val="20"/>
+              </w:rPr>
+              <w:t xml:space="preserve"> ValidadorFromulario</w:t>
+            </w:r>
+            <w:r>
+              <w:rPr>
+                <w:i/>
+                <w:iCs/>
+                <w:sz w:val="20"/>
+                <w:szCs w:val="20"/>
+              </w:rPr>
+              <w:t>.java</w:t>
             </w:r>
           </w:p>
         </w:tc>
@@ -949,7 +917,6 @@
               <w:rPr>
                 <w:b/>
                 <w:bCs/>
-                <w:color w:val="1A1A2E"/>
                 <w:sz w:val="20"/>
                 <w:szCs w:val="20"/>
               </w:rPr>
@@ -979,11 +946,28 @@
               <w:rPr>
                 <w:i/>
                 <w:iCs/>
-                <w:color w:val="AAAAAA"/>
-                <w:sz w:val="20"/>
-                <w:szCs w:val="20"/>
-              </w:rPr>
-              <w:t>Nombres de ambos integrantes de la pareja</w:t>
+                <w:sz w:val="20"/>
+                <w:szCs w:val="20"/>
+              </w:rPr>
+              <w:t xml:space="preserve">Marcos </w:t>
+            </w:r>
+            <w:r>
+              <w:rPr>
+                <w:i/>
+                <w:iCs/>
+                <w:sz w:val="20"/>
+                <w:szCs w:val="20"/>
+              </w:rPr>
+              <w:t>Gracia</w:t>
+            </w:r>
+            <w:r>
+              <w:rPr>
+                <w:i/>
+                <w:iCs/>
+                <w:sz w:val="20"/>
+                <w:szCs w:val="20"/>
+              </w:rPr>
+              <w:t xml:space="preserve"> García</w:t>
             </w:r>
           </w:p>
         </w:tc>
@@ -1103,51 +1087,191 @@
             </w:tcMar>
           </w:tcPr>
           <w:p>
-            <w:r>
-              <w:rPr>
-                <w:i/>
-                <w:iCs/>
-                <w:color w:val="AAAAAA"/>
-                <w:sz w:val="20"/>
-                <w:szCs w:val="20"/>
-              </w:rPr>
-              <w:t>1. [Clase.método()] – descripción breve</w:t>
-            </w:r>
-          </w:p>
-          <w:p>
-            <w:r>
-              <w:rPr>
-                <w:i/>
-                <w:iCs/>
-                <w:color w:val="AAAAAA"/>
-                <w:sz w:val="20"/>
-                <w:szCs w:val="20"/>
-              </w:rPr>
-              <w:t>2. [Clase.método()] – descripción breve</w:t>
-            </w:r>
-          </w:p>
-          <w:p>
-            <w:r>
-              <w:rPr>
-                <w:i/>
-                <w:iCs/>
-                <w:color w:val="AAAAAA"/>
-                <w:sz w:val="20"/>
-                <w:szCs w:val="20"/>
-              </w:rPr>
-              <w:t>3. [Clase.método()] – descripción breve</w:t>
-            </w:r>
-          </w:p>
-          <w:p>
-            <w:r>
-              <w:rPr>
-                <w:i/>
-                <w:iCs/>
-                <w:color w:val="AAAAAA"/>
-                <w:sz w:val="20"/>
-                <w:szCs w:val="20"/>
-              </w:rPr>
-              <w:t>4. (Añadid tantas filas como necesitéis)</w:t>
+            <w:pPr>
+              <w:spacing w:after="80"/>
+              <w:rPr>
+                <w:i/>
+                <w:iCs/>
+                <w:sz w:val="19"/>
+                <w:szCs w:val="19"/>
+              </w:rPr>
+            </w:pPr>
+            <w:r>
+              <w:rPr>
+                <w:i/>
+                <w:iCs/>
+                <w:sz w:val="19"/>
+                <w:szCs w:val="19"/>
+              </w:rPr>
+              <w:t>1. ValidadorFormulario.validarEmail(String</w:t>
+            </w:r>
+            <w:r>
+              <w:rPr>
+                <w:i/>
+                <w:iCs/>
+                <w:sz w:val="19"/>
+                <w:szCs w:val="19"/>
+              </w:rPr>
+              <w:t xml:space="preserve"> email</w:t>
+            </w:r>
+            <w:r>
+              <w:rPr>
+                <w:i/>
+                <w:iCs/>
+                <w:sz w:val="19"/>
+                <w:szCs w:val="19"/>
+              </w:rPr>
+              <w:t xml:space="preserve">) – Valida formato de correo electrónico </w:t>
+            </w:r>
+          </w:p>
+          <w:p>
+            <w:pPr>
+              <w:spacing w:after="80"/>
+              <w:rPr>
+                <w:i/>
+                <w:iCs/>
+                <w:sz w:val="19"/>
+                <w:szCs w:val="19"/>
+              </w:rPr>
+            </w:pPr>
+            <w:r>
+              <w:rPr>
+                <w:i/>
+                <w:iCs/>
+                <w:sz w:val="19"/>
+                <w:szCs w:val="19"/>
+              </w:rPr>
+              <w:t>2. ValidadorFormulario.validarPassword(String</w:t>
+            </w:r>
+            <w:r>
+              <w:rPr>
+                <w:i/>
+                <w:iCs/>
+                <w:sz w:val="19"/>
+                <w:szCs w:val="19"/>
+              </w:rPr>
+              <w:t xml:space="preserve"> password</w:t>
+            </w:r>
+            <w:r>
+              <w:rPr>
+                <w:i/>
+                <w:iCs/>
+                <w:sz w:val="19"/>
+                <w:szCs w:val="19"/>
+              </w:rPr>
+              <w:t xml:space="preserve">) – Valida longitud mínima y presencia de número </w:t>
+            </w:r>
+          </w:p>
+          <w:p>
+            <w:pPr>
+              <w:spacing w:after="80"/>
+              <w:rPr>
+                <w:i/>
+                <w:iCs/>
+                <w:sz w:val="19"/>
+                <w:szCs w:val="19"/>
+              </w:rPr>
+            </w:pPr>
+            <w:r>
+              <w:rPr>
+                <w:i/>
+                <w:iCs/>
+                <w:sz w:val="19"/>
+                <w:szCs w:val="19"/>
+              </w:rPr>
+              <w:t>3. ValidadorFormulario.validarTelefono(String</w:t>
+            </w:r>
+            <w:r>
+              <w:rPr>
+                <w:i/>
+                <w:iCs/>
+                <w:sz w:val="19"/>
+                <w:szCs w:val="19"/>
+              </w:rPr>
+              <w:t xml:space="preserve"> telefono</w:t>
+            </w:r>
+            <w:r>
+              <w:rPr>
+                <w:i/>
+                <w:iCs/>
+                <w:sz w:val="19"/>
+                <w:szCs w:val="19"/>
+              </w:rPr>
+              <w:t xml:space="preserve">) – </w:t>
+            </w:r>
+            <w:r>
+              <w:rPr>
+                <w:i/>
+                <w:iCs/>
+                <w:sz w:val="19"/>
+                <w:szCs w:val="19"/>
+              </w:rPr>
+              <w:t>V</w:t>
+            </w:r>
+            <w:r>
+              <w:rPr>
+                <w:i/>
+                <w:iCs/>
+                <w:sz w:val="19"/>
+                <w:szCs w:val="19"/>
+              </w:rPr>
+              <w:t xml:space="preserve">alida formato de teléfono español </w:t>
+            </w:r>
+          </w:p>
+          <w:p>
+            <w:pPr>
+              <w:spacing w:after="80"/>
+              <w:rPr>
+                <w:i/>
+                <w:iCs/>
+                <w:sz w:val="19"/>
+                <w:szCs w:val="19"/>
+              </w:rPr>
+            </w:pPr>
+            <w:r>
+              <w:rPr>
+                <w:i/>
+                <w:iCs/>
+                <w:sz w:val="19"/>
+                <w:szCs w:val="19"/>
+              </w:rPr>
+              <w:t>4. ValidadorFormulario.validarNombre(String</w:t>
+            </w:r>
+            <w:r>
+              <w:rPr>
+                <w:i/>
+                <w:iCs/>
+                <w:sz w:val="19"/>
+                <w:szCs w:val="19"/>
+              </w:rPr>
+              <w:t xml:space="preserve"> nombre</w:t>
+            </w:r>
+            <w:r>
+              <w:rPr>
+                <w:i/>
+                <w:iCs/>
+                <w:sz w:val="19"/>
+                <w:szCs w:val="19"/>
+              </w:rPr>
+              <w:t xml:space="preserve">) – </w:t>
+            </w:r>
+            <w:r>
+              <w:rPr>
+                <w:i/>
+                <w:iCs/>
+                <w:sz w:val="19"/>
+                <w:szCs w:val="19"/>
+              </w:rPr>
+              <w:t>V</w:t>
+            </w:r>
+            <w:r>
+              <w:rPr>
+                <w:i/>
+                <w:iCs/>
+                <w:sz w:val="19"/>
+                <w:szCs w:val="19"/>
+              </w:rPr>
+              <w:t xml:space="preserve">alida nombre con letras y espacios </w:t>
             </w:r>
           </w:p>
           <w:p>
@@ -1155,7 +1279,49 @@
               <w:spacing w:after="80"/>
             </w:pPr>
             <w:r>
-              <w:t xml:space="preserve"> </w:t>
+              <w:rPr>
+                <w:i/>
+                <w:iCs/>
+                <w:sz w:val="19"/>
+                <w:szCs w:val="19"/>
+              </w:rPr>
+              <w:t>5. ValidadorFormulario.validarDNI(String</w:t>
+            </w:r>
+            <w:r>
+              <w:rPr>
+                <w:i/>
+                <w:iCs/>
+                <w:sz w:val="19"/>
+                <w:szCs w:val="19"/>
+              </w:rPr>
+              <w:t xml:space="preserve"> dni</w:t>
+            </w:r>
+            <w:r>
+              <w:rPr>
+                <w:i/>
+                <w:iCs/>
+                <w:sz w:val="19"/>
+                <w:szCs w:val="19"/>
+              </w:rPr>
+              <w:t xml:space="preserve">) – </w:t>
+            </w:r>
+            <w:r>
+              <w:rPr>
+                <w:i/>
+                <w:iCs/>
+                <w:sz w:val="19"/>
+                <w:szCs w:val="19"/>
+              </w:rPr>
+              <w:t>V</w:t>
+            </w:r>
+            <w:r>
+              <w:rPr>
+                <w:i/>
+                <w:iCs/>
+                <w:sz w:val="19"/>
+                <w:szCs w:val="19"/>
+              </w:rPr>
+              <w:t>alida DNI español con algoritmo de letra</w:t>
             </w:r>
           </w:p>
         </w:tc>
@@ -1278,6 +1444,13 @@
           <w:p>
             <w:pPr>
               <w:spacing w:after="80"/>
+              <w:rPr>
+                <w:i/>
+                <w:iCs/>
+                <w:color w:val="AAAAAA"/>
+                <w:sz w:val="20"/>
+                <w:szCs w:val="20"/>
+              </w:rPr>
             </w:pPr>
             <w:r>
               <w:rPr>
@@ -1293,40 +1466,201 @@
           <w:p>
             <w:pPr>
               <w:spacing w:after="80"/>
+              <w:rPr>
+                <w:i/>
+                <w:iCs/>
+                <w:color w:val="000000" w:themeColor="text1"/>
+                <w:sz w:val="20"/>
+                <w:szCs w:val="20"/>
+              </w:rPr>
             </w:pPr>
             <w:r>
               <w:rPr>
-                <w:color w:val="AAAAAA"/>
-                <w:sz w:val="20"/>
-                <w:szCs w:val="20"/>
-              </w:rPr>
-              <w:t xml:space="preserve"> </w:t>
+                <w:i/>
+                <w:iCs/>
+                <w:color w:val="000000" w:themeColor="text1"/>
+                <w:sz w:val="20"/>
+                <w:szCs w:val="20"/>
+              </w:rPr>
+              <w:t xml:space="preserve">Se aplicará un enfoque combinado de pruebas unitarias usando JUnit 5:  </w:t>
             </w:r>
           </w:p>
           <w:p>
             <w:pPr>
               <w:spacing w:after="80"/>
+              <w:rPr>
+                <w:i/>
+                <w:iCs/>
+                <w:color w:val="000000" w:themeColor="text1"/>
+                <w:sz w:val="20"/>
+                <w:szCs w:val="20"/>
+              </w:rPr>
             </w:pPr>
             <w:r>
               <w:rPr>
-                <w:color w:val="AAAAAA"/>
-                <w:sz w:val="20"/>
-                <w:szCs w:val="20"/>
-              </w:rPr>
-              <w:t xml:space="preserve"> </w:t>
+                <w:i/>
+                <w:iCs/>
+                <w:color w:val="000000" w:themeColor="text1"/>
+                <w:sz w:val="20"/>
+                <w:szCs w:val="20"/>
+              </w:rPr>
+              <w:t>• Caja Negra (particiones equivalentes y valores límite): se diseñan casos de prueba basándose únicamente en la especificación de cada método, sin conocer la implementación</w:t>
+            </w:r>
+            <w:r>
+              <w:rPr>
+                <w:i/>
+                <w:iCs/>
+                <w:color w:val="000000" w:themeColor="text1"/>
+                <w:sz w:val="20"/>
+                <w:szCs w:val="20"/>
+              </w:rPr>
+              <w:t xml:space="preserve"> para validar</w:t>
+            </w:r>
+            <w:r>
+              <w:rPr>
+                <w:i/>
+                <w:iCs/>
+                <w:color w:val="000000" w:themeColor="text1"/>
+                <w:sz w:val="20"/>
+                <w:szCs w:val="20"/>
+              </w:rPr>
+              <w:t xml:space="preserve"> el comportamiento desde el punto de vista del usuario.</w:t>
             </w:r>
           </w:p>
           <w:p>
             <w:pPr>
               <w:spacing w:after="80"/>
+              <w:rPr>
+                <w:i/>
+                <w:iCs/>
+                <w:color w:val="000000" w:themeColor="text1"/>
+                <w:sz w:val="20"/>
+                <w:szCs w:val="20"/>
+              </w:rPr>
             </w:pPr>
             <w:r>
               <w:rPr>
+                <w:i/>
+                <w:iCs/>
+                <w:color w:val="000000" w:themeColor="text1"/>
+                <w:sz w:val="20"/>
+                <w:szCs w:val="20"/>
+              </w:rPr>
+              <w:t xml:space="preserve">• Caja Blanca (cobertura de ramas): se analiza el código fuente para garantizar que cada rama del flujo de control (if/else, bucles) queda cubierta por al menos un test.  </w:t>
+            </w:r>
+          </w:p>
+          <w:p>
+            <w:pPr>
+              <w:spacing w:after="80"/>
+              <w:rPr>
+                <w:i/>
+                <w:iCs/>
+                <w:color w:val="000000" w:themeColor="text1"/>
+                <w:sz w:val="20"/>
+                <w:szCs w:val="20"/>
+              </w:rPr>
+            </w:pPr>
+            <w:r>
+              <w:rPr>
+                <w:i/>
+                <w:iCs/>
+                <w:color w:val="000000" w:themeColor="text1"/>
+                <w:sz w:val="20"/>
+                <w:szCs w:val="20"/>
+              </w:rPr>
+              <w:t>• Tests parametrizados (@ParameterizedTest): para verificar múltiples valores equivalentes con un único método de test, reduciendo la duplicación de código</w:t>
+            </w:r>
+            <w:r>
+              <w:rPr>
+                <w:i/>
+                <w:iCs/>
+                <w:color w:val="000000" w:themeColor="text1"/>
+                <w:sz w:val="20"/>
+                <w:szCs w:val="20"/>
+              </w:rPr>
+              <w:t xml:space="preserve"> y garantizar la calidad interna del código</w:t>
+            </w:r>
+            <w:r>
+              <w:rPr>
+                <w:i/>
+                <w:iCs/>
+                <w:color w:val="000000" w:themeColor="text1"/>
+                <w:sz w:val="20"/>
+                <w:szCs w:val="20"/>
+              </w:rPr>
+              <w:t>.</w:t>
+            </w:r>
+          </w:p>
+          <w:p>
+            <w:pPr>
+              <w:spacing w:after="80"/>
+              <w:rPr>
+                <w:i/>
+                <w:iCs/>
+                <w:color w:val="000000" w:themeColor="text1"/>
+                <w:sz w:val="20"/>
+                <w:szCs w:val="20"/>
+              </w:rPr>
+            </w:pPr>
+          </w:p>
+          <w:p>
+            <w:pPr>
+              <w:pStyle w:val="Prrafodelista"/>
+              <w:numPr>
+                <w:ilvl w:val="0"/>
+                <w:numId w:val="4"/>
+              </w:numPr>
+              <w:spacing w:after="80"/>
+              <w:rPr>
+                <w:i/>
+                <w:iCs/>
+                <w:color w:val="000000" w:themeColor="text1"/>
+                <w:sz w:val="20"/>
+                <w:szCs w:val="20"/>
+              </w:rPr>
+            </w:pPr>
+            <w:r>
+              <w:rPr>
+                <w:i/>
+                <w:iCs/>
+                <w:color w:val="000000" w:themeColor="text1"/>
+                <w:sz w:val="20"/>
+                <w:szCs w:val="20"/>
+              </w:rPr>
+              <w:t xml:space="preserve">Nivel de Pruebas (Pruebas Unitarias): El nivel de ejecución se limitará estrictamente a pruebas unitarias en un entorno completamente aislado. El objetivo es verificar el correcto funcionamiento </w:t>
+            </w:r>
+            <w:r>
+              <w:rPr>
+                <w:i/>
+                <w:iCs/>
+                <w:color w:val="000000" w:themeColor="text1"/>
+                <w:sz w:val="20"/>
+                <w:szCs w:val="20"/>
+              </w:rPr>
+              <w:lastRenderedPageBreak/>
+              <w:t>lógico de cada método de la clase ValidadorFormulario de manera individual, sin interactuar con componentes externos (como bases de datos, redes o interfaces de usuario).</w:t>
+            </w:r>
+          </w:p>
+          <w:p>
+            <w:pPr>
+              <w:spacing w:after="80"/>
+              <w:rPr>
+                <w:i/>
+                <w:iCs/>
                 <w:color w:val="AAAAAA"/>
                 <w:sz w:val="20"/>
                 <w:szCs w:val="20"/>
               </w:rPr>
-              <w:t xml:space="preserve"> </w:t>
+            </w:pPr>
+            <w:r>
+              <w:rPr>
+                <w:i/>
+                <w:iCs/>
+                <w:color w:val="000000" w:themeColor="text1"/>
+                <w:sz w:val="20"/>
+                <w:szCs w:val="20"/>
+              </w:rPr>
+              <w:t>Herramientas: JUnit 5.10, JaCoCo 0.8.11 para cobertura, Maven para la automatización. Objetivo de cobertura: ≥ 80%.</w:t>
             </w:r>
           </w:p>
         </w:tc>
@@ -1337,6 +1671,7 @@
         <w:spacing w:before="60" w:after="60"/>
       </w:pPr>
       <w:r>
+        <w:lastRenderedPageBreak/>
         <w:t xml:space="preserve"> </w:t>
       </w:r>
     </w:p>
@@ -1458,60 +1793,189 @@
                 <w:sz w:val="20"/>
                 <w:szCs w:val="20"/>
               </w:rPr>
-              <w:lastRenderedPageBreak/>
               <w:t>CE-01: El código fuente compila correctamente sin errores (reemplazad esto con vuestros criterios reales) CE-02: ... CE-03: ...</w:t>
             </w:r>
           </w:p>
           <w:p>
             <w:pPr>
               <w:spacing w:after="80"/>
+              <w:rPr>
+                <w:color w:val="000000" w:themeColor="text1"/>
+                <w:sz w:val="20"/>
+                <w:szCs w:val="20"/>
+              </w:rPr>
             </w:pPr>
             <w:r>
               <w:rPr>
-                <w:color w:val="AAAAAA"/>
-                <w:sz w:val="20"/>
-                <w:szCs w:val="20"/>
-              </w:rPr>
-              <w:t xml:space="preserve"> </w:t>
+                <w:color w:val="000000" w:themeColor="text1"/>
+                <w:sz w:val="20"/>
+                <w:szCs w:val="20"/>
+              </w:rPr>
+              <w:t>CE-01: El código fuente compila correctamente sin errores (</w:t>
+            </w:r>
+            <w:r>
+              <w:rPr>
+                <w:color w:val="000000" w:themeColor="text1"/>
+                <w:sz w:val="20"/>
+                <w:szCs w:val="20"/>
+              </w:rPr>
+              <w:t xml:space="preserve">para que </w:t>
+            </w:r>
+            <w:r>
+              <w:rPr>
+                <w:color w:val="000000" w:themeColor="text1"/>
+                <w:sz w:val="20"/>
+                <w:szCs w:val="20"/>
+              </w:rPr>
+              <w:t>m</w:t>
+            </w:r>
+            <w:r>
+              <w:rPr>
+                <w:color w:val="000000" w:themeColor="text1"/>
+                <w:sz w:val="20"/>
+                <w:szCs w:val="20"/>
+              </w:rPr>
+              <w:t>a</w:t>
+            </w:r>
+            <w:r>
+              <w:rPr>
+                <w:color w:val="000000" w:themeColor="text1"/>
+                <w:sz w:val="20"/>
+                <w:szCs w:val="20"/>
+              </w:rPr>
+              <w:t>v</w:t>
+            </w:r>
+            <w:r>
+              <w:rPr>
+                <w:color w:val="000000" w:themeColor="text1"/>
+                <w:sz w:val="20"/>
+                <w:szCs w:val="20"/>
+              </w:rPr>
+              <w:t>e</w:t>
+            </w:r>
+            <w:r>
+              <w:rPr>
+                <w:color w:val="000000" w:themeColor="text1"/>
+                <w:sz w:val="20"/>
+                <w:szCs w:val="20"/>
+              </w:rPr>
+              <w:t xml:space="preserve">n compile sin errores). </w:t>
             </w:r>
           </w:p>
           <w:p>
             <w:pPr>
               <w:spacing w:after="80"/>
+              <w:rPr>
+                <w:color w:val="000000" w:themeColor="text1"/>
+                <w:sz w:val="20"/>
+                <w:szCs w:val="20"/>
+              </w:rPr>
             </w:pPr>
             <w:r>
               <w:rPr>
-                <w:color w:val="AAAAAA"/>
-                <w:sz w:val="20"/>
-                <w:szCs w:val="20"/>
-              </w:rPr>
-              <w:t xml:space="preserve"> </w:t>
+                <w:color w:val="000000" w:themeColor="text1"/>
+                <w:sz w:val="20"/>
+                <w:szCs w:val="20"/>
+              </w:rPr>
+              <w:t>CE-02: El entorno de pruebas está configurado: JDK, Maven, JUnit en el pom.xml</w:t>
+            </w:r>
+            <w:r>
+              <w:rPr>
+                <w:color w:val="000000" w:themeColor="text1"/>
+                <w:sz w:val="20"/>
+                <w:szCs w:val="20"/>
+              </w:rPr>
+              <w:t xml:space="preserve"> (para que entienda las etiquetas)</w:t>
+            </w:r>
+            <w:r>
+              <w:rPr>
+                <w:color w:val="000000" w:themeColor="text1"/>
+                <w:sz w:val="20"/>
+                <w:szCs w:val="20"/>
+              </w:rPr>
+              <w:t xml:space="preserve">. </w:t>
             </w:r>
           </w:p>
           <w:p>
             <w:pPr>
               <w:spacing w:after="80"/>
+              <w:rPr>
+                <w:color w:val="000000" w:themeColor="text1"/>
+                <w:sz w:val="20"/>
+                <w:szCs w:val="20"/>
+              </w:rPr>
             </w:pPr>
             <w:r>
               <w:rPr>
-                <w:color w:val="AAAAAA"/>
-                <w:sz w:val="20"/>
-                <w:szCs w:val="20"/>
-              </w:rPr>
-              <w:t xml:space="preserve"> </w:t>
+                <w:color w:val="000000" w:themeColor="text1"/>
+                <w:sz w:val="20"/>
+                <w:szCs w:val="20"/>
+              </w:rPr>
+              <w:t>CE-03: El repositorio Git está inicializado y el Commit 1 con el código fuente está</w:t>
+            </w:r>
+            <w:r>
+              <w:rPr>
+                <w:color w:val="000000" w:themeColor="text1"/>
+                <w:sz w:val="20"/>
+                <w:szCs w:val="20"/>
+              </w:rPr>
+              <w:t xml:space="preserve"> hecho</w:t>
+            </w:r>
+            <w:r>
+              <w:rPr>
+                <w:color w:val="000000" w:themeColor="text1"/>
+                <w:sz w:val="20"/>
+                <w:szCs w:val="20"/>
+              </w:rPr>
+              <w:t xml:space="preserve">. </w:t>
             </w:r>
           </w:p>
           <w:p>
             <w:pPr>
               <w:spacing w:after="80"/>
+              <w:rPr>
+                <w:color w:val="000000" w:themeColor="text1"/>
+              </w:rPr>
             </w:pPr>
             <w:r>
               <w:rPr>
-                <w:color w:val="AAAAAA"/>
-                <w:sz w:val="20"/>
-                <w:szCs w:val="20"/>
-              </w:rPr>
-              <w:t xml:space="preserve"> </w:t>
+                <w:color w:val="000000" w:themeColor="text1"/>
+                <w:sz w:val="20"/>
+                <w:szCs w:val="20"/>
+              </w:rPr>
+              <w:t xml:space="preserve">CE-04: Los casos de prueba </w:t>
+            </w:r>
+            <w:r>
+              <w:rPr>
+                <w:color w:val="000000" w:themeColor="text1"/>
+                <w:sz w:val="20"/>
+                <w:szCs w:val="20"/>
+              </w:rPr>
+              <w:t>están</w:t>
+            </w:r>
+            <w:r>
+              <w:rPr>
+                <w:color w:val="000000" w:themeColor="text1"/>
+                <w:sz w:val="20"/>
+                <w:szCs w:val="20"/>
+              </w:rPr>
+              <w:t xml:space="preserve"> diseñados y documentados en este informe antes de </w:t>
+            </w:r>
+            <w:r>
+              <w:rPr>
+                <w:color w:val="000000" w:themeColor="text1"/>
+                <w:sz w:val="20"/>
+                <w:szCs w:val="20"/>
+              </w:rPr>
+              <w:t>implementarlos</w:t>
+            </w:r>
+            <w:r>
+              <w:rPr>
+                <w:color w:val="000000" w:themeColor="text1"/>
+                <w:sz w:val="20"/>
+                <w:szCs w:val="20"/>
+              </w:rPr>
+              <w:t>.</w:t>
             </w:r>
           </w:p>
         </w:tc>
@@ -1634,6 +2098,13 @@
           <w:p>
             <w:pPr>
               <w:spacing w:after="80"/>
+              <w:rPr>
+                <w:i/>
+                <w:iCs/>
+                <w:color w:val="AAAAAA"/>
+                <w:sz w:val="20"/>
+                <w:szCs w:val="20"/>
+              </w:rPr>
             </w:pPr>
             <w:r>
               <w:rPr>
@@ -1649,53 +2120,99 @@
           <w:p>
             <w:pPr>
               <w:spacing w:after="80"/>
+              <w:rPr>
+                <w:color w:val="000000" w:themeColor="text1"/>
+                <w:sz w:val="20"/>
+                <w:szCs w:val="20"/>
+              </w:rPr>
             </w:pPr>
             <w:r>
               <w:rPr>
-                <w:color w:val="AAAAAA"/>
-                <w:sz w:val="20"/>
-                <w:szCs w:val="20"/>
-              </w:rPr>
-              <w:t xml:space="preserve"> </w:t>
+                <w:color w:val="000000" w:themeColor="text1"/>
+                <w:sz w:val="20"/>
+                <w:szCs w:val="20"/>
+              </w:rPr>
+              <w:t xml:space="preserve">CS-01: Se han ejecutado el 100% de los casos de prueba planificados. </w:t>
             </w:r>
           </w:p>
           <w:p>
             <w:pPr>
               <w:spacing w:after="80"/>
+              <w:rPr>
+                <w:color w:val="000000" w:themeColor="text1"/>
+                <w:sz w:val="20"/>
+                <w:szCs w:val="20"/>
+              </w:rPr>
             </w:pPr>
             <w:r>
               <w:rPr>
-                <w:color w:val="AAAAAA"/>
-                <w:sz w:val="20"/>
-                <w:szCs w:val="20"/>
-              </w:rPr>
-              <w:t xml:space="preserve"> </w:t>
+                <w:color w:val="000000" w:themeColor="text1"/>
+                <w:sz w:val="20"/>
+                <w:szCs w:val="20"/>
+              </w:rPr>
+              <w:t xml:space="preserve">CS-02: La cobertura de líneas medida por JaCoCo es igual o superior al 80%. </w:t>
             </w:r>
           </w:p>
           <w:p>
             <w:pPr>
               <w:spacing w:after="80"/>
+              <w:rPr>
+                <w:color w:val="000000" w:themeColor="text1"/>
+                <w:sz w:val="20"/>
+                <w:szCs w:val="20"/>
+              </w:rPr>
             </w:pPr>
             <w:r>
               <w:rPr>
-                <w:color w:val="AAAAAA"/>
-                <w:sz w:val="20"/>
-                <w:szCs w:val="20"/>
-              </w:rPr>
-              <w:t xml:space="preserve"> </w:t>
+                <w:color w:val="000000" w:themeColor="text1"/>
+                <w:sz w:val="20"/>
+                <w:szCs w:val="20"/>
+              </w:rPr>
+              <w:t xml:space="preserve">CS-03: </w:t>
+            </w:r>
+            <w:r>
+              <w:rPr>
+                <w:color w:val="000000" w:themeColor="text1"/>
+                <w:sz w:val="20"/>
+                <w:szCs w:val="20"/>
+              </w:rPr>
+              <w:t>Todos los fallos detectados han sido registrados en el informe, detallando el dato que los provoca y el comportamiento incorrecto del programa.</w:t>
             </w:r>
           </w:p>
           <w:p>
             <w:pPr>
               <w:spacing w:after="80"/>
+              <w:rPr>
+                <w:color w:val="000000" w:themeColor="text1"/>
+                <w:sz w:val="20"/>
+                <w:szCs w:val="20"/>
+              </w:rPr>
             </w:pPr>
             <w:r>
               <w:rPr>
-                <w:color w:val="AAAAAA"/>
-                <w:sz w:val="20"/>
-                <w:szCs w:val="20"/>
-              </w:rPr>
-              <w:t xml:space="preserve"> </w:t>
+                <w:color w:val="000000" w:themeColor="text1"/>
+                <w:sz w:val="20"/>
+                <w:szCs w:val="20"/>
+              </w:rPr>
+              <w:t xml:space="preserve">CS-04: Los defectos de severidad Alta o Crítica han sido corregidos o tienen justificación de no corrección. </w:t>
+            </w:r>
+          </w:p>
+          <w:p>
+            <w:pPr>
+              <w:spacing w:after="80"/>
+              <w:rPr>
+                <w:color w:val="000000" w:themeColor="text1"/>
+                <w:sz w:val="20"/>
+                <w:szCs w:val="20"/>
+              </w:rPr>
+            </w:pPr>
+            <w:r>
+              <w:rPr>
+                <w:color w:val="000000" w:themeColor="text1"/>
+                <w:sz w:val="20"/>
+                <w:szCs w:val="20"/>
+              </w:rPr>
+              <w:t>CS-05: El informe de pruebas está completo y subido al repositorio.</w:t>
             </w:r>
           </w:p>
         </w:tc>
@@ -1833,14 +2350,99 @@
           <w:p>
             <w:pPr>
               <w:spacing w:after="80"/>
+              <w:rPr>
+                <w:color w:val="000000" w:themeColor="text1"/>
+                <w:sz w:val="20"/>
+                <w:szCs w:val="20"/>
+              </w:rPr>
             </w:pPr>
             <w:r>
               <w:rPr>
-                <w:color w:val="AAAAAA"/>
-                <w:sz w:val="20"/>
-                <w:szCs w:val="20"/>
-              </w:rPr>
-              <w:t xml:space="preserve"> </w:t>
+                <w:color w:val="000000" w:themeColor="text1"/>
+                <w:sz w:val="20"/>
+                <w:szCs w:val="20"/>
+              </w:rPr>
+              <w:t>CSUSP-01</w:t>
+            </w:r>
+            <w:r>
+              <w:rPr>
+                <w:color w:val="000000" w:themeColor="text1"/>
+                <w:sz w:val="20"/>
+                <w:szCs w:val="20"/>
+              </w:rPr>
+              <w:t xml:space="preserve">: </w:t>
+            </w:r>
+            <w:r>
+              <w:rPr>
+                <w:color w:val="000000" w:themeColor="text1"/>
+                <w:sz w:val="20"/>
+                <w:szCs w:val="20"/>
+              </w:rPr>
+              <w:t xml:space="preserve">El código fuente deja de compilar como consecuencia de una corrección de bug. En ese caso se revertirá el cambio, se analizará el error y se volverá a intentar. </w:t>
+            </w:r>
+          </w:p>
+          <w:p>
+            <w:pPr>
+              <w:spacing w:after="80"/>
+              <w:rPr>
+                <w:color w:val="000000" w:themeColor="text1"/>
+              </w:rPr>
+            </w:pPr>
+            <w:r>
+              <w:rPr>
+                <w:color w:val="000000" w:themeColor="text1"/>
+                <w:sz w:val="20"/>
+                <w:szCs w:val="20"/>
+              </w:rPr>
+              <w:t>CSUSP-0</w:t>
+            </w:r>
+            <w:r>
+              <w:rPr>
+                <w:color w:val="000000" w:themeColor="text1"/>
+                <w:sz w:val="20"/>
+                <w:szCs w:val="20"/>
+              </w:rPr>
+              <w:t>2</w:t>
+            </w:r>
+            <w:r>
+              <w:rPr>
+                <w:color w:val="000000" w:themeColor="text1"/>
+                <w:sz w:val="20"/>
+                <w:szCs w:val="20"/>
+              </w:rPr>
+              <w:t xml:space="preserve">: </w:t>
+            </w:r>
+            <w:r>
+              <w:rPr>
+                <w:color w:val="000000" w:themeColor="text1"/>
+                <w:sz w:val="20"/>
+                <w:szCs w:val="20"/>
+              </w:rPr>
+              <w:t xml:space="preserve">Se detecta un error de entorno (Maven no ejecuta los tests, problema con JDK). Se resolverá el entorno antes de continuar.  Las pruebas se reanudarán una vez resuelto el </w:t>
+            </w:r>
+            <w:r>
+              <w:rPr>
+                <w:color w:val="000000" w:themeColor="text1"/>
+                <w:sz w:val="20"/>
+                <w:szCs w:val="20"/>
+              </w:rPr>
+              <w:t>problema</w:t>
+            </w:r>
+            <w:r>
+              <w:rPr>
+                <w:color w:val="000000" w:themeColor="text1"/>
+                <w:sz w:val="20"/>
+                <w:szCs w:val="20"/>
+              </w:rPr>
+              <w:t xml:space="preserve"> y documentado el incidente en la sección </w:t>
+            </w:r>
+            <w:r>
+              <w:rPr>
+                <w:color w:val="000000" w:themeColor="text1"/>
+                <w:sz w:val="20"/>
+                <w:szCs w:val="20"/>
+              </w:rPr>
+              <w:t>respectiva</w:t>
             </w:r>
           </w:p>
           <w:p>
@@ -1849,7 +2451,7 @@
             </w:pPr>
             <w:r>
               <w:rPr>
-                <w:color w:val="AAAAAA"/>
+                <w:color w:val="000000" w:themeColor="text1"/>
                 <w:sz w:val="20"/>
                 <w:szCs w:val="20"/>
               </w:rPr>
@@ -1864,6 +2466,7 @@
         <w:spacing w:before="60" w:after="60"/>
       </w:pPr>
       <w:r>
+        <w:lastRenderedPageBreak/>
         <w:t xml:space="preserve"> </w:t>
       </w:r>
     </w:p>
@@ -1945,15 +2548,20 @@
             </w:tcMar>
           </w:tcPr>
           <w:p>
-            <w:r>
-              <w:rPr>
-                <w:i/>
-                <w:iCs/>
-                <w:color w:val="AAAAAA"/>
-                <w:sz w:val="20"/>
-                <w:szCs w:val="20"/>
-              </w:rPr>
-              <w:t>Windows 10/11 / macOS / Linux</w:t>
+            <w:pPr>
+              <w:rPr>
+                <w:color w:val="000000" w:themeColor="text1"/>
+              </w:rPr>
+            </w:pPr>
+            <w:r>
+              <w:rPr>
+                <w:i/>
+                <w:iCs/>
+                <w:color w:val="000000" w:themeColor="text1"/>
+                <w:sz w:val="20"/>
+                <w:szCs w:val="20"/>
+              </w:rPr>
+              <w:t>Windows 10/11</w:t>
             </w:r>
           </w:p>
         </w:tc>
@@ -2007,15 +2615,20 @@
             </w:tcMar>
           </w:tcPr>
           <w:p>
-            <w:r>
-              <w:rPr>
-                <w:i/>
-                <w:iCs/>
-                <w:color w:val="AAAAAA"/>
-                <w:sz w:val="20"/>
-                <w:szCs w:val="20"/>
-              </w:rPr>
-              <w:t>OpenJDK 17 / 21</w:t>
+            <w:pPr>
+              <w:rPr>
+                <w:color w:val="000000" w:themeColor="text1"/>
+              </w:rPr>
+            </w:pPr>
+            <w:r>
+              <w:rPr>
+                <w:i/>
+                <w:iCs/>
+                <w:color w:val="000000" w:themeColor="text1"/>
+                <w:sz w:val="20"/>
+                <w:szCs w:val="20"/>
+              </w:rPr>
+              <w:t>OpenJDK 17</w:t>
             </w:r>
           </w:p>
         </w:tc>
@@ -2069,15 +2682,60 @@
             </w:tcMar>
           </w:tcPr>
           <w:p>
-            <w:r>
-              <w:rPr>
-                <w:i/>
-                <w:iCs/>
-                <w:color w:val="AAAAAA"/>
-                <w:sz w:val="20"/>
-                <w:szCs w:val="20"/>
-              </w:rPr>
-              <w:t>IntelliJ IDEA / Eclipse / VS Code</w:t>
+            <w:pPr>
+              <w:rPr>
+                <w:color w:val="000000" w:themeColor="text1"/>
+              </w:rPr>
+            </w:pPr>
+            <w:r>
+              <w:rPr>
+                <w:i/>
+                <w:iCs/>
+                <w:color w:val="000000" w:themeColor="text1"/>
+                <w:sz w:val="20"/>
+                <w:szCs w:val="20"/>
+              </w:rPr>
+              <w:t>V</w:t>
+            </w:r>
+            <w:r>
+              <w:rPr>
+                <w:i/>
+                <w:iCs/>
+                <w:color w:val="000000" w:themeColor="text1"/>
+                <w:sz w:val="20"/>
+                <w:szCs w:val="20"/>
+              </w:rPr>
+              <w:t xml:space="preserve">isual </w:t>
+            </w:r>
+            <w:r>
+              <w:rPr>
+                <w:i/>
+                <w:iCs/>
+                <w:color w:val="000000" w:themeColor="text1"/>
+                <w:sz w:val="20"/>
+                <w:szCs w:val="20"/>
+              </w:rPr>
+              <w:t>S</w:t>
+            </w:r>
+            <w:r>
+              <w:rPr>
+                <w:i/>
+                <w:iCs/>
+                <w:color w:val="000000" w:themeColor="text1"/>
+                <w:sz w:val="20"/>
+                <w:szCs w:val="20"/>
+              </w:rPr>
+              <w:t>tudio</w:t>
+            </w:r>
+            <w:r>
+              <w:rPr>
+                <w:i/>
+                <w:iCs/>
+                <w:color w:val="000000" w:themeColor="text1"/>
+                <w:sz w:val="20"/>
+                <w:szCs w:val="20"/>
+              </w:rPr>
+              <w:t xml:space="preserve"> Code</w:t>
             </w:r>
           </w:p>
         </w:tc>
@@ -2131,11 +2789,16 @@
             </w:tcMar>
           </w:tcPr>
           <w:p>
-            <w:r>
-              <w:rPr>
-                <w:i/>
-                <w:iCs/>
-                <w:color w:val="AAAAAA"/>
+            <w:pPr>
+              <w:rPr>
+                <w:color w:val="000000" w:themeColor="text1"/>
+              </w:rPr>
+            </w:pPr>
+            <w:r>
+              <w:rPr>
+                <w:i/>
+                <w:iCs/>
+                <w:color w:val="000000" w:themeColor="text1"/>
                 <w:sz w:val="20"/>
                 <w:szCs w:val="20"/>
               </w:rPr>
@@ -2193,16 +2856,31 @@
             </w:tcMar>
           </w:tcPr>
           <w:p>
-            <w:r>
-              <w:rPr>
-                <w:i/>
-                <w:iCs/>
-                <w:color w:val="AAAAAA"/>
+            <w:pPr>
+              <w:rPr>
+                <w:color w:val="000000" w:themeColor="text1"/>
+              </w:rPr>
+            </w:pPr>
+            <w:r>
+              <w:rPr>
+                <w:i/>
+                <w:iCs/>
+                <w:color w:val="000000" w:themeColor="text1"/>
                 <w:sz w:val="20"/>
                 <w:szCs w:val="20"/>
               </w:rPr>
               <w:t>JUnit 5.10</w:t>
             </w:r>
+            <w:r>
+              <w:rPr>
+                <w:i/>
+                <w:iCs/>
+                <w:color w:val="000000" w:themeColor="text1"/>
+                <w:sz w:val="20"/>
+                <w:szCs w:val="20"/>
+              </w:rPr>
+              <w:t>.2</w:t>
+            </w:r>
           </w:p>
         </w:tc>
       </w:tr>
@@ -2255,11 +2933,16 @@
             </w:tcMar>
           </w:tcPr>
           <w:p>
-            <w:r>
-              <w:rPr>
-                <w:i/>
-                <w:iCs/>
-                <w:color w:val="AAAAAA"/>
+            <w:pPr>
+              <w:rPr>
+                <w:color w:val="000000" w:themeColor="text1"/>
+              </w:rPr>
+            </w:pPr>
+            <w:r>
+              <w:rPr>
+                <w:i/>
+                <w:iCs/>
+                <w:color w:val="000000" w:themeColor="text1"/>
                 <w:sz w:val="20"/>
                 <w:szCs w:val="20"/>
               </w:rPr>
@@ -2317,15 +3000,20 @@
             </w:tcMar>
           </w:tcPr>
           <w:p>
-            <w:r>
-              <w:rPr>
-                <w:i/>
-                <w:iCs/>
-                <w:color w:val="AAAAAA"/>
-                <w:sz w:val="20"/>
-                <w:szCs w:val="20"/>
-              </w:rPr>
-              <w:t>GitHub / GitLab</w:t>
+            <w:pPr>
+              <w:rPr>
+                <w:color w:val="000000" w:themeColor="text1"/>
+              </w:rPr>
+            </w:pPr>
+            <w:r>
+              <w:rPr>
+                <w:i/>
+                <w:iCs/>
+                <w:color w:val="000000" w:themeColor="text1"/>
+                <w:sz w:val="20"/>
+                <w:szCs w:val="20"/>
+              </w:rPr>
+              <w:t>GitHub</w:t>
             </w:r>
           </w:p>
         </w:tc>
@@ -2479,16 +3167,62 @@
             </w:tcMar>
           </w:tcPr>
           <w:p>
-            <w:r>
-              <w:rPr>
-                <w:i/>
-                <w:iCs/>
-                <w:color w:val="AAAAAA"/>
-                <w:sz w:val="20"/>
-                <w:szCs w:val="20"/>
-              </w:rPr>
-              <w:lastRenderedPageBreak/>
-              <w:t>Ej: Falta de tiempo para probar todos los métodos</w:t>
+            <w:pPr>
+              <w:rPr>
+                <w:i/>
+                <w:iCs/>
+                <w:color w:val="000000" w:themeColor="text1"/>
+              </w:rPr>
+            </w:pPr>
+            <w:r>
+              <w:rPr>
+                <w:i/>
+                <w:iCs/>
+                <w:color w:val="000000" w:themeColor="text1"/>
+                <w:sz w:val="20"/>
+                <w:szCs w:val="20"/>
+              </w:rPr>
+              <w:t xml:space="preserve">R-01: </w:t>
+            </w:r>
+            <w:r>
+              <w:rPr>
+                <w:i/>
+                <w:iCs/>
+                <w:color w:val="000000" w:themeColor="text1"/>
+                <w:sz w:val="20"/>
+                <w:szCs w:val="20"/>
+              </w:rPr>
+              <w:t xml:space="preserve">Retraso en la entrega debido a una alta </w:t>
+            </w:r>
+            <w:r>
+              <w:rPr>
+                <w:i/>
+                <w:iCs/>
+                <w:color w:val="000000" w:themeColor="text1"/>
+                <w:sz w:val="20"/>
+                <w:szCs w:val="20"/>
+              </w:rPr>
+              <w:t>dificultad</w:t>
+            </w:r>
+            <w:r>
+              <w:rPr>
+                <w:i/>
+                <w:iCs/>
+                <w:color w:val="000000" w:themeColor="text1"/>
+                <w:sz w:val="20"/>
+                <w:szCs w:val="20"/>
+              </w:rPr>
+              <w:t xml:space="preserve"> en la lógica de métodos específicos</w:t>
+            </w:r>
+            <w:r>
+              <w:rPr>
+                <w:i/>
+                <w:iCs/>
+                <w:color w:val="000000" w:themeColor="text1"/>
+                <w:sz w:val="20"/>
+                <w:szCs w:val="20"/>
+              </w:rPr>
+              <w:t>.</w:t>
             </w:r>
           </w:p>
         </w:tc>
@@ -2510,11 +3244,18 @@
             </w:tcMar>
           </w:tcPr>
           <w:p>
-            <w:r>
-              <w:rPr>
-                <w:i/>
-                <w:iCs/>
-                <w:color w:val="AAAAAA"/>
+            <w:pPr>
+              <w:rPr>
+                <w:i/>
+                <w:iCs/>
+                <w:color w:val="000000" w:themeColor="text1"/>
+              </w:rPr>
+            </w:pPr>
+            <w:r>
+              <w:rPr>
+                <w:i/>
+                <w:iCs/>
+                <w:color w:val="000000" w:themeColor="text1"/>
                 <w:sz w:val="20"/>
                 <w:szCs w:val="20"/>
               </w:rPr>
@@ -2539,15 +3280,62 @@
             </w:tcMar>
           </w:tcPr>
           <w:p>
-            <w:r>
-              <w:rPr>
-                <w:i/>
-                <w:iCs/>
-                <w:color w:val="AAAAAA"/>
-                <w:sz w:val="20"/>
-                <w:szCs w:val="20"/>
-              </w:rPr>
-              <w:t>Priorizar los métodos más críticos</w:t>
+            <w:pPr>
+              <w:rPr>
+                <w:i/>
+                <w:iCs/>
+                <w:color w:val="000000" w:themeColor="text1"/>
+              </w:rPr>
+            </w:pPr>
+            <w:r>
+              <w:rPr>
+                <w:i/>
+                <w:iCs/>
+                <w:color w:val="000000" w:themeColor="text1"/>
+                <w:sz w:val="20"/>
+                <w:szCs w:val="20"/>
+              </w:rPr>
+              <w:t xml:space="preserve">Priorizar y asegurar la automatización de los métodos </w:t>
+            </w:r>
+            <w:r>
+              <w:rPr>
+                <w:i/>
+                <w:iCs/>
+                <w:color w:val="000000" w:themeColor="text1"/>
+                <w:sz w:val="20"/>
+                <w:szCs w:val="20"/>
+              </w:rPr>
+              <w:t>más compleja</w:t>
+            </w:r>
+            <w:r>
+              <w:rPr>
+                <w:i/>
+                <w:iCs/>
+                <w:color w:val="000000" w:themeColor="text1"/>
+                <w:sz w:val="20"/>
+                <w:szCs w:val="20"/>
+              </w:rPr>
+              <w:t xml:space="preserve"> del formulario</w:t>
+            </w:r>
+            <w:r>
+              <w:rPr>
+                <w:i/>
+                <w:iCs/>
+                <w:color w:val="000000" w:themeColor="text1"/>
+                <w:sz w:val="20"/>
+                <w:szCs w:val="20"/>
+              </w:rPr>
+              <w:t xml:space="preserve"> </w:t>
+            </w:r>
+            <w:r>
+              <w:rPr>
+                <w:i/>
+                <w:iCs/>
+                <w:color w:val="000000" w:themeColor="text1"/>
+                <w:sz w:val="20"/>
+                <w:szCs w:val="20"/>
+              </w:rPr>
+              <w:t>antes de avanzar con el resto.</w:t>
             </w:r>
           </w:p>
         </w:tc>
@@ -2571,15 +3359,42 @@
             </w:tcMar>
           </w:tcPr>
           <w:p>
-            <w:r>
-              <w:rPr>
-                <w:i/>
-                <w:iCs/>
-                <w:color w:val="AAAAAA"/>
-                <w:sz w:val="20"/>
-                <w:szCs w:val="20"/>
-              </w:rPr>
-              <w:t>[Añadid vuestros riesgos reales]</w:t>
+            <w:pPr>
+              <w:rPr>
+                <w:i/>
+                <w:iCs/>
+                <w:color w:val="000000" w:themeColor="text1"/>
+              </w:rPr>
+            </w:pPr>
+            <w:r>
+              <w:rPr>
+                <w:i/>
+                <w:iCs/>
+                <w:color w:val="000000" w:themeColor="text1"/>
+                <w:sz w:val="20"/>
+                <w:szCs w:val="20"/>
+              </w:rPr>
+              <w:t>R-0</w:t>
+            </w:r>
+            <w:r>
+              <w:rPr>
+                <w:i/>
+                <w:iCs/>
+                <w:color w:val="000000" w:themeColor="text1"/>
+                <w:sz w:val="20"/>
+                <w:szCs w:val="20"/>
+              </w:rPr>
+              <w:t xml:space="preserve">2: </w:t>
+            </w:r>
+            <w:r>
+              <w:rPr>
+                <w:i/>
+                <w:iCs/>
+                <w:color w:val="000000" w:themeColor="text1"/>
+                <w:sz w:val="20"/>
+                <w:szCs w:val="20"/>
+              </w:rPr>
+              <w:t>Error de compilación tras corregir bugs</w:t>
             </w:r>
           </w:p>
         </w:tc>
@@ -2600,7 +3415,25 @@
               <w:right w:w="120" w:type="dxa"/>
             </w:tcMar>
           </w:tcPr>
-          <w:p/>
+          <w:p>
+            <w:pPr>
+              <w:rPr>
+                <w:i/>
+                <w:iCs/>
+                <w:color w:val="000000" w:themeColor="text1"/>
+              </w:rPr>
+            </w:pPr>
+            <w:r>
+              <w:rPr>
+                <w:i/>
+                <w:iCs/>
+                <w:color w:val="000000" w:themeColor="text1"/>
+                <w:sz w:val="20"/>
+                <w:szCs w:val="20"/>
+              </w:rPr>
+              <w:t>Baja</w:t>
+            </w:r>
+          </w:p>
         </w:tc>
         <w:tc>
           <w:tcPr>
@@ -2619,7 +3452,25 @@
               <w:right w:w="120" w:type="dxa"/>
             </w:tcMar>
           </w:tcPr>
-          <w:p/>
+          <w:p>
+            <w:pPr>
+              <w:rPr>
+                <w:i/>
+                <w:iCs/>
+                <w:color w:val="000000" w:themeColor="text1"/>
+              </w:rPr>
+            </w:pPr>
+            <w:r>
+              <w:rPr>
+                <w:i/>
+                <w:iCs/>
+                <w:color w:val="000000" w:themeColor="text1"/>
+                <w:sz w:val="20"/>
+                <w:szCs w:val="20"/>
+              </w:rPr>
+              <w:t>Revertir el commit con 'git revert' y analizar el error antes de volver a intentarlo</w:t>
+            </w:r>
+          </w:p>
         </w:tc>
       </w:tr>
       <w:tr>
@@ -2640,15 +3491,32 @@
             </w:tcMar>
           </w:tcPr>
           <w:p>
-            <w:r>
-              <w:rPr>
-                <w:i/>
-                <w:iCs/>
-                <w:color w:val="AAAAAA"/>
-                <w:sz w:val="20"/>
-                <w:szCs w:val="20"/>
-              </w:rPr>
-              <w:t>[Añadid vuestros riesgos reales]</w:t>
+            <w:pPr>
+              <w:rPr>
+                <w:i/>
+                <w:iCs/>
+                <w:color w:val="000000" w:themeColor="text1"/>
+              </w:rPr>
+            </w:pPr>
+            <w:r>
+              <w:rPr>
+                <w:i/>
+                <w:iCs/>
+                <w:color w:val="000000" w:themeColor="text1"/>
+                <w:sz w:val="20"/>
+                <w:szCs w:val="20"/>
+              </w:rPr>
+              <w:t xml:space="preserve">R-03: </w:t>
+            </w:r>
+            <w:r>
+              <w:rPr>
+                <w:i/>
+                <w:iCs/>
+                <w:color w:val="000000" w:themeColor="text1"/>
+                <w:sz w:val="20"/>
+                <w:szCs w:val="20"/>
+              </w:rPr>
+              <w:t>Cobertura JaCoCo por debajo del 70%</w:t>
             </w:r>
           </w:p>
         </w:tc>
@@ -2668,7 +3536,25 @@
               <w:right w:w="120" w:type="dxa"/>
             </w:tcMar>
           </w:tcPr>
-          <w:p/>
+          <w:p>
+            <w:pPr>
+              <w:rPr>
+                <w:i/>
+                <w:iCs/>
+                <w:color w:val="000000" w:themeColor="text1"/>
+              </w:rPr>
+            </w:pPr>
+            <w:r>
+              <w:rPr>
+                <w:i/>
+                <w:iCs/>
+                <w:color w:val="000000" w:themeColor="text1"/>
+                <w:sz w:val="20"/>
+                <w:szCs w:val="20"/>
+              </w:rPr>
+              <w:t>Media</w:t>
+            </w:r>
+          </w:p>
         </w:tc>
         <w:tc>
           <w:tcPr>
@@ -2686,7 +3572,25 @@
               <w:right w:w="120" w:type="dxa"/>
             </w:tcMar>
           </w:tcPr>
-          <w:p/>
+          <w:p>
+            <w:pPr>
+              <w:rPr>
+                <w:i/>
+                <w:iCs/>
+                <w:color w:val="000000" w:themeColor="text1"/>
+              </w:rPr>
+            </w:pPr>
+            <w:r>
+              <w:rPr>
+                <w:i/>
+                <w:iCs/>
+                <w:color w:val="000000" w:themeColor="text1"/>
+                <w:sz w:val="20"/>
+                <w:szCs w:val="20"/>
+              </w:rPr>
+              <w:t>Añadir tests adicionales para las ramas no cubiertas identificadas en el informe HTML</w:t>
+            </w:r>
+          </w:p>
         </w:tc>
       </w:tr>
     </w:tbl>
@@ -19973,6 +20877,119 @@
 <file path=word/numbering.xml><?xml version="1.0" encoding="utf-8"?>
 <w:numbering xmlns:wpc="http://schemas.microsoft.com/office/word/2010/wordprocessingCanvas" xmlns:cx="http://schemas.microsoft.com/office/drawing/2014/chartex" xmlns:cx1="http://schemas.microsoft.com/office/drawing/2015/9/8/chartex" xmlns:cx2="http://schemas.microsoft.com/office/drawing/2015/10/21/chartex" xmlns:cx3="http://schemas.microsoft.com/office/drawing/2016/5/9/chartex" xmlns:cx4="http://schemas.microsoft.com/office/drawing/2016/5/10/chartex" xmlns:cx5="http://schemas.microsoft.com/office/drawing/2016/5/11/chartex" xmlns:cx6="http://schemas.microsoft.com/office/drawing/2016/5/12/chartex" xmlns:cx7="http://schemas.microsoft.com/office/drawing/2016/5/13/chartex" xmlns:cx8="http://schemas.microsoft.com/office/drawing/2016/5/14/chartex" xmlns:mc="http://schemas.openxmlformats.org/markup-compatibility/2006" xmlns:aink="http://schemas.microsoft.com/office/drawing/2016/ink" xmlns:am3d="http://schemas.microsoft.com/office/drawing/2017/model3d" xmlns:o="urn:schemas-microsoft-com:office:office" xmlns:oel="http://schemas.microsoft.com/office/2019/extlst" xmlns:r="http://schemas.openxmlformats.org/officeDocument/2006/relationships" xmlns:m="http://schemas.openxmlformats.org/officeDocument/2006/math" xmlns:v="urn:schemas-microsoft-com:vml" xmlns:wp14="http://schemas.microsoft.com/office/word/2010/wordprocessingDrawing" xmlns:wp="http://schemas.openxmlformats.org/drawingml/2006/wordprocessingDrawing" xmlns:w10="urn:schemas-microsoft-com:office:word" xmlns:w="http://schemas.openxmlformats.org/wordprocessingml/2006/main" xmlns:w14="http://schemas.microsoft.com/office/word/2010/wordml" xmlns:w15="http://schemas.microsoft.com/office/word/2012/wordml" xmlns:w16cex="http://schemas.microsoft.com/office/word/2018/wordml/cex" xmlns:w16cid="http://schemas.microsoft.com/office/word/2016/wordml/cid" xmlns:w16="http://schemas.microsoft.com/office/word/2018/wordml" xmlns:w16du="http://schemas.microsoft.com/office/word/2023/wordml/word16du" xmlns:w16sdtdh="http://schemas.microsoft.com/office/word/2020/wordml/sdtdatahash" xmlns:w16sdtfl="http://schemas.microsoft.com/office/word/2024/wordml/sdtformatlock" xmlns:w16se="http://schemas.microsoft.com/office/word/2015/wordml/symex" xmlns:wpg="http://schemas.microsoft.com/office/word/2010/wordprocessingGroup" xmlns:wpi="http://schemas.microsoft.com/office/word/2010/wordprocessingInk" xmlns:wne="http://schemas.microsoft.com/office/word/2006/wordml" xmlns:wps="http://schemas.microsoft.com/office/word/2010/wordprocessingShape" mc:Ignorable="w14 w15 w16se w16cid w16 w16cex w16sdtdh w16sdtfl w16du wp14">
   <w:abstractNum w:abstractNumId="0" w15:restartNumberingAfterBreak="0">
+    <w:nsid w:val="05884F21"/>
+    <w:multiLevelType w:val="hybridMultilevel"/>
+    <w:tmpl w:val="D4E62D54"/>
+    <w:lvl w:ilvl="0" w:tplc="D5E2BC22">
+      <w:start w:val="5"/>
+      <w:numFmt w:val="bullet"/>
+      <w:lvlText w:val="-"/>
+      <w:lvlJc w:val="left"/>
+      <w:pPr>
+        <w:ind w:left="720" w:hanging="360"/>
+      </w:pPr>
+      <w:rPr>
+        <w:rFonts w:ascii="Arial" w:eastAsia="Arial" w:hAnsi="Arial" w:cs="Arial" w:hint="default"/>
+      </w:rPr>
+    </w:lvl>
+    <w:lvl w:ilvl="1" w:tplc="0C0A0003" w:tentative="1">
+      <w:start w:val="1"/>
+      <w:numFmt w:val="bullet"/>
+      <w:lvlText w:val="o"/>
+      <w:lvlJc w:val="left"/>
+      <w:pPr>
+        <w:ind w:left="1440" w:hanging="360"/>
+      </w:pPr>
+      <w:rPr>
+        <w:rFonts w:ascii="Courier New" w:hAnsi="Courier New" w:cs="Courier New" w:hint="default"/>
+      </w:rPr>
+    </w:lvl>
+    <w:lvl w:ilvl="2" w:tplc="0C0A0005" w:tentative="1">
+      <w:start w:val="1"/>
+      <w:numFmt w:val="bullet"/>
+      <w:lvlText w:val=""/>
+      <w:lvlJc w:val="left"/>
+      <w:pPr>
+        <w:ind w:left="2160" w:hanging="360"/>
+      </w:pPr>
+      <w:rPr>
+        <w:rFonts w:ascii="Wingdings" w:hAnsi="Wingdings" w:hint="default"/>
+      </w:rPr>
+    </w:lvl>
+    <w:lvl w:ilvl="3" w:tplc="0C0A0001" w:tentative="1">
+      <w:start w:val="1"/>
+      <w:numFmt w:val="bullet"/>
+      <w:lvlText w:val=""/>
+      <w:lvlJc w:val="left"/>
+      <w:pPr>
+        <w:ind w:left="2880" w:hanging="360"/>
+      </w:pPr>
+      <w:rPr>
+        <w:rFonts w:ascii="Symbol" w:hAnsi="Symbol" w:hint="default"/>
+      </w:rPr>
+    </w:lvl>
+    <w:lvl w:ilvl="4" w:tplc="0C0A0003" w:tentative="1">
+      <w:start w:val="1"/>
+      <w:numFmt w:val="bullet"/>
+      <w:lvlText w:val="o"/>
+      <w:lvlJc w:val="left"/>
+      <w:pPr>
+        <w:ind w:left="3600" w:hanging="360"/>
+      </w:pPr>
+      <w:rPr>
+        <w:rFonts w:ascii="Courier New" w:hAnsi="Courier New" w:cs="Courier New" w:hint="default"/>
+      </w:rPr>
+    </w:lvl>
+    <w:lvl w:ilvl="5" w:tplc="0C0A0005" w:tentative="1">
+      <w:start w:val="1"/>
+      <w:numFmt w:val="bullet"/>
+      <w:lvlText w:val=""/>
+      <w:lvlJc w:val="left"/>
+      <w:pPr>
+        <w:ind w:left="4320" w:hanging="360"/>
+      </w:pPr>
+      <w:rPr>
+        <w:rFonts w:ascii="Wingdings" w:hAnsi="Wingdings" w:hint="default"/>
+      </w:rPr>
+    </w:lvl>
+    <w:lvl w:ilvl="6" w:tplc="0C0A0001" w:tentative="1">
+      <w:start w:val="1"/>
+      <w:numFmt w:val="bullet"/>
+      <w:lvlText w:val=""/>
+      <w:lvlJc w:val="left"/>
+      <w:pPr>
+        <w:ind w:left="5040" w:hanging="360"/>
+      </w:pPr>
+      <w:rPr>
+        <w:rFonts w:ascii="Symbol" w:hAnsi="Symbol" w:hint="default"/>
+      </w:rPr>
+    </w:lvl>
+    <w:lvl w:ilvl="7" w:tplc="0C0A0003" w:tentative="1">
+      <w:start w:val="1"/>
+      <w:numFmt w:val="bullet"/>
+      <w:lvlText w:val="o"/>
+      <w:lvlJc w:val="left"/>
+      <w:pPr>
+        <w:ind w:left="5760" w:hanging="360"/>
+      </w:pPr>
+      <w:rPr>
+        <w:rFonts w:ascii="Courier New" w:hAnsi="Courier New" w:cs="Courier New" w:hint="default"/>
+      </w:rPr>
+    </w:lvl>
+    <w:lvl w:ilvl="8" w:tplc="0C0A0005" w:tentative="1">
+      <w:start w:val="1"/>
+      <w:numFmt w:val="bullet"/>
+      <w:lvlText w:val=""/>
+      <w:lvlJc w:val="left"/>
+      <w:pPr>
+        <w:ind w:left="6480" w:hanging="360"/>
+      </w:pPr>
+      <w:rPr>
+        <w:rFonts w:ascii="Wingdings" w:hAnsi="Wingdings" w:hint="default"/>
+      </w:rPr>
+    </w:lvl>
+  </w:abstractNum>
+  <w:abstractNum w:abstractNumId="1" w15:restartNumberingAfterBreak="0">
     <w:nsid w:val="09FF1D70"/>
     <w:multiLevelType w:val="hybridMultilevel"/>
     <w:tmpl w:val="24EA664E"/>
@@ -20058,7 +21075,7 @@
       </w:pPr>
     </w:lvl>
   </w:abstractNum>
-  <w:abstractNum w:abstractNumId="1" w15:restartNumberingAfterBreak="0">
+  <w:abstractNum w:abstractNumId="2" w15:restartNumberingAfterBreak="0">
     <w:nsid w:val="101F1A97"/>
     <w:multiLevelType w:val="hybridMultilevel"/>
     <w:tmpl w:val="A53204A6"/>
@@ -20112,7 +21129,7 @@
       <w:lvlJc w:val="left"/>
     </w:lvl>
   </w:abstractNum>
-  <w:abstractNum w:abstractNumId="2" w15:restartNumberingAfterBreak="0">
+  <w:abstractNum w:abstractNumId="3" w15:restartNumberingAfterBreak="0">
     <w:nsid w:val="51A32144"/>
     <w:multiLevelType w:val="hybridMultilevel"/>
     <w:tmpl w:val="C512BA34"/>
@@ -20166,11 +21183,246 @@
       <w:lvlJc w:val="left"/>
     </w:lvl>
   </w:abstractNum>
+  <w:abstractNum w:abstractNumId="4" w15:restartNumberingAfterBreak="0">
+    <w:nsid w:val="55F0206C"/>
+    <w:multiLevelType w:val="hybridMultilevel"/>
+    <w:tmpl w:val="0B2E3C5C"/>
+    <w:lvl w:ilvl="0" w:tplc="BBE6F134">
+      <w:start w:val="5"/>
+      <w:numFmt w:val="bullet"/>
+      <w:lvlText w:val="-"/>
+      <w:lvlJc w:val="left"/>
+      <w:pPr>
+        <w:ind w:left="720" w:hanging="360"/>
+      </w:pPr>
+      <w:rPr>
+        <w:rFonts w:ascii="Arial" w:eastAsia="Arial" w:hAnsi="Arial" w:cs="Arial" w:hint="default"/>
+      </w:rPr>
+    </w:lvl>
+    <w:lvl w:ilvl="1" w:tplc="0C0A0003" w:tentative="1">
+      <w:start w:val="1"/>
+      <w:numFmt w:val="bullet"/>
+      <w:lvlText w:val="o"/>
+      <w:lvlJc w:val="left"/>
+      <w:pPr>
+        <w:ind w:left="1440" w:hanging="360"/>
+      </w:pPr>
+      <w:rPr>
+        <w:rFonts w:ascii="Courier New" w:hAnsi="Courier New" w:cs="Courier New" w:hint="default"/>
+      </w:rPr>
+    </w:lvl>
+    <w:lvl w:ilvl="2" w:tplc="0C0A0005" w:tentative="1">
+      <w:start w:val="1"/>
+      <w:numFmt w:val="bullet"/>
+      <w:lvlText w:val=""/>
+      <w:lvlJc w:val="left"/>
+      <w:pPr>
+        <w:ind w:left="2160" w:hanging="360"/>
+      </w:pPr>
+      <w:rPr>
+        <w:rFonts w:ascii="Wingdings" w:hAnsi="Wingdings" w:hint="default"/>
+      </w:rPr>
+    </w:lvl>
+    <w:lvl w:ilvl="3" w:tplc="0C0A0001" w:tentative="1">
+      <w:start w:val="1"/>
+      <w:numFmt w:val="bullet"/>
+      <w:lvlText w:val=""/>
+      <w:lvlJc w:val="left"/>
+      <w:pPr>
+        <w:ind w:left="2880" w:hanging="360"/>
+      </w:pPr>
+      <w:rPr>
+        <w:rFonts w:ascii="Symbol" w:hAnsi="Symbol" w:hint="default"/>
+      </w:rPr>
+    </w:lvl>
+    <w:lvl w:ilvl="4" w:tplc="0C0A0003" w:tentative="1">
+      <w:start w:val="1"/>
+      <w:numFmt w:val="bullet"/>
+      <w:lvlText w:val="o"/>
+      <w:lvlJc w:val="left"/>
+      <w:pPr>
+        <w:ind w:left="3600" w:hanging="360"/>
+      </w:pPr>
+      <w:rPr>
+        <w:rFonts w:ascii="Courier New" w:hAnsi="Courier New" w:cs="Courier New" w:hint="default"/>
+      </w:rPr>
+    </w:lvl>
+    <w:lvl w:ilvl="5" w:tplc="0C0A0005" w:tentative="1">
+      <w:start w:val="1"/>
+      <w:numFmt w:val="bullet"/>
+      <w:lvlText w:val=""/>
+      <w:lvlJc w:val="left"/>
+      <w:pPr>
+        <w:ind w:left="4320" w:hanging="360"/>
+      </w:pPr>
+      <w:rPr>
+        <w:rFonts w:ascii="Wingdings" w:hAnsi="Wingdings" w:hint="default"/>
+      </w:rPr>
+    </w:lvl>
+    <w:lvl w:ilvl="6" w:tplc="0C0A0001" w:tentative="1">
+      <w:start w:val="1"/>
+      <w:numFmt w:val="bullet"/>
+      <w:lvlText w:val=""/>
+      <w:lvlJc w:val="left"/>
+      <w:pPr>
+        <w:ind w:left="5040" w:hanging="360"/>
+      </w:pPr>
+      <w:rPr>
+        <w:rFonts w:ascii="Symbol" w:hAnsi="Symbol" w:hint="default"/>
+      </w:rPr>
+    </w:lvl>
+    <w:lvl w:ilvl="7" w:tplc="0C0A0003" w:tentative="1">
+      <w:start w:val="1"/>
+      <w:numFmt w:val="bullet"/>
+      <w:lvlText w:val="o"/>
+      <w:lvlJc w:val="left"/>
+      <w:pPr>
+        <w:ind w:left="5760" w:hanging="360"/>
+      </w:pPr>
+      <w:rPr>
+        <w:rFonts w:ascii="Courier New" w:hAnsi="Courier New" w:cs="Courier New" w:hint="default"/>
+      </w:rPr>
+    </w:lvl>
+    <w:lvl w:ilvl="8" w:tplc="0C0A0005" w:tentative="1">
+      <w:start w:val="1"/>
+      <w:numFmt w:val="bullet"/>
+      <w:lvlText w:val=""/>
+      <w:lvlJc w:val="left"/>
+      <w:pPr>
+        <w:ind w:left="6480" w:hanging="360"/>
+      </w:pPr>
+      <w:rPr>
+        <w:rFonts w:ascii="Wingdings" w:hAnsi="Wingdings" w:hint="default"/>
+      </w:rPr>
+    </w:lvl>
+  </w:abstractNum>
+  <w:abstractNum w:abstractNumId="5" w15:restartNumberingAfterBreak="0">
+    <w:nsid w:val="6E297012"/>
+    <w:multiLevelType w:val="hybridMultilevel"/>
+    <w:tmpl w:val="F02C5696"/>
+    <w:lvl w:ilvl="0" w:tplc="733AD2D0">
+      <w:start w:val="18"/>
+      <w:numFmt w:val="bullet"/>
+      <w:lvlText w:val=""/>
+      <w:lvlJc w:val="left"/>
+      <w:pPr>
+        <w:ind w:left="420" w:hanging="360"/>
+      </w:pPr>
+      <w:rPr>
+        <w:rFonts w:ascii="Wingdings" w:eastAsia="Arial" w:hAnsi="Wingdings" w:cs="Arial" w:hint="default"/>
+      </w:rPr>
+    </w:lvl>
+    <w:lvl w:ilvl="1" w:tplc="0C0A0003" w:tentative="1">
+      <w:start w:val="1"/>
+      <w:numFmt w:val="bullet"/>
+      <w:lvlText w:val="o"/>
+      <w:lvlJc w:val="left"/>
+      <w:pPr>
+        <w:ind w:left="1140" w:hanging="360"/>
+      </w:pPr>
+      <w:rPr>
+        <w:rFonts w:ascii="Courier New" w:hAnsi="Courier New" w:cs="Courier New" w:hint="default"/>
+      </w:rPr>
+    </w:lvl>
+    <w:lvl w:ilvl="2" w:tplc="0C0A0005" w:tentative="1">
+      <w:start w:val="1"/>
+      <w:numFmt w:val="bullet"/>
+      <w:lvlText w:val=""/>
+      <w:lvlJc w:val="left"/>
+      <w:pPr>
+        <w:ind w:left="1860" w:hanging="360"/>
+      </w:pPr>
+      <w:rPr>
+        <w:rFonts w:ascii="Wingdings" w:hAnsi="Wingdings" w:hint="default"/>
+      </w:rPr>
+    </w:lvl>
+    <w:lvl w:ilvl="3" w:tplc="0C0A0001" w:tentative="1">
+      <w:start w:val="1"/>
+      <w:numFmt w:val="bullet"/>
+      <w:lvlText w:val=""/>
+      <w:lvlJc w:val="left"/>
+      <w:pPr>
+        <w:ind w:left="2580" w:hanging="360"/>
+      </w:pPr>
+      <w:rPr>
+        <w:rFonts w:ascii="Symbol" w:hAnsi="Symbol" w:hint="default"/>
+      </w:rPr>
+    </w:lvl>
+    <w:lvl w:ilvl="4" w:tplc="0C0A0003" w:tentative="1">
+      <w:start w:val="1"/>
+      <w:numFmt w:val="bullet"/>
+      <w:lvlText w:val="o"/>
+      <w:lvlJc w:val="left"/>
+      <w:pPr>
+        <w:ind w:left="3300" w:hanging="360"/>
+      </w:pPr>
+      <w:rPr>
+        <w:rFonts w:ascii="Courier New" w:hAnsi="Courier New" w:cs="Courier New" w:hint="default"/>
+      </w:rPr>
+    </w:lvl>
+    <w:lvl w:ilvl="5" w:tplc="0C0A0005" w:tentative="1">
+      <w:start w:val="1"/>
+      <w:numFmt w:val="bullet"/>
+      <w:lvlText w:val=""/>
+      <w:lvlJc w:val="left"/>
+      <w:pPr>
+        <w:ind w:left="4020" w:hanging="360"/>
+      </w:pPr>
+      <w:rPr>
+        <w:rFonts w:ascii="Wingdings" w:hAnsi="Wingdings" w:hint="default"/>
+      </w:rPr>
+    </w:lvl>
+    <w:lvl w:ilvl="6" w:tplc="0C0A0001" w:tentative="1">
+      <w:start w:val="1"/>
+      <w:numFmt w:val="bullet"/>
+      <w:lvlText w:val=""/>
+      <w:lvlJc w:val="left"/>
+      <w:pPr>
+        <w:ind w:left="4740" w:hanging="360"/>
+      </w:pPr>
+      <w:rPr>
+        <w:rFonts w:ascii="Symbol" w:hAnsi="Symbol" w:hint="default"/>
+      </w:rPr>
+    </w:lvl>
+    <w:lvl w:ilvl="7" w:tplc="0C0A0003" w:tentative="1">
+      <w:start w:val="1"/>
+      <w:numFmt w:val="bullet"/>
+      <w:lvlText w:val="o"/>
+      <w:lvlJc w:val="left"/>
+      <w:pPr>
+        <w:ind w:left="5460" w:hanging="360"/>
+      </w:pPr>
+      <w:rPr>
+        <w:rFonts w:ascii="Courier New" w:hAnsi="Courier New" w:cs="Courier New" w:hint="default"/>
+      </w:rPr>
+    </w:lvl>
+    <w:lvl w:ilvl="8" w:tplc="0C0A0005" w:tentative="1">
+      <w:start w:val="1"/>
+      <w:numFmt w:val="bullet"/>
+      <w:lvlText w:val=""/>
+      <w:lvlJc w:val="left"/>
+      <w:pPr>
+        <w:ind w:left="6180" w:hanging="360"/>
+      </w:pPr>
+      <w:rPr>
+        <w:rFonts w:ascii="Wingdings" w:hAnsi="Wingdings" w:hint="default"/>
+      </w:rPr>
+    </w:lvl>
+  </w:abstractNum>
   <w:num w:numId="1" w16cid:durableId="1960796458">
-    <w:abstractNumId w:val="0"/>
+    <w:abstractNumId w:val="1"/>
     <w:lvlOverride w:ilvl="0">
       <w:startOverride w:val="1"/>
     </w:lvlOverride>
+  </w:num>
+  <w:num w:numId="2" w16cid:durableId="2030181930">
+    <w:abstractNumId w:val="0"/>
+  </w:num>
+  <w:num w:numId="3" w16cid:durableId="258030361">
+    <w:abstractNumId w:val="4"/>
+  </w:num>
+  <w:num w:numId="4" w16cid:durableId="57826324">
+    <w:abstractNumId w:val="5"/>
   </w:num>
 </w:numbering>
 </file>
@@ -20662,7 +21914,6 @@
   <w:style w:type="character" w:default="1" w:styleId="Fuentedeprrafopredeter">
     <w:name w:val="Default Paragraph Font"/>
     <w:uiPriority w:val="1"/>
-    <w:semiHidden/>
     <w:unhideWhenUsed/>
   </w:style>
   <w:style w:type="table" w:default="1" w:styleId="Tablanormal">

</xml_diff>

<commit_message>
docs: añadir TC-009 a TC-012 y fila de contraseña en Parte 2 del informe
</commit_message>
<xml_diff>
--- a/plantilla_iso29119.docx
+++ b/plantilla_iso29119.docx
@@ -4810,6 +4810,24 @@
               </w:rPr>
               <w:t xml:space="preserve"> </w:t>
             </w:r>
+            <w:r>
+              <w:rPr>
+                <w:color w:val="000000" w:themeColor="text1"/>
+                <w:sz w:val="20"/>
+                <w:szCs w:val="20"/>
+                <w:lang w:val="pt-PT"/>
+              </w:rPr>
+              <w:t>valida</w:t>
+            </w:r>
+            <w:r>
+              <w:rPr>
+                <w:color w:val="000000" w:themeColor="text1"/>
+                <w:sz w:val="20"/>
+                <w:szCs w:val="20"/>
+                <w:lang w:val="pt-PT"/>
+              </w:rPr>
+              <w:t>rPassword(pass)</w:t>
+            </w:r>
           </w:p>
         </w:tc>
         <w:tc>
@@ -4844,6 +4862,15 @@
               </w:rPr>
               <w:t xml:space="preserve"> </w:t>
             </w:r>
+            <w:r>
+              <w:rPr>
+                <w:color w:val="000000" w:themeColor="text1"/>
+                <w:sz w:val="20"/>
+                <w:szCs w:val="20"/>
+                <w:lang w:val="pt-PT"/>
+              </w:rPr>
+              <w:t>"Abcdefg1" (8 chars, 1 num) → true</w:t>
+            </w:r>
           </w:p>
         </w:tc>
         <w:tc>
@@ -4878,6 +4905,15 @@
               </w:rPr>
               <w:t xml:space="preserve"> </w:t>
             </w:r>
+            <w:r>
+              <w:rPr>
+                <w:color w:val="000000" w:themeColor="text1"/>
+                <w:sz w:val="20"/>
+                <w:szCs w:val="20"/>
+                <w:lang w:val="pt-PT"/>
+              </w:rPr>
+              <w:t>"Abcdefgh" (sin número) → false "Abc1" (menos de 8) → false</w:t>
+            </w:r>
           </w:p>
         </w:tc>
         <w:tc>
@@ -4900,6 +4936,8 @@
             <w:pPr>
               <w:rPr>
                 <w:color w:val="000000" w:themeColor="text1"/>
+                <w:sz w:val="20"/>
+                <w:szCs w:val="20"/>
                 <w:lang w:val="pt-PT"/>
               </w:rPr>
             </w:pPr>
@@ -4911,6 +4949,51 @@
                 <w:lang w:val="pt-PT"/>
               </w:rPr>
               <w:t xml:space="preserve"> </w:t>
+            </w:r>
+            <w:r>
+              <w:rPr>
+                <w:color w:val="000000" w:themeColor="text1"/>
+                <w:sz w:val="20"/>
+                <w:szCs w:val="20"/>
+                <w:lang w:val="pt-PT"/>
+              </w:rPr>
+              <w:t xml:space="preserve">null → false </w:t>
+            </w:r>
+          </w:p>
+          <w:p>
+            <w:pPr>
+              <w:rPr>
+                <w:color w:val="000000" w:themeColor="text1"/>
+                <w:sz w:val="20"/>
+                <w:szCs w:val="20"/>
+                <w:lang w:val="pt-PT"/>
+              </w:rPr>
+            </w:pPr>
+            <w:r>
+              <w:rPr>
+                <w:color w:val="000000" w:themeColor="text1"/>
+                <w:sz w:val="20"/>
+                <w:szCs w:val="20"/>
+                <w:lang w:val="pt-PT"/>
+              </w:rPr>
+              <w:t xml:space="preserve">7 chars con número → false </w:t>
+            </w:r>
+          </w:p>
+          <w:p>
+            <w:pPr>
+              <w:rPr>
+                <w:color w:val="000000" w:themeColor="text1"/>
+                <w:lang w:val="pt-PT"/>
+              </w:rPr>
+            </w:pPr>
+            <w:r>
+              <w:rPr>
+                <w:color w:val="000000" w:themeColor="text1"/>
+                <w:sz w:val="20"/>
+                <w:szCs w:val="20"/>
+                <w:lang w:val="pt-PT"/>
+              </w:rPr>
+              <w:t>8 chars exactos con número → true</w:t>
             </w:r>
           </w:p>
         </w:tc>
@@ -12196,11 +12279,11 @@
       <w:tr>
         <w:trPr>
           <w:gridAfter w:val="1"/>
-          <w:wAfter w:w="6638" w:type="dxa"/>
+          <w:wAfter w:w="4190" w:type="dxa"/>
         </w:trPr>
         <w:tc>
           <w:tcPr>
-            <w:tcW w:w="9638" w:type="dxa"/>
+            <w:tcW w:w="5448" w:type="dxa"/>
             <w:tcBorders>
               <w:top w:val="single" w:sz="1" w:space="0" w:color="CCCCCC"/>
               <w:left w:val="single" w:sz="1" w:space="0" w:color="CCCCCC"/>
@@ -12230,7 +12313,7 @@
       <w:tr>
         <w:tc>
           <w:tcPr>
-            <w:tcW w:w="3000" w:type="dxa"/>
+            <w:tcW w:w="5448" w:type="dxa"/>
             <w:tcBorders>
               <w:top w:val="single" w:sz="1" w:space="0" w:color="CCCCCC"/>
               <w:left w:val="single" w:sz="1" w:space="0" w:color="CCCCCC"/>
@@ -12260,39 +12343,52 @@
         </w:tc>
         <w:tc>
           <w:tcPr>
-            <w:tcW w:w="6638" w:type="dxa"/>
-            <w:tcBorders>
-              <w:top w:val="single" w:sz="1" w:space="0" w:color="CCCCCC"/>
-              <w:left w:val="single" w:sz="1" w:space="0" w:color="CCCCCC"/>
-              <w:bottom w:val="single" w:sz="1" w:space="0" w:color="CCCCCC"/>
-              <w:right w:val="single" w:sz="1" w:space="0" w:color="CCCCCC"/>
-            </w:tcBorders>
-            <w:shd w:val="clear" w:color="auto" w:fill="FFFFFF"/>
-            <w:tcMar>
-              <w:top w:w="80" w:type="dxa"/>
-              <w:left w:w="120" w:type="dxa"/>
-              <w:bottom w:w="80" w:type="dxa"/>
-              <w:right w:w="120" w:type="dxa"/>
-            </w:tcMar>
-          </w:tcPr>
-          <w:p>
-            <w:r>
-              <w:rPr>
-                <w:i/>
-                <w:iCs/>
-                <w:color w:val="AAAAAA"/>
-                <w:sz w:val="20"/>
-                <w:szCs w:val="20"/>
-              </w:rPr>
-              <w:t>TC-009</w:t>
-            </w:r>
-          </w:p>
-        </w:tc>
-      </w:tr>
-      <w:tr>
-        <w:tc>
-          <w:tcPr>
-            <w:tcW w:w="3000" w:type="dxa"/>
+            <w:tcW w:w="4190" w:type="dxa"/>
+            <w:tcBorders>
+              <w:top w:val="single" w:sz="2" w:space="0" w:color="CCCCCC"/>
+              <w:left w:val="single" w:sz="2" w:space="0" w:color="CCCCCC"/>
+              <w:bottom w:val="single" w:sz="2" w:space="0" w:color="CCCCCC"/>
+              <w:right w:val="single" w:sz="2" w:space="0" w:color="CCCCCC"/>
+            </w:tcBorders>
+            <w:tcMar>
+              <w:top w:w="80" w:type="dxa"/>
+              <w:left w:w="120" w:type="dxa"/>
+              <w:bottom w:w="80" w:type="dxa"/>
+              <w:right w:w="120" w:type="dxa"/>
+            </w:tcMar>
+            <w:vAlign w:val="center"/>
+          </w:tcPr>
+          <w:p>
+            <w:pPr>
+              <w:rPr>
+                <w:color w:val="000000" w:themeColor="text1"/>
+                <w:sz w:val="20"/>
+                <w:szCs w:val="20"/>
+              </w:rPr>
+            </w:pPr>
+            <w:r>
+              <w:rPr>
+                <w:color w:val="000000" w:themeColor="text1"/>
+                <w:sz w:val="20"/>
+                <w:szCs w:val="20"/>
+              </w:rPr>
+              <w:t>TC-00</w:t>
+            </w:r>
+            <w:r>
+              <w:rPr>
+                <w:color w:val="000000" w:themeColor="text1"/>
+                <w:sz w:val="20"/>
+                <w:szCs w:val="20"/>
+              </w:rPr>
+              <w:t>9</w:t>
+            </w:r>
+          </w:p>
+        </w:tc>
+      </w:tr>
+      <w:tr>
+        <w:tc>
+          <w:tcPr>
+            <w:tcW w:w="5448" w:type="dxa"/>
             <w:tcBorders>
               <w:top w:val="single" w:sz="1" w:space="0" w:color="CCCCCC"/>
               <w:left w:val="single" w:sz="1" w:space="0" w:color="CCCCCC"/>
@@ -12322,39 +12418,44 @@
         </w:tc>
         <w:tc>
           <w:tcPr>
-            <w:tcW w:w="6638" w:type="dxa"/>
-            <w:tcBorders>
-              <w:top w:val="single" w:sz="1" w:space="0" w:color="CCCCCC"/>
-              <w:left w:val="single" w:sz="1" w:space="0" w:color="CCCCCC"/>
-              <w:bottom w:val="single" w:sz="1" w:space="0" w:color="CCCCCC"/>
-              <w:right w:val="single" w:sz="1" w:space="0" w:color="CCCCCC"/>
-            </w:tcBorders>
-            <w:shd w:val="clear" w:color="auto" w:fill="FFFFFF"/>
-            <w:tcMar>
-              <w:top w:w="80" w:type="dxa"/>
-              <w:left w:w="120" w:type="dxa"/>
-              <w:bottom w:w="80" w:type="dxa"/>
-              <w:right w:w="120" w:type="dxa"/>
-            </w:tcMar>
-          </w:tcPr>
-          <w:p>
-            <w:r>
-              <w:rPr>
-                <w:i/>
-                <w:iCs/>
-                <w:color w:val="AAAAAA"/>
-                <w:sz w:val="20"/>
-                <w:szCs w:val="20"/>
-              </w:rPr>
-              <w:t>Describid brevemente qué comprueba este test</w:t>
-            </w:r>
-          </w:p>
-        </w:tc>
-      </w:tr>
-      <w:tr>
-        <w:tc>
-          <w:tcPr>
-            <w:tcW w:w="3000" w:type="dxa"/>
+            <w:tcW w:w="4190" w:type="dxa"/>
+            <w:tcBorders>
+              <w:top w:val="single" w:sz="2" w:space="0" w:color="CCCCCC"/>
+              <w:left w:val="single" w:sz="2" w:space="0" w:color="CCCCCC"/>
+              <w:bottom w:val="single" w:sz="2" w:space="0" w:color="CCCCCC"/>
+              <w:right w:val="single" w:sz="2" w:space="0" w:color="CCCCCC"/>
+            </w:tcBorders>
+            <w:tcMar>
+              <w:top w:w="80" w:type="dxa"/>
+              <w:left w:w="120" w:type="dxa"/>
+              <w:bottom w:w="80" w:type="dxa"/>
+              <w:right w:w="120" w:type="dxa"/>
+            </w:tcMar>
+            <w:vAlign w:val="center"/>
+          </w:tcPr>
+          <w:p>
+            <w:pPr>
+              <w:rPr>
+                <w:color w:val="000000" w:themeColor="text1"/>
+                <w:sz w:val="20"/>
+                <w:szCs w:val="20"/>
+              </w:rPr>
+            </w:pPr>
+            <w:r>
+              <w:rPr>
+                <w:color w:val="000000" w:themeColor="text1"/>
+                <w:sz w:val="20"/>
+                <w:szCs w:val="20"/>
+              </w:rPr>
+              <w:t>Contraseña con 8 caracteres y un número debe devolver true</w:t>
+            </w:r>
+          </w:p>
+        </w:tc>
+      </w:tr>
+      <w:tr>
+        <w:tc>
+          <w:tcPr>
+            <w:tcW w:w="5448" w:type="dxa"/>
             <w:tcBorders>
               <w:top w:val="single" w:sz="1" w:space="0" w:color="CCCCCC"/>
               <w:left w:val="single" w:sz="1" w:space="0" w:color="CCCCCC"/>
@@ -12384,73 +12485,206 @@
         </w:tc>
         <w:tc>
           <w:tcPr>
-            <w:tcW w:w="6638" w:type="dxa"/>
-            <w:tcBorders>
-              <w:top w:val="single" w:sz="1" w:space="0" w:color="CCCCCC"/>
-              <w:left w:val="single" w:sz="1" w:space="0" w:color="CCCCCC"/>
-              <w:bottom w:val="single" w:sz="1" w:space="0" w:color="CCCCCC"/>
-              <w:right w:val="single" w:sz="1" w:space="0" w:color="CCCCCC"/>
-            </w:tcBorders>
-            <w:shd w:val="clear" w:color="auto" w:fill="FFFFFF"/>
-            <w:tcMar>
-              <w:top w:w="80" w:type="dxa"/>
-              <w:left w:w="120" w:type="dxa"/>
-              <w:bottom w:w="80" w:type="dxa"/>
-              <w:right w:w="120" w:type="dxa"/>
-            </w:tcMar>
-          </w:tcPr>
-          <w:p>
+            <w:tcW w:w="4190" w:type="dxa"/>
+            <w:tcBorders>
+              <w:top w:val="single" w:sz="2" w:space="0" w:color="CCCCCC"/>
+              <w:left w:val="single" w:sz="2" w:space="0" w:color="CCCCCC"/>
+              <w:bottom w:val="single" w:sz="2" w:space="0" w:color="CCCCCC"/>
+              <w:right w:val="single" w:sz="2" w:space="0" w:color="CCCCCC"/>
+            </w:tcBorders>
+            <w:tcMar>
+              <w:top w:w="80" w:type="dxa"/>
+              <w:left w:w="120" w:type="dxa"/>
+              <w:bottom w:w="80" w:type="dxa"/>
+              <w:right w:w="120" w:type="dxa"/>
+            </w:tcMar>
+            <w:vAlign w:val="center"/>
+          </w:tcPr>
+          <w:p>
+            <w:pPr>
+              <w:rPr>
+                <w:color w:val="000000" w:themeColor="text1"/>
+                <w:sz w:val="20"/>
+                <w:szCs w:val="20"/>
+              </w:rPr>
+            </w:pPr>
             <w:proofErr w:type="spellStart"/>
             <w:r>
               <w:rPr>
-                <w:i/>
-                <w:iCs/>
-                <w:color w:val="AAAAAA"/>
-                <w:sz w:val="20"/>
-                <w:szCs w:val="20"/>
-              </w:rPr>
-              <w:t>Ej</w:t>
+                <w:color w:val="000000" w:themeColor="text1"/>
+                <w:sz w:val="20"/>
+                <w:szCs w:val="20"/>
+              </w:rPr>
+              <w:t>ValidadorFormulario.validarPassword</w:t>
             </w:r>
             <w:proofErr w:type="spellEnd"/>
             <w:r>
               <w:rPr>
-                <w:i/>
-                <w:iCs/>
-                <w:color w:val="AAAAAA"/>
-                <w:sz w:val="20"/>
-                <w:szCs w:val="20"/>
-              </w:rPr>
-              <w:t xml:space="preserve">: </w:t>
+                <w:color w:val="000000" w:themeColor="text1"/>
+                <w:sz w:val="20"/>
+                <w:szCs w:val="20"/>
+              </w:rPr>
+              <w:t>()</w:t>
+            </w:r>
+          </w:p>
+        </w:tc>
+      </w:tr>
+      <w:tr>
+        <w:tc>
+          <w:tcPr>
+            <w:tcW w:w="5448" w:type="dxa"/>
+            <w:tcBorders>
+              <w:top w:val="single" w:sz="1" w:space="0" w:color="CCCCCC"/>
+              <w:left w:val="single" w:sz="1" w:space="0" w:color="CCCCCC"/>
+              <w:bottom w:val="single" w:sz="1" w:space="0" w:color="CCCCCC"/>
+              <w:right w:val="single" w:sz="1" w:space="0" w:color="CCCCCC"/>
+            </w:tcBorders>
+            <w:shd w:val="clear" w:color="auto" w:fill="D6E4F0"/>
+            <w:tcMar>
+              <w:top w:w="80" w:type="dxa"/>
+              <w:left w:w="120" w:type="dxa"/>
+              <w:bottom w:w="80" w:type="dxa"/>
+              <w:right w:w="120" w:type="dxa"/>
+            </w:tcMar>
+          </w:tcPr>
+          <w:p>
+            <w:r>
+              <w:rPr>
+                <w:b/>
+                <w:bCs/>
+                <w:color w:val="1A1A2E"/>
+                <w:sz w:val="20"/>
+                <w:szCs w:val="20"/>
+              </w:rPr>
+              <w:t>Técnica de diseño</w:t>
+            </w:r>
+          </w:p>
+        </w:tc>
+        <w:tc>
+          <w:tcPr>
+            <w:tcW w:w="4190" w:type="dxa"/>
+            <w:tcBorders>
+              <w:top w:val="single" w:sz="2" w:space="0" w:color="CCCCCC"/>
+              <w:left w:val="single" w:sz="2" w:space="0" w:color="CCCCCC"/>
+              <w:bottom w:val="single" w:sz="2" w:space="0" w:color="CCCCCC"/>
+              <w:right w:val="single" w:sz="2" w:space="0" w:color="CCCCCC"/>
+            </w:tcBorders>
+            <w:tcMar>
+              <w:top w:w="80" w:type="dxa"/>
+              <w:left w:w="120" w:type="dxa"/>
+              <w:bottom w:w="80" w:type="dxa"/>
+              <w:right w:w="120" w:type="dxa"/>
+            </w:tcMar>
+            <w:vAlign w:val="center"/>
+          </w:tcPr>
+          <w:p>
+            <w:pPr>
+              <w:rPr>
+                <w:color w:val="000000" w:themeColor="text1"/>
+                <w:sz w:val="20"/>
+                <w:szCs w:val="20"/>
+              </w:rPr>
+            </w:pPr>
+            <w:r>
+              <w:rPr>
+                <w:color w:val="000000" w:themeColor="text1"/>
+                <w:sz w:val="20"/>
+                <w:szCs w:val="20"/>
+              </w:rPr>
+              <w:t>Caja Negra – Partición válida</w:t>
+            </w:r>
+          </w:p>
+        </w:tc>
+      </w:tr>
+      <w:tr>
+        <w:tc>
+          <w:tcPr>
+            <w:tcW w:w="5448" w:type="dxa"/>
+            <w:tcBorders>
+              <w:top w:val="single" w:sz="1" w:space="0" w:color="CCCCCC"/>
+              <w:left w:val="single" w:sz="1" w:space="0" w:color="CCCCCC"/>
+              <w:bottom w:val="single" w:sz="1" w:space="0" w:color="CCCCCC"/>
+              <w:right w:val="single" w:sz="1" w:space="0" w:color="CCCCCC"/>
+            </w:tcBorders>
+            <w:shd w:val="clear" w:color="auto" w:fill="D6E4F0"/>
+            <w:tcMar>
+              <w:top w:w="80" w:type="dxa"/>
+              <w:left w:w="120" w:type="dxa"/>
+              <w:bottom w:w="80" w:type="dxa"/>
+              <w:right w:w="120" w:type="dxa"/>
+            </w:tcMar>
+          </w:tcPr>
+          <w:p>
+            <w:r>
+              <w:rPr>
+                <w:b/>
+                <w:bCs/>
+                <w:color w:val="1A1A2E"/>
+                <w:sz w:val="20"/>
+                <w:szCs w:val="20"/>
+              </w:rPr>
+              <w:t>Precondiciones</w:t>
+            </w:r>
+          </w:p>
+        </w:tc>
+        <w:tc>
+          <w:tcPr>
+            <w:tcW w:w="4190" w:type="dxa"/>
+            <w:tcBorders>
+              <w:top w:val="single" w:sz="2" w:space="0" w:color="CCCCCC"/>
+              <w:left w:val="single" w:sz="2" w:space="0" w:color="CCCCCC"/>
+              <w:bottom w:val="single" w:sz="2" w:space="0" w:color="CCCCCC"/>
+              <w:right w:val="single" w:sz="2" w:space="0" w:color="CCCCCC"/>
+            </w:tcBorders>
+            <w:tcMar>
+              <w:top w:w="80" w:type="dxa"/>
+              <w:left w:w="120" w:type="dxa"/>
+              <w:bottom w:w="80" w:type="dxa"/>
+              <w:right w:w="120" w:type="dxa"/>
+            </w:tcMar>
+            <w:vAlign w:val="center"/>
+          </w:tcPr>
+          <w:p>
+            <w:pPr>
+              <w:rPr>
+                <w:color w:val="000000" w:themeColor="text1"/>
+                <w:sz w:val="20"/>
+                <w:szCs w:val="20"/>
+              </w:rPr>
+            </w:pPr>
+            <w:r>
+              <w:rPr>
+                <w:color w:val="000000" w:themeColor="text1"/>
+                <w:sz w:val="20"/>
+                <w:szCs w:val="20"/>
+              </w:rPr>
+              <w:t xml:space="preserve">Instancia de </w:t>
             </w:r>
             <w:proofErr w:type="spellStart"/>
             <w:r>
               <w:rPr>
-                <w:i/>
-                <w:iCs/>
-                <w:color w:val="AAAAAA"/>
-                <w:sz w:val="20"/>
-                <w:szCs w:val="20"/>
-              </w:rPr>
-              <w:t>Calculadora.dividir</w:t>
+                <w:color w:val="000000" w:themeColor="text1"/>
+                <w:sz w:val="20"/>
+                <w:szCs w:val="20"/>
+              </w:rPr>
+              <w:t>ValidadorFormulario</w:t>
             </w:r>
             <w:proofErr w:type="spellEnd"/>
             <w:r>
               <w:rPr>
-                <w:i/>
-                <w:iCs/>
-                <w:color w:val="AAAAAA"/>
-                <w:sz w:val="20"/>
-                <w:szCs w:val="20"/>
-              </w:rPr>
-              <w:t>()</w:t>
-            </w:r>
-          </w:p>
-        </w:tc>
-      </w:tr>
-      <w:tr>
-        <w:tc>
-          <w:tcPr>
-            <w:tcW w:w="3000" w:type="dxa"/>
+                <w:color w:val="000000" w:themeColor="text1"/>
+                <w:sz w:val="20"/>
+                <w:szCs w:val="20"/>
+              </w:rPr>
+              <w:t xml:space="preserve"> creada (@BeforeEach)</w:t>
+            </w:r>
+          </w:p>
+        </w:tc>
+      </w:tr>
+      <w:tr>
+        <w:tc>
+          <w:tcPr>
+            <w:tcW w:w="5448" w:type="dxa"/>
             <w:tcBorders>
               <w:top w:val="single" w:sz="1" w:space="0" w:color="CCCCCC"/>
               <w:left w:val="single" w:sz="1" w:space="0" w:color="CCCCCC"/>
@@ -12474,45 +12708,50 @@
                 <w:sz w:val="20"/>
                 <w:szCs w:val="20"/>
               </w:rPr>
-              <w:t>Técnica de diseño</w:t>
-            </w:r>
-          </w:p>
-        </w:tc>
-        <w:tc>
-          <w:tcPr>
-            <w:tcW w:w="6638" w:type="dxa"/>
-            <w:tcBorders>
-              <w:top w:val="single" w:sz="1" w:space="0" w:color="CCCCCC"/>
-              <w:left w:val="single" w:sz="1" w:space="0" w:color="CCCCCC"/>
-              <w:bottom w:val="single" w:sz="1" w:space="0" w:color="CCCCCC"/>
-              <w:right w:val="single" w:sz="1" w:space="0" w:color="CCCCCC"/>
-            </w:tcBorders>
-            <w:shd w:val="clear" w:color="auto" w:fill="FFFFFF"/>
-            <w:tcMar>
-              <w:top w:w="80" w:type="dxa"/>
-              <w:left w:w="120" w:type="dxa"/>
-              <w:bottom w:w="80" w:type="dxa"/>
-              <w:right w:w="120" w:type="dxa"/>
-            </w:tcMar>
-          </w:tcPr>
-          <w:p>
-            <w:r>
-              <w:rPr>
-                <w:i/>
-                <w:iCs/>
-                <w:color w:val="AAAAAA"/>
-                <w:sz w:val="20"/>
-                <w:szCs w:val="20"/>
-              </w:rPr>
-              <w:t>Caja negra / Caja blanca / Valores límite / Particiones equivalencia</w:t>
-            </w:r>
-          </w:p>
-        </w:tc>
-      </w:tr>
-      <w:tr>
-        <w:tc>
-          <w:tcPr>
-            <w:tcW w:w="3000" w:type="dxa"/>
+              <w:t>Datos de entrada</w:t>
+            </w:r>
+          </w:p>
+        </w:tc>
+        <w:tc>
+          <w:tcPr>
+            <w:tcW w:w="4190" w:type="dxa"/>
+            <w:tcBorders>
+              <w:top w:val="single" w:sz="2" w:space="0" w:color="CCCCCC"/>
+              <w:left w:val="single" w:sz="2" w:space="0" w:color="CCCCCC"/>
+              <w:bottom w:val="single" w:sz="2" w:space="0" w:color="CCCCCC"/>
+              <w:right w:val="single" w:sz="2" w:space="0" w:color="CCCCCC"/>
+            </w:tcBorders>
+            <w:tcMar>
+              <w:top w:w="80" w:type="dxa"/>
+              <w:left w:w="120" w:type="dxa"/>
+              <w:bottom w:w="80" w:type="dxa"/>
+              <w:right w:w="120" w:type="dxa"/>
+            </w:tcMar>
+            <w:vAlign w:val="center"/>
+          </w:tcPr>
+          <w:p>
+            <w:pPr>
+              <w:rPr>
+                <w:color w:val="000000" w:themeColor="text1"/>
+                <w:sz w:val="20"/>
+                <w:szCs w:val="20"/>
+              </w:rPr>
+            </w:pPr>
+            <w:r>
+              <w:rPr>
+                <w:color w:val="000000" w:themeColor="text1"/>
+                <w:sz w:val="20"/>
+                <w:szCs w:val="20"/>
+              </w:rPr>
+              <w:t>"Abcdefg1"</w:t>
+            </w:r>
+          </w:p>
+        </w:tc>
+      </w:tr>
+      <w:tr>
+        <w:tc>
+          <w:tcPr>
+            <w:tcW w:w="5448" w:type="dxa"/>
             <w:tcBorders>
               <w:top w:val="single" w:sz="1" w:space="0" w:color="CCCCCC"/>
               <w:left w:val="single" w:sz="1" w:space="0" w:color="CCCCCC"/>
@@ -12536,45 +12775,50 @@
                 <w:sz w:val="20"/>
                 <w:szCs w:val="20"/>
               </w:rPr>
-              <w:t>Precondiciones</w:t>
-            </w:r>
-          </w:p>
-        </w:tc>
-        <w:tc>
-          <w:tcPr>
-            <w:tcW w:w="6638" w:type="dxa"/>
-            <w:tcBorders>
-              <w:top w:val="single" w:sz="1" w:space="0" w:color="CCCCCC"/>
-              <w:left w:val="single" w:sz="1" w:space="0" w:color="CCCCCC"/>
-              <w:bottom w:val="single" w:sz="1" w:space="0" w:color="CCCCCC"/>
-              <w:right w:val="single" w:sz="1" w:space="0" w:color="CCCCCC"/>
-            </w:tcBorders>
-            <w:shd w:val="clear" w:color="auto" w:fill="FFFFFF"/>
-            <w:tcMar>
-              <w:top w:w="80" w:type="dxa"/>
-              <w:left w:w="120" w:type="dxa"/>
-              <w:bottom w:w="80" w:type="dxa"/>
-              <w:right w:w="120" w:type="dxa"/>
-            </w:tcMar>
-          </w:tcPr>
-          <w:p>
-            <w:r>
-              <w:rPr>
-                <w:i/>
-                <w:iCs/>
-                <w:color w:val="AAAAAA"/>
-                <w:sz w:val="20"/>
-                <w:szCs w:val="20"/>
-              </w:rPr>
-              <w:t>Estado del sistema antes de ejecutar el test</w:t>
-            </w:r>
-          </w:p>
-        </w:tc>
-      </w:tr>
-      <w:tr>
-        <w:tc>
-          <w:tcPr>
-            <w:tcW w:w="3000" w:type="dxa"/>
+              <w:t>Resultado esperado</w:t>
+            </w:r>
+          </w:p>
+        </w:tc>
+        <w:tc>
+          <w:tcPr>
+            <w:tcW w:w="4190" w:type="dxa"/>
+            <w:tcBorders>
+              <w:top w:val="single" w:sz="2" w:space="0" w:color="CCCCCC"/>
+              <w:left w:val="single" w:sz="2" w:space="0" w:color="CCCCCC"/>
+              <w:bottom w:val="single" w:sz="2" w:space="0" w:color="CCCCCC"/>
+              <w:right w:val="single" w:sz="2" w:space="0" w:color="CCCCCC"/>
+            </w:tcBorders>
+            <w:tcMar>
+              <w:top w:w="80" w:type="dxa"/>
+              <w:left w:w="120" w:type="dxa"/>
+              <w:bottom w:w="80" w:type="dxa"/>
+              <w:right w:w="120" w:type="dxa"/>
+            </w:tcMar>
+            <w:vAlign w:val="center"/>
+          </w:tcPr>
+          <w:p>
+            <w:pPr>
+              <w:rPr>
+                <w:color w:val="000000" w:themeColor="text1"/>
+                <w:sz w:val="20"/>
+                <w:szCs w:val="20"/>
+              </w:rPr>
+            </w:pPr>
+            <w:r>
+              <w:rPr>
+                <w:color w:val="000000" w:themeColor="text1"/>
+                <w:sz w:val="20"/>
+                <w:szCs w:val="20"/>
+              </w:rPr>
+              <w:t>true</w:t>
+            </w:r>
+          </w:p>
+        </w:tc>
+      </w:tr>
+      <w:tr>
+        <w:tc>
+          <w:tcPr>
+            <w:tcW w:w="5448" w:type="dxa"/>
             <w:tcBorders>
               <w:top w:val="single" w:sz="1" w:space="0" w:color="CCCCCC"/>
               <w:left w:val="single" w:sz="1" w:space="0" w:color="CCCCCC"/>
@@ -12598,44 +12842,50 @@
                 <w:sz w:val="20"/>
                 <w:szCs w:val="20"/>
               </w:rPr>
-              <w:t>Datos de entrada</w:t>
-            </w:r>
-          </w:p>
-        </w:tc>
-        <w:tc>
-          <w:tcPr>
-            <w:tcW w:w="6638" w:type="dxa"/>
-            <w:tcBorders>
-              <w:top w:val="single" w:sz="1" w:space="0" w:color="CCCCCC"/>
-              <w:left w:val="single" w:sz="1" w:space="0" w:color="CCCCCC"/>
-              <w:bottom w:val="single" w:sz="1" w:space="0" w:color="CCCCCC"/>
-              <w:right w:val="single" w:sz="1" w:space="0" w:color="CCCCCC"/>
-            </w:tcBorders>
-            <w:tcMar>
-              <w:top w:w="80" w:type="dxa"/>
-              <w:left w:w="120" w:type="dxa"/>
-              <w:bottom w:w="80" w:type="dxa"/>
-              <w:right w:w="120" w:type="dxa"/>
-            </w:tcMar>
-          </w:tcPr>
-          <w:p>
-            <w:r>
-              <w:rPr>
-                <w:i/>
-                <w:iCs/>
-                <w:color w:val="AAAAAA"/>
-                <w:sz w:val="20"/>
-                <w:szCs w:val="20"/>
-              </w:rPr>
-              <w:t>Escribid los valores de entrada del test</w:t>
-            </w:r>
-          </w:p>
-        </w:tc>
-      </w:tr>
-      <w:tr>
-        <w:tc>
-          <w:tcPr>
-            <w:tcW w:w="3000" w:type="dxa"/>
+              <w:t>Resultado obtenido</w:t>
+            </w:r>
+          </w:p>
+        </w:tc>
+        <w:tc>
+          <w:tcPr>
+            <w:tcW w:w="4190" w:type="dxa"/>
+            <w:tcBorders>
+              <w:top w:val="single" w:sz="2" w:space="0" w:color="CCCCCC"/>
+              <w:left w:val="single" w:sz="2" w:space="0" w:color="CCCCCC"/>
+              <w:bottom w:val="single" w:sz="2" w:space="0" w:color="CCCCCC"/>
+              <w:right w:val="single" w:sz="2" w:space="0" w:color="CCCCCC"/>
+            </w:tcBorders>
+            <w:tcMar>
+              <w:top w:w="80" w:type="dxa"/>
+              <w:left w:w="120" w:type="dxa"/>
+              <w:bottom w:w="80" w:type="dxa"/>
+              <w:right w:w="120" w:type="dxa"/>
+            </w:tcMar>
+            <w:vAlign w:val="center"/>
+          </w:tcPr>
+          <w:p>
+            <w:pPr>
+              <w:rPr>
+                <w:color w:val="000000" w:themeColor="text1"/>
+                <w:sz w:val="20"/>
+                <w:szCs w:val="20"/>
+              </w:rPr>
+            </w:pPr>
+            <w:r>
+              <w:rPr>
+                <w:color w:val="000000" w:themeColor="text1"/>
+                <w:sz w:val="20"/>
+                <w:szCs w:val="20"/>
+              </w:rPr>
+              <w:t>true</w:t>
+            </w:r>
+          </w:p>
+        </w:tc>
+      </w:tr>
+      <w:tr>
+        <w:tc>
+          <w:tcPr>
+            <w:tcW w:w="5448" w:type="dxa"/>
             <w:tcBorders>
               <w:top w:val="single" w:sz="1" w:space="0" w:color="CCCCCC"/>
               <w:left w:val="single" w:sz="1" w:space="0" w:color="CCCCCC"/>
@@ -12659,44 +12909,50 @@
                 <w:sz w:val="20"/>
                 <w:szCs w:val="20"/>
               </w:rPr>
-              <w:t>Resultado esperado</w:t>
-            </w:r>
-          </w:p>
-        </w:tc>
-        <w:tc>
-          <w:tcPr>
-            <w:tcW w:w="6638" w:type="dxa"/>
-            <w:tcBorders>
-              <w:top w:val="single" w:sz="1" w:space="0" w:color="CCCCCC"/>
-              <w:left w:val="single" w:sz="1" w:space="0" w:color="CCCCCC"/>
-              <w:bottom w:val="single" w:sz="1" w:space="0" w:color="CCCCCC"/>
-              <w:right w:val="single" w:sz="1" w:space="0" w:color="CCCCCC"/>
-            </w:tcBorders>
-            <w:tcMar>
-              <w:top w:w="80" w:type="dxa"/>
-              <w:left w:w="120" w:type="dxa"/>
-              <w:bottom w:w="80" w:type="dxa"/>
-              <w:right w:w="120" w:type="dxa"/>
-            </w:tcMar>
-          </w:tcPr>
-          <w:p>
-            <w:r>
-              <w:rPr>
-                <w:i/>
-                <w:iCs/>
-                <w:color w:val="AAAAAA"/>
-                <w:sz w:val="20"/>
-                <w:szCs w:val="20"/>
-              </w:rPr>
-              <w:t>Qué debería devolver o hacer el sistema si funciona correctamente</w:t>
-            </w:r>
-          </w:p>
-        </w:tc>
-      </w:tr>
-      <w:tr>
-        <w:tc>
-          <w:tcPr>
-            <w:tcW w:w="3000" w:type="dxa"/>
+              <w:t>Estado (Pasa / Falla)</w:t>
+            </w:r>
+          </w:p>
+        </w:tc>
+        <w:tc>
+          <w:tcPr>
+            <w:tcW w:w="4190" w:type="dxa"/>
+            <w:tcBorders>
+              <w:top w:val="single" w:sz="2" w:space="0" w:color="CCCCCC"/>
+              <w:left w:val="single" w:sz="2" w:space="0" w:color="CCCCCC"/>
+              <w:bottom w:val="single" w:sz="2" w:space="0" w:color="CCCCCC"/>
+              <w:right w:val="single" w:sz="2" w:space="0" w:color="CCCCCC"/>
+            </w:tcBorders>
+            <w:tcMar>
+              <w:top w:w="80" w:type="dxa"/>
+              <w:left w:w="120" w:type="dxa"/>
+              <w:bottom w:w="80" w:type="dxa"/>
+              <w:right w:w="120" w:type="dxa"/>
+            </w:tcMar>
+            <w:vAlign w:val="center"/>
+          </w:tcPr>
+          <w:p>
+            <w:pPr>
+              <w:rPr>
+                <w:color w:val="000000" w:themeColor="text1"/>
+                <w:sz w:val="20"/>
+                <w:szCs w:val="20"/>
+              </w:rPr>
+            </w:pPr>
+            <w:r>
+              <w:rPr>
+                <w:color w:val="000000" w:themeColor="text1"/>
+                <w:sz w:val="20"/>
+                <w:szCs w:val="20"/>
+              </w:rPr>
+              <w:t>Pasa</w:t>
+            </w:r>
+          </w:p>
+        </w:tc>
+      </w:tr>
+      <w:tr>
+        <w:tc>
+          <w:tcPr>
+            <w:tcW w:w="5448" w:type="dxa"/>
             <w:tcBorders>
               <w:top w:val="single" w:sz="1" w:space="0" w:color="CCCCCC"/>
               <w:left w:val="single" w:sz="1" w:space="0" w:color="CCCCCC"/>
@@ -12720,177 +12976,43 @@
                 <w:sz w:val="20"/>
                 <w:szCs w:val="20"/>
               </w:rPr>
-              <w:t>Resultado obtenido</w:t>
-            </w:r>
-          </w:p>
-        </w:tc>
-        <w:tc>
-          <w:tcPr>
-            <w:tcW w:w="6638" w:type="dxa"/>
-            <w:tcBorders>
-              <w:top w:val="single" w:sz="1" w:space="0" w:color="CCCCCC"/>
-              <w:left w:val="single" w:sz="1" w:space="0" w:color="CCCCCC"/>
-              <w:bottom w:val="single" w:sz="1" w:space="0" w:color="CCCCCC"/>
-              <w:right w:val="single" w:sz="1" w:space="0" w:color="CCCCCC"/>
-            </w:tcBorders>
-            <w:tcMar>
-              <w:top w:w="80" w:type="dxa"/>
-              <w:left w:w="120" w:type="dxa"/>
-              <w:bottom w:w="80" w:type="dxa"/>
-              <w:right w:w="120" w:type="dxa"/>
-            </w:tcMar>
-          </w:tcPr>
-          <w:p>
-            <w:r>
-              <w:rPr>
-                <w:i/>
-                <w:iCs/>
-                <w:color w:val="AAAAAA"/>
-                <w:sz w:val="20"/>
-                <w:szCs w:val="20"/>
-              </w:rPr>
-              <w:t>Qué devolvió o hizo realmente el sistema al ejecutar el test</w:t>
-            </w:r>
-          </w:p>
-        </w:tc>
-      </w:tr>
-      <w:tr>
-        <w:tc>
-          <w:tcPr>
-            <w:tcW w:w="3000" w:type="dxa"/>
-            <w:tcBorders>
-              <w:top w:val="single" w:sz="1" w:space="0" w:color="CCCCCC"/>
-              <w:left w:val="single" w:sz="1" w:space="0" w:color="CCCCCC"/>
-              <w:bottom w:val="single" w:sz="1" w:space="0" w:color="CCCCCC"/>
-              <w:right w:val="single" w:sz="1" w:space="0" w:color="CCCCCC"/>
-            </w:tcBorders>
-            <w:shd w:val="clear" w:color="auto" w:fill="D6E4F0"/>
-            <w:tcMar>
-              <w:top w:w="80" w:type="dxa"/>
-              <w:left w:w="120" w:type="dxa"/>
-              <w:bottom w:w="80" w:type="dxa"/>
-              <w:right w:w="120" w:type="dxa"/>
-            </w:tcMar>
-          </w:tcPr>
-          <w:p>
-            <w:r>
-              <w:rPr>
-                <w:b/>
-                <w:bCs/>
-                <w:color w:val="1A1A2E"/>
-                <w:sz w:val="20"/>
-                <w:szCs w:val="20"/>
-              </w:rPr>
-              <w:t>Estado (Pasa / Falla)</w:t>
-            </w:r>
-          </w:p>
-        </w:tc>
-        <w:tc>
-          <w:tcPr>
-            <w:tcW w:w="6638" w:type="dxa"/>
-            <w:tcBorders>
-              <w:top w:val="single" w:sz="1" w:space="0" w:color="CCCCCC"/>
-              <w:left w:val="single" w:sz="1" w:space="0" w:color="CCCCCC"/>
-              <w:bottom w:val="single" w:sz="1" w:space="0" w:color="CCCCCC"/>
-              <w:right w:val="single" w:sz="1" w:space="0" w:color="CCCCCC"/>
-            </w:tcBorders>
-            <w:tcMar>
-              <w:top w:w="80" w:type="dxa"/>
-              <w:left w:w="120" w:type="dxa"/>
-              <w:bottom w:w="80" w:type="dxa"/>
-              <w:right w:w="120" w:type="dxa"/>
-            </w:tcMar>
-          </w:tcPr>
-          <w:p/>
-        </w:tc>
-      </w:tr>
-      <w:tr>
-        <w:tc>
-          <w:tcPr>
-            <w:tcW w:w="3000" w:type="dxa"/>
-            <w:tcBorders>
-              <w:top w:val="single" w:sz="1" w:space="0" w:color="CCCCCC"/>
-              <w:left w:val="single" w:sz="1" w:space="0" w:color="CCCCCC"/>
-              <w:bottom w:val="single" w:sz="1" w:space="0" w:color="CCCCCC"/>
-              <w:right w:val="single" w:sz="1" w:space="0" w:color="CCCCCC"/>
-            </w:tcBorders>
-            <w:shd w:val="clear" w:color="auto" w:fill="D6E4F0"/>
-            <w:tcMar>
-              <w:top w:w="80" w:type="dxa"/>
-              <w:left w:w="120" w:type="dxa"/>
-              <w:bottom w:w="80" w:type="dxa"/>
-              <w:right w:w="120" w:type="dxa"/>
-            </w:tcMar>
-          </w:tcPr>
-          <w:p>
-            <w:r>
-              <w:rPr>
-                <w:b/>
-                <w:bCs/>
-                <w:color w:val="1A1A2E"/>
-                <w:sz w:val="20"/>
-                <w:szCs w:val="20"/>
-              </w:rPr>
               <w:t>Observaciones / Defecto encontrado</w:t>
             </w:r>
           </w:p>
         </w:tc>
         <w:tc>
           <w:tcPr>
-            <w:tcW w:w="6638" w:type="dxa"/>
-            <w:tcBorders>
-              <w:top w:val="single" w:sz="1" w:space="0" w:color="CCCCCC"/>
-              <w:left w:val="single" w:sz="1" w:space="0" w:color="CCCCCC"/>
-              <w:bottom w:val="single" w:sz="1" w:space="0" w:color="CCCCCC"/>
-              <w:right w:val="single" w:sz="1" w:space="0" w:color="CCCCCC"/>
-            </w:tcBorders>
-            <w:tcMar>
-              <w:top w:w="80" w:type="dxa"/>
-              <w:left w:w="120" w:type="dxa"/>
-              <w:bottom w:w="80" w:type="dxa"/>
-              <w:right w:w="120" w:type="dxa"/>
-            </w:tcMar>
-          </w:tcPr>
-          <w:p>
-            <w:r>
-              <w:rPr>
-                <w:i/>
-                <w:iCs/>
-                <w:color w:val="AAAAAA"/>
-                <w:sz w:val="20"/>
-                <w:szCs w:val="20"/>
-              </w:rPr>
-              <w:t xml:space="preserve">Si el test falla, </w:t>
-            </w:r>
-            <w:proofErr w:type="spellStart"/>
-            <w:r>
-              <w:rPr>
-                <w:i/>
-                <w:iCs/>
-                <w:color w:val="AAAAAA"/>
-                <w:sz w:val="20"/>
-                <w:szCs w:val="20"/>
-              </w:rPr>
-              <w:t>describird</w:t>
-            </w:r>
-            <w:proofErr w:type="spellEnd"/>
-            <w:r>
-              <w:rPr>
-                <w:i/>
-                <w:iCs/>
-                <w:color w:val="AAAAAA"/>
-                <w:sz w:val="20"/>
-                <w:szCs w:val="20"/>
-              </w:rPr>
-              <w:t xml:space="preserve"> el defecto encontrado. Si pasa, escribid 'Ninguno'.</w:t>
-            </w:r>
-          </w:p>
+            <w:tcW w:w="4190" w:type="dxa"/>
+            <w:tcBorders>
+              <w:top w:val="single" w:sz="2" w:space="0" w:color="CCCCCC"/>
+              <w:left w:val="single" w:sz="2" w:space="0" w:color="CCCCCC"/>
+              <w:bottom w:val="single" w:sz="2" w:space="0" w:color="CCCCCC"/>
+              <w:right w:val="single" w:sz="2" w:space="0" w:color="CCCCCC"/>
+            </w:tcBorders>
+            <w:tcMar>
+              <w:top w:w="80" w:type="dxa"/>
+              <w:left w:w="120" w:type="dxa"/>
+              <w:bottom w:w="80" w:type="dxa"/>
+              <w:right w:w="120" w:type="dxa"/>
+            </w:tcMar>
+            <w:vAlign w:val="center"/>
+          </w:tcPr>
           <w:p>
             <w:pPr>
               <w:spacing w:after="80"/>
+              <w:rPr>
+                <w:color w:val="000000" w:themeColor="text1"/>
+                <w:sz w:val="20"/>
+                <w:szCs w:val="20"/>
+              </w:rPr>
             </w:pPr>
             <w:r>
-              <w:t xml:space="preserve"> </w:t>
+              <w:rPr>
+                <w:color w:val="000000" w:themeColor="text1"/>
+                <w:sz w:val="20"/>
+                <w:szCs w:val="20"/>
+              </w:rPr>
+              <w:t>Ninguno</w:t>
             </w:r>
           </w:p>
         </w:tc>
@@ -12928,11 +13050,11 @@
       <w:tr>
         <w:trPr>
           <w:gridAfter w:val="1"/>
-          <w:wAfter w:w="6638" w:type="dxa"/>
+          <w:wAfter w:w="4190" w:type="dxa"/>
         </w:trPr>
         <w:tc>
           <w:tcPr>
-            <w:tcW w:w="9638" w:type="dxa"/>
+            <w:tcW w:w="5448" w:type="dxa"/>
             <w:tcBorders>
               <w:top w:val="single" w:sz="1" w:space="0" w:color="CCCCCC"/>
               <w:left w:val="single" w:sz="1" w:space="0" w:color="CCCCCC"/>
@@ -12962,7 +13084,7 @@
       <w:tr>
         <w:tc>
           <w:tcPr>
-            <w:tcW w:w="3000" w:type="dxa"/>
+            <w:tcW w:w="5448" w:type="dxa"/>
             <w:tcBorders>
               <w:top w:val="single" w:sz="1" w:space="0" w:color="CCCCCC"/>
               <w:left w:val="single" w:sz="1" w:space="0" w:color="CCCCCC"/>
@@ -12992,27 +13114,31 @@
         </w:tc>
         <w:tc>
           <w:tcPr>
-            <w:tcW w:w="6638" w:type="dxa"/>
-            <w:tcBorders>
-              <w:top w:val="single" w:sz="1" w:space="0" w:color="CCCCCC"/>
-              <w:left w:val="single" w:sz="1" w:space="0" w:color="CCCCCC"/>
-              <w:bottom w:val="single" w:sz="1" w:space="0" w:color="CCCCCC"/>
-              <w:right w:val="single" w:sz="1" w:space="0" w:color="CCCCCC"/>
-            </w:tcBorders>
-            <w:shd w:val="clear" w:color="auto" w:fill="FFFFFF"/>
-            <w:tcMar>
-              <w:top w:w="80" w:type="dxa"/>
-              <w:left w:w="120" w:type="dxa"/>
-              <w:bottom w:w="80" w:type="dxa"/>
-              <w:right w:w="120" w:type="dxa"/>
-            </w:tcMar>
-          </w:tcPr>
-          <w:p>
-            <w:r>
-              <w:rPr>
-                <w:i/>
-                <w:iCs/>
-                <w:color w:val="AAAAAA"/>
+            <w:tcW w:w="4190" w:type="dxa"/>
+            <w:tcBorders>
+              <w:top w:val="single" w:sz="2" w:space="0" w:color="CCCCCC"/>
+              <w:left w:val="single" w:sz="2" w:space="0" w:color="CCCCCC"/>
+              <w:bottom w:val="single" w:sz="2" w:space="0" w:color="CCCCCC"/>
+              <w:right w:val="single" w:sz="2" w:space="0" w:color="CCCCCC"/>
+            </w:tcBorders>
+            <w:tcMar>
+              <w:top w:w="80" w:type="dxa"/>
+              <w:left w:w="120" w:type="dxa"/>
+              <w:bottom w:w="80" w:type="dxa"/>
+              <w:right w:w="120" w:type="dxa"/>
+            </w:tcMar>
+            <w:vAlign w:val="center"/>
+          </w:tcPr>
+          <w:p>
+            <w:pPr>
+              <w:rPr>
+                <w:sz w:val="20"/>
+                <w:szCs w:val="20"/>
+              </w:rPr>
+            </w:pPr>
+            <w:r>
+              <w:rPr>
+                <w:color w:val="000000"/>
                 <w:sz w:val="20"/>
                 <w:szCs w:val="20"/>
               </w:rPr>
@@ -13024,7 +13150,7 @@
       <w:tr>
         <w:tc>
           <w:tcPr>
-            <w:tcW w:w="3000" w:type="dxa"/>
+            <w:tcW w:w="5448" w:type="dxa"/>
             <w:tcBorders>
               <w:top w:val="single" w:sz="1" w:space="0" w:color="CCCCCC"/>
               <w:left w:val="single" w:sz="1" w:space="0" w:color="CCCCCC"/>
@@ -13054,39 +13180,61 @@
         </w:tc>
         <w:tc>
           <w:tcPr>
-            <w:tcW w:w="6638" w:type="dxa"/>
-            <w:tcBorders>
-              <w:top w:val="single" w:sz="1" w:space="0" w:color="CCCCCC"/>
-              <w:left w:val="single" w:sz="1" w:space="0" w:color="CCCCCC"/>
-              <w:bottom w:val="single" w:sz="1" w:space="0" w:color="CCCCCC"/>
-              <w:right w:val="single" w:sz="1" w:space="0" w:color="CCCCCC"/>
-            </w:tcBorders>
-            <w:shd w:val="clear" w:color="auto" w:fill="FFFFFF"/>
-            <w:tcMar>
-              <w:top w:w="80" w:type="dxa"/>
-              <w:left w:w="120" w:type="dxa"/>
-              <w:bottom w:w="80" w:type="dxa"/>
-              <w:right w:w="120" w:type="dxa"/>
-            </w:tcMar>
-          </w:tcPr>
-          <w:p>
-            <w:r>
-              <w:rPr>
-                <w:i/>
-                <w:iCs/>
-                <w:color w:val="AAAAAA"/>
-                <w:sz w:val="20"/>
-                <w:szCs w:val="20"/>
-              </w:rPr>
-              <w:t>Describid brevemente qué comprueba este test</w:t>
-            </w:r>
-          </w:p>
-        </w:tc>
-      </w:tr>
-      <w:tr>
-        <w:tc>
-          <w:tcPr>
-            <w:tcW w:w="3000" w:type="dxa"/>
+            <w:tcW w:w="4190" w:type="dxa"/>
+            <w:tcBorders>
+              <w:top w:val="single" w:sz="2" w:space="0" w:color="CCCCCC"/>
+              <w:left w:val="single" w:sz="2" w:space="0" w:color="CCCCCC"/>
+              <w:bottom w:val="single" w:sz="2" w:space="0" w:color="CCCCCC"/>
+              <w:right w:val="single" w:sz="2" w:space="0" w:color="CCCCCC"/>
+            </w:tcBorders>
+            <w:tcMar>
+              <w:top w:w="80" w:type="dxa"/>
+              <w:left w:w="120" w:type="dxa"/>
+              <w:bottom w:w="80" w:type="dxa"/>
+              <w:right w:w="120" w:type="dxa"/>
+            </w:tcMar>
+            <w:vAlign w:val="center"/>
+          </w:tcPr>
+          <w:p>
+            <w:pPr>
+              <w:rPr>
+                <w:sz w:val="20"/>
+                <w:szCs w:val="20"/>
+              </w:rPr>
+            </w:pPr>
+            <w:r>
+              <w:rPr>
+                <w:color w:val="000000"/>
+                <w:sz w:val="20"/>
+                <w:szCs w:val="20"/>
+              </w:rPr>
+              <w:t xml:space="preserve">Contraseña </w:t>
+            </w:r>
+            <w:proofErr w:type="spellStart"/>
+            <w:r>
+              <w:rPr>
+                <w:color w:val="000000"/>
+                <w:sz w:val="20"/>
+                <w:szCs w:val="20"/>
+              </w:rPr>
+              <w:t>null</w:t>
+            </w:r>
+            <w:proofErr w:type="spellEnd"/>
+            <w:r>
+              <w:rPr>
+                <w:color w:val="000000"/>
+                <w:sz w:val="20"/>
+                <w:szCs w:val="20"/>
+              </w:rPr>
+              <w:t xml:space="preserve"> debe devolver false</w:t>
+            </w:r>
+          </w:p>
+        </w:tc>
+      </w:tr>
+      <w:tr>
+        <w:tc>
+          <w:tcPr>
+            <w:tcW w:w="5448" w:type="dxa"/>
             <w:tcBorders>
               <w:top w:val="single" w:sz="1" w:space="0" w:color="CCCCCC"/>
               <w:left w:val="single" w:sz="1" w:space="0" w:color="CCCCCC"/>
@@ -13116,73 +13264,129 @@
         </w:tc>
         <w:tc>
           <w:tcPr>
-            <w:tcW w:w="6638" w:type="dxa"/>
-            <w:tcBorders>
-              <w:top w:val="single" w:sz="1" w:space="0" w:color="CCCCCC"/>
-              <w:left w:val="single" w:sz="1" w:space="0" w:color="CCCCCC"/>
-              <w:bottom w:val="single" w:sz="1" w:space="0" w:color="CCCCCC"/>
-              <w:right w:val="single" w:sz="1" w:space="0" w:color="CCCCCC"/>
-            </w:tcBorders>
-            <w:shd w:val="clear" w:color="auto" w:fill="FFFFFF"/>
-            <w:tcMar>
-              <w:top w:w="80" w:type="dxa"/>
-              <w:left w:w="120" w:type="dxa"/>
-              <w:bottom w:w="80" w:type="dxa"/>
-              <w:right w:w="120" w:type="dxa"/>
-            </w:tcMar>
-          </w:tcPr>
-          <w:p>
+            <w:tcW w:w="4190" w:type="dxa"/>
+            <w:tcBorders>
+              <w:top w:val="single" w:sz="2" w:space="0" w:color="CCCCCC"/>
+              <w:left w:val="single" w:sz="2" w:space="0" w:color="CCCCCC"/>
+              <w:bottom w:val="single" w:sz="2" w:space="0" w:color="CCCCCC"/>
+              <w:right w:val="single" w:sz="2" w:space="0" w:color="CCCCCC"/>
+            </w:tcBorders>
+            <w:tcMar>
+              <w:top w:w="80" w:type="dxa"/>
+              <w:left w:w="120" w:type="dxa"/>
+              <w:bottom w:w="80" w:type="dxa"/>
+              <w:right w:w="120" w:type="dxa"/>
+            </w:tcMar>
+            <w:vAlign w:val="center"/>
+          </w:tcPr>
+          <w:p>
+            <w:pPr>
+              <w:rPr>
+                <w:sz w:val="20"/>
+                <w:szCs w:val="20"/>
+              </w:rPr>
+            </w:pPr>
             <w:proofErr w:type="spellStart"/>
             <w:r>
               <w:rPr>
-                <w:i/>
-                <w:iCs/>
-                <w:color w:val="AAAAAA"/>
-                <w:sz w:val="20"/>
-                <w:szCs w:val="20"/>
-              </w:rPr>
-              <w:t>Ej</w:t>
+                <w:color w:val="000000"/>
+                <w:sz w:val="20"/>
+                <w:szCs w:val="20"/>
+              </w:rPr>
+              <w:t>ValidadorFormulario.validarPassword</w:t>
             </w:r>
             <w:proofErr w:type="spellEnd"/>
             <w:r>
               <w:rPr>
-                <w:i/>
-                <w:iCs/>
-                <w:color w:val="AAAAAA"/>
-                <w:sz w:val="20"/>
-                <w:szCs w:val="20"/>
-              </w:rPr>
-              <w:t xml:space="preserve">: </w:t>
+                <w:color w:val="000000"/>
+                <w:sz w:val="20"/>
+                <w:szCs w:val="20"/>
+              </w:rPr>
+              <w:t>()</w:t>
+            </w:r>
+          </w:p>
+        </w:tc>
+      </w:tr>
+      <w:tr>
+        <w:tc>
+          <w:tcPr>
+            <w:tcW w:w="5448" w:type="dxa"/>
+            <w:tcBorders>
+              <w:top w:val="single" w:sz="1" w:space="0" w:color="CCCCCC"/>
+              <w:left w:val="single" w:sz="1" w:space="0" w:color="CCCCCC"/>
+              <w:bottom w:val="single" w:sz="1" w:space="0" w:color="CCCCCC"/>
+              <w:right w:val="single" w:sz="1" w:space="0" w:color="CCCCCC"/>
+            </w:tcBorders>
+            <w:shd w:val="clear" w:color="auto" w:fill="D6E4F0"/>
+            <w:tcMar>
+              <w:top w:w="80" w:type="dxa"/>
+              <w:left w:w="120" w:type="dxa"/>
+              <w:bottom w:w="80" w:type="dxa"/>
+              <w:right w:w="120" w:type="dxa"/>
+            </w:tcMar>
+          </w:tcPr>
+          <w:p>
+            <w:r>
+              <w:rPr>
+                <w:b/>
+                <w:bCs/>
+                <w:color w:val="1A1A2E"/>
+                <w:sz w:val="20"/>
+                <w:szCs w:val="20"/>
+              </w:rPr>
+              <w:t>Técnica de diseño</w:t>
+            </w:r>
+          </w:p>
+        </w:tc>
+        <w:tc>
+          <w:tcPr>
+            <w:tcW w:w="4190" w:type="dxa"/>
+            <w:tcBorders>
+              <w:top w:val="single" w:sz="2" w:space="0" w:color="CCCCCC"/>
+              <w:left w:val="single" w:sz="2" w:space="0" w:color="CCCCCC"/>
+              <w:bottom w:val="single" w:sz="2" w:space="0" w:color="CCCCCC"/>
+              <w:right w:val="single" w:sz="2" w:space="0" w:color="CCCCCC"/>
+            </w:tcBorders>
+            <w:tcMar>
+              <w:top w:w="80" w:type="dxa"/>
+              <w:left w:w="120" w:type="dxa"/>
+              <w:bottom w:w="80" w:type="dxa"/>
+              <w:right w:w="120" w:type="dxa"/>
+            </w:tcMar>
+            <w:vAlign w:val="center"/>
+          </w:tcPr>
+          <w:p>
+            <w:pPr>
+              <w:rPr>
+                <w:sz w:val="20"/>
+                <w:szCs w:val="20"/>
+              </w:rPr>
+            </w:pPr>
+            <w:r>
+              <w:rPr>
+                <w:color w:val="000000"/>
+                <w:sz w:val="20"/>
+                <w:szCs w:val="20"/>
+              </w:rPr>
+              <w:t xml:space="preserve">Caja Blanca – Rama </w:t>
             </w:r>
             <w:proofErr w:type="spellStart"/>
             <w:r>
               <w:rPr>
-                <w:i/>
-                <w:iCs/>
-                <w:color w:val="AAAAAA"/>
-                <w:sz w:val="20"/>
-                <w:szCs w:val="20"/>
-              </w:rPr>
-              <w:t>Calculadora.dividir</w:t>
+                <w:color w:val="000000"/>
+                <w:sz w:val="20"/>
+                <w:szCs w:val="20"/>
+              </w:rPr>
+              <w:t>null</w:t>
             </w:r>
             <w:proofErr w:type="spellEnd"/>
-            <w:r>
-              <w:rPr>
-                <w:i/>
-                <w:iCs/>
-                <w:color w:val="AAAAAA"/>
-                <w:sz w:val="20"/>
-                <w:szCs w:val="20"/>
-              </w:rPr>
-              <w:t>()</w:t>
-            </w:r>
-          </w:p>
-        </w:tc>
-      </w:tr>
-      <w:tr>
-        <w:tc>
-          <w:tcPr>
-            <w:tcW w:w="3000" w:type="dxa"/>
+          </w:p>
+        </w:tc>
+      </w:tr>
+      <w:tr>
+        <w:tc>
+          <w:tcPr>
+            <w:tcW w:w="5448" w:type="dxa"/>
             <w:tcBorders>
               <w:top w:val="single" w:sz="1" w:space="0" w:color="CCCCCC"/>
               <w:left w:val="single" w:sz="1" w:space="0" w:color="CCCCCC"/>
@@ -13206,45 +13410,67 @@
                 <w:sz w:val="20"/>
                 <w:szCs w:val="20"/>
               </w:rPr>
-              <w:t>Técnica de diseño</w:t>
-            </w:r>
-          </w:p>
-        </w:tc>
-        <w:tc>
-          <w:tcPr>
-            <w:tcW w:w="6638" w:type="dxa"/>
-            <w:tcBorders>
-              <w:top w:val="single" w:sz="1" w:space="0" w:color="CCCCCC"/>
-              <w:left w:val="single" w:sz="1" w:space="0" w:color="CCCCCC"/>
-              <w:bottom w:val="single" w:sz="1" w:space="0" w:color="CCCCCC"/>
-              <w:right w:val="single" w:sz="1" w:space="0" w:color="CCCCCC"/>
-            </w:tcBorders>
-            <w:shd w:val="clear" w:color="auto" w:fill="FFFFFF"/>
-            <w:tcMar>
-              <w:top w:w="80" w:type="dxa"/>
-              <w:left w:w="120" w:type="dxa"/>
-              <w:bottom w:w="80" w:type="dxa"/>
-              <w:right w:w="120" w:type="dxa"/>
-            </w:tcMar>
-          </w:tcPr>
-          <w:p>
-            <w:r>
-              <w:rPr>
-                <w:i/>
-                <w:iCs/>
-                <w:color w:val="AAAAAA"/>
-                <w:sz w:val="20"/>
-                <w:szCs w:val="20"/>
-              </w:rPr>
-              <w:t>Caja negra / Caja blanca / Valores límite / Particiones equivalencia</w:t>
-            </w:r>
-          </w:p>
-        </w:tc>
-      </w:tr>
-      <w:tr>
-        <w:tc>
-          <w:tcPr>
-            <w:tcW w:w="3000" w:type="dxa"/>
+              <w:t>Precondiciones</w:t>
+            </w:r>
+          </w:p>
+        </w:tc>
+        <w:tc>
+          <w:tcPr>
+            <w:tcW w:w="4190" w:type="dxa"/>
+            <w:tcBorders>
+              <w:top w:val="single" w:sz="2" w:space="0" w:color="CCCCCC"/>
+              <w:left w:val="single" w:sz="2" w:space="0" w:color="CCCCCC"/>
+              <w:bottom w:val="single" w:sz="2" w:space="0" w:color="CCCCCC"/>
+              <w:right w:val="single" w:sz="2" w:space="0" w:color="CCCCCC"/>
+            </w:tcBorders>
+            <w:tcMar>
+              <w:top w:w="80" w:type="dxa"/>
+              <w:left w:w="120" w:type="dxa"/>
+              <w:bottom w:w="80" w:type="dxa"/>
+              <w:right w:w="120" w:type="dxa"/>
+            </w:tcMar>
+            <w:vAlign w:val="center"/>
+          </w:tcPr>
+          <w:p>
+            <w:pPr>
+              <w:rPr>
+                <w:sz w:val="20"/>
+                <w:szCs w:val="20"/>
+              </w:rPr>
+            </w:pPr>
+            <w:r>
+              <w:rPr>
+                <w:color w:val="000000"/>
+                <w:sz w:val="20"/>
+                <w:szCs w:val="20"/>
+              </w:rPr>
+              <w:t xml:space="preserve">Instancia de </w:t>
+            </w:r>
+            <w:proofErr w:type="spellStart"/>
+            <w:r>
+              <w:rPr>
+                <w:color w:val="000000"/>
+                <w:sz w:val="20"/>
+                <w:szCs w:val="20"/>
+              </w:rPr>
+              <w:t>ValidadorFormulario</w:t>
+            </w:r>
+            <w:proofErr w:type="spellEnd"/>
+            <w:r>
+              <w:rPr>
+                <w:color w:val="000000"/>
+                <w:sz w:val="20"/>
+                <w:szCs w:val="20"/>
+              </w:rPr>
+              <w:t xml:space="preserve"> creada (@BeforeEach)</w:t>
+            </w:r>
+          </w:p>
+        </w:tc>
+      </w:tr>
+      <w:tr>
+        <w:tc>
+          <w:tcPr>
+            <w:tcW w:w="5448" w:type="dxa"/>
             <w:tcBorders>
               <w:top w:val="single" w:sz="1" w:space="0" w:color="CCCCCC"/>
               <w:left w:val="single" w:sz="1" w:space="0" w:color="CCCCCC"/>
@@ -13268,45 +13494,51 @@
                 <w:sz w:val="20"/>
                 <w:szCs w:val="20"/>
               </w:rPr>
-              <w:t>Precondiciones</w:t>
-            </w:r>
-          </w:p>
-        </w:tc>
-        <w:tc>
-          <w:tcPr>
-            <w:tcW w:w="6638" w:type="dxa"/>
-            <w:tcBorders>
-              <w:top w:val="single" w:sz="1" w:space="0" w:color="CCCCCC"/>
-              <w:left w:val="single" w:sz="1" w:space="0" w:color="CCCCCC"/>
-              <w:bottom w:val="single" w:sz="1" w:space="0" w:color="CCCCCC"/>
-              <w:right w:val="single" w:sz="1" w:space="0" w:color="CCCCCC"/>
-            </w:tcBorders>
-            <w:shd w:val="clear" w:color="auto" w:fill="FFFFFF"/>
-            <w:tcMar>
-              <w:top w:w="80" w:type="dxa"/>
-              <w:left w:w="120" w:type="dxa"/>
-              <w:bottom w:w="80" w:type="dxa"/>
-              <w:right w:w="120" w:type="dxa"/>
-            </w:tcMar>
-          </w:tcPr>
-          <w:p>
-            <w:r>
-              <w:rPr>
-                <w:i/>
-                <w:iCs/>
-                <w:color w:val="AAAAAA"/>
-                <w:sz w:val="20"/>
-                <w:szCs w:val="20"/>
-              </w:rPr>
-              <w:t>Estado del sistema antes de ejecutar el test</w:t>
-            </w:r>
-          </w:p>
-        </w:tc>
-      </w:tr>
-      <w:tr>
-        <w:tc>
-          <w:tcPr>
-            <w:tcW w:w="3000" w:type="dxa"/>
+              <w:t>Datos de entrada</w:t>
+            </w:r>
+          </w:p>
+        </w:tc>
+        <w:tc>
+          <w:tcPr>
+            <w:tcW w:w="4190" w:type="dxa"/>
+            <w:tcBorders>
+              <w:top w:val="single" w:sz="2" w:space="0" w:color="CCCCCC"/>
+              <w:left w:val="single" w:sz="2" w:space="0" w:color="CCCCCC"/>
+              <w:bottom w:val="single" w:sz="2" w:space="0" w:color="CCCCCC"/>
+              <w:right w:val="single" w:sz="2" w:space="0" w:color="CCCCCC"/>
+            </w:tcBorders>
+            <w:tcMar>
+              <w:top w:w="80" w:type="dxa"/>
+              <w:left w:w="120" w:type="dxa"/>
+              <w:bottom w:w="80" w:type="dxa"/>
+              <w:right w:w="120" w:type="dxa"/>
+            </w:tcMar>
+            <w:vAlign w:val="center"/>
+          </w:tcPr>
+          <w:p>
+            <w:pPr>
+              <w:rPr>
+                <w:sz w:val="20"/>
+                <w:szCs w:val="20"/>
+              </w:rPr>
+            </w:pPr>
+            <w:proofErr w:type="spellStart"/>
+            <w:r>
+              <w:rPr>
+                <w:color w:val="000000"/>
+                <w:sz w:val="20"/>
+                <w:szCs w:val="20"/>
+              </w:rPr>
+              <w:t>null</w:t>
+            </w:r>
+            <w:proofErr w:type="spellEnd"/>
+          </w:p>
+        </w:tc>
+      </w:tr>
+      <w:tr>
+        <w:tc>
+          <w:tcPr>
+            <w:tcW w:w="5448" w:type="dxa"/>
             <w:tcBorders>
               <w:top w:val="single" w:sz="1" w:space="0" w:color="CCCCCC"/>
               <w:left w:val="single" w:sz="1" w:space="0" w:color="CCCCCC"/>
@@ -13330,44 +13562,49 @@
                 <w:sz w:val="20"/>
                 <w:szCs w:val="20"/>
               </w:rPr>
-              <w:t>Datos de entrada</w:t>
-            </w:r>
-          </w:p>
-        </w:tc>
-        <w:tc>
-          <w:tcPr>
-            <w:tcW w:w="6638" w:type="dxa"/>
-            <w:tcBorders>
-              <w:top w:val="single" w:sz="1" w:space="0" w:color="CCCCCC"/>
-              <w:left w:val="single" w:sz="1" w:space="0" w:color="CCCCCC"/>
-              <w:bottom w:val="single" w:sz="1" w:space="0" w:color="CCCCCC"/>
-              <w:right w:val="single" w:sz="1" w:space="0" w:color="CCCCCC"/>
-            </w:tcBorders>
-            <w:tcMar>
-              <w:top w:w="80" w:type="dxa"/>
-              <w:left w:w="120" w:type="dxa"/>
-              <w:bottom w:w="80" w:type="dxa"/>
-              <w:right w:w="120" w:type="dxa"/>
-            </w:tcMar>
-          </w:tcPr>
-          <w:p>
-            <w:r>
-              <w:rPr>
-                <w:i/>
-                <w:iCs/>
-                <w:color w:val="AAAAAA"/>
-                <w:sz w:val="20"/>
-                <w:szCs w:val="20"/>
-              </w:rPr>
-              <w:t>Escribid los valores de entrada del test</w:t>
-            </w:r>
-          </w:p>
-        </w:tc>
-      </w:tr>
-      <w:tr>
-        <w:tc>
-          <w:tcPr>
-            <w:tcW w:w="3000" w:type="dxa"/>
+              <w:t>Resultado esperado</w:t>
+            </w:r>
+          </w:p>
+        </w:tc>
+        <w:tc>
+          <w:tcPr>
+            <w:tcW w:w="4190" w:type="dxa"/>
+            <w:tcBorders>
+              <w:top w:val="single" w:sz="2" w:space="0" w:color="CCCCCC"/>
+              <w:left w:val="single" w:sz="2" w:space="0" w:color="CCCCCC"/>
+              <w:bottom w:val="single" w:sz="2" w:space="0" w:color="CCCCCC"/>
+              <w:right w:val="single" w:sz="2" w:space="0" w:color="CCCCCC"/>
+            </w:tcBorders>
+            <w:tcMar>
+              <w:top w:w="80" w:type="dxa"/>
+              <w:left w:w="120" w:type="dxa"/>
+              <w:bottom w:w="80" w:type="dxa"/>
+              <w:right w:w="120" w:type="dxa"/>
+            </w:tcMar>
+            <w:vAlign w:val="center"/>
+          </w:tcPr>
+          <w:p>
+            <w:pPr>
+              <w:rPr>
+                <w:sz w:val="20"/>
+                <w:szCs w:val="20"/>
+              </w:rPr>
+            </w:pPr>
+            <w:r>
+              <w:rPr>
+                <w:color w:val="000000"/>
+                <w:sz w:val="20"/>
+                <w:szCs w:val="20"/>
+              </w:rPr>
+              <w:t>false</w:t>
+            </w:r>
+          </w:p>
+        </w:tc>
+      </w:tr>
+      <w:tr>
+        <w:tc>
+          <w:tcPr>
+            <w:tcW w:w="5448" w:type="dxa"/>
             <w:tcBorders>
               <w:top w:val="single" w:sz="1" w:space="0" w:color="CCCCCC"/>
               <w:left w:val="single" w:sz="1" w:space="0" w:color="CCCCCC"/>
@@ -13391,44 +13628,49 @@
                 <w:sz w:val="20"/>
                 <w:szCs w:val="20"/>
               </w:rPr>
-              <w:t>Resultado esperado</w:t>
-            </w:r>
-          </w:p>
-        </w:tc>
-        <w:tc>
-          <w:tcPr>
-            <w:tcW w:w="6638" w:type="dxa"/>
-            <w:tcBorders>
-              <w:top w:val="single" w:sz="1" w:space="0" w:color="CCCCCC"/>
-              <w:left w:val="single" w:sz="1" w:space="0" w:color="CCCCCC"/>
-              <w:bottom w:val="single" w:sz="1" w:space="0" w:color="CCCCCC"/>
-              <w:right w:val="single" w:sz="1" w:space="0" w:color="CCCCCC"/>
-            </w:tcBorders>
-            <w:tcMar>
-              <w:top w:w="80" w:type="dxa"/>
-              <w:left w:w="120" w:type="dxa"/>
-              <w:bottom w:w="80" w:type="dxa"/>
-              <w:right w:w="120" w:type="dxa"/>
-            </w:tcMar>
-          </w:tcPr>
-          <w:p>
-            <w:r>
-              <w:rPr>
-                <w:i/>
-                <w:iCs/>
-                <w:color w:val="AAAAAA"/>
-                <w:sz w:val="20"/>
-                <w:szCs w:val="20"/>
-              </w:rPr>
-              <w:t>Qué debería devolver o hacer el sistema si funciona correctamente</w:t>
-            </w:r>
-          </w:p>
-        </w:tc>
-      </w:tr>
-      <w:tr>
-        <w:tc>
-          <w:tcPr>
-            <w:tcW w:w="3000" w:type="dxa"/>
+              <w:t>Resultado obtenido</w:t>
+            </w:r>
+          </w:p>
+        </w:tc>
+        <w:tc>
+          <w:tcPr>
+            <w:tcW w:w="4190" w:type="dxa"/>
+            <w:tcBorders>
+              <w:top w:val="single" w:sz="2" w:space="0" w:color="CCCCCC"/>
+              <w:left w:val="single" w:sz="2" w:space="0" w:color="CCCCCC"/>
+              <w:bottom w:val="single" w:sz="2" w:space="0" w:color="CCCCCC"/>
+              <w:right w:val="single" w:sz="2" w:space="0" w:color="CCCCCC"/>
+            </w:tcBorders>
+            <w:tcMar>
+              <w:top w:w="80" w:type="dxa"/>
+              <w:left w:w="120" w:type="dxa"/>
+              <w:bottom w:w="80" w:type="dxa"/>
+              <w:right w:w="120" w:type="dxa"/>
+            </w:tcMar>
+            <w:vAlign w:val="center"/>
+          </w:tcPr>
+          <w:p>
+            <w:pPr>
+              <w:rPr>
+                <w:sz w:val="20"/>
+                <w:szCs w:val="20"/>
+              </w:rPr>
+            </w:pPr>
+            <w:r>
+              <w:rPr>
+                <w:color w:val="000000"/>
+                <w:sz w:val="20"/>
+                <w:szCs w:val="20"/>
+              </w:rPr>
+              <w:t>false</w:t>
+            </w:r>
+          </w:p>
+        </w:tc>
+      </w:tr>
+      <w:tr>
+        <w:tc>
+          <w:tcPr>
+            <w:tcW w:w="5448" w:type="dxa"/>
             <w:tcBorders>
               <w:top w:val="single" w:sz="1" w:space="0" w:color="CCCCCC"/>
               <w:left w:val="single" w:sz="1" w:space="0" w:color="CCCCCC"/>
@@ -13452,44 +13694,93 @@
                 <w:sz w:val="20"/>
                 <w:szCs w:val="20"/>
               </w:rPr>
-              <w:t>Resultado obtenido</w:t>
-            </w:r>
-          </w:p>
-        </w:tc>
-        <w:tc>
-          <w:tcPr>
-            <w:tcW w:w="6638" w:type="dxa"/>
-            <w:tcBorders>
-              <w:top w:val="single" w:sz="1" w:space="0" w:color="CCCCCC"/>
-              <w:left w:val="single" w:sz="1" w:space="0" w:color="CCCCCC"/>
-              <w:bottom w:val="single" w:sz="1" w:space="0" w:color="CCCCCC"/>
-              <w:right w:val="single" w:sz="1" w:space="0" w:color="CCCCCC"/>
-            </w:tcBorders>
-            <w:tcMar>
-              <w:top w:w="80" w:type="dxa"/>
-              <w:left w:w="120" w:type="dxa"/>
-              <w:bottom w:w="80" w:type="dxa"/>
-              <w:right w:w="120" w:type="dxa"/>
-            </w:tcMar>
-          </w:tcPr>
-          <w:p>
-            <w:r>
-              <w:rPr>
-                <w:i/>
-                <w:iCs/>
-                <w:color w:val="AAAAAA"/>
-                <w:sz w:val="20"/>
-                <w:szCs w:val="20"/>
-              </w:rPr>
-              <w:t>Qué devolvió o hizo realmente el sistema al ejecutar el test</w:t>
-            </w:r>
-          </w:p>
-        </w:tc>
-      </w:tr>
-      <w:tr>
-        <w:tc>
-          <w:tcPr>
-            <w:tcW w:w="3000" w:type="dxa"/>
+              <w:t xml:space="preserve">Estado </w:t>
+            </w:r>
+            <w:proofErr w:type="gramStart"/>
+            <w:r>
+              <w:rPr>
+                <w:b/>
+                <w:bCs/>
+                <w:color w:val="1A1A2E"/>
+                <w:sz w:val="20"/>
+                <w:szCs w:val="20"/>
+              </w:rPr>
+              <w:t>( Pasa</w:t>
+            </w:r>
+            <w:proofErr w:type="gramEnd"/>
+            <w:r>
+              <w:rPr>
+                <w:b/>
+                <w:bCs/>
+                <w:color w:val="1A1A2E"/>
+                <w:sz w:val="20"/>
+                <w:szCs w:val="20"/>
+              </w:rPr>
+              <w:t xml:space="preserve"> </w:t>
+            </w:r>
+            <w:proofErr w:type="gramStart"/>
+            <w:r>
+              <w:rPr>
+                <w:b/>
+                <w:bCs/>
+                <w:color w:val="1A1A2E"/>
+                <w:sz w:val="20"/>
+                <w:szCs w:val="20"/>
+              </w:rPr>
+              <w:t>/  Falla</w:t>
+            </w:r>
+            <w:proofErr w:type="gramEnd"/>
+            <w:r>
+              <w:rPr>
+                <w:b/>
+                <w:bCs/>
+                <w:color w:val="1A1A2E"/>
+                <w:sz w:val="20"/>
+                <w:szCs w:val="20"/>
+              </w:rPr>
+              <w:t>)</w:t>
+            </w:r>
+          </w:p>
+        </w:tc>
+        <w:tc>
+          <w:tcPr>
+            <w:tcW w:w="4190" w:type="dxa"/>
+            <w:tcBorders>
+              <w:top w:val="single" w:sz="2" w:space="0" w:color="CCCCCC"/>
+              <w:left w:val="single" w:sz="2" w:space="0" w:color="CCCCCC"/>
+              <w:bottom w:val="single" w:sz="2" w:space="0" w:color="CCCCCC"/>
+              <w:right w:val="single" w:sz="2" w:space="0" w:color="CCCCCC"/>
+            </w:tcBorders>
+            <w:tcMar>
+              <w:top w:w="80" w:type="dxa"/>
+              <w:left w:w="120" w:type="dxa"/>
+              <w:bottom w:w="80" w:type="dxa"/>
+              <w:right w:w="120" w:type="dxa"/>
+            </w:tcMar>
+            <w:vAlign w:val="center"/>
+          </w:tcPr>
+          <w:p>
+            <w:pPr>
+              <w:rPr>
+                <w:sz w:val="20"/>
+                <w:szCs w:val="20"/>
+              </w:rPr>
+            </w:pPr>
+            <w:r>
+              <w:rPr>
+                <w:color w:val="000000"/>
+                <w:sz w:val="20"/>
+                <w:szCs w:val="20"/>
+              </w:rPr>
+              <w:t>Pasa</w:t>
+            </w:r>
+          </w:p>
+        </w:tc>
+      </w:tr>
+      <w:tr>
+        <w:tc>
+          <w:tcPr>
+            <w:tcW w:w="5448" w:type="dxa"/>
             <w:tcBorders>
               <w:top w:val="single" w:sz="1" w:space="0" w:color="CCCCCC"/>
               <w:left w:val="single" w:sz="1" w:space="0" w:color="CCCCCC"/>
@@ -13513,160 +13804,42 @@
                 <w:sz w:val="20"/>
                 <w:szCs w:val="20"/>
               </w:rPr>
-              <w:t xml:space="preserve">Estado </w:t>
-            </w:r>
-            <w:proofErr w:type="gramStart"/>
-            <w:r>
-              <w:rPr>
-                <w:b/>
-                <w:bCs/>
-                <w:color w:val="1A1A2E"/>
-                <w:sz w:val="20"/>
-                <w:szCs w:val="20"/>
-              </w:rPr>
-              <w:t>( Pasa</w:t>
-            </w:r>
-            <w:proofErr w:type="gramEnd"/>
-            <w:r>
-              <w:rPr>
-                <w:b/>
-                <w:bCs/>
-                <w:color w:val="1A1A2E"/>
-                <w:sz w:val="20"/>
-                <w:szCs w:val="20"/>
-              </w:rPr>
-              <w:t xml:space="preserve"> </w:t>
-            </w:r>
-            <w:proofErr w:type="gramStart"/>
-            <w:r>
-              <w:rPr>
-                <w:b/>
-                <w:bCs/>
-                <w:color w:val="1A1A2E"/>
-                <w:sz w:val="20"/>
-                <w:szCs w:val="20"/>
-              </w:rPr>
-              <w:t>/  Falla</w:t>
-            </w:r>
-            <w:proofErr w:type="gramEnd"/>
-            <w:r>
-              <w:rPr>
-                <w:b/>
-                <w:bCs/>
-                <w:color w:val="1A1A2E"/>
-                <w:sz w:val="20"/>
-                <w:szCs w:val="20"/>
-              </w:rPr>
-              <w:t>)</w:t>
-            </w:r>
-          </w:p>
-        </w:tc>
-        <w:tc>
-          <w:tcPr>
-            <w:tcW w:w="6638" w:type="dxa"/>
-            <w:tcBorders>
-              <w:top w:val="single" w:sz="1" w:space="0" w:color="CCCCCC"/>
-              <w:left w:val="single" w:sz="1" w:space="0" w:color="CCCCCC"/>
-              <w:bottom w:val="single" w:sz="1" w:space="0" w:color="CCCCCC"/>
-              <w:right w:val="single" w:sz="1" w:space="0" w:color="CCCCCC"/>
-            </w:tcBorders>
-            <w:tcMar>
-              <w:top w:w="80" w:type="dxa"/>
-              <w:left w:w="120" w:type="dxa"/>
-              <w:bottom w:w="80" w:type="dxa"/>
-              <w:right w:w="120" w:type="dxa"/>
-            </w:tcMar>
-          </w:tcPr>
-          <w:p/>
-        </w:tc>
-      </w:tr>
-      <w:tr>
-        <w:tc>
-          <w:tcPr>
-            <w:tcW w:w="3000" w:type="dxa"/>
-            <w:tcBorders>
-              <w:top w:val="single" w:sz="1" w:space="0" w:color="CCCCCC"/>
-              <w:left w:val="single" w:sz="1" w:space="0" w:color="CCCCCC"/>
-              <w:bottom w:val="single" w:sz="1" w:space="0" w:color="CCCCCC"/>
-              <w:right w:val="single" w:sz="1" w:space="0" w:color="CCCCCC"/>
-            </w:tcBorders>
-            <w:shd w:val="clear" w:color="auto" w:fill="D6E4F0"/>
-            <w:tcMar>
-              <w:top w:w="80" w:type="dxa"/>
-              <w:left w:w="120" w:type="dxa"/>
-              <w:bottom w:w="80" w:type="dxa"/>
-              <w:right w:w="120" w:type="dxa"/>
-            </w:tcMar>
-          </w:tcPr>
-          <w:p>
-            <w:r>
-              <w:rPr>
-                <w:b/>
-                <w:bCs/>
-                <w:color w:val="1A1A2E"/>
-                <w:sz w:val="20"/>
-                <w:szCs w:val="20"/>
-              </w:rPr>
               <w:t>Observaciones / Defecto encontrado</w:t>
             </w:r>
           </w:p>
         </w:tc>
         <w:tc>
           <w:tcPr>
-            <w:tcW w:w="6638" w:type="dxa"/>
-            <w:tcBorders>
-              <w:top w:val="single" w:sz="1" w:space="0" w:color="CCCCCC"/>
-              <w:left w:val="single" w:sz="1" w:space="0" w:color="CCCCCC"/>
-              <w:bottom w:val="single" w:sz="1" w:space="0" w:color="CCCCCC"/>
-              <w:right w:val="single" w:sz="1" w:space="0" w:color="CCCCCC"/>
-            </w:tcBorders>
-            <w:tcMar>
-              <w:top w:w="80" w:type="dxa"/>
-              <w:left w:w="120" w:type="dxa"/>
-              <w:bottom w:w="80" w:type="dxa"/>
-              <w:right w:w="120" w:type="dxa"/>
-            </w:tcMar>
-          </w:tcPr>
-          <w:p>
-            <w:r>
-              <w:rPr>
-                <w:i/>
-                <w:iCs/>
-                <w:color w:val="AAAAAA"/>
-                <w:sz w:val="20"/>
-                <w:szCs w:val="20"/>
-              </w:rPr>
-              <w:t xml:space="preserve">Si el test falla, </w:t>
-            </w:r>
-            <w:proofErr w:type="spellStart"/>
-            <w:r>
-              <w:rPr>
-                <w:i/>
-                <w:iCs/>
-                <w:color w:val="AAAAAA"/>
-                <w:sz w:val="20"/>
-                <w:szCs w:val="20"/>
-              </w:rPr>
-              <w:t>describird</w:t>
-            </w:r>
-            <w:proofErr w:type="spellEnd"/>
-            <w:r>
-              <w:rPr>
-                <w:i/>
-                <w:iCs/>
-                <w:color w:val="AAAAAA"/>
-                <w:sz w:val="20"/>
-                <w:szCs w:val="20"/>
-              </w:rPr>
-              <w:t xml:space="preserve"> el defecto encontrado. Si pasa, escribid 'Ninguno'.</w:t>
-            </w:r>
-          </w:p>
+            <w:tcW w:w="4190" w:type="dxa"/>
+            <w:tcBorders>
+              <w:top w:val="single" w:sz="2" w:space="0" w:color="CCCCCC"/>
+              <w:left w:val="single" w:sz="2" w:space="0" w:color="CCCCCC"/>
+              <w:bottom w:val="single" w:sz="2" w:space="0" w:color="CCCCCC"/>
+              <w:right w:val="single" w:sz="2" w:space="0" w:color="CCCCCC"/>
+            </w:tcBorders>
+            <w:tcMar>
+              <w:top w:w="80" w:type="dxa"/>
+              <w:left w:w="120" w:type="dxa"/>
+              <w:bottom w:w="80" w:type="dxa"/>
+              <w:right w:w="120" w:type="dxa"/>
+            </w:tcMar>
+            <w:vAlign w:val="center"/>
+          </w:tcPr>
           <w:p>
             <w:pPr>
               <w:spacing w:after="80"/>
+              <w:rPr>
+                <w:sz w:val="20"/>
+                <w:szCs w:val="20"/>
+              </w:rPr>
             </w:pPr>
             <w:r>
-              <w:t xml:space="preserve"> </w:t>
+              <w:rPr>
+                <w:color w:val="000000"/>
+                <w:sz w:val="20"/>
+                <w:szCs w:val="20"/>
+              </w:rPr>
+              <w:t>Ninguno</w:t>
             </w:r>
           </w:p>
         </w:tc>
@@ -13701,11 +13874,11 @@
       <w:tr>
         <w:trPr>
           <w:gridAfter w:val="1"/>
-          <w:wAfter w:w="6638" w:type="dxa"/>
+          <w:wAfter w:w="4190" w:type="dxa"/>
         </w:trPr>
         <w:tc>
           <w:tcPr>
-            <w:tcW w:w="9638" w:type="dxa"/>
+            <w:tcW w:w="5448" w:type="dxa"/>
             <w:tcBorders>
               <w:top w:val="single" w:sz="1" w:space="0" w:color="CCCCCC"/>
               <w:left w:val="single" w:sz="1" w:space="0" w:color="CCCCCC"/>
@@ -13736,7 +13909,7 @@
       <w:tr>
         <w:tc>
           <w:tcPr>
-            <w:tcW w:w="3000" w:type="dxa"/>
+            <w:tcW w:w="5448" w:type="dxa"/>
             <w:tcBorders>
               <w:top w:val="single" w:sz="1" w:space="0" w:color="CCCCCC"/>
               <w:left w:val="single" w:sz="1" w:space="0" w:color="CCCCCC"/>
@@ -13766,39 +13939,51 @@
         </w:tc>
         <w:tc>
           <w:tcPr>
-            <w:tcW w:w="6638" w:type="dxa"/>
-            <w:tcBorders>
-              <w:top w:val="single" w:sz="1" w:space="0" w:color="CCCCCC"/>
-              <w:left w:val="single" w:sz="1" w:space="0" w:color="CCCCCC"/>
-              <w:bottom w:val="single" w:sz="1" w:space="0" w:color="CCCCCC"/>
-              <w:right w:val="single" w:sz="1" w:space="0" w:color="CCCCCC"/>
-            </w:tcBorders>
-            <w:shd w:val="clear" w:color="auto" w:fill="FFFFFF"/>
-            <w:tcMar>
-              <w:top w:w="80" w:type="dxa"/>
-              <w:left w:w="120" w:type="dxa"/>
-              <w:bottom w:w="80" w:type="dxa"/>
-              <w:right w:w="120" w:type="dxa"/>
-            </w:tcMar>
-          </w:tcPr>
-          <w:p>
-            <w:r>
-              <w:rPr>
-                <w:i/>
-                <w:iCs/>
-                <w:color w:val="AAAAAA"/>
-                <w:sz w:val="20"/>
-                <w:szCs w:val="20"/>
-              </w:rPr>
-              <w:t>TC-011</w:t>
-            </w:r>
-          </w:p>
-        </w:tc>
-      </w:tr>
-      <w:tr>
-        <w:tc>
-          <w:tcPr>
-            <w:tcW w:w="3000" w:type="dxa"/>
+            <w:tcW w:w="4190" w:type="dxa"/>
+            <w:tcBorders>
+              <w:top w:val="single" w:sz="2" w:space="0" w:color="CCCCCC"/>
+              <w:left w:val="single" w:sz="2" w:space="0" w:color="CCCCCC"/>
+              <w:bottom w:val="single" w:sz="2" w:space="0" w:color="CCCCCC"/>
+              <w:right w:val="single" w:sz="2" w:space="0" w:color="CCCCCC"/>
+            </w:tcBorders>
+            <w:tcMar>
+              <w:top w:w="80" w:type="dxa"/>
+              <w:left w:w="120" w:type="dxa"/>
+              <w:bottom w:w="80" w:type="dxa"/>
+              <w:right w:w="120" w:type="dxa"/>
+            </w:tcMar>
+            <w:vAlign w:val="center"/>
+          </w:tcPr>
+          <w:p>
+            <w:pPr>
+              <w:rPr>
+                <w:sz w:val="20"/>
+                <w:szCs w:val="20"/>
+              </w:rPr>
+            </w:pPr>
+            <w:r>
+              <w:rPr>
+                <w:color w:val="000000"/>
+                <w:sz w:val="20"/>
+                <w:szCs w:val="20"/>
+              </w:rPr>
+              <w:t>TC-0</w:t>
+            </w:r>
+            <w:r>
+              <w:rPr>
+                <w:color w:val="000000"/>
+                <w:sz w:val="20"/>
+                <w:szCs w:val="20"/>
+              </w:rPr>
+              <w:t>11</w:t>
+            </w:r>
+          </w:p>
+        </w:tc>
+      </w:tr>
+      <w:tr>
+        <w:tc>
+          <w:tcPr>
+            <w:tcW w:w="5448" w:type="dxa"/>
             <w:tcBorders>
               <w:top w:val="single" w:sz="1" w:space="0" w:color="CCCCCC"/>
               <w:left w:val="single" w:sz="1" w:space="0" w:color="CCCCCC"/>
@@ -13828,39 +14013,43 @@
         </w:tc>
         <w:tc>
           <w:tcPr>
-            <w:tcW w:w="6638" w:type="dxa"/>
-            <w:tcBorders>
-              <w:top w:val="single" w:sz="1" w:space="0" w:color="CCCCCC"/>
-              <w:left w:val="single" w:sz="1" w:space="0" w:color="CCCCCC"/>
-              <w:bottom w:val="single" w:sz="1" w:space="0" w:color="CCCCCC"/>
-              <w:right w:val="single" w:sz="1" w:space="0" w:color="CCCCCC"/>
-            </w:tcBorders>
-            <w:shd w:val="clear" w:color="auto" w:fill="FFFFFF"/>
-            <w:tcMar>
-              <w:top w:w="80" w:type="dxa"/>
-              <w:left w:w="120" w:type="dxa"/>
-              <w:bottom w:w="80" w:type="dxa"/>
-              <w:right w:w="120" w:type="dxa"/>
-            </w:tcMar>
-          </w:tcPr>
-          <w:p>
-            <w:r>
-              <w:rPr>
-                <w:i/>
-                <w:iCs/>
-                <w:color w:val="AAAAAA"/>
-                <w:sz w:val="20"/>
-                <w:szCs w:val="20"/>
-              </w:rPr>
-              <w:t>Describid brevemente qué comprueba este test</w:t>
-            </w:r>
-          </w:p>
-        </w:tc>
-      </w:tr>
-      <w:tr>
-        <w:tc>
-          <w:tcPr>
-            <w:tcW w:w="3000" w:type="dxa"/>
+            <w:tcW w:w="4190" w:type="dxa"/>
+            <w:tcBorders>
+              <w:top w:val="single" w:sz="2" w:space="0" w:color="CCCCCC"/>
+              <w:left w:val="single" w:sz="2" w:space="0" w:color="CCCCCC"/>
+              <w:bottom w:val="single" w:sz="2" w:space="0" w:color="CCCCCC"/>
+              <w:right w:val="single" w:sz="2" w:space="0" w:color="CCCCCC"/>
+            </w:tcBorders>
+            <w:tcMar>
+              <w:top w:w="80" w:type="dxa"/>
+              <w:left w:w="120" w:type="dxa"/>
+              <w:bottom w:w="80" w:type="dxa"/>
+              <w:right w:w="120" w:type="dxa"/>
+            </w:tcMar>
+            <w:vAlign w:val="center"/>
+          </w:tcPr>
+          <w:p>
+            <w:pPr>
+              <w:rPr>
+                <w:sz w:val="20"/>
+                <w:szCs w:val="20"/>
+              </w:rPr>
+            </w:pPr>
+            <w:r>
+              <w:rPr>
+                <w:color w:val="000000"/>
+                <w:sz w:val="20"/>
+                <w:szCs w:val="20"/>
+              </w:rPr>
+              <w:t>Contraseña con 7 caracteres debe devolver false (valor límite)</w:t>
+            </w:r>
+          </w:p>
+        </w:tc>
+      </w:tr>
+      <w:tr>
+        <w:tc>
+          <w:tcPr>
+            <w:tcW w:w="5448" w:type="dxa"/>
             <w:tcBorders>
               <w:top w:val="single" w:sz="1" w:space="0" w:color="CCCCCC"/>
               <w:left w:val="single" w:sz="1" w:space="0" w:color="CCCCCC"/>
@@ -13890,73 +14079,203 @@
         </w:tc>
         <w:tc>
           <w:tcPr>
-            <w:tcW w:w="6638" w:type="dxa"/>
-            <w:tcBorders>
-              <w:top w:val="single" w:sz="1" w:space="0" w:color="CCCCCC"/>
-              <w:left w:val="single" w:sz="1" w:space="0" w:color="CCCCCC"/>
-              <w:bottom w:val="single" w:sz="1" w:space="0" w:color="CCCCCC"/>
-              <w:right w:val="single" w:sz="1" w:space="0" w:color="CCCCCC"/>
-            </w:tcBorders>
-            <w:shd w:val="clear" w:color="auto" w:fill="FFFFFF"/>
-            <w:tcMar>
-              <w:top w:w="80" w:type="dxa"/>
-              <w:left w:w="120" w:type="dxa"/>
-              <w:bottom w:w="80" w:type="dxa"/>
-              <w:right w:w="120" w:type="dxa"/>
-            </w:tcMar>
-          </w:tcPr>
-          <w:p>
+            <w:tcW w:w="4190" w:type="dxa"/>
+            <w:tcBorders>
+              <w:top w:val="single" w:sz="2" w:space="0" w:color="CCCCCC"/>
+              <w:left w:val="single" w:sz="2" w:space="0" w:color="CCCCCC"/>
+              <w:bottom w:val="single" w:sz="2" w:space="0" w:color="CCCCCC"/>
+              <w:right w:val="single" w:sz="2" w:space="0" w:color="CCCCCC"/>
+            </w:tcBorders>
+            <w:tcMar>
+              <w:top w:w="80" w:type="dxa"/>
+              <w:left w:w="120" w:type="dxa"/>
+              <w:bottom w:w="80" w:type="dxa"/>
+              <w:right w:w="120" w:type="dxa"/>
+            </w:tcMar>
+            <w:vAlign w:val="center"/>
+          </w:tcPr>
+          <w:p>
+            <w:pPr>
+              <w:rPr>
+                <w:sz w:val="20"/>
+                <w:szCs w:val="20"/>
+              </w:rPr>
+            </w:pPr>
             <w:proofErr w:type="spellStart"/>
             <w:r>
               <w:rPr>
-                <w:i/>
-                <w:iCs/>
-                <w:color w:val="AAAAAA"/>
-                <w:sz w:val="20"/>
-                <w:szCs w:val="20"/>
-              </w:rPr>
-              <w:t>Ej</w:t>
+                <w:color w:val="000000"/>
+                <w:sz w:val="20"/>
+                <w:szCs w:val="20"/>
+              </w:rPr>
+              <w:t>ValidadorFormulario.validarPassword</w:t>
             </w:r>
             <w:proofErr w:type="spellEnd"/>
             <w:r>
               <w:rPr>
-                <w:i/>
-                <w:iCs/>
-                <w:color w:val="AAAAAA"/>
-                <w:sz w:val="20"/>
-                <w:szCs w:val="20"/>
-              </w:rPr>
-              <w:t xml:space="preserve">: </w:t>
+                <w:color w:val="000000"/>
+                <w:sz w:val="20"/>
+                <w:szCs w:val="20"/>
+              </w:rPr>
+              <w:t>()</w:t>
+            </w:r>
+          </w:p>
+        </w:tc>
+      </w:tr>
+      <w:tr>
+        <w:tc>
+          <w:tcPr>
+            <w:tcW w:w="5448" w:type="dxa"/>
+            <w:tcBorders>
+              <w:top w:val="single" w:sz="1" w:space="0" w:color="CCCCCC"/>
+              <w:left w:val="single" w:sz="1" w:space="0" w:color="CCCCCC"/>
+              <w:bottom w:val="single" w:sz="1" w:space="0" w:color="CCCCCC"/>
+              <w:right w:val="single" w:sz="1" w:space="0" w:color="CCCCCC"/>
+            </w:tcBorders>
+            <w:shd w:val="clear" w:color="auto" w:fill="D6E4F0"/>
+            <w:tcMar>
+              <w:top w:w="80" w:type="dxa"/>
+              <w:left w:w="120" w:type="dxa"/>
+              <w:bottom w:w="80" w:type="dxa"/>
+              <w:right w:w="120" w:type="dxa"/>
+            </w:tcMar>
+          </w:tcPr>
+          <w:p>
+            <w:r>
+              <w:rPr>
+                <w:b/>
+                <w:bCs/>
+                <w:color w:val="1A1A2E"/>
+                <w:sz w:val="20"/>
+                <w:szCs w:val="20"/>
+              </w:rPr>
+              <w:t>Técnica de diseño</w:t>
+            </w:r>
+          </w:p>
+        </w:tc>
+        <w:tc>
+          <w:tcPr>
+            <w:tcW w:w="4190" w:type="dxa"/>
+            <w:tcBorders>
+              <w:top w:val="single" w:sz="2" w:space="0" w:color="CCCCCC"/>
+              <w:left w:val="single" w:sz="2" w:space="0" w:color="CCCCCC"/>
+              <w:bottom w:val="single" w:sz="2" w:space="0" w:color="CCCCCC"/>
+              <w:right w:val="single" w:sz="2" w:space="0" w:color="CCCCCC"/>
+            </w:tcBorders>
+            <w:tcMar>
+              <w:top w:w="80" w:type="dxa"/>
+              <w:left w:w="120" w:type="dxa"/>
+              <w:bottom w:w="80" w:type="dxa"/>
+              <w:right w:w="120" w:type="dxa"/>
+            </w:tcMar>
+            <w:vAlign w:val="center"/>
+          </w:tcPr>
+          <w:p>
+            <w:pPr>
+              <w:rPr>
+                <w:sz w:val="20"/>
+                <w:szCs w:val="20"/>
+              </w:rPr>
+            </w:pPr>
+            <w:r>
+              <w:rPr>
+                <w:color w:val="000000"/>
+                <w:sz w:val="20"/>
+                <w:szCs w:val="20"/>
+              </w:rPr>
+              <w:t>Caja Negra – Valor límite inferior</w:t>
+            </w:r>
+          </w:p>
+        </w:tc>
+      </w:tr>
+      <w:tr>
+        <w:tc>
+          <w:tcPr>
+            <w:tcW w:w="5448" w:type="dxa"/>
+            <w:tcBorders>
+              <w:top w:val="single" w:sz="1" w:space="0" w:color="CCCCCC"/>
+              <w:left w:val="single" w:sz="1" w:space="0" w:color="CCCCCC"/>
+              <w:bottom w:val="single" w:sz="1" w:space="0" w:color="CCCCCC"/>
+              <w:right w:val="single" w:sz="1" w:space="0" w:color="CCCCCC"/>
+            </w:tcBorders>
+            <w:shd w:val="clear" w:color="auto" w:fill="D6E4F0"/>
+            <w:tcMar>
+              <w:top w:w="80" w:type="dxa"/>
+              <w:left w:w="120" w:type="dxa"/>
+              <w:bottom w:w="80" w:type="dxa"/>
+              <w:right w:w="120" w:type="dxa"/>
+            </w:tcMar>
+          </w:tcPr>
+          <w:p>
+            <w:r>
+              <w:rPr>
+                <w:b/>
+                <w:bCs/>
+                <w:color w:val="1A1A2E"/>
+                <w:sz w:val="20"/>
+                <w:szCs w:val="20"/>
+              </w:rPr>
+              <w:t>Precondiciones</w:t>
+            </w:r>
+          </w:p>
+        </w:tc>
+        <w:tc>
+          <w:tcPr>
+            <w:tcW w:w="4190" w:type="dxa"/>
+            <w:tcBorders>
+              <w:top w:val="single" w:sz="2" w:space="0" w:color="CCCCCC"/>
+              <w:left w:val="single" w:sz="2" w:space="0" w:color="CCCCCC"/>
+              <w:bottom w:val="single" w:sz="2" w:space="0" w:color="CCCCCC"/>
+              <w:right w:val="single" w:sz="2" w:space="0" w:color="CCCCCC"/>
+            </w:tcBorders>
+            <w:tcMar>
+              <w:top w:w="80" w:type="dxa"/>
+              <w:left w:w="120" w:type="dxa"/>
+              <w:bottom w:w="80" w:type="dxa"/>
+              <w:right w:w="120" w:type="dxa"/>
+            </w:tcMar>
+            <w:vAlign w:val="center"/>
+          </w:tcPr>
+          <w:p>
+            <w:pPr>
+              <w:rPr>
+                <w:sz w:val="20"/>
+                <w:szCs w:val="20"/>
+              </w:rPr>
+            </w:pPr>
+            <w:r>
+              <w:rPr>
+                <w:color w:val="000000"/>
+                <w:sz w:val="20"/>
+                <w:szCs w:val="20"/>
+              </w:rPr>
+              <w:t xml:space="preserve">Instancia de </w:t>
             </w:r>
             <w:proofErr w:type="spellStart"/>
             <w:r>
               <w:rPr>
-                <w:i/>
-                <w:iCs/>
-                <w:color w:val="AAAAAA"/>
-                <w:sz w:val="20"/>
-                <w:szCs w:val="20"/>
-              </w:rPr>
-              <w:t>Calculadora.dividir</w:t>
+                <w:color w:val="000000"/>
+                <w:sz w:val="20"/>
+                <w:szCs w:val="20"/>
+              </w:rPr>
+              <w:t>ValidadorFormulario</w:t>
             </w:r>
             <w:proofErr w:type="spellEnd"/>
             <w:r>
               <w:rPr>
-                <w:i/>
-                <w:iCs/>
-                <w:color w:val="AAAAAA"/>
-                <w:sz w:val="20"/>
-                <w:szCs w:val="20"/>
-              </w:rPr>
-              <w:t>()</w:t>
-            </w:r>
-          </w:p>
-        </w:tc>
-      </w:tr>
-      <w:tr>
-        <w:tc>
-          <w:tcPr>
-            <w:tcW w:w="3000" w:type="dxa"/>
+                <w:color w:val="000000"/>
+                <w:sz w:val="20"/>
+                <w:szCs w:val="20"/>
+              </w:rPr>
+              <w:t xml:space="preserve"> creada (@BeforeEach)</w:t>
+            </w:r>
+          </w:p>
+        </w:tc>
+      </w:tr>
+      <w:tr>
+        <w:tc>
+          <w:tcPr>
+            <w:tcW w:w="5448" w:type="dxa"/>
             <w:tcBorders>
               <w:top w:val="single" w:sz="1" w:space="0" w:color="CCCCCC"/>
               <w:left w:val="single" w:sz="1" w:space="0" w:color="CCCCCC"/>
@@ -13980,45 +14299,67 @@
                 <w:sz w:val="20"/>
                 <w:szCs w:val="20"/>
               </w:rPr>
-              <w:t>Técnica de diseño</w:t>
-            </w:r>
-          </w:p>
-        </w:tc>
-        <w:tc>
-          <w:tcPr>
-            <w:tcW w:w="6638" w:type="dxa"/>
-            <w:tcBorders>
-              <w:top w:val="single" w:sz="1" w:space="0" w:color="CCCCCC"/>
-              <w:left w:val="single" w:sz="1" w:space="0" w:color="CCCCCC"/>
-              <w:bottom w:val="single" w:sz="1" w:space="0" w:color="CCCCCC"/>
-              <w:right w:val="single" w:sz="1" w:space="0" w:color="CCCCCC"/>
-            </w:tcBorders>
-            <w:shd w:val="clear" w:color="auto" w:fill="FFFFFF"/>
-            <w:tcMar>
-              <w:top w:w="80" w:type="dxa"/>
-              <w:left w:w="120" w:type="dxa"/>
-              <w:bottom w:w="80" w:type="dxa"/>
-              <w:right w:w="120" w:type="dxa"/>
-            </w:tcMar>
-          </w:tcPr>
-          <w:p>
-            <w:r>
-              <w:rPr>
-                <w:i/>
-                <w:iCs/>
-                <w:color w:val="AAAAAA"/>
-                <w:sz w:val="20"/>
-                <w:szCs w:val="20"/>
-              </w:rPr>
-              <w:t>Caja negra / Caja blanca / Valores límite / Particiones equivalencia</w:t>
-            </w:r>
-          </w:p>
-        </w:tc>
-      </w:tr>
-      <w:tr>
-        <w:tc>
-          <w:tcPr>
-            <w:tcW w:w="3000" w:type="dxa"/>
+              <w:t>Datos de entrada</w:t>
+            </w:r>
+          </w:p>
+        </w:tc>
+        <w:tc>
+          <w:tcPr>
+            <w:tcW w:w="4190" w:type="dxa"/>
+            <w:tcBorders>
+              <w:top w:val="single" w:sz="2" w:space="0" w:color="CCCCCC"/>
+              <w:left w:val="single" w:sz="2" w:space="0" w:color="CCCCCC"/>
+              <w:bottom w:val="single" w:sz="2" w:space="0" w:color="CCCCCC"/>
+              <w:right w:val="single" w:sz="2" w:space="0" w:color="CCCCCC"/>
+            </w:tcBorders>
+            <w:tcMar>
+              <w:top w:w="80" w:type="dxa"/>
+              <w:left w:w="120" w:type="dxa"/>
+              <w:bottom w:w="80" w:type="dxa"/>
+              <w:right w:w="120" w:type="dxa"/>
+            </w:tcMar>
+            <w:vAlign w:val="center"/>
+          </w:tcPr>
+          <w:p>
+            <w:pPr>
+              <w:rPr>
+                <w:sz w:val="20"/>
+                <w:szCs w:val="20"/>
+              </w:rPr>
+            </w:pPr>
+            <w:r>
+              <w:rPr>
+                <w:color w:val="000000"/>
+                <w:sz w:val="20"/>
+                <w:szCs w:val="20"/>
+              </w:rPr>
+              <w:t xml:space="preserve">"Abcde1f" (7 </w:t>
+            </w:r>
+            <w:proofErr w:type="spellStart"/>
+            <w:r>
+              <w:rPr>
+                <w:color w:val="000000"/>
+                <w:sz w:val="20"/>
+                <w:szCs w:val="20"/>
+              </w:rPr>
+              <w:t>chars</w:t>
+            </w:r>
+            <w:proofErr w:type="spellEnd"/>
+            <w:r>
+              <w:rPr>
+                <w:color w:val="000000"/>
+                <w:sz w:val="20"/>
+                <w:szCs w:val="20"/>
+              </w:rPr>
+              <w:t>)</w:t>
+            </w:r>
+          </w:p>
+        </w:tc>
+      </w:tr>
+      <w:tr>
+        <w:tc>
+          <w:tcPr>
+            <w:tcW w:w="5448" w:type="dxa"/>
             <w:tcBorders>
               <w:top w:val="single" w:sz="1" w:space="0" w:color="CCCCCC"/>
               <w:left w:val="single" w:sz="1" w:space="0" w:color="CCCCCC"/>
@@ -14042,45 +14383,49 @@
                 <w:sz w:val="20"/>
                 <w:szCs w:val="20"/>
               </w:rPr>
-              <w:t>Precondiciones</w:t>
-            </w:r>
-          </w:p>
-        </w:tc>
-        <w:tc>
-          <w:tcPr>
-            <w:tcW w:w="6638" w:type="dxa"/>
-            <w:tcBorders>
-              <w:top w:val="single" w:sz="1" w:space="0" w:color="CCCCCC"/>
-              <w:left w:val="single" w:sz="1" w:space="0" w:color="CCCCCC"/>
-              <w:bottom w:val="single" w:sz="1" w:space="0" w:color="CCCCCC"/>
-              <w:right w:val="single" w:sz="1" w:space="0" w:color="CCCCCC"/>
-            </w:tcBorders>
-            <w:shd w:val="clear" w:color="auto" w:fill="FFFFFF"/>
-            <w:tcMar>
-              <w:top w:w="80" w:type="dxa"/>
-              <w:left w:w="120" w:type="dxa"/>
-              <w:bottom w:w="80" w:type="dxa"/>
-              <w:right w:w="120" w:type="dxa"/>
-            </w:tcMar>
-          </w:tcPr>
-          <w:p>
-            <w:r>
-              <w:rPr>
-                <w:i/>
-                <w:iCs/>
-                <w:color w:val="AAAAAA"/>
-                <w:sz w:val="20"/>
-                <w:szCs w:val="20"/>
-              </w:rPr>
-              <w:t>Estado del sistema antes de ejecutar el test</w:t>
-            </w:r>
-          </w:p>
-        </w:tc>
-      </w:tr>
-      <w:tr>
-        <w:tc>
-          <w:tcPr>
-            <w:tcW w:w="3000" w:type="dxa"/>
+              <w:t>Resultado esperado</w:t>
+            </w:r>
+          </w:p>
+        </w:tc>
+        <w:tc>
+          <w:tcPr>
+            <w:tcW w:w="4190" w:type="dxa"/>
+            <w:tcBorders>
+              <w:top w:val="single" w:sz="2" w:space="0" w:color="CCCCCC"/>
+              <w:left w:val="single" w:sz="2" w:space="0" w:color="CCCCCC"/>
+              <w:bottom w:val="single" w:sz="2" w:space="0" w:color="CCCCCC"/>
+              <w:right w:val="single" w:sz="2" w:space="0" w:color="CCCCCC"/>
+            </w:tcBorders>
+            <w:tcMar>
+              <w:top w:w="80" w:type="dxa"/>
+              <w:left w:w="120" w:type="dxa"/>
+              <w:bottom w:w="80" w:type="dxa"/>
+              <w:right w:w="120" w:type="dxa"/>
+            </w:tcMar>
+            <w:vAlign w:val="center"/>
+          </w:tcPr>
+          <w:p>
+            <w:pPr>
+              <w:rPr>
+                <w:sz w:val="20"/>
+                <w:szCs w:val="20"/>
+              </w:rPr>
+            </w:pPr>
+            <w:r>
+              <w:rPr>
+                <w:color w:val="000000"/>
+                <w:sz w:val="20"/>
+                <w:szCs w:val="20"/>
+              </w:rPr>
+              <w:t>false</w:t>
+            </w:r>
+          </w:p>
+        </w:tc>
+      </w:tr>
+      <w:tr>
+        <w:tc>
+          <w:tcPr>
+            <w:tcW w:w="5448" w:type="dxa"/>
             <w:tcBorders>
               <w:top w:val="single" w:sz="1" w:space="0" w:color="CCCCCC"/>
               <w:left w:val="single" w:sz="1" w:space="0" w:color="CCCCCC"/>
@@ -14104,44 +14449,49 @@
                 <w:sz w:val="20"/>
                 <w:szCs w:val="20"/>
               </w:rPr>
-              <w:t>Datos de entrada</w:t>
-            </w:r>
-          </w:p>
-        </w:tc>
-        <w:tc>
-          <w:tcPr>
-            <w:tcW w:w="6638" w:type="dxa"/>
-            <w:tcBorders>
-              <w:top w:val="single" w:sz="1" w:space="0" w:color="CCCCCC"/>
-              <w:left w:val="single" w:sz="1" w:space="0" w:color="CCCCCC"/>
-              <w:bottom w:val="single" w:sz="1" w:space="0" w:color="CCCCCC"/>
-              <w:right w:val="single" w:sz="1" w:space="0" w:color="CCCCCC"/>
-            </w:tcBorders>
-            <w:tcMar>
-              <w:top w:w="80" w:type="dxa"/>
-              <w:left w:w="120" w:type="dxa"/>
-              <w:bottom w:w="80" w:type="dxa"/>
-              <w:right w:w="120" w:type="dxa"/>
-            </w:tcMar>
-          </w:tcPr>
-          <w:p>
-            <w:r>
-              <w:rPr>
-                <w:i/>
-                <w:iCs/>
-                <w:color w:val="AAAAAA"/>
-                <w:sz w:val="20"/>
-                <w:szCs w:val="20"/>
-              </w:rPr>
-              <w:t>Escribid los valores de entrada del test</w:t>
-            </w:r>
-          </w:p>
-        </w:tc>
-      </w:tr>
-      <w:tr>
-        <w:tc>
-          <w:tcPr>
-            <w:tcW w:w="3000" w:type="dxa"/>
+              <w:t>Resultado obtenido</w:t>
+            </w:r>
+          </w:p>
+        </w:tc>
+        <w:tc>
+          <w:tcPr>
+            <w:tcW w:w="4190" w:type="dxa"/>
+            <w:tcBorders>
+              <w:top w:val="single" w:sz="2" w:space="0" w:color="CCCCCC"/>
+              <w:left w:val="single" w:sz="2" w:space="0" w:color="CCCCCC"/>
+              <w:bottom w:val="single" w:sz="2" w:space="0" w:color="CCCCCC"/>
+              <w:right w:val="single" w:sz="2" w:space="0" w:color="CCCCCC"/>
+            </w:tcBorders>
+            <w:tcMar>
+              <w:top w:w="80" w:type="dxa"/>
+              <w:left w:w="120" w:type="dxa"/>
+              <w:bottom w:w="80" w:type="dxa"/>
+              <w:right w:w="120" w:type="dxa"/>
+            </w:tcMar>
+            <w:vAlign w:val="center"/>
+          </w:tcPr>
+          <w:p>
+            <w:pPr>
+              <w:rPr>
+                <w:sz w:val="20"/>
+                <w:szCs w:val="20"/>
+              </w:rPr>
+            </w:pPr>
+            <w:r>
+              <w:rPr>
+                <w:color w:val="000000"/>
+                <w:sz w:val="20"/>
+                <w:szCs w:val="20"/>
+              </w:rPr>
+              <w:t>false</w:t>
+            </w:r>
+          </w:p>
+        </w:tc>
+      </w:tr>
+      <w:tr>
+        <w:tc>
+          <w:tcPr>
+            <w:tcW w:w="5448" w:type="dxa"/>
             <w:tcBorders>
               <w:top w:val="single" w:sz="1" w:space="0" w:color="CCCCCC"/>
               <w:left w:val="single" w:sz="1" w:space="0" w:color="CCCCCC"/>
@@ -14165,44 +14515,93 @@
                 <w:sz w:val="20"/>
                 <w:szCs w:val="20"/>
               </w:rPr>
-              <w:t>Resultado esperado</w:t>
-            </w:r>
-          </w:p>
-        </w:tc>
-        <w:tc>
-          <w:tcPr>
-            <w:tcW w:w="6638" w:type="dxa"/>
-            <w:tcBorders>
-              <w:top w:val="single" w:sz="1" w:space="0" w:color="CCCCCC"/>
-              <w:left w:val="single" w:sz="1" w:space="0" w:color="CCCCCC"/>
-              <w:bottom w:val="single" w:sz="1" w:space="0" w:color="CCCCCC"/>
-              <w:right w:val="single" w:sz="1" w:space="0" w:color="CCCCCC"/>
-            </w:tcBorders>
-            <w:tcMar>
-              <w:top w:w="80" w:type="dxa"/>
-              <w:left w:w="120" w:type="dxa"/>
-              <w:bottom w:w="80" w:type="dxa"/>
-              <w:right w:w="120" w:type="dxa"/>
-            </w:tcMar>
-          </w:tcPr>
-          <w:p>
-            <w:r>
-              <w:rPr>
-                <w:i/>
-                <w:iCs/>
-                <w:color w:val="AAAAAA"/>
-                <w:sz w:val="20"/>
-                <w:szCs w:val="20"/>
-              </w:rPr>
-              <w:t>Qué debería devolver o hacer el sistema si funciona correctamente</w:t>
-            </w:r>
-          </w:p>
-        </w:tc>
-      </w:tr>
-      <w:tr>
-        <w:tc>
-          <w:tcPr>
-            <w:tcW w:w="3000" w:type="dxa"/>
+              <w:t xml:space="preserve">Estado </w:t>
+            </w:r>
+            <w:proofErr w:type="gramStart"/>
+            <w:r>
+              <w:rPr>
+                <w:b/>
+                <w:bCs/>
+                <w:color w:val="1A1A2E"/>
+                <w:sz w:val="20"/>
+                <w:szCs w:val="20"/>
+              </w:rPr>
+              <w:t>( Pasa</w:t>
+            </w:r>
+            <w:proofErr w:type="gramEnd"/>
+            <w:r>
+              <w:rPr>
+                <w:b/>
+                <w:bCs/>
+                <w:color w:val="1A1A2E"/>
+                <w:sz w:val="20"/>
+                <w:szCs w:val="20"/>
+              </w:rPr>
+              <w:t xml:space="preserve"> </w:t>
+            </w:r>
+            <w:proofErr w:type="gramStart"/>
+            <w:r>
+              <w:rPr>
+                <w:b/>
+                <w:bCs/>
+                <w:color w:val="1A1A2E"/>
+                <w:sz w:val="20"/>
+                <w:szCs w:val="20"/>
+              </w:rPr>
+              <w:t>/  Falla</w:t>
+            </w:r>
+            <w:proofErr w:type="gramEnd"/>
+            <w:r>
+              <w:rPr>
+                <w:b/>
+                <w:bCs/>
+                <w:color w:val="1A1A2E"/>
+                <w:sz w:val="20"/>
+                <w:szCs w:val="20"/>
+              </w:rPr>
+              <w:t>)</w:t>
+            </w:r>
+          </w:p>
+        </w:tc>
+        <w:tc>
+          <w:tcPr>
+            <w:tcW w:w="4190" w:type="dxa"/>
+            <w:tcBorders>
+              <w:top w:val="single" w:sz="2" w:space="0" w:color="CCCCCC"/>
+              <w:left w:val="single" w:sz="2" w:space="0" w:color="CCCCCC"/>
+              <w:bottom w:val="single" w:sz="2" w:space="0" w:color="CCCCCC"/>
+              <w:right w:val="single" w:sz="2" w:space="0" w:color="CCCCCC"/>
+            </w:tcBorders>
+            <w:tcMar>
+              <w:top w:w="80" w:type="dxa"/>
+              <w:left w:w="120" w:type="dxa"/>
+              <w:bottom w:w="80" w:type="dxa"/>
+              <w:right w:w="120" w:type="dxa"/>
+            </w:tcMar>
+            <w:vAlign w:val="center"/>
+          </w:tcPr>
+          <w:p>
+            <w:pPr>
+              <w:rPr>
+                <w:sz w:val="20"/>
+                <w:szCs w:val="20"/>
+              </w:rPr>
+            </w:pPr>
+            <w:r>
+              <w:rPr>
+                <w:color w:val="000000"/>
+                <w:sz w:val="20"/>
+                <w:szCs w:val="20"/>
+              </w:rPr>
+              <w:t>Pasa</w:t>
+            </w:r>
+          </w:p>
+        </w:tc>
+      </w:tr>
+      <w:tr>
+        <w:tc>
+          <w:tcPr>
+            <w:tcW w:w="5448" w:type="dxa"/>
             <w:tcBorders>
               <w:top w:val="single" w:sz="1" w:space="0" w:color="CCCCCC"/>
               <w:left w:val="single" w:sz="1" w:space="0" w:color="CCCCCC"/>
@@ -14226,221 +14625,42 @@
                 <w:sz w:val="20"/>
                 <w:szCs w:val="20"/>
               </w:rPr>
-              <w:t>Resultado obtenido</w:t>
-            </w:r>
-          </w:p>
-        </w:tc>
-        <w:tc>
-          <w:tcPr>
-            <w:tcW w:w="6638" w:type="dxa"/>
-            <w:tcBorders>
-              <w:top w:val="single" w:sz="1" w:space="0" w:color="CCCCCC"/>
-              <w:left w:val="single" w:sz="1" w:space="0" w:color="CCCCCC"/>
-              <w:bottom w:val="single" w:sz="1" w:space="0" w:color="CCCCCC"/>
-              <w:right w:val="single" w:sz="1" w:space="0" w:color="CCCCCC"/>
-            </w:tcBorders>
-            <w:tcMar>
-              <w:top w:w="80" w:type="dxa"/>
-              <w:left w:w="120" w:type="dxa"/>
-              <w:bottom w:w="80" w:type="dxa"/>
-              <w:right w:w="120" w:type="dxa"/>
-            </w:tcMar>
-          </w:tcPr>
-          <w:p>
-            <w:r>
-              <w:rPr>
-                <w:i/>
-                <w:iCs/>
-                <w:color w:val="AAAAAA"/>
-                <w:sz w:val="20"/>
-                <w:szCs w:val="20"/>
-              </w:rPr>
-              <w:t>Qué devolvió o hizo realmente el sistema al ejecutar el test</w:t>
-            </w:r>
-          </w:p>
-        </w:tc>
-      </w:tr>
-      <w:tr>
-        <w:tc>
-          <w:tcPr>
-            <w:tcW w:w="3000" w:type="dxa"/>
-            <w:tcBorders>
-              <w:top w:val="single" w:sz="1" w:space="0" w:color="CCCCCC"/>
-              <w:left w:val="single" w:sz="1" w:space="0" w:color="CCCCCC"/>
-              <w:bottom w:val="single" w:sz="1" w:space="0" w:color="CCCCCC"/>
-              <w:right w:val="single" w:sz="1" w:space="0" w:color="CCCCCC"/>
-            </w:tcBorders>
-            <w:shd w:val="clear" w:color="auto" w:fill="D6E4F0"/>
-            <w:tcMar>
-              <w:top w:w="80" w:type="dxa"/>
-              <w:left w:w="120" w:type="dxa"/>
-              <w:bottom w:w="80" w:type="dxa"/>
-              <w:right w:w="120" w:type="dxa"/>
-            </w:tcMar>
-          </w:tcPr>
-          <w:p>
-            <w:r>
-              <w:rPr>
-                <w:b/>
-                <w:bCs/>
-                <w:color w:val="1A1A2E"/>
-                <w:sz w:val="20"/>
-                <w:szCs w:val="20"/>
-              </w:rPr>
-              <w:t xml:space="preserve">Estado </w:t>
-            </w:r>
-            <w:proofErr w:type="gramStart"/>
-            <w:r>
-              <w:rPr>
-                <w:b/>
-                <w:bCs/>
-                <w:color w:val="1A1A2E"/>
-                <w:sz w:val="20"/>
-                <w:szCs w:val="20"/>
-              </w:rPr>
-              <w:t>( Pasa</w:t>
-            </w:r>
-            <w:proofErr w:type="gramEnd"/>
-            <w:r>
-              <w:rPr>
-                <w:b/>
-                <w:bCs/>
-                <w:color w:val="1A1A2E"/>
-                <w:sz w:val="20"/>
-                <w:szCs w:val="20"/>
-              </w:rPr>
-              <w:t xml:space="preserve"> </w:t>
-            </w:r>
-            <w:proofErr w:type="gramStart"/>
-            <w:r>
-              <w:rPr>
-                <w:b/>
-                <w:bCs/>
-                <w:color w:val="1A1A2E"/>
-                <w:sz w:val="20"/>
-                <w:szCs w:val="20"/>
-              </w:rPr>
-              <w:t>/  Falla</w:t>
-            </w:r>
-            <w:proofErr w:type="gramEnd"/>
-            <w:r>
-              <w:rPr>
-                <w:b/>
-                <w:bCs/>
-                <w:color w:val="1A1A2E"/>
-                <w:sz w:val="20"/>
-                <w:szCs w:val="20"/>
-              </w:rPr>
-              <w:t>)</w:t>
-            </w:r>
-          </w:p>
-        </w:tc>
-        <w:tc>
-          <w:tcPr>
-            <w:tcW w:w="6638" w:type="dxa"/>
-            <w:tcBorders>
-              <w:top w:val="single" w:sz="1" w:space="0" w:color="CCCCCC"/>
-              <w:left w:val="single" w:sz="1" w:space="0" w:color="CCCCCC"/>
-              <w:bottom w:val="single" w:sz="1" w:space="0" w:color="CCCCCC"/>
-              <w:right w:val="single" w:sz="1" w:space="0" w:color="CCCCCC"/>
-            </w:tcBorders>
-            <w:tcMar>
-              <w:top w:w="80" w:type="dxa"/>
-              <w:left w:w="120" w:type="dxa"/>
-              <w:bottom w:w="80" w:type="dxa"/>
-              <w:right w:w="120" w:type="dxa"/>
-            </w:tcMar>
-          </w:tcPr>
-          <w:p/>
-        </w:tc>
-      </w:tr>
-      <w:tr>
-        <w:tc>
-          <w:tcPr>
-            <w:tcW w:w="3000" w:type="dxa"/>
-            <w:tcBorders>
-              <w:top w:val="single" w:sz="1" w:space="0" w:color="CCCCCC"/>
-              <w:left w:val="single" w:sz="1" w:space="0" w:color="CCCCCC"/>
-              <w:bottom w:val="single" w:sz="1" w:space="0" w:color="CCCCCC"/>
-              <w:right w:val="single" w:sz="1" w:space="0" w:color="CCCCCC"/>
-            </w:tcBorders>
-            <w:shd w:val="clear" w:color="auto" w:fill="D6E4F0"/>
-            <w:tcMar>
-              <w:top w:w="80" w:type="dxa"/>
-              <w:left w:w="120" w:type="dxa"/>
-              <w:bottom w:w="80" w:type="dxa"/>
-              <w:right w:w="120" w:type="dxa"/>
-            </w:tcMar>
-          </w:tcPr>
-          <w:p>
-            <w:r>
-              <w:rPr>
-                <w:b/>
-                <w:bCs/>
-                <w:color w:val="1A1A2E"/>
-                <w:sz w:val="20"/>
-                <w:szCs w:val="20"/>
-              </w:rPr>
               <w:t>Observaciones / Defecto encontrado</w:t>
             </w:r>
           </w:p>
         </w:tc>
         <w:tc>
           <w:tcPr>
-            <w:tcW w:w="6638" w:type="dxa"/>
-            <w:tcBorders>
-              <w:top w:val="single" w:sz="1" w:space="0" w:color="CCCCCC"/>
-              <w:left w:val="single" w:sz="1" w:space="0" w:color="CCCCCC"/>
-              <w:bottom w:val="single" w:sz="1" w:space="0" w:color="CCCCCC"/>
-              <w:right w:val="single" w:sz="1" w:space="0" w:color="CCCCCC"/>
-            </w:tcBorders>
-            <w:tcMar>
-              <w:top w:w="80" w:type="dxa"/>
-              <w:left w:w="120" w:type="dxa"/>
-              <w:bottom w:w="80" w:type="dxa"/>
-              <w:right w:w="120" w:type="dxa"/>
-            </w:tcMar>
-          </w:tcPr>
-          <w:p>
-            <w:r>
-              <w:rPr>
-                <w:i/>
-                <w:iCs/>
-                <w:color w:val="AAAAAA"/>
-                <w:sz w:val="20"/>
-                <w:szCs w:val="20"/>
-              </w:rPr>
-              <w:t xml:space="preserve">Si el test falla, </w:t>
-            </w:r>
-            <w:proofErr w:type="spellStart"/>
-            <w:r>
-              <w:rPr>
-                <w:i/>
-                <w:iCs/>
-                <w:color w:val="AAAAAA"/>
-                <w:sz w:val="20"/>
-                <w:szCs w:val="20"/>
-              </w:rPr>
-              <w:t>describird</w:t>
-            </w:r>
-            <w:proofErr w:type="spellEnd"/>
-            <w:r>
-              <w:rPr>
-                <w:i/>
-                <w:iCs/>
-                <w:color w:val="AAAAAA"/>
-                <w:sz w:val="20"/>
-                <w:szCs w:val="20"/>
-              </w:rPr>
-              <w:t xml:space="preserve"> el defecto encontrado. Si pasa, escribid 'Ninguno'.</w:t>
-            </w:r>
-          </w:p>
+            <w:tcW w:w="4190" w:type="dxa"/>
+            <w:tcBorders>
+              <w:top w:val="single" w:sz="2" w:space="0" w:color="CCCCCC"/>
+              <w:left w:val="single" w:sz="2" w:space="0" w:color="CCCCCC"/>
+              <w:bottom w:val="single" w:sz="2" w:space="0" w:color="CCCCCC"/>
+              <w:right w:val="single" w:sz="2" w:space="0" w:color="CCCCCC"/>
+            </w:tcBorders>
+            <w:tcMar>
+              <w:top w:w="80" w:type="dxa"/>
+              <w:left w:w="120" w:type="dxa"/>
+              <w:bottom w:w="80" w:type="dxa"/>
+              <w:right w:w="120" w:type="dxa"/>
+            </w:tcMar>
+            <w:vAlign w:val="center"/>
+          </w:tcPr>
           <w:p>
             <w:pPr>
               <w:spacing w:after="80"/>
+              <w:rPr>
+                <w:sz w:val="20"/>
+                <w:szCs w:val="20"/>
+              </w:rPr>
             </w:pPr>
             <w:r>
-              <w:t xml:space="preserve"> </w:t>
+              <w:rPr>
+                <w:color w:val="000000"/>
+                <w:sz w:val="20"/>
+                <w:szCs w:val="20"/>
+              </w:rPr>
+              <w:t>Ninguno</w:t>
             </w:r>
           </w:p>
         </w:tc>
@@ -14478,11 +14698,11 @@
       <w:tr>
         <w:trPr>
           <w:gridAfter w:val="1"/>
-          <w:wAfter w:w="6638" w:type="dxa"/>
+          <w:wAfter w:w="4190" w:type="dxa"/>
         </w:trPr>
         <w:tc>
           <w:tcPr>
-            <w:tcW w:w="9638" w:type="dxa"/>
+            <w:tcW w:w="5448" w:type="dxa"/>
             <w:tcBorders>
               <w:top w:val="single" w:sz="1" w:space="0" w:color="CCCCCC"/>
               <w:left w:val="single" w:sz="1" w:space="0" w:color="CCCCCC"/>
@@ -14512,7 +14732,7 @@
       <w:tr>
         <w:tc>
           <w:tcPr>
-            <w:tcW w:w="3000" w:type="dxa"/>
+            <w:tcW w:w="5448" w:type="dxa"/>
             <w:tcBorders>
               <w:top w:val="single" w:sz="1" w:space="0" w:color="CCCCCC"/>
               <w:left w:val="single" w:sz="1" w:space="0" w:color="CCCCCC"/>
@@ -14542,27 +14762,32 @@
         </w:tc>
         <w:tc>
           <w:tcPr>
-            <w:tcW w:w="6638" w:type="dxa"/>
-            <w:tcBorders>
-              <w:top w:val="single" w:sz="1" w:space="0" w:color="CCCCCC"/>
-              <w:left w:val="single" w:sz="1" w:space="0" w:color="CCCCCC"/>
-              <w:bottom w:val="single" w:sz="1" w:space="0" w:color="CCCCCC"/>
-              <w:right w:val="single" w:sz="1" w:space="0" w:color="CCCCCC"/>
-            </w:tcBorders>
-            <w:shd w:val="clear" w:color="auto" w:fill="FFFFFF"/>
-            <w:tcMar>
-              <w:top w:w="80" w:type="dxa"/>
-              <w:left w:w="120" w:type="dxa"/>
-              <w:bottom w:w="80" w:type="dxa"/>
-              <w:right w:w="120" w:type="dxa"/>
-            </w:tcMar>
-          </w:tcPr>
-          <w:p>
-            <w:r>
-              <w:rPr>
-                <w:i/>
-                <w:iCs/>
-                <w:color w:val="AAAAAA"/>
+            <w:tcW w:w="4190" w:type="dxa"/>
+            <w:tcBorders>
+              <w:top w:val="single" w:sz="2" w:space="0" w:color="CCCCCC"/>
+              <w:left w:val="single" w:sz="2" w:space="0" w:color="CCCCCC"/>
+              <w:bottom w:val="single" w:sz="2" w:space="0" w:color="CCCCCC"/>
+              <w:right w:val="single" w:sz="2" w:space="0" w:color="CCCCCC"/>
+            </w:tcBorders>
+            <w:tcMar>
+              <w:top w:w="80" w:type="dxa"/>
+              <w:left w:w="120" w:type="dxa"/>
+              <w:bottom w:w="80" w:type="dxa"/>
+              <w:right w:w="120" w:type="dxa"/>
+            </w:tcMar>
+            <w:vAlign w:val="center"/>
+          </w:tcPr>
+          <w:p>
+            <w:pPr>
+              <w:rPr>
+                <w:color w:val="000000" w:themeColor="text1"/>
+                <w:sz w:val="20"/>
+                <w:szCs w:val="20"/>
+              </w:rPr>
+            </w:pPr>
+            <w:r>
+              <w:rPr>
+                <w:color w:val="000000" w:themeColor="text1"/>
                 <w:sz w:val="20"/>
                 <w:szCs w:val="20"/>
               </w:rPr>
@@ -14574,7 +14799,7 @@
       <w:tr>
         <w:tc>
           <w:tcPr>
-            <w:tcW w:w="3000" w:type="dxa"/>
+            <w:tcW w:w="5448" w:type="dxa"/>
             <w:tcBorders>
               <w:top w:val="single" w:sz="1" w:space="0" w:color="CCCCCC"/>
               <w:left w:val="single" w:sz="1" w:space="0" w:color="CCCCCC"/>
@@ -14604,39 +14829,44 @@
         </w:tc>
         <w:tc>
           <w:tcPr>
-            <w:tcW w:w="6638" w:type="dxa"/>
-            <w:tcBorders>
-              <w:top w:val="single" w:sz="1" w:space="0" w:color="CCCCCC"/>
-              <w:left w:val="single" w:sz="1" w:space="0" w:color="CCCCCC"/>
-              <w:bottom w:val="single" w:sz="1" w:space="0" w:color="CCCCCC"/>
-              <w:right w:val="single" w:sz="1" w:space="0" w:color="CCCCCC"/>
-            </w:tcBorders>
-            <w:shd w:val="clear" w:color="auto" w:fill="FFFFFF"/>
-            <w:tcMar>
-              <w:top w:w="80" w:type="dxa"/>
-              <w:left w:w="120" w:type="dxa"/>
-              <w:bottom w:w="80" w:type="dxa"/>
-              <w:right w:w="120" w:type="dxa"/>
-            </w:tcMar>
-          </w:tcPr>
-          <w:p>
-            <w:r>
-              <w:rPr>
-                <w:i/>
-                <w:iCs/>
-                <w:color w:val="AAAAAA"/>
-                <w:sz w:val="20"/>
-                <w:szCs w:val="20"/>
-              </w:rPr>
-              <w:t>Describid brevemente qué comprueba este test</w:t>
-            </w:r>
-          </w:p>
-        </w:tc>
-      </w:tr>
-      <w:tr>
-        <w:tc>
-          <w:tcPr>
-            <w:tcW w:w="3000" w:type="dxa"/>
+            <w:tcW w:w="4190" w:type="dxa"/>
+            <w:tcBorders>
+              <w:top w:val="single" w:sz="2" w:space="0" w:color="CCCCCC"/>
+              <w:left w:val="single" w:sz="2" w:space="0" w:color="CCCCCC"/>
+              <w:bottom w:val="single" w:sz="2" w:space="0" w:color="CCCCCC"/>
+              <w:right w:val="single" w:sz="2" w:space="0" w:color="CCCCCC"/>
+            </w:tcBorders>
+            <w:tcMar>
+              <w:top w:w="80" w:type="dxa"/>
+              <w:left w:w="120" w:type="dxa"/>
+              <w:bottom w:w="80" w:type="dxa"/>
+              <w:right w:w="120" w:type="dxa"/>
+            </w:tcMar>
+            <w:vAlign w:val="center"/>
+          </w:tcPr>
+          <w:p>
+            <w:pPr>
+              <w:rPr>
+                <w:color w:val="000000" w:themeColor="text1"/>
+                <w:sz w:val="20"/>
+                <w:szCs w:val="20"/>
+              </w:rPr>
+            </w:pPr>
+            <w:r>
+              <w:rPr>
+                <w:color w:val="000000" w:themeColor="text1"/>
+                <w:sz w:val="20"/>
+                <w:szCs w:val="20"/>
+              </w:rPr>
+              <w:t>Contraseña de 8 caracteres sin número debe devolver false</w:t>
+            </w:r>
+          </w:p>
+        </w:tc>
+      </w:tr>
+      <w:tr>
+        <w:tc>
+          <w:tcPr>
+            <w:tcW w:w="5448" w:type="dxa"/>
             <w:tcBorders>
               <w:top w:val="single" w:sz="1" w:space="0" w:color="CCCCCC"/>
               <w:left w:val="single" w:sz="1" w:space="0" w:color="CCCCCC"/>
@@ -14666,73 +14896,206 @@
         </w:tc>
         <w:tc>
           <w:tcPr>
-            <w:tcW w:w="6638" w:type="dxa"/>
-            <w:tcBorders>
-              <w:top w:val="single" w:sz="1" w:space="0" w:color="CCCCCC"/>
-              <w:left w:val="single" w:sz="1" w:space="0" w:color="CCCCCC"/>
-              <w:bottom w:val="single" w:sz="1" w:space="0" w:color="CCCCCC"/>
-              <w:right w:val="single" w:sz="1" w:space="0" w:color="CCCCCC"/>
-            </w:tcBorders>
-            <w:shd w:val="clear" w:color="auto" w:fill="FFFFFF"/>
-            <w:tcMar>
-              <w:top w:w="80" w:type="dxa"/>
-              <w:left w:w="120" w:type="dxa"/>
-              <w:bottom w:w="80" w:type="dxa"/>
-              <w:right w:w="120" w:type="dxa"/>
-            </w:tcMar>
-          </w:tcPr>
-          <w:p>
+            <w:tcW w:w="4190" w:type="dxa"/>
+            <w:tcBorders>
+              <w:top w:val="single" w:sz="2" w:space="0" w:color="CCCCCC"/>
+              <w:left w:val="single" w:sz="2" w:space="0" w:color="CCCCCC"/>
+              <w:bottom w:val="single" w:sz="2" w:space="0" w:color="CCCCCC"/>
+              <w:right w:val="single" w:sz="2" w:space="0" w:color="CCCCCC"/>
+            </w:tcBorders>
+            <w:tcMar>
+              <w:top w:w="80" w:type="dxa"/>
+              <w:left w:w="120" w:type="dxa"/>
+              <w:bottom w:w="80" w:type="dxa"/>
+              <w:right w:w="120" w:type="dxa"/>
+            </w:tcMar>
+            <w:vAlign w:val="center"/>
+          </w:tcPr>
+          <w:p>
+            <w:pPr>
+              <w:rPr>
+                <w:color w:val="000000" w:themeColor="text1"/>
+                <w:sz w:val="20"/>
+                <w:szCs w:val="20"/>
+              </w:rPr>
+            </w:pPr>
             <w:proofErr w:type="spellStart"/>
             <w:r>
               <w:rPr>
-                <w:i/>
-                <w:iCs/>
-                <w:color w:val="AAAAAA"/>
-                <w:sz w:val="20"/>
-                <w:szCs w:val="20"/>
-              </w:rPr>
-              <w:t>Ej</w:t>
+                <w:color w:val="000000" w:themeColor="text1"/>
+                <w:sz w:val="20"/>
+                <w:szCs w:val="20"/>
+              </w:rPr>
+              <w:t>ValidadorFormulario.validarPassword</w:t>
             </w:r>
             <w:proofErr w:type="spellEnd"/>
             <w:r>
               <w:rPr>
-                <w:i/>
-                <w:iCs/>
-                <w:color w:val="AAAAAA"/>
-                <w:sz w:val="20"/>
-                <w:szCs w:val="20"/>
-              </w:rPr>
-              <w:t xml:space="preserve">: </w:t>
+                <w:color w:val="000000" w:themeColor="text1"/>
+                <w:sz w:val="20"/>
+                <w:szCs w:val="20"/>
+              </w:rPr>
+              <w:t>()</w:t>
+            </w:r>
+          </w:p>
+        </w:tc>
+      </w:tr>
+      <w:tr>
+        <w:tc>
+          <w:tcPr>
+            <w:tcW w:w="5448" w:type="dxa"/>
+            <w:tcBorders>
+              <w:top w:val="single" w:sz="1" w:space="0" w:color="CCCCCC"/>
+              <w:left w:val="single" w:sz="1" w:space="0" w:color="CCCCCC"/>
+              <w:bottom w:val="single" w:sz="1" w:space="0" w:color="CCCCCC"/>
+              <w:right w:val="single" w:sz="1" w:space="0" w:color="CCCCCC"/>
+            </w:tcBorders>
+            <w:shd w:val="clear" w:color="auto" w:fill="D6E4F0"/>
+            <w:tcMar>
+              <w:top w:w="80" w:type="dxa"/>
+              <w:left w:w="120" w:type="dxa"/>
+              <w:bottom w:w="80" w:type="dxa"/>
+              <w:right w:w="120" w:type="dxa"/>
+            </w:tcMar>
+          </w:tcPr>
+          <w:p>
+            <w:r>
+              <w:rPr>
+                <w:b/>
+                <w:bCs/>
+                <w:color w:val="1A1A2E"/>
+                <w:sz w:val="20"/>
+                <w:szCs w:val="20"/>
+              </w:rPr>
+              <w:t>Técnica de diseño</w:t>
+            </w:r>
+          </w:p>
+        </w:tc>
+        <w:tc>
+          <w:tcPr>
+            <w:tcW w:w="4190" w:type="dxa"/>
+            <w:tcBorders>
+              <w:top w:val="single" w:sz="2" w:space="0" w:color="CCCCCC"/>
+              <w:left w:val="single" w:sz="2" w:space="0" w:color="CCCCCC"/>
+              <w:bottom w:val="single" w:sz="2" w:space="0" w:color="CCCCCC"/>
+              <w:right w:val="single" w:sz="2" w:space="0" w:color="CCCCCC"/>
+            </w:tcBorders>
+            <w:tcMar>
+              <w:top w:w="80" w:type="dxa"/>
+              <w:left w:w="120" w:type="dxa"/>
+              <w:bottom w:w="80" w:type="dxa"/>
+              <w:right w:w="120" w:type="dxa"/>
+            </w:tcMar>
+            <w:vAlign w:val="center"/>
+          </w:tcPr>
+          <w:p>
+            <w:pPr>
+              <w:rPr>
+                <w:color w:val="000000" w:themeColor="text1"/>
+                <w:sz w:val="20"/>
+                <w:szCs w:val="20"/>
+              </w:rPr>
+            </w:pPr>
+            <w:r>
+              <w:rPr>
+                <w:color w:val="000000" w:themeColor="text1"/>
+                <w:sz w:val="20"/>
+                <w:szCs w:val="20"/>
+              </w:rPr>
+              <w:t>Caja Blanca – Rama sin dígito</w:t>
+            </w:r>
+          </w:p>
+        </w:tc>
+      </w:tr>
+      <w:tr>
+        <w:tc>
+          <w:tcPr>
+            <w:tcW w:w="5448" w:type="dxa"/>
+            <w:tcBorders>
+              <w:top w:val="single" w:sz="1" w:space="0" w:color="CCCCCC"/>
+              <w:left w:val="single" w:sz="1" w:space="0" w:color="CCCCCC"/>
+              <w:bottom w:val="single" w:sz="1" w:space="0" w:color="CCCCCC"/>
+              <w:right w:val="single" w:sz="1" w:space="0" w:color="CCCCCC"/>
+            </w:tcBorders>
+            <w:shd w:val="clear" w:color="auto" w:fill="D6E4F0"/>
+            <w:tcMar>
+              <w:top w:w="80" w:type="dxa"/>
+              <w:left w:w="120" w:type="dxa"/>
+              <w:bottom w:w="80" w:type="dxa"/>
+              <w:right w:w="120" w:type="dxa"/>
+            </w:tcMar>
+          </w:tcPr>
+          <w:p>
+            <w:r>
+              <w:rPr>
+                <w:b/>
+                <w:bCs/>
+                <w:color w:val="1A1A2E"/>
+                <w:sz w:val="20"/>
+                <w:szCs w:val="20"/>
+              </w:rPr>
+              <w:t>Precondiciones</w:t>
+            </w:r>
+          </w:p>
+        </w:tc>
+        <w:tc>
+          <w:tcPr>
+            <w:tcW w:w="4190" w:type="dxa"/>
+            <w:tcBorders>
+              <w:top w:val="single" w:sz="2" w:space="0" w:color="CCCCCC"/>
+              <w:left w:val="single" w:sz="2" w:space="0" w:color="CCCCCC"/>
+              <w:bottom w:val="single" w:sz="2" w:space="0" w:color="CCCCCC"/>
+              <w:right w:val="single" w:sz="2" w:space="0" w:color="CCCCCC"/>
+            </w:tcBorders>
+            <w:tcMar>
+              <w:top w:w="80" w:type="dxa"/>
+              <w:left w:w="120" w:type="dxa"/>
+              <w:bottom w:w="80" w:type="dxa"/>
+              <w:right w:w="120" w:type="dxa"/>
+            </w:tcMar>
+            <w:vAlign w:val="center"/>
+          </w:tcPr>
+          <w:p>
+            <w:pPr>
+              <w:rPr>
+                <w:color w:val="000000" w:themeColor="text1"/>
+                <w:sz w:val="20"/>
+                <w:szCs w:val="20"/>
+              </w:rPr>
+            </w:pPr>
+            <w:r>
+              <w:rPr>
+                <w:color w:val="000000" w:themeColor="text1"/>
+                <w:sz w:val="20"/>
+                <w:szCs w:val="20"/>
+              </w:rPr>
+              <w:t xml:space="preserve">Instancia de </w:t>
             </w:r>
             <w:proofErr w:type="spellStart"/>
             <w:r>
               <w:rPr>
-                <w:i/>
-                <w:iCs/>
-                <w:color w:val="AAAAAA"/>
-                <w:sz w:val="20"/>
-                <w:szCs w:val="20"/>
-              </w:rPr>
-              <w:t>Calculadora.dividir</w:t>
+                <w:color w:val="000000" w:themeColor="text1"/>
+                <w:sz w:val="20"/>
+                <w:szCs w:val="20"/>
+              </w:rPr>
+              <w:t>ValidadorFormulario</w:t>
             </w:r>
             <w:proofErr w:type="spellEnd"/>
             <w:r>
               <w:rPr>
-                <w:i/>
-                <w:iCs/>
-                <w:color w:val="AAAAAA"/>
-                <w:sz w:val="20"/>
-                <w:szCs w:val="20"/>
-              </w:rPr>
-              <w:t>()</w:t>
-            </w:r>
-          </w:p>
-        </w:tc>
-      </w:tr>
-      <w:tr>
-        <w:tc>
-          <w:tcPr>
-            <w:tcW w:w="3000" w:type="dxa"/>
+                <w:color w:val="000000" w:themeColor="text1"/>
+                <w:sz w:val="20"/>
+                <w:szCs w:val="20"/>
+              </w:rPr>
+              <w:t xml:space="preserve"> creada (@BeforeEach)</w:t>
+            </w:r>
+          </w:p>
+        </w:tc>
+      </w:tr>
+      <w:tr>
+        <w:tc>
+          <w:tcPr>
+            <w:tcW w:w="5448" w:type="dxa"/>
             <w:tcBorders>
               <w:top w:val="single" w:sz="1" w:space="0" w:color="CCCCCC"/>
               <w:left w:val="single" w:sz="1" w:space="0" w:color="CCCCCC"/>
@@ -14756,45 +15119,68 @@
                 <w:sz w:val="20"/>
                 <w:szCs w:val="20"/>
               </w:rPr>
-              <w:t>Técnica de diseño</w:t>
-            </w:r>
-          </w:p>
-        </w:tc>
-        <w:tc>
-          <w:tcPr>
-            <w:tcW w:w="6638" w:type="dxa"/>
-            <w:tcBorders>
-              <w:top w:val="single" w:sz="1" w:space="0" w:color="CCCCCC"/>
-              <w:left w:val="single" w:sz="1" w:space="0" w:color="CCCCCC"/>
-              <w:bottom w:val="single" w:sz="1" w:space="0" w:color="CCCCCC"/>
-              <w:right w:val="single" w:sz="1" w:space="0" w:color="CCCCCC"/>
-            </w:tcBorders>
-            <w:shd w:val="clear" w:color="auto" w:fill="FFFFFF"/>
-            <w:tcMar>
-              <w:top w:w="80" w:type="dxa"/>
-              <w:left w:w="120" w:type="dxa"/>
-              <w:bottom w:w="80" w:type="dxa"/>
-              <w:right w:w="120" w:type="dxa"/>
-            </w:tcMar>
-          </w:tcPr>
-          <w:p>
-            <w:r>
-              <w:rPr>
-                <w:i/>
-                <w:iCs/>
-                <w:color w:val="AAAAAA"/>
-                <w:sz w:val="20"/>
-                <w:szCs w:val="20"/>
-              </w:rPr>
-              <w:t>Caja negra / Caja blanca / Valores límite / Particiones equivalencia</w:t>
-            </w:r>
-          </w:p>
-        </w:tc>
-      </w:tr>
-      <w:tr>
-        <w:tc>
-          <w:tcPr>
-            <w:tcW w:w="3000" w:type="dxa"/>
+              <w:t>Datos de entrada</w:t>
+            </w:r>
+          </w:p>
+        </w:tc>
+        <w:tc>
+          <w:tcPr>
+            <w:tcW w:w="4190" w:type="dxa"/>
+            <w:tcBorders>
+              <w:top w:val="single" w:sz="2" w:space="0" w:color="CCCCCC"/>
+              <w:left w:val="single" w:sz="2" w:space="0" w:color="CCCCCC"/>
+              <w:bottom w:val="single" w:sz="2" w:space="0" w:color="CCCCCC"/>
+              <w:right w:val="single" w:sz="2" w:space="0" w:color="CCCCCC"/>
+            </w:tcBorders>
+            <w:tcMar>
+              <w:top w:w="80" w:type="dxa"/>
+              <w:left w:w="120" w:type="dxa"/>
+              <w:bottom w:w="80" w:type="dxa"/>
+              <w:right w:w="120" w:type="dxa"/>
+            </w:tcMar>
+            <w:vAlign w:val="center"/>
+          </w:tcPr>
+          <w:p>
+            <w:pPr>
+              <w:rPr>
+                <w:color w:val="000000" w:themeColor="text1"/>
+                <w:sz w:val="20"/>
+                <w:szCs w:val="20"/>
+              </w:rPr>
+            </w:pPr>
+            <w:r>
+              <w:rPr>
+                <w:color w:val="000000" w:themeColor="text1"/>
+                <w:sz w:val="20"/>
+                <w:szCs w:val="20"/>
+              </w:rPr>
+              <w:t>"</w:t>
+            </w:r>
+            <w:proofErr w:type="spellStart"/>
+            <w:r>
+              <w:rPr>
+                <w:color w:val="000000" w:themeColor="text1"/>
+                <w:sz w:val="20"/>
+                <w:szCs w:val="20"/>
+              </w:rPr>
+              <w:t>AbcdefGH</w:t>
+            </w:r>
+            <w:proofErr w:type="spellEnd"/>
+            <w:r>
+              <w:rPr>
+                <w:color w:val="000000" w:themeColor="text1"/>
+                <w:sz w:val="20"/>
+                <w:szCs w:val="20"/>
+              </w:rPr>
+              <w:t>"</w:t>
+            </w:r>
+          </w:p>
+        </w:tc>
+      </w:tr>
+      <w:tr>
+        <w:tc>
+          <w:tcPr>
+            <w:tcW w:w="5448" w:type="dxa"/>
             <w:tcBorders>
               <w:top w:val="single" w:sz="1" w:space="0" w:color="CCCCCC"/>
               <w:left w:val="single" w:sz="1" w:space="0" w:color="CCCCCC"/>
@@ -14818,45 +15204,50 @@
                 <w:sz w:val="20"/>
                 <w:szCs w:val="20"/>
               </w:rPr>
-              <w:t>Precondiciones</w:t>
-            </w:r>
-          </w:p>
-        </w:tc>
-        <w:tc>
-          <w:tcPr>
-            <w:tcW w:w="6638" w:type="dxa"/>
-            <w:tcBorders>
-              <w:top w:val="single" w:sz="1" w:space="0" w:color="CCCCCC"/>
-              <w:left w:val="single" w:sz="1" w:space="0" w:color="CCCCCC"/>
-              <w:bottom w:val="single" w:sz="1" w:space="0" w:color="CCCCCC"/>
-              <w:right w:val="single" w:sz="1" w:space="0" w:color="CCCCCC"/>
-            </w:tcBorders>
-            <w:shd w:val="clear" w:color="auto" w:fill="FFFFFF"/>
-            <w:tcMar>
-              <w:top w:w="80" w:type="dxa"/>
-              <w:left w:w="120" w:type="dxa"/>
-              <w:bottom w:w="80" w:type="dxa"/>
-              <w:right w:w="120" w:type="dxa"/>
-            </w:tcMar>
-          </w:tcPr>
-          <w:p>
-            <w:r>
-              <w:rPr>
-                <w:i/>
-                <w:iCs/>
-                <w:color w:val="AAAAAA"/>
-                <w:sz w:val="20"/>
-                <w:szCs w:val="20"/>
-              </w:rPr>
-              <w:t>Estado del sistema antes de ejecutar el test</w:t>
-            </w:r>
-          </w:p>
-        </w:tc>
-      </w:tr>
-      <w:tr>
-        <w:tc>
-          <w:tcPr>
-            <w:tcW w:w="3000" w:type="dxa"/>
+              <w:t>Resultado esperado</w:t>
+            </w:r>
+          </w:p>
+        </w:tc>
+        <w:tc>
+          <w:tcPr>
+            <w:tcW w:w="4190" w:type="dxa"/>
+            <w:tcBorders>
+              <w:top w:val="single" w:sz="2" w:space="0" w:color="CCCCCC"/>
+              <w:left w:val="single" w:sz="2" w:space="0" w:color="CCCCCC"/>
+              <w:bottom w:val="single" w:sz="2" w:space="0" w:color="CCCCCC"/>
+              <w:right w:val="single" w:sz="2" w:space="0" w:color="CCCCCC"/>
+            </w:tcBorders>
+            <w:tcMar>
+              <w:top w:w="80" w:type="dxa"/>
+              <w:left w:w="120" w:type="dxa"/>
+              <w:bottom w:w="80" w:type="dxa"/>
+              <w:right w:w="120" w:type="dxa"/>
+            </w:tcMar>
+            <w:vAlign w:val="center"/>
+          </w:tcPr>
+          <w:p>
+            <w:pPr>
+              <w:rPr>
+                <w:color w:val="000000" w:themeColor="text1"/>
+                <w:sz w:val="20"/>
+                <w:szCs w:val="20"/>
+              </w:rPr>
+            </w:pPr>
+            <w:r>
+              <w:rPr>
+                <w:color w:val="000000" w:themeColor="text1"/>
+                <w:sz w:val="20"/>
+                <w:szCs w:val="20"/>
+              </w:rPr>
+              <w:t>false</w:t>
+            </w:r>
+          </w:p>
+        </w:tc>
+      </w:tr>
+      <w:tr>
+        <w:tc>
+          <w:tcPr>
+            <w:tcW w:w="5448" w:type="dxa"/>
             <w:tcBorders>
               <w:top w:val="single" w:sz="1" w:space="0" w:color="CCCCCC"/>
               <w:left w:val="single" w:sz="1" w:space="0" w:color="CCCCCC"/>
@@ -14880,44 +15271,50 @@
                 <w:sz w:val="20"/>
                 <w:szCs w:val="20"/>
               </w:rPr>
-              <w:t>Datos de entrada</w:t>
-            </w:r>
-          </w:p>
-        </w:tc>
-        <w:tc>
-          <w:tcPr>
-            <w:tcW w:w="6638" w:type="dxa"/>
-            <w:tcBorders>
-              <w:top w:val="single" w:sz="1" w:space="0" w:color="CCCCCC"/>
-              <w:left w:val="single" w:sz="1" w:space="0" w:color="CCCCCC"/>
-              <w:bottom w:val="single" w:sz="1" w:space="0" w:color="CCCCCC"/>
-              <w:right w:val="single" w:sz="1" w:space="0" w:color="CCCCCC"/>
-            </w:tcBorders>
-            <w:tcMar>
-              <w:top w:w="80" w:type="dxa"/>
-              <w:left w:w="120" w:type="dxa"/>
-              <w:bottom w:w="80" w:type="dxa"/>
-              <w:right w:w="120" w:type="dxa"/>
-            </w:tcMar>
-          </w:tcPr>
-          <w:p>
-            <w:r>
-              <w:rPr>
-                <w:i/>
-                <w:iCs/>
-                <w:color w:val="AAAAAA"/>
-                <w:sz w:val="20"/>
-                <w:szCs w:val="20"/>
-              </w:rPr>
-              <w:t>Escribid los valores de entrada del test</w:t>
-            </w:r>
-          </w:p>
-        </w:tc>
-      </w:tr>
-      <w:tr>
-        <w:tc>
-          <w:tcPr>
-            <w:tcW w:w="3000" w:type="dxa"/>
+              <w:t>Resultado obtenido</w:t>
+            </w:r>
+          </w:p>
+        </w:tc>
+        <w:tc>
+          <w:tcPr>
+            <w:tcW w:w="4190" w:type="dxa"/>
+            <w:tcBorders>
+              <w:top w:val="single" w:sz="2" w:space="0" w:color="CCCCCC"/>
+              <w:left w:val="single" w:sz="2" w:space="0" w:color="CCCCCC"/>
+              <w:bottom w:val="single" w:sz="2" w:space="0" w:color="CCCCCC"/>
+              <w:right w:val="single" w:sz="2" w:space="0" w:color="CCCCCC"/>
+            </w:tcBorders>
+            <w:tcMar>
+              <w:top w:w="80" w:type="dxa"/>
+              <w:left w:w="120" w:type="dxa"/>
+              <w:bottom w:w="80" w:type="dxa"/>
+              <w:right w:w="120" w:type="dxa"/>
+            </w:tcMar>
+            <w:vAlign w:val="center"/>
+          </w:tcPr>
+          <w:p>
+            <w:pPr>
+              <w:rPr>
+                <w:color w:val="000000" w:themeColor="text1"/>
+                <w:sz w:val="20"/>
+                <w:szCs w:val="20"/>
+              </w:rPr>
+            </w:pPr>
+            <w:r>
+              <w:rPr>
+                <w:color w:val="000000" w:themeColor="text1"/>
+                <w:sz w:val="20"/>
+                <w:szCs w:val="20"/>
+              </w:rPr>
+              <w:t>false</w:t>
+            </w:r>
+          </w:p>
+        </w:tc>
+      </w:tr>
+      <w:tr>
+        <w:tc>
+          <w:tcPr>
+            <w:tcW w:w="5448" w:type="dxa"/>
             <w:tcBorders>
               <w:top w:val="single" w:sz="1" w:space="0" w:color="CCCCCC"/>
               <w:left w:val="single" w:sz="1" w:space="0" w:color="CCCCCC"/>
@@ -14941,44 +15338,72 @@
                 <w:sz w:val="20"/>
                 <w:szCs w:val="20"/>
               </w:rPr>
-              <w:t>Resultado esperado</w:t>
-            </w:r>
-          </w:p>
-        </w:tc>
-        <w:tc>
-          <w:tcPr>
-            <w:tcW w:w="6638" w:type="dxa"/>
-            <w:tcBorders>
-              <w:top w:val="single" w:sz="1" w:space="0" w:color="CCCCCC"/>
-              <w:left w:val="single" w:sz="1" w:space="0" w:color="CCCCCC"/>
-              <w:bottom w:val="single" w:sz="1" w:space="0" w:color="CCCCCC"/>
-              <w:right w:val="single" w:sz="1" w:space="0" w:color="CCCCCC"/>
-            </w:tcBorders>
-            <w:tcMar>
-              <w:top w:w="80" w:type="dxa"/>
-              <w:left w:w="120" w:type="dxa"/>
-              <w:bottom w:w="80" w:type="dxa"/>
-              <w:right w:w="120" w:type="dxa"/>
-            </w:tcMar>
-          </w:tcPr>
-          <w:p>
-            <w:r>
-              <w:rPr>
-                <w:i/>
-                <w:iCs/>
-                <w:color w:val="AAAAAA"/>
-                <w:sz w:val="20"/>
-                <w:szCs w:val="20"/>
-              </w:rPr>
-              <w:t>Qué debería devolver o hacer el sistema si funciona correctamente</w:t>
-            </w:r>
-          </w:p>
-        </w:tc>
-      </w:tr>
-      <w:tr>
-        <w:tc>
-          <w:tcPr>
-            <w:tcW w:w="3000" w:type="dxa"/>
+              <w:t xml:space="preserve">Estado </w:t>
+            </w:r>
+            <w:proofErr w:type="gramStart"/>
+            <w:r>
+              <w:rPr>
+                <w:b/>
+                <w:bCs/>
+                <w:color w:val="1A1A2E"/>
+                <w:sz w:val="20"/>
+                <w:szCs w:val="20"/>
+              </w:rPr>
+              <w:t>( Pasa</w:t>
+            </w:r>
+            <w:proofErr w:type="gramEnd"/>
+            <w:r>
+              <w:rPr>
+                <w:b/>
+                <w:bCs/>
+                <w:color w:val="1A1A2E"/>
+                <w:sz w:val="20"/>
+                <w:szCs w:val="20"/>
+              </w:rPr>
+              <w:t xml:space="preserve"> / Falla)</w:t>
+            </w:r>
+          </w:p>
+        </w:tc>
+        <w:tc>
+          <w:tcPr>
+            <w:tcW w:w="4190" w:type="dxa"/>
+            <w:tcBorders>
+              <w:top w:val="single" w:sz="2" w:space="0" w:color="CCCCCC"/>
+              <w:left w:val="single" w:sz="2" w:space="0" w:color="CCCCCC"/>
+              <w:bottom w:val="single" w:sz="2" w:space="0" w:color="CCCCCC"/>
+              <w:right w:val="single" w:sz="2" w:space="0" w:color="CCCCCC"/>
+            </w:tcBorders>
+            <w:tcMar>
+              <w:top w:w="80" w:type="dxa"/>
+              <w:left w:w="120" w:type="dxa"/>
+              <w:bottom w:w="80" w:type="dxa"/>
+              <w:right w:w="120" w:type="dxa"/>
+            </w:tcMar>
+            <w:vAlign w:val="center"/>
+          </w:tcPr>
+          <w:p>
+            <w:pPr>
+              <w:rPr>
+                <w:color w:val="000000" w:themeColor="text1"/>
+                <w:sz w:val="20"/>
+                <w:szCs w:val="20"/>
+              </w:rPr>
+            </w:pPr>
+            <w:r>
+              <w:rPr>
+                <w:color w:val="000000" w:themeColor="text1"/>
+                <w:sz w:val="20"/>
+                <w:szCs w:val="20"/>
+              </w:rPr>
+              <w:t>Pasa</w:t>
+            </w:r>
+          </w:p>
+        </w:tc>
+      </w:tr>
+      <w:tr>
+        <w:tc>
+          <w:tcPr>
+            <w:tcW w:w="5448" w:type="dxa"/>
             <w:tcBorders>
               <w:top w:val="single" w:sz="1" w:space="0" w:color="CCCCCC"/>
               <w:left w:val="single" w:sz="1" w:space="0" w:color="CCCCCC"/>
@@ -15002,199 +15427,43 @@
                 <w:sz w:val="20"/>
                 <w:szCs w:val="20"/>
               </w:rPr>
-              <w:t>Resultado obtenido</w:t>
-            </w:r>
-          </w:p>
-        </w:tc>
-        <w:tc>
-          <w:tcPr>
-            <w:tcW w:w="6638" w:type="dxa"/>
-            <w:tcBorders>
-              <w:top w:val="single" w:sz="1" w:space="0" w:color="CCCCCC"/>
-              <w:left w:val="single" w:sz="1" w:space="0" w:color="CCCCCC"/>
-              <w:bottom w:val="single" w:sz="1" w:space="0" w:color="CCCCCC"/>
-              <w:right w:val="single" w:sz="1" w:space="0" w:color="CCCCCC"/>
-            </w:tcBorders>
-            <w:tcMar>
-              <w:top w:w="80" w:type="dxa"/>
-              <w:left w:w="120" w:type="dxa"/>
-              <w:bottom w:w="80" w:type="dxa"/>
-              <w:right w:w="120" w:type="dxa"/>
-            </w:tcMar>
-          </w:tcPr>
-          <w:p>
-            <w:r>
-              <w:rPr>
-                <w:i/>
-                <w:iCs/>
-                <w:color w:val="AAAAAA"/>
-                <w:sz w:val="20"/>
-                <w:szCs w:val="20"/>
-              </w:rPr>
-              <w:t>Qué devolvió o hizo realmente el sistema al ejecutar el test</w:t>
-            </w:r>
-          </w:p>
-        </w:tc>
-      </w:tr>
-      <w:tr>
-        <w:tc>
-          <w:tcPr>
-            <w:tcW w:w="3000" w:type="dxa"/>
-            <w:tcBorders>
-              <w:top w:val="single" w:sz="1" w:space="0" w:color="CCCCCC"/>
-              <w:left w:val="single" w:sz="1" w:space="0" w:color="CCCCCC"/>
-              <w:bottom w:val="single" w:sz="1" w:space="0" w:color="CCCCCC"/>
-              <w:right w:val="single" w:sz="1" w:space="0" w:color="CCCCCC"/>
-            </w:tcBorders>
-            <w:shd w:val="clear" w:color="auto" w:fill="D6E4F0"/>
-            <w:tcMar>
-              <w:top w:w="80" w:type="dxa"/>
-              <w:left w:w="120" w:type="dxa"/>
-              <w:bottom w:w="80" w:type="dxa"/>
-              <w:right w:w="120" w:type="dxa"/>
-            </w:tcMar>
-          </w:tcPr>
-          <w:p>
-            <w:r>
-              <w:rPr>
-                <w:b/>
-                <w:bCs/>
-                <w:color w:val="1A1A2E"/>
-                <w:sz w:val="20"/>
-                <w:szCs w:val="20"/>
-              </w:rPr>
-              <w:t xml:space="preserve">Estado </w:t>
-            </w:r>
-            <w:proofErr w:type="gramStart"/>
-            <w:r>
-              <w:rPr>
-                <w:b/>
-                <w:bCs/>
-                <w:color w:val="1A1A2E"/>
-                <w:sz w:val="20"/>
-                <w:szCs w:val="20"/>
-              </w:rPr>
-              <w:t>( Pasa</w:t>
-            </w:r>
-            <w:proofErr w:type="gramEnd"/>
-            <w:r>
-              <w:rPr>
-                <w:b/>
-                <w:bCs/>
-                <w:color w:val="1A1A2E"/>
-                <w:sz w:val="20"/>
-                <w:szCs w:val="20"/>
-              </w:rPr>
-              <w:t xml:space="preserve"> / Falla)</w:t>
-            </w:r>
-          </w:p>
-        </w:tc>
-        <w:tc>
-          <w:tcPr>
-            <w:tcW w:w="6638" w:type="dxa"/>
-            <w:tcBorders>
-              <w:top w:val="single" w:sz="1" w:space="0" w:color="CCCCCC"/>
-              <w:left w:val="single" w:sz="1" w:space="0" w:color="CCCCCC"/>
-              <w:bottom w:val="single" w:sz="1" w:space="0" w:color="CCCCCC"/>
-              <w:right w:val="single" w:sz="1" w:space="0" w:color="CCCCCC"/>
-            </w:tcBorders>
-            <w:tcMar>
-              <w:top w:w="80" w:type="dxa"/>
-              <w:left w:w="120" w:type="dxa"/>
-              <w:bottom w:w="80" w:type="dxa"/>
-              <w:right w:w="120" w:type="dxa"/>
-            </w:tcMar>
-          </w:tcPr>
-          <w:p/>
-        </w:tc>
-      </w:tr>
-      <w:tr>
-        <w:tc>
-          <w:tcPr>
-            <w:tcW w:w="3000" w:type="dxa"/>
-            <w:tcBorders>
-              <w:top w:val="single" w:sz="1" w:space="0" w:color="CCCCCC"/>
-              <w:left w:val="single" w:sz="1" w:space="0" w:color="CCCCCC"/>
-              <w:bottom w:val="single" w:sz="1" w:space="0" w:color="CCCCCC"/>
-              <w:right w:val="single" w:sz="1" w:space="0" w:color="CCCCCC"/>
-            </w:tcBorders>
-            <w:shd w:val="clear" w:color="auto" w:fill="D6E4F0"/>
-            <w:tcMar>
-              <w:top w:w="80" w:type="dxa"/>
-              <w:left w:w="120" w:type="dxa"/>
-              <w:bottom w:w="80" w:type="dxa"/>
-              <w:right w:w="120" w:type="dxa"/>
-            </w:tcMar>
-          </w:tcPr>
-          <w:p>
-            <w:r>
-              <w:rPr>
-                <w:b/>
-                <w:bCs/>
-                <w:color w:val="1A1A2E"/>
-                <w:sz w:val="20"/>
-                <w:szCs w:val="20"/>
-              </w:rPr>
               <w:t>Observaciones / Defecto encontrado</w:t>
             </w:r>
           </w:p>
         </w:tc>
         <w:tc>
           <w:tcPr>
-            <w:tcW w:w="6638" w:type="dxa"/>
-            <w:tcBorders>
-              <w:top w:val="single" w:sz="1" w:space="0" w:color="CCCCCC"/>
-              <w:left w:val="single" w:sz="1" w:space="0" w:color="CCCCCC"/>
-              <w:bottom w:val="single" w:sz="1" w:space="0" w:color="CCCCCC"/>
-              <w:right w:val="single" w:sz="1" w:space="0" w:color="CCCCCC"/>
-            </w:tcBorders>
-            <w:tcMar>
-              <w:top w:w="80" w:type="dxa"/>
-              <w:left w:w="120" w:type="dxa"/>
-              <w:bottom w:w="80" w:type="dxa"/>
-              <w:right w:w="120" w:type="dxa"/>
-            </w:tcMar>
-          </w:tcPr>
-          <w:p>
-            <w:r>
-              <w:rPr>
-                <w:i/>
-                <w:iCs/>
-                <w:color w:val="AAAAAA"/>
-                <w:sz w:val="20"/>
-                <w:szCs w:val="20"/>
-              </w:rPr>
-              <w:t xml:space="preserve">Si el test falla, </w:t>
-            </w:r>
-            <w:proofErr w:type="spellStart"/>
-            <w:r>
-              <w:rPr>
-                <w:i/>
-                <w:iCs/>
-                <w:color w:val="AAAAAA"/>
-                <w:sz w:val="20"/>
-                <w:szCs w:val="20"/>
-              </w:rPr>
-              <w:t>describird</w:t>
-            </w:r>
-            <w:proofErr w:type="spellEnd"/>
-            <w:r>
-              <w:rPr>
-                <w:i/>
-                <w:iCs/>
-                <w:color w:val="AAAAAA"/>
-                <w:sz w:val="20"/>
-                <w:szCs w:val="20"/>
-              </w:rPr>
-              <w:t xml:space="preserve"> el defecto encontrado. Si pasa, escribid 'Ninguno'.</w:t>
-            </w:r>
-          </w:p>
+            <w:tcW w:w="4190" w:type="dxa"/>
+            <w:tcBorders>
+              <w:top w:val="single" w:sz="2" w:space="0" w:color="CCCCCC"/>
+              <w:left w:val="single" w:sz="2" w:space="0" w:color="CCCCCC"/>
+              <w:bottom w:val="single" w:sz="2" w:space="0" w:color="CCCCCC"/>
+              <w:right w:val="single" w:sz="2" w:space="0" w:color="CCCCCC"/>
+            </w:tcBorders>
+            <w:tcMar>
+              <w:top w:w="80" w:type="dxa"/>
+              <w:left w:w="120" w:type="dxa"/>
+              <w:bottom w:w="80" w:type="dxa"/>
+              <w:right w:w="120" w:type="dxa"/>
+            </w:tcMar>
+            <w:vAlign w:val="center"/>
+          </w:tcPr>
           <w:p>
             <w:pPr>
               <w:spacing w:after="80"/>
+              <w:rPr>
+                <w:color w:val="000000" w:themeColor="text1"/>
+                <w:sz w:val="20"/>
+                <w:szCs w:val="20"/>
+              </w:rPr>
             </w:pPr>
             <w:r>
-              <w:t xml:space="preserve"> </w:t>
+              <w:rPr>
+                <w:color w:val="000000" w:themeColor="text1"/>
+                <w:sz w:val="20"/>
+                <w:szCs w:val="20"/>
+              </w:rPr>
+              <w:t>Ninguno</w:t>
             </w:r>
           </w:p>
         </w:tc>
@@ -15510,253 +15779,253 @@
                 <w:sz w:val="20"/>
                 <w:szCs w:val="20"/>
               </w:rPr>
+              <w:t>Técnica de diseño</w:t>
+            </w:r>
+          </w:p>
+        </w:tc>
+        <w:tc>
+          <w:tcPr>
+            <w:tcW w:w="6638" w:type="dxa"/>
+            <w:tcBorders>
+              <w:top w:val="single" w:sz="1" w:space="0" w:color="CCCCCC"/>
+              <w:left w:val="single" w:sz="1" w:space="0" w:color="CCCCCC"/>
+              <w:bottom w:val="single" w:sz="1" w:space="0" w:color="CCCCCC"/>
+              <w:right w:val="single" w:sz="1" w:space="0" w:color="CCCCCC"/>
+            </w:tcBorders>
+            <w:shd w:val="clear" w:color="auto" w:fill="FFFFFF"/>
+            <w:tcMar>
+              <w:top w:w="80" w:type="dxa"/>
+              <w:left w:w="120" w:type="dxa"/>
+              <w:bottom w:w="80" w:type="dxa"/>
+              <w:right w:w="120" w:type="dxa"/>
+            </w:tcMar>
+          </w:tcPr>
+          <w:p>
+            <w:r>
+              <w:rPr>
+                <w:i/>
+                <w:iCs/>
+                <w:color w:val="AAAAAA"/>
+                <w:sz w:val="20"/>
+                <w:szCs w:val="20"/>
+              </w:rPr>
+              <w:t>Caja negra / Caja blanca / Valores límite / Particiones equivalencia</w:t>
+            </w:r>
+          </w:p>
+        </w:tc>
+      </w:tr>
+      <w:tr>
+        <w:tc>
+          <w:tcPr>
+            <w:tcW w:w="3000" w:type="dxa"/>
+            <w:tcBorders>
+              <w:top w:val="single" w:sz="1" w:space="0" w:color="CCCCCC"/>
+              <w:left w:val="single" w:sz="1" w:space="0" w:color="CCCCCC"/>
+              <w:bottom w:val="single" w:sz="1" w:space="0" w:color="CCCCCC"/>
+              <w:right w:val="single" w:sz="1" w:space="0" w:color="CCCCCC"/>
+            </w:tcBorders>
+            <w:shd w:val="clear" w:color="auto" w:fill="D6E4F0"/>
+            <w:tcMar>
+              <w:top w:w="80" w:type="dxa"/>
+              <w:left w:w="120" w:type="dxa"/>
+              <w:bottom w:w="80" w:type="dxa"/>
+              <w:right w:w="120" w:type="dxa"/>
+            </w:tcMar>
+          </w:tcPr>
+          <w:p>
+            <w:r>
+              <w:rPr>
+                <w:b/>
+                <w:bCs/>
+                <w:color w:val="1A1A2E"/>
+                <w:sz w:val="20"/>
+                <w:szCs w:val="20"/>
+              </w:rPr>
+              <w:t>Precondiciones</w:t>
+            </w:r>
+          </w:p>
+        </w:tc>
+        <w:tc>
+          <w:tcPr>
+            <w:tcW w:w="6638" w:type="dxa"/>
+            <w:tcBorders>
+              <w:top w:val="single" w:sz="1" w:space="0" w:color="CCCCCC"/>
+              <w:left w:val="single" w:sz="1" w:space="0" w:color="CCCCCC"/>
+              <w:bottom w:val="single" w:sz="1" w:space="0" w:color="CCCCCC"/>
+              <w:right w:val="single" w:sz="1" w:space="0" w:color="CCCCCC"/>
+            </w:tcBorders>
+            <w:shd w:val="clear" w:color="auto" w:fill="FFFFFF"/>
+            <w:tcMar>
+              <w:top w:w="80" w:type="dxa"/>
+              <w:left w:w="120" w:type="dxa"/>
+              <w:bottom w:w="80" w:type="dxa"/>
+              <w:right w:w="120" w:type="dxa"/>
+            </w:tcMar>
+          </w:tcPr>
+          <w:p>
+            <w:r>
+              <w:rPr>
+                <w:i/>
+                <w:iCs/>
+                <w:color w:val="AAAAAA"/>
+                <w:sz w:val="20"/>
+                <w:szCs w:val="20"/>
+              </w:rPr>
+              <w:t>Estado del sistema antes de ejecutar el test</w:t>
+            </w:r>
+          </w:p>
+        </w:tc>
+      </w:tr>
+      <w:tr>
+        <w:tc>
+          <w:tcPr>
+            <w:tcW w:w="3000" w:type="dxa"/>
+            <w:tcBorders>
+              <w:top w:val="single" w:sz="1" w:space="0" w:color="CCCCCC"/>
+              <w:left w:val="single" w:sz="1" w:space="0" w:color="CCCCCC"/>
+              <w:bottom w:val="single" w:sz="1" w:space="0" w:color="CCCCCC"/>
+              <w:right w:val="single" w:sz="1" w:space="0" w:color="CCCCCC"/>
+            </w:tcBorders>
+            <w:shd w:val="clear" w:color="auto" w:fill="D6E4F0"/>
+            <w:tcMar>
+              <w:top w:w="80" w:type="dxa"/>
+              <w:left w:w="120" w:type="dxa"/>
+              <w:bottom w:w="80" w:type="dxa"/>
+              <w:right w:w="120" w:type="dxa"/>
+            </w:tcMar>
+          </w:tcPr>
+          <w:p>
+            <w:r>
+              <w:rPr>
+                <w:b/>
+                <w:bCs/>
+                <w:color w:val="1A1A2E"/>
+                <w:sz w:val="20"/>
+                <w:szCs w:val="20"/>
+              </w:rPr>
+              <w:t>Datos de entrada</w:t>
+            </w:r>
+          </w:p>
+        </w:tc>
+        <w:tc>
+          <w:tcPr>
+            <w:tcW w:w="6638" w:type="dxa"/>
+            <w:tcBorders>
+              <w:top w:val="single" w:sz="1" w:space="0" w:color="CCCCCC"/>
+              <w:left w:val="single" w:sz="1" w:space="0" w:color="CCCCCC"/>
+              <w:bottom w:val="single" w:sz="1" w:space="0" w:color="CCCCCC"/>
+              <w:right w:val="single" w:sz="1" w:space="0" w:color="CCCCCC"/>
+            </w:tcBorders>
+            <w:tcMar>
+              <w:top w:w="80" w:type="dxa"/>
+              <w:left w:w="120" w:type="dxa"/>
+              <w:bottom w:w="80" w:type="dxa"/>
+              <w:right w:w="120" w:type="dxa"/>
+            </w:tcMar>
+          </w:tcPr>
+          <w:p>
+            <w:r>
+              <w:rPr>
+                <w:i/>
+                <w:iCs/>
+                <w:color w:val="AAAAAA"/>
+                <w:sz w:val="20"/>
+                <w:szCs w:val="20"/>
+              </w:rPr>
+              <w:t>Escribid los valores de entrada del test</w:t>
+            </w:r>
+          </w:p>
+        </w:tc>
+      </w:tr>
+      <w:tr>
+        <w:tc>
+          <w:tcPr>
+            <w:tcW w:w="3000" w:type="dxa"/>
+            <w:tcBorders>
+              <w:top w:val="single" w:sz="1" w:space="0" w:color="CCCCCC"/>
+              <w:left w:val="single" w:sz="1" w:space="0" w:color="CCCCCC"/>
+              <w:bottom w:val="single" w:sz="1" w:space="0" w:color="CCCCCC"/>
+              <w:right w:val="single" w:sz="1" w:space="0" w:color="CCCCCC"/>
+            </w:tcBorders>
+            <w:shd w:val="clear" w:color="auto" w:fill="D6E4F0"/>
+            <w:tcMar>
+              <w:top w:w="80" w:type="dxa"/>
+              <w:left w:w="120" w:type="dxa"/>
+              <w:bottom w:w="80" w:type="dxa"/>
+              <w:right w:w="120" w:type="dxa"/>
+            </w:tcMar>
+          </w:tcPr>
+          <w:p>
+            <w:r>
+              <w:rPr>
+                <w:b/>
+                <w:bCs/>
+                <w:color w:val="1A1A2E"/>
+                <w:sz w:val="20"/>
+                <w:szCs w:val="20"/>
+              </w:rPr>
+              <w:t>Resultado esperado</w:t>
+            </w:r>
+          </w:p>
+        </w:tc>
+        <w:tc>
+          <w:tcPr>
+            <w:tcW w:w="6638" w:type="dxa"/>
+            <w:tcBorders>
+              <w:top w:val="single" w:sz="1" w:space="0" w:color="CCCCCC"/>
+              <w:left w:val="single" w:sz="1" w:space="0" w:color="CCCCCC"/>
+              <w:bottom w:val="single" w:sz="1" w:space="0" w:color="CCCCCC"/>
+              <w:right w:val="single" w:sz="1" w:space="0" w:color="CCCCCC"/>
+            </w:tcBorders>
+            <w:tcMar>
+              <w:top w:w="80" w:type="dxa"/>
+              <w:left w:w="120" w:type="dxa"/>
+              <w:bottom w:w="80" w:type="dxa"/>
+              <w:right w:w="120" w:type="dxa"/>
+            </w:tcMar>
+          </w:tcPr>
+          <w:p>
+            <w:r>
+              <w:rPr>
+                <w:i/>
+                <w:iCs/>
+                <w:color w:val="AAAAAA"/>
+                <w:sz w:val="20"/>
+                <w:szCs w:val="20"/>
+              </w:rPr>
+              <w:t>Qué debería devolver o hacer el sistema si funciona correctamente</w:t>
+            </w:r>
+          </w:p>
+        </w:tc>
+      </w:tr>
+      <w:tr>
+        <w:tc>
+          <w:tcPr>
+            <w:tcW w:w="3000" w:type="dxa"/>
+            <w:tcBorders>
+              <w:top w:val="single" w:sz="1" w:space="0" w:color="CCCCCC"/>
+              <w:left w:val="single" w:sz="1" w:space="0" w:color="CCCCCC"/>
+              <w:bottom w:val="single" w:sz="1" w:space="0" w:color="CCCCCC"/>
+              <w:right w:val="single" w:sz="1" w:space="0" w:color="CCCCCC"/>
+            </w:tcBorders>
+            <w:shd w:val="clear" w:color="auto" w:fill="D6E4F0"/>
+            <w:tcMar>
+              <w:top w:w="80" w:type="dxa"/>
+              <w:left w:w="120" w:type="dxa"/>
+              <w:bottom w:w="80" w:type="dxa"/>
+              <w:right w:w="120" w:type="dxa"/>
+            </w:tcMar>
+          </w:tcPr>
+          <w:p>
+            <w:r>
+              <w:rPr>
+                <w:b/>
+                <w:bCs/>
+                <w:color w:val="1A1A2E"/>
+                <w:sz w:val="20"/>
+                <w:szCs w:val="20"/>
+              </w:rPr>
               <w:lastRenderedPageBreak/>
-              <w:t>Técnica de diseño</w:t>
-            </w:r>
-          </w:p>
-        </w:tc>
-        <w:tc>
-          <w:tcPr>
-            <w:tcW w:w="6638" w:type="dxa"/>
-            <w:tcBorders>
-              <w:top w:val="single" w:sz="1" w:space="0" w:color="CCCCCC"/>
-              <w:left w:val="single" w:sz="1" w:space="0" w:color="CCCCCC"/>
-              <w:bottom w:val="single" w:sz="1" w:space="0" w:color="CCCCCC"/>
-              <w:right w:val="single" w:sz="1" w:space="0" w:color="CCCCCC"/>
-            </w:tcBorders>
-            <w:shd w:val="clear" w:color="auto" w:fill="FFFFFF"/>
-            <w:tcMar>
-              <w:top w:w="80" w:type="dxa"/>
-              <w:left w:w="120" w:type="dxa"/>
-              <w:bottom w:w="80" w:type="dxa"/>
-              <w:right w:w="120" w:type="dxa"/>
-            </w:tcMar>
-          </w:tcPr>
-          <w:p>
-            <w:r>
-              <w:rPr>
-                <w:i/>
-                <w:iCs/>
-                <w:color w:val="AAAAAA"/>
-                <w:sz w:val="20"/>
-                <w:szCs w:val="20"/>
-              </w:rPr>
-              <w:t>Caja negra / Caja blanca / Valores límite / Particiones equivalencia</w:t>
-            </w:r>
-          </w:p>
-        </w:tc>
-      </w:tr>
-      <w:tr>
-        <w:tc>
-          <w:tcPr>
-            <w:tcW w:w="3000" w:type="dxa"/>
-            <w:tcBorders>
-              <w:top w:val="single" w:sz="1" w:space="0" w:color="CCCCCC"/>
-              <w:left w:val="single" w:sz="1" w:space="0" w:color="CCCCCC"/>
-              <w:bottom w:val="single" w:sz="1" w:space="0" w:color="CCCCCC"/>
-              <w:right w:val="single" w:sz="1" w:space="0" w:color="CCCCCC"/>
-            </w:tcBorders>
-            <w:shd w:val="clear" w:color="auto" w:fill="D6E4F0"/>
-            <w:tcMar>
-              <w:top w:w="80" w:type="dxa"/>
-              <w:left w:w="120" w:type="dxa"/>
-              <w:bottom w:w="80" w:type="dxa"/>
-              <w:right w:w="120" w:type="dxa"/>
-            </w:tcMar>
-          </w:tcPr>
-          <w:p>
-            <w:r>
-              <w:rPr>
-                <w:b/>
-                <w:bCs/>
-                <w:color w:val="1A1A2E"/>
-                <w:sz w:val="20"/>
-                <w:szCs w:val="20"/>
-              </w:rPr>
-              <w:t>Precondiciones</w:t>
-            </w:r>
-          </w:p>
-        </w:tc>
-        <w:tc>
-          <w:tcPr>
-            <w:tcW w:w="6638" w:type="dxa"/>
-            <w:tcBorders>
-              <w:top w:val="single" w:sz="1" w:space="0" w:color="CCCCCC"/>
-              <w:left w:val="single" w:sz="1" w:space="0" w:color="CCCCCC"/>
-              <w:bottom w:val="single" w:sz="1" w:space="0" w:color="CCCCCC"/>
-              <w:right w:val="single" w:sz="1" w:space="0" w:color="CCCCCC"/>
-            </w:tcBorders>
-            <w:shd w:val="clear" w:color="auto" w:fill="FFFFFF"/>
-            <w:tcMar>
-              <w:top w:w="80" w:type="dxa"/>
-              <w:left w:w="120" w:type="dxa"/>
-              <w:bottom w:w="80" w:type="dxa"/>
-              <w:right w:w="120" w:type="dxa"/>
-            </w:tcMar>
-          </w:tcPr>
-          <w:p>
-            <w:r>
-              <w:rPr>
-                <w:i/>
-                <w:iCs/>
-                <w:color w:val="AAAAAA"/>
-                <w:sz w:val="20"/>
-                <w:szCs w:val="20"/>
-              </w:rPr>
-              <w:t>Estado del sistema antes de ejecutar el test</w:t>
-            </w:r>
-          </w:p>
-        </w:tc>
-      </w:tr>
-      <w:tr>
-        <w:tc>
-          <w:tcPr>
-            <w:tcW w:w="3000" w:type="dxa"/>
-            <w:tcBorders>
-              <w:top w:val="single" w:sz="1" w:space="0" w:color="CCCCCC"/>
-              <w:left w:val="single" w:sz="1" w:space="0" w:color="CCCCCC"/>
-              <w:bottom w:val="single" w:sz="1" w:space="0" w:color="CCCCCC"/>
-              <w:right w:val="single" w:sz="1" w:space="0" w:color="CCCCCC"/>
-            </w:tcBorders>
-            <w:shd w:val="clear" w:color="auto" w:fill="D6E4F0"/>
-            <w:tcMar>
-              <w:top w:w="80" w:type="dxa"/>
-              <w:left w:w="120" w:type="dxa"/>
-              <w:bottom w:w="80" w:type="dxa"/>
-              <w:right w:w="120" w:type="dxa"/>
-            </w:tcMar>
-          </w:tcPr>
-          <w:p>
-            <w:r>
-              <w:rPr>
-                <w:b/>
-                <w:bCs/>
-                <w:color w:val="1A1A2E"/>
-                <w:sz w:val="20"/>
-                <w:szCs w:val="20"/>
-              </w:rPr>
-              <w:t>Datos de entrada</w:t>
-            </w:r>
-          </w:p>
-        </w:tc>
-        <w:tc>
-          <w:tcPr>
-            <w:tcW w:w="6638" w:type="dxa"/>
-            <w:tcBorders>
-              <w:top w:val="single" w:sz="1" w:space="0" w:color="CCCCCC"/>
-              <w:left w:val="single" w:sz="1" w:space="0" w:color="CCCCCC"/>
-              <w:bottom w:val="single" w:sz="1" w:space="0" w:color="CCCCCC"/>
-              <w:right w:val="single" w:sz="1" w:space="0" w:color="CCCCCC"/>
-            </w:tcBorders>
-            <w:tcMar>
-              <w:top w:w="80" w:type="dxa"/>
-              <w:left w:w="120" w:type="dxa"/>
-              <w:bottom w:w="80" w:type="dxa"/>
-              <w:right w:w="120" w:type="dxa"/>
-            </w:tcMar>
-          </w:tcPr>
-          <w:p>
-            <w:r>
-              <w:rPr>
-                <w:i/>
-                <w:iCs/>
-                <w:color w:val="AAAAAA"/>
-                <w:sz w:val="20"/>
-                <w:szCs w:val="20"/>
-              </w:rPr>
-              <w:t>Escribid los valores de entrada del test</w:t>
-            </w:r>
-          </w:p>
-        </w:tc>
-      </w:tr>
-      <w:tr>
-        <w:tc>
-          <w:tcPr>
-            <w:tcW w:w="3000" w:type="dxa"/>
-            <w:tcBorders>
-              <w:top w:val="single" w:sz="1" w:space="0" w:color="CCCCCC"/>
-              <w:left w:val="single" w:sz="1" w:space="0" w:color="CCCCCC"/>
-              <w:bottom w:val="single" w:sz="1" w:space="0" w:color="CCCCCC"/>
-              <w:right w:val="single" w:sz="1" w:space="0" w:color="CCCCCC"/>
-            </w:tcBorders>
-            <w:shd w:val="clear" w:color="auto" w:fill="D6E4F0"/>
-            <w:tcMar>
-              <w:top w:w="80" w:type="dxa"/>
-              <w:left w:w="120" w:type="dxa"/>
-              <w:bottom w:w="80" w:type="dxa"/>
-              <w:right w:w="120" w:type="dxa"/>
-            </w:tcMar>
-          </w:tcPr>
-          <w:p>
-            <w:r>
-              <w:rPr>
-                <w:b/>
-                <w:bCs/>
-                <w:color w:val="1A1A2E"/>
-                <w:sz w:val="20"/>
-                <w:szCs w:val="20"/>
-              </w:rPr>
-              <w:t>Resultado esperado</w:t>
-            </w:r>
-          </w:p>
-        </w:tc>
-        <w:tc>
-          <w:tcPr>
-            <w:tcW w:w="6638" w:type="dxa"/>
-            <w:tcBorders>
-              <w:top w:val="single" w:sz="1" w:space="0" w:color="CCCCCC"/>
-              <w:left w:val="single" w:sz="1" w:space="0" w:color="CCCCCC"/>
-              <w:bottom w:val="single" w:sz="1" w:space="0" w:color="CCCCCC"/>
-              <w:right w:val="single" w:sz="1" w:space="0" w:color="CCCCCC"/>
-            </w:tcBorders>
-            <w:tcMar>
-              <w:top w:w="80" w:type="dxa"/>
-              <w:left w:w="120" w:type="dxa"/>
-              <w:bottom w:w="80" w:type="dxa"/>
-              <w:right w:w="120" w:type="dxa"/>
-            </w:tcMar>
-          </w:tcPr>
-          <w:p>
-            <w:r>
-              <w:rPr>
-                <w:i/>
-                <w:iCs/>
-                <w:color w:val="AAAAAA"/>
-                <w:sz w:val="20"/>
-                <w:szCs w:val="20"/>
-              </w:rPr>
-              <w:t>Qué debería devolver o hacer el sistema si funciona correctamente</w:t>
-            </w:r>
-          </w:p>
-        </w:tc>
-      </w:tr>
-      <w:tr>
-        <w:tc>
-          <w:tcPr>
-            <w:tcW w:w="3000" w:type="dxa"/>
-            <w:tcBorders>
-              <w:top w:val="single" w:sz="1" w:space="0" w:color="CCCCCC"/>
-              <w:left w:val="single" w:sz="1" w:space="0" w:color="CCCCCC"/>
-              <w:bottom w:val="single" w:sz="1" w:space="0" w:color="CCCCCC"/>
-              <w:right w:val="single" w:sz="1" w:space="0" w:color="CCCCCC"/>
-            </w:tcBorders>
-            <w:shd w:val="clear" w:color="auto" w:fill="D6E4F0"/>
-            <w:tcMar>
-              <w:top w:w="80" w:type="dxa"/>
-              <w:left w:w="120" w:type="dxa"/>
-              <w:bottom w:w="80" w:type="dxa"/>
-              <w:right w:w="120" w:type="dxa"/>
-            </w:tcMar>
-          </w:tcPr>
-          <w:p>
-            <w:r>
-              <w:rPr>
-                <w:b/>
-                <w:bCs/>
-                <w:color w:val="1A1A2E"/>
-                <w:sz w:val="20"/>
-                <w:szCs w:val="20"/>
-              </w:rPr>
               <w:t>Resultado obtenido</w:t>
             </w:r>
           </w:p>
@@ -17265,7 +17534,6 @@
                 <w:sz w:val="20"/>
                 <w:szCs w:val="20"/>
               </w:rPr>
-              <w:lastRenderedPageBreak/>
               <w:t>Resultado obtenido</w:t>
             </w:r>
           </w:p>
@@ -17488,6 +17756,7 @@
     </w:tbl>
     <w:p>
       <w:r>
+        <w:lastRenderedPageBreak/>
         <w:br w:type="page"/>
       </w:r>
     </w:p>

</xml_diff>

<commit_message>
docs: añadir TC-017 a TC-020 y fila de nombre en Parte 2 del informe
</commit_message>
<xml_diff>
--- a/plantilla_iso29119.docx
+++ b/plantilla_iso29119.docx
@@ -4558,7 +4558,6 @@
               <w:bottom w:val="single" w:sz="1" w:space="0" w:color="CCCCCC"/>
               <w:right w:val="single" w:sz="1" w:space="0" w:color="CCCCCC"/>
             </w:tcBorders>
-            <w:shd w:val="clear" w:color="auto" w:fill="F5F5F5"/>
             <w:tcMar>
               <w:top w:w="80" w:type="dxa"/>
               <w:left w:w="120" w:type="dxa"/>
@@ -4606,7 +4605,6 @@
               <w:bottom w:val="single" w:sz="1" w:space="0" w:color="CCCCCC"/>
               <w:right w:val="single" w:sz="1" w:space="0" w:color="CCCCCC"/>
             </w:tcBorders>
-            <w:shd w:val="clear" w:color="auto" w:fill="F5F5F5"/>
             <w:tcMar>
               <w:top w:w="80" w:type="dxa"/>
               <w:left w:w="120" w:type="dxa"/>
@@ -4641,7 +4639,6 @@
               <w:bottom w:val="single" w:sz="1" w:space="0" w:color="CCCCCC"/>
               <w:right w:val="single" w:sz="1" w:space="0" w:color="CCCCCC"/>
             </w:tcBorders>
-            <w:shd w:val="clear" w:color="auto" w:fill="F5F5F5"/>
             <w:tcMar>
               <w:top w:w="80" w:type="dxa"/>
               <w:left w:w="120" w:type="dxa"/>
@@ -4697,7 +4694,6 @@
               <w:bottom w:val="single" w:sz="1" w:space="0" w:color="CCCCCC"/>
               <w:right w:val="single" w:sz="1" w:space="0" w:color="CCCCCC"/>
             </w:tcBorders>
-            <w:shd w:val="clear" w:color="auto" w:fill="F5F5F5"/>
             <w:tcMar>
               <w:top w:w="80" w:type="dxa"/>
               <w:left w:w="120" w:type="dxa"/>
@@ -4948,15 +4944,6 @@
                 <w:szCs w:val="20"/>
                 <w:lang w:val="pt-PT"/>
               </w:rPr>
-              <w:t xml:space="preserve"> </w:t>
-            </w:r>
-            <w:r>
-              <w:rPr>
-                <w:color w:val="000000" w:themeColor="text1"/>
-                <w:sz w:val="20"/>
-                <w:szCs w:val="20"/>
-                <w:lang w:val="pt-PT"/>
-              </w:rPr>
               <w:t xml:space="preserve">null → false </w:t>
             </w:r>
           </w:p>
@@ -5035,6 +5022,33 @@
               </w:rPr>
               <w:t xml:space="preserve"> </w:t>
             </w:r>
+            <w:r>
+              <w:rPr>
+                <w:color w:val="000000" w:themeColor="text1"/>
+                <w:sz w:val="20"/>
+                <w:szCs w:val="20"/>
+                <w:lang w:val="pt-PT"/>
+              </w:rPr>
+              <w:t>validarTelefono(tel</w:t>
+            </w:r>
+            <w:r>
+              <w:rPr>
+                <w:color w:val="000000" w:themeColor="text1"/>
+                <w:sz w:val="20"/>
+                <w:szCs w:val="20"/>
+                <w:lang w:val="pt-PT"/>
+              </w:rPr>
+              <w:t>efono</w:t>
+            </w:r>
+            <w:r>
+              <w:rPr>
+                <w:color w:val="000000" w:themeColor="text1"/>
+                <w:sz w:val="20"/>
+                <w:szCs w:val="20"/>
+                <w:lang w:val="pt-PT"/>
+              </w:rPr>
+              <w:t>)</w:t>
+            </w:r>
           </w:p>
         </w:tc>
         <w:tc>
@@ -5067,13 +5081,49 @@
                 <w:szCs w:val="20"/>
                 <w:lang w:val="pt-PT"/>
               </w:rPr>
-              <w:t xml:space="preserve"> </w:t>
+              <w:t>"612345678" → true "712345678" → true "912345678" → true</w:t>
             </w:r>
           </w:p>
         </w:tc>
         <w:tc>
           <w:tcPr>
             <w:tcW w:w="2300" w:type="dxa"/>
+            <w:tcBorders>
+              <w:top w:val="single" w:sz="2" w:space="0" w:color="CCCCCC"/>
+              <w:left w:val="single" w:sz="2" w:space="0" w:color="CCCCCC"/>
+              <w:bottom w:val="single" w:sz="2" w:space="0" w:color="CCCCCC"/>
+              <w:right w:val="single" w:sz="2" w:space="0" w:color="CCCCCC"/>
+            </w:tcBorders>
+            <w:tcMar>
+              <w:top w:w="80" w:type="dxa"/>
+              <w:left w:w="120" w:type="dxa"/>
+              <w:bottom w:w="80" w:type="dxa"/>
+              <w:right w:w="120" w:type="dxa"/>
+            </w:tcMar>
+            <w:vAlign w:val="center"/>
+          </w:tcPr>
+          <w:p>
+            <w:pPr>
+              <w:rPr>
+                <w:color w:val="000000" w:themeColor="text1"/>
+                <w:sz w:val="20"/>
+                <w:szCs w:val="20"/>
+                <w:lang w:val="pt-PT"/>
+              </w:rPr>
+            </w:pPr>
+            <w:r>
+              <w:rPr>
+                <w:color w:val="000000"/>
+                <w:sz w:val="20"/>
+                <w:szCs w:val="20"/>
+              </w:rPr>
+              <w:t>"812345678" (empieza por 8) → false "61234567" (8 dígitos) → false</w:t>
+            </w:r>
+          </w:p>
+        </w:tc>
+        <w:tc>
+          <w:tcPr>
+            <w:tcW w:w="2538" w:type="dxa"/>
             <w:tcBorders>
               <w:top w:val="single" w:sz="1" w:space="0" w:color="CCCCCC"/>
               <w:left w:val="single" w:sz="1" w:space="0" w:color="CCCCCC"/>
@@ -5101,41 +5151,7 @@
                 <w:szCs w:val="20"/>
                 <w:lang w:val="pt-PT"/>
               </w:rPr>
-              <w:t xml:space="preserve"> </w:t>
-            </w:r>
-          </w:p>
-        </w:tc>
-        <w:tc>
-          <w:tcPr>
-            <w:tcW w:w="2538" w:type="dxa"/>
-            <w:tcBorders>
-              <w:top w:val="single" w:sz="1" w:space="0" w:color="CCCCCC"/>
-              <w:left w:val="single" w:sz="1" w:space="0" w:color="CCCCCC"/>
-              <w:bottom w:val="single" w:sz="1" w:space="0" w:color="CCCCCC"/>
-              <w:right w:val="single" w:sz="1" w:space="0" w:color="CCCCCC"/>
-            </w:tcBorders>
-            <w:tcMar>
-              <w:top w:w="80" w:type="dxa"/>
-              <w:left w:w="120" w:type="dxa"/>
-              <w:bottom w:w="80" w:type="dxa"/>
-              <w:right w:w="120" w:type="dxa"/>
-            </w:tcMar>
-          </w:tcPr>
-          <w:p>
-            <w:pPr>
-              <w:rPr>
-                <w:color w:val="000000" w:themeColor="text1"/>
-                <w:lang w:val="pt-PT"/>
-              </w:rPr>
-            </w:pPr>
-            <w:r>
-              <w:rPr>
-                <w:color w:val="000000" w:themeColor="text1"/>
-                <w:sz w:val="20"/>
-                <w:szCs w:val="20"/>
-                <w:lang w:val="pt-PT"/>
-              </w:rPr>
-              <w:t xml:space="preserve"> </w:t>
+              <w:t>null → false 9 dígitos empieza por 5 → false letras incluidas → false</w:t>
             </w:r>
           </w:p>
         </w:tc>
@@ -5177,6 +5193,15 @@
               </w:rPr>
               <w:t xml:space="preserve"> </w:t>
             </w:r>
+            <w:r>
+              <w:rPr>
+                <w:color w:val="000000" w:themeColor="text1"/>
+                <w:sz w:val="20"/>
+                <w:szCs w:val="20"/>
+                <w:lang w:val="pt-PT"/>
+              </w:rPr>
+              <w:t>validarNombre(nombre)</w:t>
+            </w:r>
           </w:p>
         </w:tc>
         <w:tc>
@@ -5209,7 +5234,7 @@
                 <w:szCs w:val="20"/>
                 <w:lang w:val="pt-PT"/>
               </w:rPr>
-              <w:t xml:space="preserve"> </w:t>
+              <w:t>"Juan Garcia" → true</w:t>
             </w:r>
           </w:p>
         </w:tc>
@@ -5243,7 +5268,7 @@
                 <w:szCs w:val="20"/>
                 <w:lang w:val="pt-PT"/>
               </w:rPr>
-              <w:t xml:space="preserve"> </w:t>
+              <w:t>"A" (1 char) → false "María" → false (BUG: debería ser true)</w:t>
             </w:r>
           </w:p>
         </w:tc>
@@ -5278,6 +5303,15 @@
                 <w:lang w:val="pt-PT"/>
               </w:rPr>
               <w:t xml:space="preserve"> </w:t>
+            </w:r>
+            <w:r>
+              <w:rPr>
+                <w:color w:val="000000" w:themeColor="text1"/>
+                <w:sz w:val="20"/>
+                <w:szCs w:val="20"/>
+                <w:lang w:val="pt-PT"/>
+              </w:rPr>
+              <w:t>null → false 2 chars → true 51 chars → false Nombre con ñ → false (BUG)</w:t>
             </w:r>
           </w:p>
         </w:tc>
@@ -5435,7 +5469,6 @@
               <w:bottom w:val="single" w:sz="1" w:space="0" w:color="CCCCCC"/>
               <w:right w:val="single" w:sz="1" w:space="0" w:color="CCCCCC"/>
             </w:tcBorders>
-            <w:shd w:val="clear" w:color="auto" w:fill="F5F5F5"/>
             <w:tcMar>
               <w:top w:w="80" w:type="dxa"/>
               <w:left w:w="120" w:type="dxa"/>
@@ -5504,7 +5537,6 @@
               <w:bottom w:val="single" w:sz="1" w:space="0" w:color="CCCCCC"/>
               <w:right w:val="single" w:sz="1" w:space="0" w:color="CCCCCC"/>
             </w:tcBorders>
-            <w:shd w:val="clear" w:color="auto" w:fill="F5F5F5"/>
             <w:tcMar>
               <w:top w:w="80" w:type="dxa"/>
               <w:left w:w="120" w:type="dxa"/>
@@ -5539,7 +5571,6 @@
               <w:bottom w:val="single" w:sz="1" w:space="0" w:color="CCCCCC"/>
               <w:right w:val="single" w:sz="1" w:space="0" w:color="CCCCCC"/>
             </w:tcBorders>
-            <w:shd w:val="clear" w:color="auto" w:fill="F5F5F5"/>
             <w:tcMar>
               <w:top w:w="80" w:type="dxa"/>
               <w:left w:w="120" w:type="dxa"/>
@@ -5574,7 +5605,6 @@
               <w:bottom w:val="single" w:sz="1" w:space="0" w:color="CCCCCC"/>
               <w:right w:val="single" w:sz="1" w:space="0" w:color="CCCCCC"/>
             </w:tcBorders>
-            <w:shd w:val="clear" w:color="auto" w:fill="F5F5F5"/>
             <w:tcMar>
               <w:top w:w="80" w:type="dxa"/>
               <w:left w:w="120" w:type="dxa"/>
@@ -18841,22 +18871,6 @@
               </w:rPr>
               <w:t>7</w:t>
             </w:r>
-            <w:r>
-              <w:rPr>
-                <w:color w:val="000000"/>
-                <w:sz w:val="20"/>
-                <w:szCs w:val="20"/>
-              </w:rPr>
-              <w:t xml:space="preserve"> </w:t>
-            </w:r>
-            <w:r>
-              <w:rPr>
-                <w:color w:val="000000"/>
-                <w:sz w:val="20"/>
-                <w:szCs w:val="20"/>
-              </w:rPr>
-              <w:t>– Hasta aquí</w:t>
-            </w:r>
           </w:p>
         </w:tc>
       </w:tr>
@@ -18921,7 +18935,7 @@
                 <w:sz w:val="20"/>
                 <w:szCs w:val="20"/>
               </w:rPr>
-              <w:t>Teléfono empezando por 8 debe devolver false</w:t>
+              <w:t>Nombre válido sin tildes debe devolver true</w:t>
             </w:r>
           </w:p>
         </w:tc>
@@ -18988,7 +19002,7 @@
                 <w:sz w:val="20"/>
                 <w:szCs w:val="20"/>
               </w:rPr>
-              <w:t>ValidadorFormulario.validarTelefono</w:t>
+              <w:t>ValidadorFormulario.validarNombre</w:t>
             </w:r>
             <w:proofErr w:type="spellEnd"/>
             <w:r>
@@ -19063,7 +19077,7 @@
                 <w:sz w:val="20"/>
                 <w:szCs w:val="20"/>
               </w:rPr>
-              <w:t>Caja Negra – Partición inválida</w:t>
+              <w:t>Caja Negra – Partición válida</w:t>
             </w:r>
           </w:p>
         </w:tc>
@@ -19213,7 +19227,7 @@
                 <w:sz w:val="20"/>
                 <w:szCs w:val="20"/>
               </w:rPr>
-              <w:t>"812345678"</w:t>
+              <w:t>"Juan Garcia"</w:t>
             </w:r>
           </w:p>
         </w:tc>
@@ -19279,7 +19293,7 @@
                 <w:sz w:val="20"/>
                 <w:szCs w:val="20"/>
               </w:rPr>
-              <w:t>false</w:t>
+              <w:t>true</w:t>
             </w:r>
           </w:p>
         </w:tc>
@@ -19345,7 +19359,7 @@
                 <w:sz w:val="20"/>
                 <w:szCs w:val="20"/>
               </w:rPr>
-              <w:t>false</w:t>
+              <w:t>true</w:t>
             </w:r>
           </w:p>
         </w:tc>
@@ -19722,17 +19736,18 @@
           <w:p>
             <w:pPr>
               <w:rPr>
-                <w:sz w:val="20"/>
-                <w:szCs w:val="20"/>
-              </w:rPr>
-            </w:pPr>
-            <w:r>
-              <w:rPr>
                 <w:color w:val="000000"/>
                 <w:sz w:val="20"/>
                 <w:szCs w:val="20"/>
               </w:rPr>
-              <w:t xml:space="preserve">Teléfono </w:t>
+            </w:pPr>
+            <w:r>
+              <w:rPr>
+                <w:color w:val="000000"/>
+                <w:sz w:val="20"/>
+                <w:szCs w:val="20"/>
+              </w:rPr>
+              <w:t xml:space="preserve">Nombre </w:t>
             </w:r>
             <w:proofErr w:type="spellStart"/>
             <w:r>
@@ -19817,7 +19832,7 @@
                 <w:sz w:val="20"/>
                 <w:szCs w:val="20"/>
               </w:rPr>
-              <w:t>ValidadorFormulario.validarTelefono</w:t>
+              <w:t>ValidadorFormulario.validarNombre</w:t>
             </w:r>
             <w:proofErr w:type="spellEnd"/>
             <w:r>
@@ -20544,17 +20559,18 @@
           <w:p>
             <w:pPr>
               <w:rPr>
-                <w:sz w:val="20"/>
-                <w:szCs w:val="20"/>
-              </w:rPr>
-            </w:pPr>
-            <w:r>
-              <w:rPr>
                 <w:color w:val="000000"/>
                 <w:sz w:val="20"/>
                 <w:szCs w:val="20"/>
               </w:rPr>
-              <w:t>Teléfono empezando por 8 debe devolver false</w:t>
+            </w:pPr>
+            <w:r>
+              <w:rPr>
+                <w:color w:val="000000"/>
+                <w:sz w:val="20"/>
+                <w:szCs w:val="20"/>
+              </w:rPr>
+              <w:t>Nombre de 1 carácter debe devolver false (valor límite inferior)</w:t>
             </w:r>
           </w:p>
         </w:tc>
@@ -20621,7 +20637,7 @@
                 <w:sz w:val="20"/>
                 <w:szCs w:val="20"/>
               </w:rPr>
-              <w:t>ValidadorFormulario.validarTelefono</w:t>
+              <w:t>ValidadorFormulario.validarNombre</w:t>
             </w:r>
             <w:proofErr w:type="spellEnd"/>
             <w:r>
@@ -20696,7 +20712,7 @@
                 <w:sz w:val="20"/>
                 <w:szCs w:val="20"/>
               </w:rPr>
-              <w:t>Caja Negra – Partición inválida</w:t>
+              <w:t>Caja Negra – Valor límite</w:t>
             </w:r>
           </w:p>
         </w:tc>
@@ -20846,7 +20862,25 @@
                 <w:sz w:val="20"/>
                 <w:szCs w:val="20"/>
               </w:rPr>
-              <w:t>"812345678"</w:t>
+              <w:t xml:space="preserve">"A" (1 </w:t>
+            </w:r>
+            <w:proofErr w:type="spellStart"/>
+            <w:r>
+              <w:rPr>
+                <w:color w:val="000000"/>
+                <w:sz w:val="20"/>
+                <w:szCs w:val="20"/>
+              </w:rPr>
+              <w:t>char</w:t>
+            </w:r>
+            <w:proofErr w:type="spellEnd"/>
+            <w:r>
+              <w:rPr>
+                <w:color w:val="000000"/>
+                <w:sz w:val="20"/>
+                <w:szCs w:val="20"/>
+              </w:rPr>
+              <w:t>)</w:t>
             </w:r>
           </w:p>
         </w:tc>
@@ -21365,25 +21399,7 @@
                 <w:sz w:val="20"/>
                 <w:szCs w:val="20"/>
               </w:rPr>
-              <w:t xml:space="preserve">Teléfono </w:t>
-            </w:r>
-            <w:proofErr w:type="spellStart"/>
-            <w:r>
-              <w:rPr>
-                <w:color w:val="000000"/>
-                <w:sz w:val="20"/>
-                <w:szCs w:val="20"/>
-              </w:rPr>
-              <w:t>null</w:t>
-            </w:r>
-            <w:proofErr w:type="spellEnd"/>
-            <w:r>
-              <w:rPr>
-                <w:color w:val="000000"/>
-                <w:sz w:val="20"/>
-                <w:szCs w:val="20"/>
-              </w:rPr>
-              <w:t xml:space="preserve"> debe devolver false</w:t>
+              <w:t>Nombre con tildes debe devolver false (BUG: debería ser true)</w:t>
             </w:r>
           </w:p>
         </w:tc>
@@ -21450,7 +21466,7 @@
                 <w:sz w:val="20"/>
                 <w:szCs w:val="20"/>
               </w:rPr>
-              <w:t>ValidadorFormulario.validarTelefono</w:t>
+              <w:t>ValidadorFormulario.validarNombre</w:t>
             </w:r>
             <w:proofErr w:type="spellEnd"/>
             <w:r>
@@ -21525,18 +21541,8 @@
                 <w:sz w:val="20"/>
                 <w:szCs w:val="20"/>
               </w:rPr>
-              <w:t xml:space="preserve">Caja Blanca – Rama </w:t>
-            </w:r>
-            <w:proofErr w:type="spellStart"/>
-            <w:r>
-              <w:rPr>
-                <w:color w:val="000000"/>
-                <w:sz w:val="20"/>
-                <w:szCs w:val="20"/>
-              </w:rPr>
-              <w:t>null</w:t>
-            </w:r>
-            <w:proofErr w:type="spellEnd"/>
+              <w:t>Caja Negra – Partición inválida / BUG</w:t>
+            </w:r>
           </w:p>
         </w:tc>
       </w:tr>
@@ -21679,16 +21685,14 @@
                 <w:szCs w:val="20"/>
               </w:rPr>
             </w:pPr>
-            <w:proofErr w:type="spellStart"/>
             <w:r>
               <w:rPr>
                 <w:color w:val="000000"/>
                 <w:sz w:val="20"/>
                 <w:szCs w:val="20"/>
               </w:rPr>
-              <w:t>null</w:t>
-            </w:r>
-            <w:proofErr w:type="spellEnd"/>
+              <w:t>"María José"</w:t>
+            </w:r>
           </w:p>
         </w:tc>
       </w:tr>
@@ -21753,7 +21757,7 @@
                 <w:sz w:val="20"/>
                 <w:szCs w:val="20"/>
               </w:rPr>
-              <w:t>false</w:t>
+              <w:t>true (nombre español válido)</w:t>
             </w:r>
           </w:p>
         </w:tc>
@@ -21907,7 +21911,7 @@
                 <w:sz w:val="20"/>
                 <w:szCs w:val="20"/>
               </w:rPr>
-              <w:t>Pasa</w:t>
+              <w:t>Falla</w:t>
             </w:r>
           </w:p>
         </w:tc>
@@ -21974,7 +21978,61 @@
                 <w:sz w:val="20"/>
                 <w:szCs w:val="20"/>
               </w:rPr>
-              <w:t>Ninguno</w:t>
+              <w:t xml:space="preserve">BUG IR-002: el </w:t>
+            </w:r>
+            <w:proofErr w:type="spellStart"/>
+            <w:r>
+              <w:rPr>
+                <w:color w:val="000000"/>
+                <w:sz w:val="20"/>
+                <w:szCs w:val="20"/>
+              </w:rPr>
+              <w:t>regex</w:t>
+            </w:r>
+            <w:proofErr w:type="spellEnd"/>
+            <w:r>
+              <w:rPr>
+                <w:color w:val="000000"/>
+                <w:sz w:val="20"/>
+                <w:szCs w:val="20"/>
+              </w:rPr>
+              <w:t xml:space="preserve"> [a-</w:t>
+            </w:r>
+            <w:proofErr w:type="spellStart"/>
+            <w:r>
+              <w:rPr>
+                <w:color w:val="000000"/>
+                <w:sz w:val="20"/>
+                <w:szCs w:val="20"/>
+              </w:rPr>
+              <w:t>zA</w:t>
+            </w:r>
+            <w:proofErr w:type="spellEnd"/>
+            <w:r>
+              <w:rPr>
+                <w:color w:val="000000"/>
+                <w:sz w:val="20"/>
+                <w:szCs w:val="20"/>
+              </w:rPr>
+              <w:t>-</w:t>
+            </w:r>
+            <w:proofErr w:type="gramStart"/>
+            <w:r>
+              <w:rPr>
+                <w:color w:val="000000"/>
+                <w:sz w:val="20"/>
+                <w:szCs w:val="20"/>
+              </w:rPr>
+              <w:t>Z ]</w:t>
+            </w:r>
+            <w:proofErr w:type="gramEnd"/>
+            <w:r>
+              <w:rPr>
+                <w:color w:val="000000"/>
+                <w:sz w:val="20"/>
+                <w:szCs w:val="20"/>
+              </w:rPr>
+              <w:t xml:space="preserve"> no acepta tildes ni ñ</w:t>
             </w:r>
           </w:p>
         </w:tc>
@@ -22104,6 +22162,7 @@
               <w:rPr>
                 <w:sz w:val="20"/>
                 <w:szCs w:val="20"/>
+                <w:u w:val="single"/>
               </w:rPr>
             </w:pPr>
             <w:r>
@@ -22121,6 +22180,14 @@
                 <w:szCs w:val="20"/>
               </w:rPr>
               <w:t>21</w:t>
+            </w:r>
+            <w:r>
+              <w:rPr>
+                <w:color w:val="000000"/>
+                <w:sz w:val="20"/>
+                <w:szCs w:val="20"/>
+              </w:rPr>
+              <w:t xml:space="preserve"> – Hasta aquí</w:t>
             </w:r>
           </w:p>
         </w:tc>
@@ -22642,6 +22709,7 @@
                 <w:sz w:val="20"/>
                 <w:szCs w:val="20"/>
               </w:rPr>
+              <w:lastRenderedPageBreak/>
               <w:t xml:space="preserve">Estado </w:t>
             </w:r>
             <w:proofErr w:type="gramStart"/>
@@ -22752,7 +22820,6 @@
                 <w:sz w:val="20"/>
                 <w:szCs w:val="20"/>
               </w:rPr>
-              <w:lastRenderedPageBreak/>
               <w:t>Observaciones / Defecto encontrado</w:t>
             </w:r>
           </w:p>

</xml_diff>

<commit_message>
docs: añadir TC-020 a TC-023 y fila de DNI en Parte 2 del informe
</commit_message>
<xml_diff>
--- a/plantilla_iso29119.docx
+++ b/plantilla_iso29119.docx
@@ -1064,23 +1064,13 @@
               <w:t>Calculadora.maximo</w:t>
             </w:r>
             <w:proofErr w:type="spellEnd"/>
-            <w:proofErr w:type="gramStart"/>
             <w:r>
               <w:rPr>
                 <w:color w:val="6D4C00"/>
                 <w:sz w:val="20"/>
                 <w:szCs w:val="20"/>
               </w:rPr>
-              <w:t>()...</w:t>
-            </w:r>
-            <w:proofErr w:type="gramEnd"/>
-            <w:r>
-              <w:rPr>
-                <w:color w:val="6D4C00"/>
-                <w:sz w:val="20"/>
-                <w:szCs w:val="20"/>
-              </w:rPr>
-              <w:t>'</w:t>
+              <w:t>()...'</w:t>
             </w:r>
           </w:p>
         </w:tc>
@@ -1664,7 +1654,6 @@
               <w:t xml:space="preserve"> 5, </w:t>
             </w:r>
             <w:proofErr w:type="spellStart"/>
-            <w:proofErr w:type="gramStart"/>
             <w:r>
               <w:rPr>
                 <w:i/>
@@ -1686,7 +1675,6 @@
               </w:rPr>
               <w:t>)...</w:t>
             </w:r>
-            <w:proofErr w:type="gramEnd"/>
           </w:p>
           <w:p>
             <w:pPr>
@@ -5191,15 +5179,6 @@
                 <w:szCs w:val="20"/>
                 <w:lang w:val="pt-PT"/>
               </w:rPr>
-              <w:t xml:space="preserve"> </w:t>
-            </w:r>
-            <w:r>
-              <w:rPr>
-                <w:color w:val="000000" w:themeColor="text1"/>
-                <w:sz w:val="20"/>
-                <w:szCs w:val="20"/>
-                <w:lang w:val="pt-PT"/>
-              </w:rPr>
               <w:t>validarNombre(nombre)</w:t>
             </w:r>
           </w:p>
@@ -5295,15 +5274,6 @@
                 <w:lang w:val="pt-PT"/>
               </w:rPr>
             </w:pPr>
-            <w:r>
-              <w:rPr>
-                <w:color w:val="000000" w:themeColor="text1"/>
-                <w:sz w:val="20"/>
-                <w:szCs w:val="20"/>
-                <w:lang w:val="pt-PT"/>
-              </w:rPr>
-              <w:t xml:space="preserve"> </w:t>
-            </w:r>
             <w:r>
               <w:rPr>
                 <w:color w:val="000000" w:themeColor="text1"/>
@@ -5351,7 +5321,7 @@
                 <w:szCs w:val="20"/>
                 <w:lang w:val="pt-PT"/>
               </w:rPr>
-              <w:t xml:space="preserve"> </w:t>
+              <w:t>validarDNI(dni)</w:t>
             </w:r>
           </w:p>
         </w:tc>
@@ -5387,6 +5357,15 @@
               </w:rPr>
               <w:t xml:space="preserve"> </w:t>
             </w:r>
+            <w:r>
+              <w:rPr>
+                <w:color w:val="000000" w:themeColor="text1"/>
+                <w:sz w:val="20"/>
+                <w:szCs w:val="20"/>
+                <w:lang w:val="pt-PT"/>
+              </w:rPr>
+              <w:t>"12345678Z" → true (letra correcta)</w:t>
+            </w:r>
           </w:p>
         </w:tc>
         <w:tc>
@@ -5421,6 +5400,15 @@
               </w:rPr>
               <w:t xml:space="preserve"> </w:t>
             </w:r>
+            <w:r>
+              <w:rPr>
+                <w:color w:val="000000" w:themeColor="text1"/>
+                <w:sz w:val="20"/>
+                <w:szCs w:val="20"/>
+                <w:lang w:val="pt-PT"/>
+              </w:rPr>
+              <w:t>"12345678A" → false (letra incorrecta) "1234567Z" (8 chars) → false</w:t>
+            </w:r>
           </w:p>
         </w:tc>
         <w:tc>
@@ -5453,7 +5441,7 @@
                 <w:szCs w:val="20"/>
                 <w:lang w:val="pt-PT"/>
               </w:rPr>
-              <w:t xml:space="preserve"> </w:t>
+              <w:t>null → false Letras en los 8 dígitos → false DNI con longitud 8 o 10 → false</w:t>
             </w:r>
           </w:p>
         </w:tc>
@@ -5502,9 +5490,32 @@
                 <w:sz w:val="20"/>
                 <w:szCs w:val="20"/>
               </w:rPr>
-              <w:t xml:space="preserve">: </w:t>
-            </w:r>
-            <w:proofErr w:type="gramStart"/>
+              <w:t>: dividir(a, b)</w:t>
+            </w:r>
+          </w:p>
+        </w:tc>
+        <w:tc>
+          <w:tcPr>
+            <w:tcW w:w="2300" w:type="dxa"/>
+            <w:tcBorders>
+              <w:top w:val="single" w:sz="1" w:space="0" w:color="CCCCCC"/>
+              <w:left w:val="single" w:sz="1" w:space="0" w:color="CCCCCC"/>
+              <w:bottom w:val="single" w:sz="1" w:space="0" w:color="CCCCCC"/>
+              <w:right w:val="single" w:sz="1" w:space="0" w:color="CCCCCC"/>
+            </w:tcBorders>
+            <w:tcMar>
+              <w:top w:w="80" w:type="dxa"/>
+              <w:left w:w="120" w:type="dxa"/>
+              <w:bottom w:w="80" w:type="dxa"/>
+              <w:right w:w="120" w:type="dxa"/>
+            </w:tcMar>
+          </w:tcPr>
+          <w:p>
+            <w:pPr>
+              <w:rPr>
+                <w:color w:val="000000" w:themeColor="text1"/>
+              </w:rPr>
+            </w:pPr>
             <w:r>
               <w:rPr>
                 <w:i/>
@@ -5513,9 +5524,32 @@
                 <w:sz w:val="20"/>
                 <w:szCs w:val="20"/>
               </w:rPr>
-              <w:t>dividir(</w:t>
-            </w:r>
-            <w:proofErr w:type="gramEnd"/>
+              <w:t>a=10, b=2 → resultado=5</w:t>
+            </w:r>
+          </w:p>
+        </w:tc>
+        <w:tc>
+          <w:tcPr>
+            <w:tcW w:w="2300" w:type="dxa"/>
+            <w:tcBorders>
+              <w:top w:val="single" w:sz="1" w:space="0" w:color="CCCCCC"/>
+              <w:left w:val="single" w:sz="1" w:space="0" w:color="CCCCCC"/>
+              <w:bottom w:val="single" w:sz="1" w:space="0" w:color="CCCCCC"/>
+              <w:right w:val="single" w:sz="1" w:space="0" w:color="CCCCCC"/>
+            </w:tcBorders>
+            <w:tcMar>
+              <w:top w:w="80" w:type="dxa"/>
+              <w:left w:w="120" w:type="dxa"/>
+              <w:bottom w:w="80" w:type="dxa"/>
+              <w:right w:w="120" w:type="dxa"/>
+            </w:tcMar>
+          </w:tcPr>
+          <w:p>
+            <w:pPr>
+              <w:rPr>
+                <w:color w:val="000000" w:themeColor="text1"/>
+              </w:rPr>
+            </w:pPr>
             <w:r>
               <w:rPr>
                 <w:i/>
@@ -5524,13 +5558,13 @@
                 <w:sz w:val="20"/>
                 <w:szCs w:val="20"/>
               </w:rPr>
-              <w:t>a, b)</w:t>
-            </w:r>
-          </w:p>
-        </w:tc>
-        <w:tc>
-          <w:tcPr>
-            <w:tcW w:w="2300" w:type="dxa"/>
+              <w:t>b=0 → excepción</w:t>
+            </w:r>
+          </w:p>
+        </w:tc>
+        <w:tc>
+          <w:tcPr>
+            <w:tcW w:w="2538" w:type="dxa"/>
             <w:tcBorders>
               <w:top w:val="single" w:sz="1" w:space="0" w:color="CCCCCC"/>
               <w:left w:val="single" w:sz="1" w:space="0" w:color="CCCCCC"/>
@@ -5548,6 +5582,7 @@
             <w:pPr>
               <w:rPr>
                 <w:color w:val="000000" w:themeColor="text1"/>
+                <w:lang w:val="pt-PT"/>
               </w:rPr>
             </w:pPr>
             <w:r>
@@ -5557,212 +5592,9 @@
                 <w:color w:val="000000" w:themeColor="text1"/>
                 <w:sz w:val="20"/>
                 <w:szCs w:val="20"/>
-              </w:rPr>
-              <w:t>a=10, b=2 → resultado=5</w:t>
-            </w:r>
-          </w:p>
-        </w:tc>
-        <w:tc>
-          <w:tcPr>
-            <w:tcW w:w="2300" w:type="dxa"/>
-            <w:tcBorders>
-              <w:top w:val="single" w:sz="1" w:space="0" w:color="CCCCCC"/>
-              <w:left w:val="single" w:sz="1" w:space="0" w:color="CCCCCC"/>
-              <w:bottom w:val="single" w:sz="1" w:space="0" w:color="CCCCCC"/>
-              <w:right w:val="single" w:sz="1" w:space="0" w:color="CCCCCC"/>
-            </w:tcBorders>
-            <w:tcMar>
-              <w:top w:w="80" w:type="dxa"/>
-              <w:left w:w="120" w:type="dxa"/>
-              <w:bottom w:w="80" w:type="dxa"/>
-              <w:right w:w="120" w:type="dxa"/>
-            </w:tcMar>
-          </w:tcPr>
-          <w:p>
-            <w:pPr>
-              <w:rPr>
-                <w:color w:val="000000" w:themeColor="text1"/>
-              </w:rPr>
-            </w:pPr>
-            <w:r>
-              <w:rPr>
-                <w:i/>
-                <w:iCs/>
-                <w:color w:val="000000" w:themeColor="text1"/>
-                <w:sz w:val="20"/>
-                <w:szCs w:val="20"/>
-              </w:rPr>
-              <w:t>b=0 → excepción</w:t>
-            </w:r>
-          </w:p>
-        </w:tc>
-        <w:tc>
-          <w:tcPr>
-            <w:tcW w:w="2538" w:type="dxa"/>
-            <w:tcBorders>
-              <w:top w:val="single" w:sz="1" w:space="0" w:color="CCCCCC"/>
-              <w:left w:val="single" w:sz="1" w:space="0" w:color="CCCCCC"/>
-              <w:bottom w:val="single" w:sz="1" w:space="0" w:color="CCCCCC"/>
-              <w:right w:val="single" w:sz="1" w:space="0" w:color="CCCCCC"/>
-            </w:tcBorders>
-            <w:tcMar>
-              <w:top w:w="80" w:type="dxa"/>
-              <w:left w:w="120" w:type="dxa"/>
-              <w:bottom w:w="80" w:type="dxa"/>
-              <w:right w:w="120" w:type="dxa"/>
-            </w:tcMar>
-          </w:tcPr>
-          <w:p>
-            <w:pPr>
-              <w:rPr>
-                <w:color w:val="000000" w:themeColor="text1"/>
                 <w:lang w:val="pt-PT"/>
               </w:rPr>
-            </w:pPr>
-            <w:r>
-              <w:rPr>
-                <w:i/>
-                <w:iCs/>
-                <w:color w:val="000000" w:themeColor="text1"/>
-                <w:sz w:val="20"/>
-                <w:szCs w:val="20"/>
-                <w:lang w:val="pt-PT"/>
-              </w:rPr>
               <w:t>a=0, b=1 → 0; a=MAX_DOUBLE</w:t>
-            </w:r>
-          </w:p>
-        </w:tc>
-      </w:tr>
-      <w:tr>
-        <w:trPr>
-          <w:gridBefore w:val="1"/>
-          <w:wBefore w:w="11" w:type="dxa"/>
-        </w:trPr>
-        <w:tc>
-          <w:tcPr>
-            <w:tcW w:w="2500" w:type="dxa"/>
-            <w:tcBorders>
-              <w:top w:val="single" w:sz="1" w:space="0" w:color="CCCCCC"/>
-              <w:left w:val="single" w:sz="1" w:space="0" w:color="CCCCCC"/>
-              <w:bottom w:val="single" w:sz="1" w:space="0" w:color="CCCCCC"/>
-              <w:right w:val="single" w:sz="1" w:space="0" w:color="CCCCCC"/>
-            </w:tcBorders>
-            <w:tcMar>
-              <w:top w:w="80" w:type="dxa"/>
-              <w:left w:w="120" w:type="dxa"/>
-              <w:bottom w:w="80" w:type="dxa"/>
-              <w:right w:w="120" w:type="dxa"/>
-            </w:tcMar>
-          </w:tcPr>
-          <w:p>
-            <w:pPr>
-              <w:rPr>
-                <w:lang w:val="pt-PT"/>
-              </w:rPr>
-            </w:pPr>
-            <w:r>
-              <w:rPr>
-                <w:sz w:val="20"/>
-                <w:szCs w:val="20"/>
-                <w:lang w:val="pt-PT"/>
-              </w:rPr>
-              <w:t xml:space="preserve"> </w:t>
-            </w:r>
-          </w:p>
-        </w:tc>
-        <w:tc>
-          <w:tcPr>
-            <w:tcW w:w="2300" w:type="dxa"/>
-            <w:tcBorders>
-              <w:top w:val="single" w:sz="1" w:space="0" w:color="CCCCCC"/>
-              <w:left w:val="single" w:sz="1" w:space="0" w:color="CCCCCC"/>
-              <w:bottom w:val="single" w:sz="1" w:space="0" w:color="CCCCCC"/>
-              <w:right w:val="single" w:sz="1" w:space="0" w:color="CCCCCC"/>
-            </w:tcBorders>
-            <w:tcMar>
-              <w:top w:w="80" w:type="dxa"/>
-              <w:left w:w="120" w:type="dxa"/>
-              <w:bottom w:w="80" w:type="dxa"/>
-              <w:right w:w="120" w:type="dxa"/>
-            </w:tcMar>
-          </w:tcPr>
-          <w:p>
-            <w:pPr>
-              <w:rPr>
-                <w:lang w:val="pt-PT"/>
-              </w:rPr>
-            </w:pPr>
-            <w:r>
-              <w:rPr>
-                <w:sz w:val="20"/>
-                <w:szCs w:val="20"/>
-                <w:lang w:val="pt-PT"/>
-              </w:rPr>
-              <w:t xml:space="preserve"> </w:t>
-            </w:r>
-          </w:p>
-        </w:tc>
-        <w:tc>
-          <w:tcPr>
-            <w:tcW w:w="2300" w:type="dxa"/>
-            <w:tcBorders>
-              <w:top w:val="single" w:sz="1" w:space="0" w:color="CCCCCC"/>
-              <w:left w:val="single" w:sz="1" w:space="0" w:color="CCCCCC"/>
-              <w:bottom w:val="single" w:sz="1" w:space="0" w:color="CCCCCC"/>
-              <w:right w:val="single" w:sz="1" w:space="0" w:color="CCCCCC"/>
-            </w:tcBorders>
-            <w:tcMar>
-              <w:top w:w="80" w:type="dxa"/>
-              <w:left w:w="120" w:type="dxa"/>
-              <w:bottom w:w="80" w:type="dxa"/>
-              <w:right w:w="120" w:type="dxa"/>
-            </w:tcMar>
-          </w:tcPr>
-          <w:p>
-            <w:pPr>
-              <w:rPr>
-                <w:lang w:val="pt-PT"/>
-              </w:rPr>
-            </w:pPr>
-            <w:r>
-              <w:rPr>
-                <w:sz w:val="20"/>
-                <w:szCs w:val="20"/>
-                <w:lang w:val="pt-PT"/>
-              </w:rPr>
-              <w:t xml:space="preserve"> </w:t>
-            </w:r>
-          </w:p>
-        </w:tc>
-        <w:tc>
-          <w:tcPr>
-            <w:tcW w:w="2538" w:type="dxa"/>
-            <w:tcBorders>
-              <w:top w:val="single" w:sz="1" w:space="0" w:color="CCCCCC"/>
-              <w:left w:val="single" w:sz="1" w:space="0" w:color="CCCCCC"/>
-              <w:bottom w:val="single" w:sz="1" w:space="0" w:color="CCCCCC"/>
-              <w:right w:val="single" w:sz="1" w:space="0" w:color="CCCCCC"/>
-            </w:tcBorders>
-            <w:tcMar>
-              <w:top w:w="80" w:type="dxa"/>
-              <w:left w:w="120" w:type="dxa"/>
-              <w:bottom w:w="80" w:type="dxa"/>
-              <w:right w:w="120" w:type="dxa"/>
-            </w:tcMar>
-          </w:tcPr>
-          <w:p>
-            <w:pPr>
-              <w:rPr>
-                <w:lang w:val="pt-PT"/>
-              </w:rPr>
-            </w:pPr>
-            <w:r>
-              <w:rPr>
-                <w:sz w:val="20"/>
-                <w:szCs w:val="20"/>
-                <w:lang w:val="pt-PT"/>
-              </w:rPr>
-              <w:t xml:space="preserve"> </w:t>
             </w:r>
           </w:p>
         </w:tc>
@@ -6555,29 +6387,7 @@
                 <w:sz w:val="20"/>
                 <w:szCs w:val="20"/>
               </w:rPr>
-              <w:t xml:space="preserve">Estado </w:t>
-            </w:r>
-            <w:proofErr w:type="gramStart"/>
-            <w:r>
-              <w:rPr>
-                <w:b/>
-                <w:bCs/>
-                <w:color w:val="1A1A2E"/>
-                <w:sz w:val="20"/>
-                <w:szCs w:val="20"/>
-              </w:rPr>
-              <w:t>( Pasa</w:t>
-            </w:r>
-            <w:proofErr w:type="gramEnd"/>
-            <w:r>
-              <w:rPr>
-                <w:b/>
-                <w:bCs/>
-                <w:color w:val="1A1A2E"/>
-                <w:sz w:val="20"/>
-                <w:szCs w:val="20"/>
-              </w:rPr>
-              <w:t xml:space="preserve"> / Falla)</w:t>
+              <w:t>Estado ( Pasa / Falla)</w:t>
             </w:r>
           </w:p>
         </w:tc>
@@ -7339,29 +7149,7 @@
                 <w:sz w:val="20"/>
                 <w:szCs w:val="20"/>
               </w:rPr>
-              <w:t xml:space="preserve">Estado </w:t>
-            </w:r>
-            <w:proofErr w:type="gramStart"/>
-            <w:r>
-              <w:rPr>
-                <w:b/>
-                <w:bCs/>
-                <w:color w:val="1A1A2E"/>
-                <w:sz w:val="20"/>
-                <w:szCs w:val="20"/>
-              </w:rPr>
-              <w:t>( Pasa</w:t>
-            </w:r>
-            <w:proofErr w:type="gramEnd"/>
-            <w:r>
-              <w:rPr>
-                <w:b/>
-                <w:bCs/>
-                <w:color w:val="1A1A2E"/>
-                <w:sz w:val="20"/>
-                <w:szCs w:val="20"/>
-              </w:rPr>
-              <w:t xml:space="preserve"> /Falla)</w:t>
+              <w:t>Estado ( Pasa /Falla)</w:t>
             </w:r>
           </w:p>
         </w:tc>
@@ -8914,29 +8702,7 @@
                 <w:sz w:val="20"/>
                 <w:szCs w:val="20"/>
               </w:rPr>
-              <w:t xml:space="preserve">Estado </w:t>
-            </w:r>
-            <w:proofErr w:type="gramStart"/>
-            <w:r>
-              <w:rPr>
-                <w:b/>
-                <w:bCs/>
-                <w:color w:val="1A1A2E"/>
-                <w:sz w:val="20"/>
-                <w:szCs w:val="20"/>
-              </w:rPr>
-              <w:t>( Pasa</w:t>
-            </w:r>
-            <w:proofErr w:type="gramEnd"/>
-            <w:r>
-              <w:rPr>
-                <w:b/>
-                <w:bCs/>
-                <w:color w:val="1A1A2E"/>
-                <w:sz w:val="20"/>
-                <w:szCs w:val="20"/>
-              </w:rPr>
-              <w:t xml:space="preserve"> / Falla)</w:t>
+              <w:t>Estado ( Pasa / Falla)</w:t>
             </w:r>
           </w:p>
         </w:tc>
@@ -9690,29 +9456,7 @@
                 <w:sz w:val="20"/>
                 <w:szCs w:val="20"/>
               </w:rPr>
-              <w:t xml:space="preserve">Estado </w:t>
-            </w:r>
-            <w:proofErr w:type="gramStart"/>
-            <w:r>
-              <w:rPr>
-                <w:b/>
-                <w:bCs/>
-                <w:color w:val="1A1A2E"/>
-                <w:sz w:val="20"/>
-                <w:szCs w:val="20"/>
-              </w:rPr>
-              <w:t>( Pasa</w:t>
-            </w:r>
-            <w:proofErr w:type="gramEnd"/>
-            <w:r>
-              <w:rPr>
-                <w:b/>
-                <w:bCs/>
-                <w:color w:val="1A1A2E"/>
-                <w:sz w:val="20"/>
-                <w:szCs w:val="20"/>
-              </w:rPr>
-              <w:t xml:space="preserve"> / Falla)</w:t>
+              <w:t>Estado ( Pasa / Falla)</w:t>
             </w:r>
           </w:p>
         </w:tc>
@@ -9816,7 +9560,6 @@
               <w:t xml:space="preserve">BUG IR-001: el código solo comprueba </w:t>
             </w:r>
             <w:proofErr w:type="spellStart"/>
-            <w:proofErr w:type="gramStart"/>
             <w:r>
               <w:rPr>
                 <w:color w:val="000000"/>
@@ -9832,16 +9575,7 @@
                 <w:sz w:val="20"/>
                 <w:szCs w:val="20"/>
               </w:rPr>
-              <w:t>(</w:t>
-            </w:r>
-            <w:proofErr w:type="gramEnd"/>
-            <w:r>
-              <w:rPr>
-                <w:color w:val="000000"/>
-                <w:sz w:val="20"/>
-                <w:szCs w:val="20"/>
-              </w:rPr>
-              <w:t>'@'), acepta emails sin dominio</w:t>
+              <w:t>('@'), acepta emails sin dominio</w:t>
             </w:r>
           </w:p>
         </w:tc>
@@ -11228,29 +10962,7 @@
                 <w:sz w:val="20"/>
                 <w:szCs w:val="20"/>
               </w:rPr>
-              <w:t xml:space="preserve">Estado </w:t>
-            </w:r>
-            <w:proofErr w:type="gramStart"/>
-            <w:r>
-              <w:rPr>
-                <w:b/>
-                <w:bCs/>
-                <w:color w:val="1A1A2E"/>
-                <w:sz w:val="20"/>
-                <w:szCs w:val="20"/>
-              </w:rPr>
-              <w:t>( Pasa</w:t>
-            </w:r>
-            <w:proofErr w:type="gramEnd"/>
-            <w:r>
-              <w:rPr>
-                <w:b/>
-                <w:bCs/>
-                <w:color w:val="1A1A2E"/>
-                <w:sz w:val="20"/>
-                <w:szCs w:val="20"/>
-              </w:rPr>
-              <w:t xml:space="preserve"> / Falla)</w:t>
+              <w:t>Estado ( Pasa / Falla)</w:t>
             </w:r>
           </w:p>
         </w:tc>
@@ -12079,51 +11791,7 @@
                 <w:sz w:val="20"/>
                 <w:szCs w:val="20"/>
               </w:rPr>
-              <w:t xml:space="preserve">Estado </w:t>
-            </w:r>
-            <w:proofErr w:type="gramStart"/>
-            <w:r>
-              <w:rPr>
-                <w:b/>
-                <w:bCs/>
-                <w:color w:val="1A1A2E"/>
-                <w:sz w:val="20"/>
-                <w:szCs w:val="20"/>
-              </w:rPr>
-              <w:t>( Pasa</w:t>
-            </w:r>
-            <w:proofErr w:type="gramEnd"/>
-            <w:r>
-              <w:rPr>
-                <w:b/>
-                <w:bCs/>
-                <w:color w:val="1A1A2E"/>
-                <w:sz w:val="20"/>
-                <w:szCs w:val="20"/>
-              </w:rPr>
-              <w:t xml:space="preserve"> </w:t>
-            </w:r>
-            <w:proofErr w:type="gramStart"/>
-            <w:r>
-              <w:rPr>
-                <w:b/>
-                <w:bCs/>
-                <w:color w:val="1A1A2E"/>
-                <w:sz w:val="20"/>
-                <w:szCs w:val="20"/>
-              </w:rPr>
-              <w:t>/  Falla</w:t>
-            </w:r>
-            <w:proofErr w:type="gramEnd"/>
-            <w:r>
-              <w:rPr>
-                <w:b/>
-                <w:bCs/>
-                <w:color w:val="1A1A2E"/>
-                <w:sz w:val="20"/>
-                <w:szCs w:val="20"/>
-              </w:rPr>
-              <w:t>)</w:t>
+              <w:t>Estado ( Pasa /  Falla)</w:t>
             </w:r>
           </w:p>
         </w:tc>
@@ -12230,7 +11898,6 @@
               <w:t xml:space="preserve">BUG IR-001: el código solo comprueba </w:t>
             </w:r>
             <w:proofErr w:type="spellStart"/>
-            <w:proofErr w:type="gramStart"/>
             <w:r>
               <w:rPr>
                 <w:i/>
@@ -12250,18 +11917,7 @@
                 <w:sz w:val="20"/>
                 <w:szCs w:val="20"/>
               </w:rPr>
-              <w:t>(</w:t>
-            </w:r>
-            <w:proofErr w:type="gramEnd"/>
-            <w:r>
-              <w:rPr>
-                <w:i/>
-                <w:iCs/>
-                <w:color w:val="000000" w:themeColor="text1"/>
-                <w:sz w:val="20"/>
-                <w:szCs w:val="20"/>
-              </w:rPr>
-              <w:t>'@')</w:t>
+              <w:t>('@')</w:t>
             </w:r>
             <w:r>
               <w:rPr>
@@ -13724,51 +13380,7 @@
                 <w:sz w:val="20"/>
                 <w:szCs w:val="20"/>
               </w:rPr>
-              <w:t xml:space="preserve">Estado </w:t>
-            </w:r>
-            <w:proofErr w:type="gramStart"/>
-            <w:r>
-              <w:rPr>
-                <w:b/>
-                <w:bCs/>
-                <w:color w:val="1A1A2E"/>
-                <w:sz w:val="20"/>
-                <w:szCs w:val="20"/>
-              </w:rPr>
-              <w:t>( Pasa</w:t>
-            </w:r>
-            <w:proofErr w:type="gramEnd"/>
-            <w:r>
-              <w:rPr>
-                <w:b/>
-                <w:bCs/>
-                <w:color w:val="1A1A2E"/>
-                <w:sz w:val="20"/>
-                <w:szCs w:val="20"/>
-              </w:rPr>
-              <w:t xml:space="preserve"> </w:t>
-            </w:r>
-            <w:proofErr w:type="gramStart"/>
-            <w:r>
-              <w:rPr>
-                <w:b/>
-                <w:bCs/>
-                <w:color w:val="1A1A2E"/>
-                <w:sz w:val="20"/>
-                <w:szCs w:val="20"/>
-              </w:rPr>
-              <w:t>/  Falla</w:t>
-            </w:r>
-            <w:proofErr w:type="gramEnd"/>
-            <w:r>
-              <w:rPr>
-                <w:b/>
-                <w:bCs/>
-                <w:color w:val="1A1A2E"/>
-                <w:sz w:val="20"/>
-                <w:szCs w:val="20"/>
-              </w:rPr>
-              <w:t>)</w:t>
+              <w:t>Estado ( Pasa /  Falla)</w:t>
             </w:r>
           </w:p>
         </w:tc>
@@ -14545,51 +14157,7 @@
                 <w:sz w:val="20"/>
                 <w:szCs w:val="20"/>
               </w:rPr>
-              <w:t xml:space="preserve">Estado </w:t>
-            </w:r>
-            <w:proofErr w:type="gramStart"/>
-            <w:r>
-              <w:rPr>
-                <w:b/>
-                <w:bCs/>
-                <w:color w:val="1A1A2E"/>
-                <w:sz w:val="20"/>
-                <w:szCs w:val="20"/>
-              </w:rPr>
-              <w:t>( Pasa</w:t>
-            </w:r>
-            <w:proofErr w:type="gramEnd"/>
-            <w:r>
-              <w:rPr>
-                <w:b/>
-                <w:bCs/>
-                <w:color w:val="1A1A2E"/>
-                <w:sz w:val="20"/>
-                <w:szCs w:val="20"/>
-              </w:rPr>
-              <w:t xml:space="preserve"> </w:t>
-            </w:r>
-            <w:proofErr w:type="gramStart"/>
-            <w:r>
-              <w:rPr>
-                <w:b/>
-                <w:bCs/>
-                <w:color w:val="1A1A2E"/>
-                <w:sz w:val="20"/>
-                <w:szCs w:val="20"/>
-              </w:rPr>
-              <w:t>/  Falla</w:t>
-            </w:r>
-            <w:proofErr w:type="gramEnd"/>
-            <w:r>
-              <w:rPr>
-                <w:b/>
-                <w:bCs/>
-                <w:color w:val="1A1A2E"/>
-                <w:sz w:val="20"/>
-                <w:szCs w:val="20"/>
-              </w:rPr>
-              <w:t>)</w:t>
+              <w:t>Estado ( Pasa /  Falla)</w:t>
             </w:r>
           </w:p>
         </w:tc>
@@ -15368,29 +14936,7 @@
                 <w:sz w:val="20"/>
                 <w:szCs w:val="20"/>
               </w:rPr>
-              <w:t xml:space="preserve">Estado </w:t>
-            </w:r>
-            <w:proofErr w:type="gramStart"/>
-            <w:r>
-              <w:rPr>
-                <w:b/>
-                <w:bCs/>
-                <w:color w:val="1A1A2E"/>
-                <w:sz w:val="20"/>
-                <w:szCs w:val="20"/>
-              </w:rPr>
-              <w:t>( Pasa</w:t>
-            </w:r>
-            <w:proofErr w:type="gramEnd"/>
-            <w:r>
-              <w:rPr>
-                <w:b/>
-                <w:bCs/>
-                <w:color w:val="1A1A2E"/>
-                <w:sz w:val="20"/>
-                <w:szCs w:val="20"/>
-              </w:rPr>
-              <w:t xml:space="preserve"> / Falla)</w:t>
+              <w:t>Estado ( Pasa / Falla)</w:t>
             </w:r>
           </w:p>
         </w:tc>
@@ -16163,29 +15709,7 @@
                 <w:sz w:val="20"/>
                 <w:szCs w:val="20"/>
               </w:rPr>
-              <w:t xml:space="preserve">Estado (Pasa </w:t>
-            </w:r>
-            <w:proofErr w:type="gramStart"/>
-            <w:r>
-              <w:rPr>
-                <w:b/>
-                <w:bCs/>
-                <w:color w:val="1A1A2E"/>
-                <w:sz w:val="20"/>
-                <w:szCs w:val="20"/>
-              </w:rPr>
-              <w:t>/  Falla</w:t>
-            </w:r>
-            <w:proofErr w:type="gramEnd"/>
-            <w:r>
-              <w:rPr>
-                <w:b/>
-                <w:bCs/>
-                <w:color w:val="1A1A2E"/>
-                <w:sz w:val="20"/>
-                <w:szCs w:val="20"/>
-              </w:rPr>
-              <w:t>)</w:t>
+              <w:t>Estado (Pasa /  Falla)</w:t>
             </w:r>
           </w:p>
         </w:tc>
@@ -16968,29 +16492,7 @@
                 <w:sz w:val="20"/>
                 <w:szCs w:val="20"/>
               </w:rPr>
-              <w:t xml:space="preserve">Estado (Pasa </w:t>
-            </w:r>
-            <w:proofErr w:type="gramStart"/>
-            <w:r>
-              <w:rPr>
-                <w:b/>
-                <w:bCs/>
-                <w:color w:val="1A1A2E"/>
-                <w:sz w:val="20"/>
-                <w:szCs w:val="20"/>
-              </w:rPr>
-              <w:t>/  Falla</w:t>
-            </w:r>
-            <w:proofErr w:type="gramEnd"/>
-            <w:r>
-              <w:rPr>
-                <w:b/>
-                <w:bCs/>
-                <w:color w:val="1A1A2E"/>
-                <w:sz w:val="20"/>
-                <w:szCs w:val="20"/>
-              </w:rPr>
-              <w:t>)</w:t>
+              <w:t>Estado (Pasa /  Falla)</w:t>
             </w:r>
           </w:p>
         </w:tc>
@@ -17751,51 +17253,7 @@
                 <w:sz w:val="20"/>
                 <w:szCs w:val="20"/>
               </w:rPr>
-              <w:t xml:space="preserve">Estado </w:t>
-            </w:r>
-            <w:proofErr w:type="gramStart"/>
-            <w:r>
-              <w:rPr>
-                <w:b/>
-                <w:bCs/>
-                <w:color w:val="1A1A2E"/>
-                <w:sz w:val="20"/>
-                <w:szCs w:val="20"/>
-              </w:rPr>
-              <w:t>( Pasa</w:t>
-            </w:r>
-            <w:proofErr w:type="gramEnd"/>
-            <w:r>
-              <w:rPr>
-                <w:b/>
-                <w:bCs/>
-                <w:color w:val="1A1A2E"/>
-                <w:sz w:val="20"/>
-                <w:szCs w:val="20"/>
-              </w:rPr>
-              <w:t xml:space="preserve"> </w:t>
-            </w:r>
-            <w:proofErr w:type="gramStart"/>
-            <w:r>
-              <w:rPr>
-                <w:b/>
-                <w:bCs/>
-                <w:color w:val="1A1A2E"/>
-                <w:sz w:val="20"/>
-                <w:szCs w:val="20"/>
-              </w:rPr>
-              <w:t>/  Falla</w:t>
-            </w:r>
-            <w:proofErr w:type="gramEnd"/>
-            <w:r>
-              <w:rPr>
-                <w:b/>
-                <w:bCs/>
-                <w:color w:val="1A1A2E"/>
-                <w:sz w:val="20"/>
-                <w:szCs w:val="20"/>
-              </w:rPr>
-              <w:t>)</w:t>
+              <w:t>Estado ( Pasa /  Falla)</w:t>
             </w:r>
           </w:p>
         </w:tc>
@@ -18600,29 +18058,7 @@
                 <w:sz w:val="20"/>
                 <w:szCs w:val="20"/>
               </w:rPr>
-              <w:t xml:space="preserve">Estado (Pasa </w:t>
-            </w:r>
-            <w:proofErr w:type="gramStart"/>
-            <w:r>
-              <w:rPr>
-                <w:b/>
-                <w:bCs/>
-                <w:color w:val="1A1A2E"/>
-                <w:sz w:val="20"/>
-                <w:szCs w:val="20"/>
-              </w:rPr>
-              <w:t>/  Falla</w:t>
-            </w:r>
-            <w:proofErr w:type="gramEnd"/>
-            <w:r>
-              <w:rPr>
-                <w:b/>
-                <w:bCs/>
-                <w:color w:val="1A1A2E"/>
-                <w:sz w:val="20"/>
-                <w:szCs w:val="20"/>
-              </w:rPr>
-              <w:t>)</w:t>
+              <w:t>Estado (Pasa /  Falla)</w:t>
             </w:r>
           </w:p>
         </w:tc>
@@ -19391,51 +18827,7 @@
                 <w:sz w:val="20"/>
                 <w:szCs w:val="20"/>
               </w:rPr>
-              <w:t xml:space="preserve">Estado </w:t>
-            </w:r>
-            <w:proofErr w:type="gramStart"/>
-            <w:r>
-              <w:rPr>
-                <w:b/>
-                <w:bCs/>
-                <w:color w:val="1A1A2E"/>
-                <w:sz w:val="20"/>
-                <w:szCs w:val="20"/>
-              </w:rPr>
-              <w:t>( Pasa</w:t>
-            </w:r>
-            <w:proofErr w:type="gramEnd"/>
-            <w:r>
-              <w:rPr>
-                <w:b/>
-                <w:bCs/>
-                <w:color w:val="1A1A2E"/>
-                <w:sz w:val="20"/>
-                <w:szCs w:val="20"/>
-              </w:rPr>
-              <w:t xml:space="preserve"> </w:t>
-            </w:r>
-            <w:proofErr w:type="gramStart"/>
-            <w:r>
-              <w:rPr>
-                <w:b/>
-                <w:bCs/>
-                <w:color w:val="1A1A2E"/>
-                <w:sz w:val="20"/>
-                <w:szCs w:val="20"/>
-              </w:rPr>
-              <w:t>/  Falla</w:t>
-            </w:r>
-            <w:proofErr w:type="gramEnd"/>
-            <w:r>
-              <w:rPr>
-                <w:b/>
-                <w:bCs/>
-                <w:color w:val="1A1A2E"/>
-                <w:sz w:val="20"/>
-                <w:szCs w:val="20"/>
-              </w:rPr>
-              <w:t>)</w:t>
+              <w:t>Estado ( Pasa /  Falla)</w:t>
             </w:r>
           </w:p>
         </w:tc>
@@ -20233,29 +19625,7 @@
                 <w:sz w:val="20"/>
                 <w:szCs w:val="20"/>
               </w:rPr>
-              <w:t xml:space="preserve">Estado (Pasa </w:t>
-            </w:r>
-            <w:proofErr w:type="gramStart"/>
-            <w:r>
-              <w:rPr>
-                <w:b/>
-                <w:bCs/>
-                <w:color w:val="1A1A2E"/>
-                <w:sz w:val="20"/>
-                <w:szCs w:val="20"/>
-              </w:rPr>
-              <w:t>/  Falla</w:t>
-            </w:r>
-            <w:proofErr w:type="gramEnd"/>
-            <w:r>
-              <w:rPr>
-                <w:b/>
-                <w:bCs/>
-                <w:color w:val="1A1A2E"/>
-                <w:sz w:val="20"/>
-                <w:szCs w:val="20"/>
-              </w:rPr>
-              <w:t>)</w:t>
+              <w:t>Estado (Pasa /  Falla)</w:t>
             </w:r>
           </w:p>
         </w:tc>
@@ -21044,51 +20414,7 @@
                 <w:sz w:val="20"/>
                 <w:szCs w:val="20"/>
               </w:rPr>
-              <w:t xml:space="preserve">Estado </w:t>
-            </w:r>
-            <w:proofErr w:type="gramStart"/>
-            <w:r>
-              <w:rPr>
-                <w:b/>
-                <w:bCs/>
-                <w:color w:val="1A1A2E"/>
-                <w:sz w:val="20"/>
-                <w:szCs w:val="20"/>
-              </w:rPr>
-              <w:t>( Pasa</w:t>
-            </w:r>
-            <w:proofErr w:type="gramEnd"/>
-            <w:r>
-              <w:rPr>
-                <w:b/>
-                <w:bCs/>
-                <w:color w:val="1A1A2E"/>
-                <w:sz w:val="20"/>
-                <w:szCs w:val="20"/>
-              </w:rPr>
-              <w:t xml:space="preserve"> </w:t>
-            </w:r>
-            <w:proofErr w:type="gramStart"/>
-            <w:r>
-              <w:rPr>
-                <w:b/>
-                <w:bCs/>
-                <w:color w:val="1A1A2E"/>
-                <w:sz w:val="20"/>
-                <w:szCs w:val="20"/>
-              </w:rPr>
-              <w:t>/  Falla</w:t>
-            </w:r>
-            <w:proofErr w:type="gramEnd"/>
-            <w:r>
-              <w:rPr>
-                <w:b/>
-                <w:bCs/>
-                <w:color w:val="1A1A2E"/>
-                <w:sz w:val="20"/>
-                <w:szCs w:val="20"/>
-              </w:rPr>
-              <w:t>)</w:t>
+              <w:t>Estado ( Pasa /  Falla)</w:t>
             </w:r>
           </w:p>
         </w:tc>
@@ -21399,7 +20725,7 @@
                 <w:sz w:val="20"/>
                 <w:szCs w:val="20"/>
               </w:rPr>
-              <w:t>Nombre con tildes debe devolver false (BUG: debería ser true)</w:t>
+              <w:t>DNI con letra correcta debe devolver true</w:t>
             </w:r>
           </w:p>
         </w:tc>
@@ -21466,7 +20792,7 @@
                 <w:sz w:val="20"/>
                 <w:szCs w:val="20"/>
               </w:rPr>
-              <w:t>ValidadorFormulario.validarNombre</w:t>
+              <w:t>ValidadorFormulario.validarDNI</w:t>
             </w:r>
             <w:proofErr w:type="spellEnd"/>
             <w:r>
@@ -21541,7 +20867,7 @@
                 <w:sz w:val="20"/>
                 <w:szCs w:val="20"/>
               </w:rPr>
-              <w:t>Caja Negra – Partición inválida / BUG</w:t>
+              <w:t>Caja Negra – Partición válida</w:t>
             </w:r>
           </w:p>
         </w:tc>
@@ -21691,7 +21017,7 @@
                 <w:sz w:val="20"/>
                 <w:szCs w:val="20"/>
               </w:rPr>
-              <w:t>"María José"</w:t>
+              <w:t>"12345678Z"</w:t>
             </w:r>
           </w:p>
         </w:tc>
@@ -21757,7 +21083,7 @@
                 <w:sz w:val="20"/>
                 <w:szCs w:val="20"/>
               </w:rPr>
-              <w:t>true (nombre español válido)</w:t>
+              <w:t>true</w:t>
             </w:r>
           </w:p>
         </w:tc>
@@ -21823,7 +21149,7 @@
                 <w:sz w:val="20"/>
                 <w:szCs w:val="20"/>
               </w:rPr>
-              <w:t>false</w:t>
+              <w:t>true</w:t>
             </w:r>
           </w:p>
         </w:tc>
@@ -21855,29 +21181,7 @@
                 <w:sz w:val="20"/>
                 <w:szCs w:val="20"/>
               </w:rPr>
-              <w:t xml:space="preserve">Estado (Pasa </w:t>
-            </w:r>
-            <w:proofErr w:type="gramStart"/>
-            <w:r>
-              <w:rPr>
-                <w:b/>
-                <w:bCs/>
-                <w:color w:val="1A1A2E"/>
-                <w:sz w:val="20"/>
-                <w:szCs w:val="20"/>
-              </w:rPr>
-              <w:t>/  Falla</w:t>
-            </w:r>
-            <w:proofErr w:type="gramEnd"/>
-            <w:r>
-              <w:rPr>
-                <w:b/>
-                <w:bCs/>
-                <w:color w:val="1A1A2E"/>
-                <w:sz w:val="20"/>
-                <w:szCs w:val="20"/>
-              </w:rPr>
-              <w:t>)</w:t>
+              <w:t>Estado (Pasa /  Falla)</w:t>
             </w:r>
           </w:p>
         </w:tc>
@@ -21911,7 +21215,7 @@
                 <w:sz w:val="20"/>
                 <w:szCs w:val="20"/>
               </w:rPr>
-              <w:t>Falla</w:t>
+              <w:t>Pasa</w:t>
             </w:r>
           </w:p>
         </w:tc>
@@ -21978,61 +21282,7 @@
                 <w:sz w:val="20"/>
                 <w:szCs w:val="20"/>
               </w:rPr>
-              <w:t xml:space="preserve">BUG IR-002: el </w:t>
-            </w:r>
-            <w:proofErr w:type="spellStart"/>
-            <w:r>
-              <w:rPr>
-                <w:color w:val="000000"/>
-                <w:sz w:val="20"/>
-                <w:szCs w:val="20"/>
-              </w:rPr>
-              <w:t>regex</w:t>
-            </w:r>
-            <w:proofErr w:type="spellEnd"/>
-            <w:r>
-              <w:rPr>
-                <w:color w:val="000000"/>
-                <w:sz w:val="20"/>
-                <w:szCs w:val="20"/>
-              </w:rPr>
-              <w:t xml:space="preserve"> [a-</w:t>
-            </w:r>
-            <w:proofErr w:type="spellStart"/>
-            <w:r>
-              <w:rPr>
-                <w:color w:val="000000"/>
-                <w:sz w:val="20"/>
-                <w:szCs w:val="20"/>
-              </w:rPr>
-              <w:t>zA</w:t>
-            </w:r>
-            <w:proofErr w:type="spellEnd"/>
-            <w:r>
-              <w:rPr>
-                <w:color w:val="000000"/>
-                <w:sz w:val="20"/>
-                <w:szCs w:val="20"/>
-              </w:rPr>
-              <w:t>-</w:t>
-            </w:r>
-            <w:proofErr w:type="gramStart"/>
-            <w:r>
-              <w:rPr>
-                <w:color w:val="000000"/>
-                <w:sz w:val="20"/>
-                <w:szCs w:val="20"/>
-              </w:rPr>
-              <w:t>Z ]</w:t>
-            </w:r>
-            <w:proofErr w:type="gramEnd"/>
-            <w:r>
-              <w:rPr>
-                <w:color w:val="000000"/>
-                <w:sz w:val="20"/>
-                <w:szCs w:val="20"/>
-              </w:rPr>
-              <w:t xml:space="preserve"> no acepta tildes ni ñ</w:t>
+              <w:t>Ninguno</w:t>
             </w:r>
           </w:p>
         </w:tc>
@@ -22181,14 +21431,6 @@
               </w:rPr>
               <w:t>21</w:t>
             </w:r>
-            <w:r>
-              <w:rPr>
-                <w:color w:val="000000"/>
-                <w:sz w:val="20"/>
-                <w:szCs w:val="20"/>
-              </w:rPr>
-              <w:t xml:space="preserve"> – Hasta aquí</w:t>
-            </w:r>
           </w:p>
         </w:tc>
       </w:tr>
@@ -22238,22 +21480,36 @@
               <w:bottom w:w="80" w:type="dxa"/>
               <w:right w:w="120" w:type="dxa"/>
             </w:tcMar>
-            <w:vAlign w:val="center"/>
-          </w:tcPr>
-          <w:p>
-            <w:pPr>
-              <w:rPr>
-                <w:sz w:val="20"/>
-                <w:szCs w:val="20"/>
-              </w:rPr>
-            </w:pPr>
-            <w:r>
-              <w:rPr>
-                <w:color w:val="000000"/>
-                <w:sz w:val="20"/>
-                <w:szCs w:val="20"/>
-              </w:rPr>
-              <w:t>Teléfono empezando por 8 debe devolver false</w:t>
+          </w:tcPr>
+          <w:p>
+            <w:pPr>
+              <w:rPr>
+                <w:sz w:val="20"/>
+                <w:szCs w:val="20"/>
+              </w:rPr>
+            </w:pPr>
+            <w:r>
+              <w:rPr>
+                <w:sz w:val="20"/>
+                <w:szCs w:val="20"/>
+              </w:rPr>
+              <w:t xml:space="preserve">DNI </w:t>
+            </w:r>
+            <w:proofErr w:type="spellStart"/>
+            <w:r>
+              <w:rPr>
+                <w:sz w:val="20"/>
+                <w:szCs w:val="20"/>
+              </w:rPr>
+              <w:t>null</w:t>
+            </w:r>
+            <w:proofErr w:type="spellEnd"/>
+            <w:r>
+              <w:rPr>
+                <w:sz w:val="20"/>
+                <w:szCs w:val="20"/>
+              </w:rPr>
+              <w:t xml:space="preserve"> debe devolver false</w:t>
             </w:r>
           </w:p>
         </w:tc>
@@ -22304,7 +21560,6 @@
               <w:bottom w:w="80" w:type="dxa"/>
               <w:right w:w="120" w:type="dxa"/>
             </w:tcMar>
-            <w:vAlign w:val="center"/>
           </w:tcPr>
           <w:p>
             <w:pPr>
@@ -22316,16 +21571,14 @@
             <w:proofErr w:type="spellStart"/>
             <w:r>
               <w:rPr>
-                <w:color w:val="000000"/>
-                <w:sz w:val="20"/>
-                <w:szCs w:val="20"/>
-              </w:rPr>
-              <w:t>ValidadorFormulario.validarTelefono</w:t>
+                <w:sz w:val="20"/>
+                <w:szCs w:val="20"/>
+              </w:rPr>
+              <w:t>ValidadorFormulario.validarDNI</w:t>
             </w:r>
             <w:proofErr w:type="spellEnd"/>
             <w:r>
               <w:rPr>
-                <w:color w:val="000000"/>
                 <w:sz w:val="20"/>
                 <w:szCs w:val="20"/>
               </w:rPr>
@@ -22380,23 +21633,30 @@
               <w:bottom w:w="80" w:type="dxa"/>
               <w:right w:w="120" w:type="dxa"/>
             </w:tcMar>
-            <w:vAlign w:val="center"/>
-          </w:tcPr>
-          <w:p>
-            <w:pPr>
-              <w:rPr>
-                <w:sz w:val="20"/>
-                <w:szCs w:val="20"/>
-              </w:rPr>
-            </w:pPr>
-            <w:r>
-              <w:rPr>
-                <w:color w:val="000000"/>
-                <w:sz w:val="20"/>
-                <w:szCs w:val="20"/>
-              </w:rPr>
-              <w:t>Caja Negra – Partición inválida</w:t>
-            </w:r>
+          </w:tcPr>
+          <w:p>
+            <w:pPr>
+              <w:rPr>
+                <w:sz w:val="20"/>
+                <w:szCs w:val="20"/>
+              </w:rPr>
+            </w:pPr>
+            <w:r>
+              <w:rPr>
+                <w:sz w:val="20"/>
+                <w:szCs w:val="20"/>
+              </w:rPr>
+              <w:t xml:space="preserve">Caja Blanca – Rama </w:t>
+            </w:r>
+            <w:proofErr w:type="spellStart"/>
+            <w:r>
+              <w:rPr>
+                <w:sz w:val="20"/>
+                <w:szCs w:val="20"/>
+              </w:rPr>
+              <w:t>null</w:t>
+            </w:r>
+            <w:proofErr w:type="spellEnd"/>
           </w:p>
         </w:tc>
       </w:tr>
@@ -22446,18 +21706,16 @@
               <w:bottom w:w="80" w:type="dxa"/>
               <w:right w:w="120" w:type="dxa"/>
             </w:tcMar>
-            <w:vAlign w:val="center"/>
-          </w:tcPr>
-          <w:p>
-            <w:pPr>
-              <w:rPr>
-                <w:sz w:val="20"/>
-                <w:szCs w:val="20"/>
-              </w:rPr>
-            </w:pPr>
-            <w:r>
-              <w:rPr>
-                <w:color w:val="000000"/>
+          </w:tcPr>
+          <w:p>
+            <w:pPr>
+              <w:rPr>
+                <w:sz w:val="20"/>
+                <w:szCs w:val="20"/>
+              </w:rPr>
+            </w:pPr>
+            <w:r>
+              <w:rPr>
                 <w:sz w:val="20"/>
                 <w:szCs w:val="20"/>
               </w:rPr>
@@ -22466,7 +21724,6 @@
             <w:proofErr w:type="spellStart"/>
             <w:r>
               <w:rPr>
-                <w:color w:val="000000"/>
                 <w:sz w:val="20"/>
                 <w:szCs w:val="20"/>
               </w:rPr>
@@ -22475,7 +21732,6 @@
             <w:proofErr w:type="spellEnd"/>
             <w:r>
               <w:rPr>
-                <w:color w:val="000000"/>
                 <w:sz w:val="20"/>
                 <w:szCs w:val="20"/>
               </w:rPr>
@@ -22530,23 +21786,23 @@
               <w:bottom w:w="80" w:type="dxa"/>
               <w:right w:w="120" w:type="dxa"/>
             </w:tcMar>
-            <w:vAlign w:val="center"/>
-          </w:tcPr>
-          <w:p>
-            <w:pPr>
-              <w:rPr>
-                <w:sz w:val="20"/>
-                <w:szCs w:val="20"/>
-              </w:rPr>
-            </w:pPr>
-            <w:r>
-              <w:rPr>
-                <w:color w:val="000000"/>
-                <w:sz w:val="20"/>
-                <w:szCs w:val="20"/>
-              </w:rPr>
-              <w:t>"812345678"</w:t>
-            </w:r>
+          </w:tcPr>
+          <w:p>
+            <w:pPr>
+              <w:rPr>
+                <w:sz w:val="20"/>
+                <w:szCs w:val="20"/>
+              </w:rPr>
+            </w:pPr>
+            <w:proofErr w:type="spellStart"/>
+            <w:r>
+              <w:rPr>
+                <w:sz w:val="20"/>
+                <w:szCs w:val="20"/>
+              </w:rPr>
+              <w:t>null</w:t>
+            </w:r>
+            <w:proofErr w:type="spellEnd"/>
           </w:p>
         </w:tc>
       </w:tr>
@@ -22596,18 +21852,16 @@
               <w:bottom w:w="80" w:type="dxa"/>
               <w:right w:w="120" w:type="dxa"/>
             </w:tcMar>
-            <w:vAlign w:val="center"/>
-          </w:tcPr>
-          <w:p>
-            <w:pPr>
-              <w:rPr>
-                <w:sz w:val="20"/>
-                <w:szCs w:val="20"/>
-              </w:rPr>
-            </w:pPr>
-            <w:r>
-              <w:rPr>
-                <w:color w:val="000000"/>
+          </w:tcPr>
+          <w:p>
+            <w:pPr>
+              <w:rPr>
+                <w:sz w:val="20"/>
+                <w:szCs w:val="20"/>
+              </w:rPr>
+            </w:pPr>
+            <w:r>
+              <w:rPr>
                 <w:sz w:val="20"/>
                 <w:szCs w:val="20"/>
               </w:rPr>
@@ -22662,18 +21916,16 @@
               <w:bottom w:w="80" w:type="dxa"/>
               <w:right w:w="120" w:type="dxa"/>
             </w:tcMar>
-            <w:vAlign w:val="center"/>
-          </w:tcPr>
-          <w:p>
-            <w:pPr>
-              <w:rPr>
-                <w:sz w:val="20"/>
-                <w:szCs w:val="20"/>
-              </w:rPr>
-            </w:pPr>
-            <w:r>
-              <w:rPr>
-                <w:color w:val="000000"/>
+          </w:tcPr>
+          <w:p>
+            <w:pPr>
+              <w:rPr>
+                <w:sz w:val="20"/>
+                <w:szCs w:val="20"/>
+              </w:rPr>
+            </w:pPr>
+            <w:r>
+              <w:rPr>
                 <w:sz w:val="20"/>
                 <w:szCs w:val="20"/>
               </w:rPr>
@@ -22709,52 +21961,7 @@
                 <w:sz w:val="20"/>
                 <w:szCs w:val="20"/>
               </w:rPr>
-              <w:lastRenderedPageBreak/>
-              <w:t xml:space="preserve">Estado </w:t>
-            </w:r>
-            <w:proofErr w:type="gramStart"/>
-            <w:r>
-              <w:rPr>
-                <w:b/>
-                <w:bCs/>
-                <w:color w:val="1A1A2E"/>
-                <w:sz w:val="20"/>
-                <w:szCs w:val="20"/>
-              </w:rPr>
-              <w:t>( Pasa</w:t>
-            </w:r>
-            <w:proofErr w:type="gramEnd"/>
-            <w:r>
-              <w:rPr>
-                <w:b/>
-                <w:bCs/>
-                <w:color w:val="1A1A2E"/>
-                <w:sz w:val="20"/>
-                <w:szCs w:val="20"/>
-              </w:rPr>
-              <w:t xml:space="preserve"> </w:t>
-            </w:r>
-            <w:proofErr w:type="gramStart"/>
-            <w:r>
-              <w:rPr>
-                <w:b/>
-                <w:bCs/>
-                <w:color w:val="1A1A2E"/>
-                <w:sz w:val="20"/>
-                <w:szCs w:val="20"/>
-              </w:rPr>
-              <w:t>/  Falla</w:t>
-            </w:r>
-            <w:proofErr w:type="gramEnd"/>
-            <w:r>
-              <w:rPr>
-                <w:b/>
-                <w:bCs/>
-                <w:color w:val="1A1A2E"/>
-                <w:sz w:val="20"/>
-                <w:szCs w:val="20"/>
-              </w:rPr>
-              <w:t>)</w:t>
+              <w:t>Estado ( Pasa /  Falla)</w:t>
             </w:r>
           </w:p>
         </w:tc>
@@ -22773,18 +21980,16 @@
               <w:bottom w:w="80" w:type="dxa"/>
               <w:right w:w="120" w:type="dxa"/>
             </w:tcMar>
-            <w:vAlign w:val="center"/>
-          </w:tcPr>
-          <w:p>
-            <w:pPr>
-              <w:rPr>
-                <w:sz w:val="20"/>
-                <w:szCs w:val="20"/>
-              </w:rPr>
-            </w:pPr>
-            <w:r>
-              <w:rPr>
-                <w:color w:val="000000"/>
+          </w:tcPr>
+          <w:p>
+            <w:pPr>
+              <w:rPr>
+                <w:sz w:val="20"/>
+                <w:szCs w:val="20"/>
+              </w:rPr>
+            </w:pPr>
+            <w:r>
+              <w:rPr>
                 <w:sz w:val="20"/>
                 <w:szCs w:val="20"/>
               </w:rPr>
@@ -22862,12 +22067,1592 @@
       </w:tr>
     </w:tbl>
     <w:p>
-      <w:r>
-        <w:br w:type="page"/>
-      </w:r>
+      <w:pPr>
+        <w:spacing w:before="60" w:after="60"/>
+      </w:pPr>
     </w:p>
+    <w:tbl>
+      <w:tblPr>
+        <w:tblW w:w="9638" w:type="dxa"/>
+        <w:tblBorders>
+          <w:top w:val="single" w:sz="4" w:space="0" w:color="auto"/>
+          <w:left w:val="single" w:sz="4" w:space="0" w:color="auto"/>
+          <w:bottom w:val="single" w:sz="4" w:space="0" w:color="auto"/>
+          <w:right w:val="single" w:sz="4" w:space="0" w:color="auto"/>
+          <w:insideH w:val="single" w:sz="4" w:space="0" w:color="auto"/>
+          <w:insideV w:val="single" w:sz="4" w:space="0" w:color="auto"/>
+        </w:tblBorders>
+        <w:tblCellMar>
+          <w:left w:w="10" w:type="dxa"/>
+          <w:right w:w="10" w:type="dxa"/>
+        </w:tblCellMar>
+        <w:tblLook w:val="04A0" w:firstRow="1" w:lastRow="0" w:firstColumn="1" w:lastColumn="0" w:noHBand="0" w:noVBand="1"/>
+      </w:tblPr>
+      <w:tblGrid>
+        <w:gridCol w:w="5448"/>
+        <w:gridCol w:w="4190"/>
+      </w:tblGrid>
+      <w:tr>
+        <w:trPr>
+          <w:gridAfter w:val="1"/>
+          <w:wAfter w:w="4190" w:type="dxa"/>
+        </w:trPr>
+        <w:tc>
+          <w:tcPr>
+            <w:tcW w:w="5448" w:type="dxa"/>
+            <w:tcBorders>
+              <w:top w:val="single" w:sz="1" w:space="0" w:color="CCCCCC"/>
+              <w:left w:val="single" w:sz="1" w:space="0" w:color="CCCCCC"/>
+              <w:bottom w:val="single" w:sz="1" w:space="0" w:color="CCCCCC"/>
+              <w:right w:val="single" w:sz="1" w:space="0" w:color="CCCCCC"/>
+            </w:tcBorders>
+            <w:shd w:val="clear" w:color="auto" w:fill="1F5C8B"/>
+            <w:tcMar>
+              <w:top w:w="80" w:type="dxa"/>
+              <w:left w:w="120" w:type="dxa"/>
+              <w:bottom w:w="80" w:type="dxa"/>
+              <w:right w:w="120" w:type="dxa"/>
+            </w:tcMar>
+          </w:tcPr>
+          <w:p>
+            <w:r>
+              <w:rPr>
+                <w:b/>
+                <w:bCs/>
+                <w:color w:val="FFFFFF"/>
+              </w:rPr>
+              <w:t>CASO DE PRUEBA TC-02</w:t>
+            </w:r>
+            <w:r>
+              <w:rPr>
+                <w:b/>
+                <w:bCs/>
+                <w:color w:val="FFFFFF"/>
+              </w:rPr>
+              <w:t>2</w:t>
+            </w:r>
+          </w:p>
+        </w:tc>
+      </w:tr>
+      <w:tr>
+        <w:tc>
+          <w:tcPr>
+            <w:tcW w:w="5448" w:type="dxa"/>
+            <w:tcBorders>
+              <w:top w:val="single" w:sz="1" w:space="0" w:color="CCCCCC"/>
+              <w:left w:val="single" w:sz="1" w:space="0" w:color="CCCCCC"/>
+              <w:bottom w:val="single" w:sz="1" w:space="0" w:color="CCCCCC"/>
+              <w:right w:val="single" w:sz="1" w:space="0" w:color="CCCCCC"/>
+            </w:tcBorders>
+            <w:shd w:val="clear" w:color="auto" w:fill="D6E4F0"/>
+            <w:tcMar>
+              <w:top w:w="80" w:type="dxa"/>
+              <w:left w:w="120" w:type="dxa"/>
+              <w:bottom w:w="80" w:type="dxa"/>
+              <w:right w:w="120" w:type="dxa"/>
+            </w:tcMar>
+          </w:tcPr>
+          <w:p>
+            <w:r>
+              <w:rPr>
+                <w:b/>
+                <w:bCs/>
+                <w:color w:val="1A1A2E"/>
+                <w:sz w:val="20"/>
+                <w:szCs w:val="20"/>
+              </w:rPr>
+              <w:t>Identificador</w:t>
+            </w:r>
+          </w:p>
+        </w:tc>
+        <w:tc>
+          <w:tcPr>
+            <w:tcW w:w="4190" w:type="dxa"/>
+            <w:tcBorders>
+              <w:top w:val="single" w:sz="2" w:space="0" w:color="CCCCCC"/>
+              <w:left w:val="single" w:sz="2" w:space="0" w:color="CCCCCC"/>
+              <w:bottom w:val="single" w:sz="2" w:space="0" w:color="CCCCCC"/>
+              <w:right w:val="single" w:sz="2" w:space="0" w:color="CCCCCC"/>
+            </w:tcBorders>
+            <w:tcMar>
+              <w:top w:w="80" w:type="dxa"/>
+              <w:left w:w="120" w:type="dxa"/>
+              <w:bottom w:w="80" w:type="dxa"/>
+              <w:right w:w="120" w:type="dxa"/>
+            </w:tcMar>
+            <w:vAlign w:val="center"/>
+          </w:tcPr>
+          <w:p>
+            <w:pPr>
+              <w:rPr>
+                <w:sz w:val="20"/>
+                <w:szCs w:val="20"/>
+                <w:u w:val="single"/>
+              </w:rPr>
+            </w:pPr>
+            <w:r>
+              <w:rPr>
+                <w:color w:val="000000"/>
+                <w:sz w:val="20"/>
+                <w:szCs w:val="20"/>
+              </w:rPr>
+              <w:t>TC-0</w:t>
+            </w:r>
+            <w:r>
+              <w:rPr>
+                <w:color w:val="000000"/>
+                <w:sz w:val="20"/>
+                <w:szCs w:val="20"/>
+              </w:rPr>
+              <w:t>2</w:t>
+            </w:r>
+            <w:r>
+              <w:rPr>
+                <w:color w:val="000000"/>
+                <w:sz w:val="20"/>
+                <w:szCs w:val="20"/>
+              </w:rPr>
+              <w:t>2</w:t>
+            </w:r>
+          </w:p>
+        </w:tc>
+      </w:tr>
+      <w:tr>
+        <w:tc>
+          <w:tcPr>
+            <w:tcW w:w="5448" w:type="dxa"/>
+            <w:tcBorders>
+              <w:top w:val="single" w:sz="1" w:space="0" w:color="CCCCCC"/>
+              <w:left w:val="single" w:sz="1" w:space="0" w:color="CCCCCC"/>
+              <w:bottom w:val="single" w:sz="1" w:space="0" w:color="CCCCCC"/>
+              <w:right w:val="single" w:sz="1" w:space="0" w:color="CCCCCC"/>
+            </w:tcBorders>
+            <w:shd w:val="clear" w:color="auto" w:fill="D6E4F0"/>
+            <w:tcMar>
+              <w:top w:w="80" w:type="dxa"/>
+              <w:left w:w="120" w:type="dxa"/>
+              <w:bottom w:w="80" w:type="dxa"/>
+              <w:right w:w="120" w:type="dxa"/>
+            </w:tcMar>
+          </w:tcPr>
+          <w:p>
+            <w:r>
+              <w:rPr>
+                <w:b/>
+                <w:bCs/>
+                <w:color w:val="1A1A2E"/>
+                <w:sz w:val="20"/>
+                <w:szCs w:val="20"/>
+              </w:rPr>
+              <w:t>Nombre / Descripción</w:t>
+            </w:r>
+          </w:p>
+        </w:tc>
+        <w:tc>
+          <w:tcPr>
+            <w:tcW w:w="4190" w:type="dxa"/>
+            <w:tcBorders>
+              <w:top w:val="single" w:sz="2" w:space="0" w:color="CCCCCC"/>
+              <w:left w:val="single" w:sz="2" w:space="0" w:color="CCCCCC"/>
+              <w:bottom w:val="single" w:sz="2" w:space="0" w:color="CCCCCC"/>
+              <w:right w:val="single" w:sz="2" w:space="0" w:color="CCCCCC"/>
+            </w:tcBorders>
+            <w:tcMar>
+              <w:top w:w="80" w:type="dxa"/>
+              <w:left w:w="120" w:type="dxa"/>
+              <w:bottom w:w="80" w:type="dxa"/>
+              <w:right w:w="120" w:type="dxa"/>
+            </w:tcMar>
+            <w:vAlign w:val="center"/>
+          </w:tcPr>
+          <w:p>
+            <w:pPr>
+              <w:rPr>
+                <w:sz w:val="20"/>
+                <w:szCs w:val="20"/>
+              </w:rPr>
+            </w:pPr>
+            <w:r>
+              <w:rPr>
+                <w:color w:val="000000"/>
+                <w:sz w:val="20"/>
+                <w:szCs w:val="20"/>
+              </w:rPr>
+              <w:t>DNI con letra incorrecta debe devolver false</w:t>
+            </w:r>
+          </w:p>
+        </w:tc>
+      </w:tr>
+      <w:tr>
+        <w:tc>
+          <w:tcPr>
+            <w:tcW w:w="5448" w:type="dxa"/>
+            <w:tcBorders>
+              <w:top w:val="single" w:sz="1" w:space="0" w:color="CCCCCC"/>
+              <w:left w:val="single" w:sz="1" w:space="0" w:color="CCCCCC"/>
+              <w:bottom w:val="single" w:sz="1" w:space="0" w:color="CCCCCC"/>
+              <w:right w:val="single" w:sz="1" w:space="0" w:color="CCCCCC"/>
+            </w:tcBorders>
+            <w:shd w:val="clear" w:color="auto" w:fill="D6E4F0"/>
+            <w:tcMar>
+              <w:top w:w="80" w:type="dxa"/>
+              <w:left w:w="120" w:type="dxa"/>
+              <w:bottom w:w="80" w:type="dxa"/>
+              <w:right w:w="120" w:type="dxa"/>
+            </w:tcMar>
+          </w:tcPr>
+          <w:p>
+            <w:r>
+              <w:rPr>
+                <w:b/>
+                <w:bCs/>
+                <w:color w:val="1A1A2E"/>
+                <w:sz w:val="20"/>
+                <w:szCs w:val="20"/>
+              </w:rPr>
+              <w:t>Clase / Método bajo prueba</w:t>
+            </w:r>
+          </w:p>
+        </w:tc>
+        <w:tc>
+          <w:tcPr>
+            <w:tcW w:w="4190" w:type="dxa"/>
+            <w:tcBorders>
+              <w:top w:val="single" w:sz="2" w:space="0" w:color="CCCCCC"/>
+              <w:left w:val="single" w:sz="2" w:space="0" w:color="CCCCCC"/>
+              <w:bottom w:val="single" w:sz="2" w:space="0" w:color="CCCCCC"/>
+              <w:right w:val="single" w:sz="2" w:space="0" w:color="CCCCCC"/>
+            </w:tcBorders>
+            <w:tcMar>
+              <w:top w:w="80" w:type="dxa"/>
+              <w:left w:w="120" w:type="dxa"/>
+              <w:bottom w:w="80" w:type="dxa"/>
+              <w:right w:w="120" w:type="dxa"/>
+            </w:tcMar>
+            <w:vAlign w:val="center"/>
+          </w:tcPr>
+          <w:p>
+            <w:pPr>
+              <w:rPr>
+                <w:sz w:val="20"/>
+                <w:szCs w:val="20"/>
+              </w:rPr>
+            </w:pPr>
+            <w:proofErr w:type="spellStart"/>
+            <w:r>
+              <w:rPr>
+                <w:color w:val="000000"/>
+                <w:sz w:val="20"/>
+                <w:szCs w:val="20"/>
+              </w:rPr>
+              <w:t>ValidadorFormulario.validarDNI</w:t>
+            </w:r>
+            <w:proofErr w:type="spellEnd"/>
+            <w:r>
+              <w:rPr>
+                <w:color w:val="000000"/>
+                <w:sz w:val="20"/>
+                <w:szCs w:val="20"/>
+              </w:rPr>
+              <w:t>()</w:t>
+            </w:r>
+          </w:p>
+        </w:tc>
+      </w:tr>
+      <w:tr>
+        <w:tc>
+          <w:tcPr>
+            <w:tcW w:w="5448" w:type="dxa"/>
+            <w:tcBorders>
+              <w:top w:val="single" w:sz="1" w:space="0" w:color="CCCCCC"/>
+              <w:left w:val="single" w:sz="1" w:space="0" w:color="CCCCCC"/>
+              <w:bottom w:val="single" w:sz="1" w:space="0" w:color="CCCCCC"/>
+              <w:right w:val="single" w:sz="1" w:space="0" w:color="CCCCCC"/>
+            </w:tcBorders>
+            <w:shd w:val="clear" w:color="auto" w:fill="D6E4F0"/>
+            <w:tcMar>
+              <w:top w:w="80" w:type="dxa"/>
+              <w:left w:w="120" w:type="dxa"/>
+              <w:bottom w:w="80" w:type="dxa"/>
+              <w:right w:w="120" w:type="dxa"/>
+            </w:tcMar>
+          </w:tcPr>
+          <w:p>
+            <w:r>
+              <w:rPr>
+                <w:b/>
+                <w:bCs/>
+                <w:color w:val="1A1A2E"/>
+                <w:sz w:val="20"/>
+                <w:szCs w:val="20"/>
+              </w:rPr>
+              <w:t>Técnica de diseño</w:t>
+            </w:r>
+          </w:p>
+        </w:tc>
+        <w:tc>
+          <w:tcPr>
+            <w:tcW w:w="4190" w:type="dxa"/>
+            <w:tcBorders>
+              <w:top w:val="single" w:sz="2" w:space="0" w:color="CCCCCC"/>
+              <w:left w:val="single" w:sz="2" w:space="0" w:color="CCCCCC"/>
+              <w:bottom w:val="single" w:sz="2" w:space="0" w:color="CCCCCC"/>
+              <w:right w:val="single" w:sz="2" w:space="0" w:color="CCCCCC"/>
+            </w:tcBorders>
+            <w:tcMar>
+              <w:top w:w="80" w:type="dxa"/>
+              <w:left w:w="120" w:type="dxa"/>
+              <w:bottom w:w="80" w:type="dxa"/>
+              <w:right w:w="120" w:type="dxa"/>
+            </w:tcMar>
+            <w:vAlign w:val="center"/>
+          </w:tcPr>
+          <w:p>
+            <w:pPr>
+              <w:rPr>
+                <w:sz w:val="20"/>
+                <w:szCs w:val="20"/>
+              </w:rPr>
+            </w:pPr>
+            <w:r>
+              <w:rPr>
+                <w:color w:val="000000"/>
+                <w:sz w:val="20"/>
+                <w:szCs w:val="20"/>
+              </w:rPr>
+              <w:t>Caja Negra – Partición inválida</w:t>
+            </w:r>
+          </w:p>
+        </w:tc>
+      </w:tr>
+      <w:tr>
+        <w:tc>
+          <w:tcPr>
+            <w:tcW w:w="5448" w:type="dxa"/>
+            <w:tcBorders>
+              <w:top w:val="single" w:sz="1" w:space="0" w:color="CCCCCC"/>
+              <w:left w:val="single" w:sz="1" w:space="0" w:color="CCCCCC"/>
+              <w:bottom w:val="single" w:sz="1" w:space="0" w:color="CCCCCC"/>
+              <w:right w:val="single" w:sz="1" w:space="0" w:color="CCCCCC"/>
+            </w:tcBorders>
+            <w:shd w:val="clear" w:color="auto" w:fill="D6E4F0"/>
+            <w:tcMar>
+              <w:top w:w="80" w:type="dxa"/>
+              <w:left w:w="120" w:type="dxa"/>
+              <w:bottom w:w="80" w:type="dxa"/>
+              <w:right w:w="120" w:type="dxa"/>
+            </w:tcMar>
+          </w:tcPr>
+          <w:p>
+            <w:r>
+              <w:rPr>
+                <w:b/>
+                <w:bCs/>
+                <w:color w:val="1A1A2E"/>
+                <w:sz w:val="20"/>
+                <w:szCs w:val="20"/>
+              </w:rPr>
+              <w:t>Precondiciones</w:t>
+            </w:r>
+          </w:p>
+        </w:tc>
+        <w:tc>
+          <w:tcPr>
+            <w:tcW w:w="4190" w:type="dxa"/>
+            <w:tcBorders>
+              <w:top w:val="single" w:sz="2" w:space="0" w:color="CCCCCC"/>
+              <w:left w:val="single" w:sz="2" w:space="0" w:color="CCCCCC"/>
+              <w:bottom w:val="single" w:sz="2" w:space="0" w:color="CCCCCC"/>
+              <w:right w:val="single" w:sz="2" w:space="0" w:color="CCCCCC"/>
+            </w:tcBorders>
+            <w:tcMar>
+              <w:top w:w="80" w:type="dxa"/>
+              <w:left w:w="120" w:type="dxa"/>
+              <w:bottom w:w="80" w:type="dxa"/>
+              <w:right w:w="120" w:type="dxa"/>
+            </w:tcMar>
+            <w:vAlign w:val="center"/>
+          </w:tcPr>
+          <w:p>
+            <w:pPr>
+              <w:rPr>
+                <w:sz w:val="20"/>
+                <w:szCs w:val="20"/>
+              </w:rPr>
+            </w:pPr>
+            <w:r>
+              <w:rPr>
+                <w:color w:val="000000"/>
+                <w:sz w:val="20"/>
+                <w:szCs w:val="20"/>
+              </w:rPr>
+              <w:t xml:space="preserve">Instancia de </w:t>
+            </w:r>
+            <w:proofErr w:type="spellStart"/>
+            <w:r>
+              <w:rPr>
+                <w:color w:val="000000"/>
+                <w:sz w:val="20"/>
+                <w:szCs w:val="20"/>
+              </w:rPr>
+              <w:t>ValidadorFormulario</w:t>
+            </w:r>
+            <w:proofErr w:type="spellEnd"/>
+            <w:r>
+              <w:rPr>
+                <w:color w:val="000000"/>
+                <w:sz w:val="20"/>
+                <w:szCs w:val="20"/>
+              </w:rPr>
+              <w:t xml:space="preserve"> creada (@BeforeEach)</w:t>
+            </w:r>
+          </w:p>
+        </w:tc>
+      </w:tr>
+      <w:tr>
+        <w:tc>
+          <w:tcPr>
+            <w:tcW w:w="5448" w:type="dxa"/>
+            <w:tcBorders>
+              <w:top w:val="single" w:sz="1" w:space="0" w:color="CCCCCC"/>
+              <w:left w:val="single" w:sz="1" w:space="0" w:color="CCCCCC"/>
+              <w:bottom w:val="single" w:sz="1" w:space="0" w:color="CCCCCC"/>
+              <w:right w:val="single" w:sz="1" w:space="0" w:color="CCCCCC"/>
+            </w:tcBorders>
+            <w:shd w:val="clear" w:color="auto" w:fill="D6E4F0"/>
+            <w:tcMar>
+              <w:top w:w="80" w:type="dxa"/>
+              <w:left w:w="120" w:type="dxa"/>
+              <w:bottom w:w="80" w:type="dxa"/>
+              <w:right w:w="120" w:type="dxa"/>
+            </w:tcMar>
+          </w:tcPr>
+          <w:p>
+            <w:r>
+              <w:rPr>
+                <w:b/>
+                <w:bCs/>
+                <w:color w:val="1A1A2E"/>
+                <w:sz w:val="20"/>
+                <w:szCs w:val="20"/>
+              </w:rPr>
+              <w:t>Datos de entrada</w:t>
+            </w:r>
+          </w:p>
+        </w:tc>
+        <w:tc>
+          <w:tcPr>
+            <w:tcW w:w="4190" w:type="dxa"/>
+            <w:tcBorders>
+              <w:top w:val="single" w:sz="2" w:space="0" w:color="CCCCCC"/>
+              <w:left w:val="single" w:sz="2" w:space="0" w:color="CCCCCC"/>
+              <w:bottom w:val="single" w:sz="2" w:space="0" w:color="CCCCCC"/>
+              <w:right w:val="single" w:sz="2" w:space="0" w:color="CCCCCC"/>
+            </w:tcBorders>
+            <w:tcMar>
+              <w:top w:w="80" w:type="dxa"/>
+              <w:left w:w="120" w:type="dxa"/>
+              <w:bottom w:w="80" w:type="dxa"/>
+              <w:right w:w="120" w:type="dxa"/>
+            </w:tcMar>
+            <w:vAlign w:val="center"/>
+          </w:tcPr>
+          <w:p>
+            <w:pPr>
+              <w:rPr>
+                <w:sz w:val="20"/>
+                <w:szCs w:val="20"/>
+              </w:rPr>
+            </w:pPr>
+            <w:r>
+              <w:rPr>
+                <w:color w:val="000000"/>
+                <w:sz w:val="20"/>
+                <w:szCs w:val="20"/>
+              </w:rPr>
+              <w:t>"12345678A"</w:t>
+            </w:r>
+          </w:p>
+        </w:tc>
+      </w:tr>
+      <w:tr>
+        <w:tc>
+          <w:tcPr>
+            <w:tcW w:w="5448" w:type="dxa"/>
+            <w:tcBorders>
+              <w:top w:val="single" w:sz="1" w:space="0" w:color="CCCCCC"/>
+              <w:left w:val="single" w:sz="1" w:space="0" w:color="CCCCCC"/>
+              <w:bottom w:val="single" w:sz="1" w:space="0" w:color="CCCCCC"/>
+              <w:right w:val="single" w:sz="1" w:space="0" w:color="CCCCCC"/>
+            </w:tcBorders>
+            <w:shd w:val="clear" w:color="auto" w:fill="D6E4F0"/>
+            <w:tcMar>
+              <w:top w:w="80" w:type="dxa"/>
+              <w:left w:w="120" w:type="dxa"/>
+              <w:bottom w:w="80" w:type="dxa"/>
+              <w:right w:w="120" w:type="dxa"/>
+            </w:tcMar>
+          </w:tcPr>
+          <w:p>
+            <w:r>
+              <w:rPr>
+                <w:b/>
+                <w:bCs/>
+                <w:color w:val="1A1A2E"/>
+                <w:sz w:val="20"/>
+                <w:szCs w:val="20"/>
+              </w:rPr>
+              <w:t>Resultado esperado</w:t>
+            </w:r>
+          </w:p>
+        </w:tc>
+        <w:tc>
+          <w:tcPr>
+            <w:tcW w:w="4190" w:type="dxa"/>
+            <w:tcBorders>
+              <w:top w:val="single" w:sz="2" w:space="0" w:color="CCCCCC"/>
+              <w:left w:val="single" w:sz="2" w:space="0" w:color="CCCCCC"/>
+              <w:bottom w:val="single" w:sz="2" w:space="0" w:color="CCCCCC"/>
+              <w:right w:val="single" w:sz="2" w:space="0" w:color="CCCCCC"/>
+            </w:tcBorders>
+            <w:tcMar>
+              <w:top w:w="80" w:type="dxa"/>
+              <w:left w:w="120" w:type="dxa"/>
+              <w:bottom w:w="80" w:type="dxa"/>
+              <w:right w:w="120" w:type="dxa"/>
+            </w:tcMar>
+            <w:vAlign w:val="center"/>
+          </w:tcPr>
+          <w:p>
+            <w:pPr>
+              <w:rPr>
+                <w:sz w:val="20"/>
+                <w:szCs w:val="20"/>
+              </w:rPr>
+            </w:pPr>
+            <w:r>
+              <w:rPr>
+                <w:color w:val="000000"/>
+                <w:sz w:val="20"/>
+                <w:szCs w:val="20"/>
+              </w:rPr>
+              <w:t>false</w:t>
+            </w:r>
+          </w:p>
+        </w:tc>
+      </w:tr>
+      <w:tr>
+        <w:tc>
+          <w:tcPr>
+            <w:tcW w:w="5448" w:type="dxa"/>
+            <w:tcBorders>
+              <w:top w:val="single" w:sz="1" w:space="0" w:color="CCCCCC"/>
+              <w:left w:val="single" w:sz="1" w:space="0" w:color="CCCCCC"/>
+              <w:bottom w:val="single" w:sz="1" w:space="0" w:color="CCCCCC"/>
+              <w:right w:val="single" w:sz="1" w:space="0" w:color="CCCCCC"/>
+            </w:tcBorders>
+            <w:shd w:val="clear" w:color="auto" w:fill="D6E4F0"/>
+            <w:tcMar>
+              <w:top w:w="80" w:type="dxa"/>
+              <w:left w:w="120" w:type="dxa"/>
+              <w:bottom w:w="80" w:type="dxa"/>
+              <w:right w:w="120" w:type="dxa"/>
+            </w:tcMar>
+          </w:tcPr>
+          <w:p>
+            <w:r>
+              <w:rPr>
+                <w:b/>
+                <w:bCs/>
+                <w:color w:val="1A1A2E"/>
+                <w:sz w:val="20"/>
+                <w:szCs w:val="20"/>
+              </w:rPr>
+              <w:t>Resultado obtenido</w:t>
+            </w:r>
+          </w:p>
+        </w:tc>
+        <w:tc>
+          <w:tcPr>
+            <w:tcW w:w="4190" w:type="dxa"/>
+            <w:tcBorders>
+              <w:top w:val="single" w:sz="2" w:space="0" w:color="CCCCCC"/>
+              <w:left w:val="single" w:sz="2" w:space="0" w:color="CCCCCC"/>
+              <w:bottom w:val="single" w:sz="2" w:space="0" w:color="CCCCCC"/>
+              <w:right w:val="single" w:sz="2" w:space="0" w:color="CCCCCC"/>
+            </w:tcBorders>
+            <w:tcMar>
+              <w:top w:w="80" w:type="dxa"/>
+              <w:left w:w="120" w:type="dxa"/>
+              <w:bottom w:w="80" w:type="dxa"/>
+              <w:right w:w="120" w:type="dxa"/>
+            </w:tcMar>
+            <w:vAlign w:val="center"/>
+          </w:tcPr>
+          <w:p>
+            <w:pPr>
+              <w:rPr>
+                <w:sz w:val="20"/>
+                <w:szCs w:val="20"/>
+              </w:rPr>
+            </w:pPr>
+            <w:r>
+              <w:rPr>
+                <w:color w:val="000000"/>
+                <w:sz w:val="20"/>
+                <w:szCs w:val="20"/>
+              </w:rPr>
+              <w:t>false</w:t>
+            </w:r>
+          </w:p>
+        </w:tc>
+      </w:tr>
+      <w:tr>
+        <w:tc>
+          <w:tcPr>
+            <w:tcW w:w="5448" w:type="dxa"/>
+            <w:tcBorders>
+              <w:top w:val="single" w:sz="1" w:space="0" w:color="CCCCCC"/>
+              <w:left w:val="single" w:sz="1" w:space="0" w:color="CCCCCC"/>
+              <w:bottom w:val="single" w:sz="1" w:space="0" w:color="CCCCCC"/>
+              <w:right w:val="single" w:sz="1" w:space="0" w:color="CCCCCC"/>
+            </w:tcBorders>
+            <w:shd w:val="clear" w:color="auto" w:fill="D6E4F0"/>
+            <w:tcMar>
+              <w:top w:w="80" w:type="dxa"/>
+              <w:left w:w="120" w:type="dxa"/>
+              <w:bottom w:w="80" w:type="dxa"/>
+              <w:right w:w="120" w:type="dxa"/>
+            </w:tcMar>
+          </w:tcPr>
+          <w:p>
+            <w:r>
+              <w:rPr>
+                <w:b/>
+                <w:bCs/>
+                <w:color w:val="1A1A2E"/>
+                <w:sz w:val="20"/>
+                <w:szCs w:val="20"/>
+              </w:rPr>
+              <w:t>Estado ( Pasa /  Falla)</w:t>
+            </w:r>
+          </w:p>
+        </w:tc>
+        <w:tc>
+          <w:tcPr>
+            <w:tcW w:w="4190" w:type="dxa"/>
+            <w:tcBorders>
+              <w:top w:val="single" w:sz="2" w:space="0" w:color="CCCCCC"/>
+              <w:left w:val="single" w:sz="2" w:space="0" w:color="CCCCCC"/>
+              <w:bottom w:val="single" w:sz="2" w:space="0" w:color="CCCCCC"/>
+              <w:right w:val="single" w:sz="2" w:space="0" w:color="CCCCCC"/>
+            </w:tcBorders>
+            <w:tcMar>
+              <w:top w:w="80" w:type="dxa"/>
+              <w:left w:w="120" w:type="dxa"/>
+              <w:bottom w:w="80" w:type="dxa"/>
+              <w:right w:w="120" w:type="dxa"/>
+            </w:tcMar>
+            <w:vAlign w:val="center"/>
+          </w:tcPr>
+          <w:p>
+            <w:pPr>
+              <w:rPr>
+                <w:sz w:val="20"/>
+                <w:szCs w:val="20"/>
+              </w:rPr>
+            </w:pPr>
+            <w:r>
+              <w:rPr>
+                <w:color w:val="000000"/>
+                <w:sz w:val="20"/>
+                <w:szCs w:val="20"/>
+              </w:rPr>
+              <w:t>Pasa</w:t>
+            </w:r>
+          </w:p>
+        </w:tc>
+      </w:tr>
+      <w:tr>
+        <w:tc>
+          <w:tcPr>
+            <w:tcW w:w="5448" w:type="dxa"/>
+            <w:tcBorders>
+              <w:top w:val="single" w:sz="1" w:space="0" w:color="CCCCCC"/>
+              <w:left w:val="single" w:sz="1" w:space="0" w:color="CCCCCC"/>
+              <w:bottom w:val="single" w:sz="1" w:space="0" w:color="CCCCCC"/>
+              <w:right w:val="single" w:sz="1" w:space="0" w:color="CCCCCC"/>
+            </w:tcBorders>
+            <w:shd w:val="clear" w:color="auto" w:fill="D6E4F0"/>
+            <w:tcMar>
+              <w:top w:w="80" w:type="dxa"/>
+              <w:left w:w="120" w:type="dxa"/>
+              <w:bottom w:w="80" w:type="dxa"/>
+              <w:right w:w="120" w:type="dxa"/>
+            </w:tcMar>
+          </w:tcPr>
+          <w:p>
+            <w:r>
+              <w:rPr>
+                <w:b/>
+                <w:bCs/>
+                <w:color w:val="1A1A2E"/>
+                <w:sz w:val="20"/>
+                <w:szCs w:val="20"/>
+              </w:rPr>
+              <w:t>Observaciones / Defecto encontrado</w:t>
+            </w:r>
+          </w:p>
+        </w:tc>
+        <w:tc>
+          <w:tcPr>
+            <w:tcW w:w="4190" w:type="dxa"/>
+            <w:tcBorders>
+              <w:top w:val="single" w:sz="2" w:space="0" w:color="CCCCCC"/>
+              <w:left w:val="single" w:sz="2" w:space="0" w:color="CCCCCC"/>
+              <w:bottom w:val="single" w:sz="2" w:space="0" w:color="CCCCCC"/>
+              <w:right w:val="single" w:sz="2" w:space="0" w:color="CCCCCC"/>
+            </w:tcBorders>
+            <w:tcMar>
+              <w:top w:w="80" w:type="dxa"/>
+              <w:left w:w="120" w:type="dxa"/>
+              <w:bottom w:w="80" w:type="dxa"/>
+              <w:right w:w="120" w:type="dxa"/>
+            </w:tcMar>
+            <w:vAlign w:val="center"/>
+          </w:tcPr>
+          <w:p>
+            <w:pPr>
+              <w:spacing w:after="80"/>
+              <w:rPr>
+                <w:sz w:val="20"/>
+                <w:szCs w:val="20"/>
+              </w:rPr>
+            </w:pPr>
+            <w:r>
+              <w:rPr>
+                <w:color w:val="000000"/>
+                <w:sz w:val="20"/>
+                <w:szCs w:val="20"/>
+              </w:rPr>
+              <w:t>Ninguno</w:t>
+            </w:r>
+          </w:p>
+        </w:tc>
+      </w:tr>
+    </w:tbl>
     <w:p/>
-    <w:p/>
+    <w:p>
+      <w:pPr>
+        <w:spacing w:before="60" w:after="60"/>
+      </w:pPr>
+    </w:p>
+    <w:tbl>
+      <w:tblPr>
+        <w:tblW w:w="9638" w:type="dxa"/>
+        <w:tblBorders>
+          <w:top w:val="single" w:sz="4" w:space="0" w:color="auto"/>
+          <w:left w:val="single" w:sz="4" w:space="0" w:color="auto"/>
+          <w:bottom w:val="single" w:sz="4" w:space="0" w:color="auto"/>
+          <w:right w:val="single" w:sz="4" w:space="0" w:color="auto"/>
+          <w:insideH w:val="single" w:sz="4" w:space="0" w:color="auto"/>
+          <w:insideV w:val="single" w:sz="4" w:space="0" w:color="auto"/>
+        </w:tblBorders>
+        <w:tblCellMar>
+          <w:left w:w="10" w:type="dxa"/>
+          <w:right w:w="10" w:type="dxa"/>
+        </w:tblCellMar>
+        <w:tblLook w:val="04A0" w:firstRow="1" w:lastRow="0" w:firstColumn="1" w:lastColumn="0" w:noHBand="0" w:noVBand="1"/>
+      </w:tblPr>
+      <w:tblGrid>
+        <w:gridCol w:w="5448"/>
+        <w:gridCol w:w="4190"/>
+      </w:tblGrid>
+      <w:tr>
+        <w:trPr>
+          <w:gridAfter w:val="1"/>
+          <w:wAfter w:w="4190" w:type="dxa"/>
+        </w:trPr>
+        <w:tc>
+          <w:tcPr>
+            <w:tcW w:w="5448" w:type="dxa"/>
+            <w:tcBorders>
+              <w:top w:val="single" w:sz="1" w:space="0" w:color="CCCCCC"/>
+              <w:left w:val="single" w:sz="1" w:space="0" w:color="CCCCCC"/>
+              <w:bottom w:val="single" w:sz="1" w:space="0" w:color="CCCCCC"/>
+              <w:right w:val="single" w:sz="1" w:space="0" w:color="CCCCCC"/>
+            </w:tcBorders>
+            <w:shd w:val="clear" w:color="auto" w:fill="1F5C8B"/>
+            <w:tcMar>
+              <w:top w:w="80" w:type="dxa"/>
+              <w:left w:w="120" w:type="dxa"/>
+              <w:bottom w:w="80" w:type="dxa"/>
+              <w:right w:w="120" w:type="dxa"/>
+            </w:tcMar>
+          </w:tcPr>
+          <w:p>
+            <w:r>
+              <w:rPr>
+                <w:b/>
+                <w:bCs/>
+                <w:color w:val="FFFFFF"/>
+              </w:rPr>
+              <w:t>CASO DE PRUEBA TC-02</w:t>
+            </w:r>
+            <w:r>
+              <w:rPr>
+                <w:b/>
+                <w:bCs/>
+                <w:color w:val="FFFFFF"/>
+              </w:rPr>
+              <w:t>3</w:t>
+            </w:r>
+          </w:p>
+        </w:tc>
+      </w:tr>
+      <w:tr>
+        <w:tc>
+          <w:tcPr>
+            <w:tcW w:w="5448" w:type="dxa"/>
+            <w:tcBorders>
+              <w:top w:val="single" w:sz="1" w:space="0" w:color="CCCCCC"/>
+              <w:left w:val="single" w:sz="1" w:space="0" w:color="CCCCCC"/>
+              <w:bottom w:val="single" w:sz="1" w:space="0" w:color="CCCCCC"/>
+              <w:right w:val="single" w:sz="1" w:space="0" w:color="CCCCCC"/>
+            </w:tcBorders>
+            <w:shd w:val="clear" w:color="auto" w:fill="D6E4F0"/>
+            <w:tcMar>
+              <w:top w:w="80" w:type="dxa"/>
+              <w:left w:w="120" w:type="dxa"/>
+              <w:bottom w:w="80" w:type="dxa"/>
+              <w:right w:w="120" w:type="dxa"/>
+            </w:tcMar>
+          </w:tcPr>
+          <w:p>
+            <w:r>
+              <w:rPr>
+                <w:b/>
+                <w:bCs/>
+                <w:color w:val="1A1A2E"/>
+                <w:sz w:val="20"/>
+                <w:szCs w:val="20"/>
+              </w:rPr>
+              <w:t>Identificador</w:t>
+            </w:r>
+          </w:p>
+        </w:tc>
+        <w:tc>
+          <w:tcPr>
+            <w:tcW w:w="4190" w:type="dxa"/>
+            <w:tcBorders>
+              <w:top w:val="single" w:sz="2" w:space="0" w:color="CCCCCC"/>
+              <w:left w:val="single" w:sz="2" w:space="0" w:color="CCCCCC"/>
+              <w:bottom w:val="single" w:sz="2" w:space="0" w:color="CCCCCC"/>
+              <w:right w:val="single" w:sz="2" w:space="0" w:color="CCCCCC"/>
+            </w:tcBorders>
+            <w:tcMar>
+              <w:top w:w="80" w:type="dxa"/>
+              <w:left w:w="120" w:type="dxa"/>
+              <w:bottom w:w="80" w:type="dxa"/>
+              <w:right w:w="120" w:type="dxa"/>
+            </w:tcMar>
+            <w:vAlign w:val="center"/>
+          </w:tcPr>
+          <w:p>
+            <w:pPr>
+              <w:rPr>
+                <w:sz w:val="20"/>
+                <w:szCs w:val="20"/>
+                <w:u w:val="single"/>
+              </w:rPr>
+            </w:pPr>
+            <w:r>
+              <w:rPr>
+                <w:color w:val="000000"/>
+                <w:sz w:val="20"/>
+                <w:szCs w:val="20"/>
+              </w:rPr>
+              <w:t>TC-0</w:t>
+            </w:r>
+            <w:r>
+              <w:rPr>
+                <w:color w:val="000000"/>
+                <w:sz w:val="20"/>
+                <w:szCs w:val="20"/>
+              </w:rPr>
+              <w:t>2</w:t>
+            </w:r>
+            <w:r>
+              <w:rPr>
+                <w:color w:val="000000"/>
+                <w:sz w:val="20"/>
+                <w:szCs w:val="20"/>
+              </w:rPr>
+              <w:t>3</w:t>
+            </w:r>
+          </w:p>
+        </w:tc>
+      </w:tr>
+      <w:tr>
+        <w:tc>
+          <w:tcPr>
+            <w:tcW w:w="5448" w:type="dxa"/>
+            <w:tcBorders>
+              <w:top w:val="single" w:sz="1" w:space="0" w:color="CCCCCC"/>
+              <w:left w:val="single" w:sz="1" w:space="0" w:color="CCCCCC"/>
+              <w:bottom w:val="single" w:sz="1" w:space="0" w:color="CCCCCC"/>
+              <w:right w:val="single" w:sz="1" w:space="0" w:color="CCCCCC"/>
+            </w:tcBorders>
+            <w:shd w:val="clear" w:color="auto" w:fill="D6E4F0"/>
+            <w:tcMar>
+              <w:top w:w="80" w:type="dxa"/>
+              <w:left w:w="120" w:type="dxa"/>
+              <w:bottom w:w="80" w:type="dxa"/>
+              <w:right w:w="120" w:type="dxa"/>
+            </w:tcMar>
+          </w:tcPr>
+          <w:p>
+            <w:r>
+              <w:rPr>
+                <w:b/>
+                <w:bCs/>
+                <w:color w:val="1A1A2E"/>
+                <w:sz w:val="20"/>
+                <w:szCs w:val="20"/>
+              </w:rPr>
+              <w:t>Nombre / Descripción</w:t>
+            </w:r>
+          </w:p>
+        </w:tc>
+        <w:tc>
+          <w:tcPr>
+            <w:tcW w:w="4190" w:type="dxa"/>
+            <w:tcBorders>
+              <w:top w:val="single" w:sz="2" w:space="0" w:color="CCCCCC"/>
+              <w:left w:val="single" w:sz="2" w:space="0" w:color="CCCCCC"/>
+              <w:bottom w:val="single" w:sz="2" w:space="0" w:color="CCCCCC"/>
+              <w:right w:val="single" w:sz="2" w:space="0" w:color="CCCCCC"/>
+            </w:tcBorders>
+            <w:tcMar>
+              <w:top w:w="80" w:type="dxa"/>
+              <w:left w:w="120" w:type="dxa"/>
+              <w:bottom w:w="80" w:type="dxa"/>
+              <w:right w:w="120" w:type="dxa"/>
+            </w:tcMar>
+            <w:vAlign w:val="center"/>
+          </w:tcPr>
+          <w:p>
+            <w:pPr>
+              <w:rPr>
+                <w:sz w:val="20"/>
+                <w:szCs w:val="20"/>
+              </w:rPr>
+            </w:pPr>
+            <w:r>
+              <w:rPr>
+                <w:color w:val="000000"/>
+                <w:sz w:val="20"/>
+                <w:szCs w:val="20"/>
+              </w:rPr>
+              <w:t>DNI con letra en minúscula debe devolver true (convierte a mayúscula)</w:t>
+            </w:r>
+          </w:p>
+        </w:tc>
+      </w:tr>
+      <w:tr>
+        <w:tc>
+          <w:tcPr>
+            <w:tcW w:w="5448" w:type="dxa"/>
+            <w:tcBorders>
+              <w:top w:val="single" w:sz="1" w:space="0" w:color="CCCCCC"/>
+              <w:left w:val="single" w:sz="1" w:space="0" w:color="CCCCCC"/>
+              <w:bottom w:val="single" w:sz="1" w:space="0" w:color="CCCCCC"/>
+              <w:right w:val="single" w:sz="1" w:space="0" w:color="CCCCCC"/>
+            </w:tcBorders>
+            <w:shd w:val="clear" w:color="auto" w:fill="D6E4F0"/>
+            <w:tcMar>
+              <w:top w:w="80" w:type="dxa"/>
+              <w:left w:w="120" w:type="dxa"/>
+              <w:bottom w:w="80" w:type="dxa"/>
+              <w:right w:w="120" w:type="dxa"/>
+            </w:tcMar>
+          </w:tcPr>
+          <w:p>
+            <w:r>
+              <w:rPr>
+                <w:b/>
+                <w:bCs/>
+                <w:color w:val="1A1A2E"/>
+                <w:sz w:val="20"/>
+                <w:szCs w:val="20"/>
+              </w:rPr>
+              <w:t>Clase / Método bajo prueba</w:t>
+            </w:r>
+          </w:p>
+        </w:tc>
+        <w:tc>
+          <w:tcPr>
+            <w:tcW w:w="4190" w:type="dxa"/>
+            <w:tcBorders>
+              <w:top w:val="single" w:sz="2" w:space="0" w:color="CCCCCC"/>
+              <w:left w:val="single" w:sz="2" w:space="0" w:color="CCCCCC"/>
+              <w:bottom w:val="single" w:sz="2" w:space="0" w:color="CCCCCC"/>
+              <w:right w:val="single" w:sz="2" w:space="0" w:color="CCCCCC"/>
+            </w:tcBorders>
+            <w:tcMar>
+              <w:top w:w="80" w:type="dxa"/>
+              <w:left w:w="120" w:type="dxa"/>
+              <w:bottom w:w="80" w:type="dxa"/>
+              <w:right w:w="120" w:type="dxa"/>
+            </w:tcMar>
+            <w:vAlign w:val="center"/>
+          </w:tcPr>
+          <w:p>
+            <w:pPr>
+              <w:rPr>
+                <w:sz w:val="20"/>
+                <w:szCs w:val="20"/>
+              </w:rPr>
+            </w:pPr>
+            <w:proofErr w:type="spellStart"/>
+            <w:r>
+              <w:rPr>
+                <w:color w:val="000000"/>
+                <w:sz w:val="20"/>
+                <w:szCs w:val="20"/>
+              </w:rPr>
+              <w:t>ValidadorFormulario.validarDNI</w:t>
+            </w:r>
+            <w:proofErr w:type="spellEnd"/>
+            <w:r>
+              <w:rPr>
+                <w:color w:val="000000"/>
+                <w:sz w:val="20"/>
+                <w:szCs w:val="20"/>
+              </w:rPr>
+              <w:t>()</w:t>
+            </w:r>
+          </w:p>
+        </w:tc>
+      </w:tr>
+      <w:tr>
+        <w:tc>
+          <w:tcPr>
+            <w:tcW w:w="5448" w:type="dxa"/>
+            <w:tcBorders>
+              <w:top w:val="single" w:sz="1" w:space="0" w:color="CCCCCC"/>
+              <w:left w:val="single" w:sz="1" w:space="0" w:color="CCCCCC"/>
+              <w:bottom w:val="single" w:sz="1" w:space="0" w:color="CCCCCC"/>
+              <w:right w:val="single" w:sz="1" w:space="0" w:color="CCCCCC"/>
+            </w:tcBorders>
+            <w:shd w:val="clear" w:color="auto" w:fill="D6E4F0"/>
+            <w:tcMar>
+              <w:top w:w="80" w:type="dxa"/>
+              <w:left w:w="120" w:type="dxa"/>
+              <w:bottom w:w="80" w:type="dxa"/>
+              <w:right w:w="120" w:type="dxa"/>
+            </w:tcMar>
+          </w:tcPr>
+          <w:p>
+            <w:r>
+              <w:rPr>
+                <w:b/>
+                <w:bCs/>
+                <w:color w:val="1A1A2E"/>
+                <w:sz w:val="20"/>
+                <w:szCs w:val="20"/>
+              </w:rPr>
+              <w:t>Técnica de diseño</w:t>
+            </w:r>
+          </w:p>
+        </w:tc>
+        <w:tc>
+          <w:tcPr>
+            <w:tcW w:w="4190" w:type="dxa"/>
+            <w:tcBorders>
+              <w:top w:val="single" w:sz="2" w:space="0" w:color="CCCCCC"/>
+              <w:left w:val="single" w:sz="2" w:space="0" w:color="CCCCCC"/>
+              <w:bottom w:val="single" w:sz="2" w:space="0" w:color="CCCCCC"/>
+              <w:right w:val="single" w:sz="2" w:space="0" w:color="CCCCCC"/>
+            </w:tcBorders>
+            <w:tcMar>
+              <w:top w:w="80" w:type="dxa"/>
+              <w:left w:w="120" w:type="dxa"/>
+              <w:bottom w:w="80" w:type="dxa"/>
+              <w:right w:w="120" w:type="dxa"/>
+            </w:tcMar>
+            <w:vAlign w:val="center"/>
+          </w:tcPr>
+          <w:p>
+            <w:pPr>
+              <w:rPr>
+                <w:sz w:val="20"/>
+                <w:szCs w:val="20"/>
+              </w:rPr>
+            </w:pPr>
+            <w:r>
+              <w:rPr>
+                <w:color w:val="000000"/>
+                <w:sz w:val="20"/>
+                <w:szCs w:val="20"/>
+              </w:rPr>
+              <w:t xml:space="preserve">Caja Blanca – Rama </w:t>
+            </w:r>
+            <w:proofErr w:type="spellStart"/>
+            <w:r>
+              <w:rPr>
+                <w:color w:val="000000"/>
+                <w:sz w:val="20"/>
+                <w:szCs w:val="20"/>
+              </w:rPr>
+              <w:t>toUpperCase</w:t>
+            </w:r>
+            <w:proofErr w:type="spellEnd"/>
+            <w:r>
+              <w:rPr>
+                <w:color w:val="000000"/>
+                <w:sz w:val="20"/>
+                <w:szCs w:val="20"/>
+              </w:rPr>
+              <w:t>()</w:t>
+            </w:r>
+          </w:p>
+        </w:tc>
+      </w:tr>
+      <w:tr>
+        <w:tc>
+          <w:tcPr>
+            <w:tcW w:w="5448" w:type="dxa"/>
+            <w:tcBorders>
+              <w:top w:val="single" w:sz="1" w:space="0" w:color="CCCCCC"/>
+              <w:left w:val="single" w:sz="1" w:space="0" w:color="CCCCCC"/>
+              <w:bottom w:val="single" w:sz="1" w:space="0" w:color="CCCCCC"/>
+              <w:right w:val="single" w:sz="1" w:space="0" w:color="CCCCCC"/>
+            </w:tcBorders>
+            <w:shd w:val="clear" w:color="auto" w:fill="D6E4F0"/>
+            <w:tcMar>
+              <w:top w:w="80" w:type="dxa"/>
+              <w:left w:w="120" w:type="dxa"/>
+              <w:bottom w:w="80" w:type="dxa"/>
+              <w:right w:w="120" w:type="dxa"/>
+            </w:tcMar>
+          </w:tcPr>
+          <w:p>
+            <w:r>
+              <w:rPr>
+                <w:b/>
+                <w:bCs/>
+                <w:color w:val="1A1A2E"/>
+                <w:sz w:val="20"/>
+                <w:szCs w:val="20"/>
+              </w:rPr>
+              <w:t>Precondiciones</w:t>
+            </w:r>
+          </w:p>
+        </w:tc>
+        <w:tc>
+          <w:tcPr>
+            <w:tcW w:w="4190" w:type="dxa"/>
+            <w:tcBorders>
+              <w:top w:val="single" w:sz="2" w:space="0" w:color="CCCCCC"/>
+              <w:left w:val="single" w:sz="2" w:space="0" w:color="CCCCCC"/>
+              <w:bottom w:val="single" w:sz="2" w:space="0" w:color="CCCCCC"/>
+              <w:right w:val="single" w:sz="2" w:space="0" w:color="CCCCCC"/>
+            </w:tcBorders>
+            <w:tcMar>
+              <w:top w:w="80" w:type="dxa"/>
+              <w:left w:w="120" w:type="dxa"/>
+              <w:bottom w:w="80" w:type="dxa"/>
+              <w:right w:w="120" w:type="dxa"/>
+            </w:tcMar>
+            <w:vAlign w:val="center"/>
+          </w:tcPr>
+          <w:p>
+            <w:pPr>
+              <w:rPr>
+                <w:sz w:val="20"/>
+                <w:szCs w:val="20"/>
+              </w:rPr>
+            </w:pPr>
+            <w:r>
+              <w:rPr>
+                <w:color w:val="000000"/>
+                <w:sz w:val="20"/>
+                <w:szCs w:val="20"/>
+              </w:rPr>
+              <w:t xml:space="preserve">Instancia de </w:t>
+            </w:r>
+            <w:proofErr w:type="spellStart"/>
+            <w:r>
+              <w:rPr>
+                <w:color w:val="000000"/>
+                <w:sz w:val="20"/>
+                <w:szCs w:val="20"/>
+              </w:rPr>
+              <w:t>ValidadorFormulario</w:t>
+            </w:r>
+            <w:proofErr w:type="spellEnd"/>
+            <w:r>
+              <w:rPr>
+                <w:color w:val="000000"/>
+                <w:sz w:val="20"/>
+                <w:szCs w:val="20"/>
+              </w:rPr>
+              <w:t xml:space="preserve"> creada (@BeforeEach)</w:t>
+            </w:r>
+          </w:p>
+        </w:tc>
+      </w:tr>
+      <w:tr>
+        <w:tc>
+          <w:tcPr>
+            <w:tcW w:w="5448" w:type="dxa"/>
+            <w:tcBorders>
+              <w:top w:val="single" w:sz="1" w:space="0" w:color="CCCCCC"/>
+              <w:left w:val="single" w:sz="1" w:space="0" w:color="CCCCCC"/>
+              <w:bottom w:val="single" w:sz="1" w:space="0" w:color="CCCCCC"/>
+              <w:right w:val="single" w:sz="1" w:space="0" w:color="CCCCCC"/>
+            </w:tcBorders>
+            <w:shd w:val="clear" w:color="auto" w:fill="D6E4F0"/>
+            <w:tcMar>
+              <w:top w:w="80" w:type="dxa"/>
+              <w:left w:w="120" w:type="dxa"/>
+              <w:bottom w:w="80" w:type="dxa"/>
+              <w:right w:w="120" w:type="dxa"/>
+            </w:tcMar>
+          </w:tcPr>
+          <w:p>
+            <w:r>
+              <w:rPr>
+                <w:b/>
+                <w:bCs/>
+                <w:color w:val="1A1A2E"/>
+                <w:sz w:val="20"/>
+                <w:szCs w:val="20"/>
+              </w:rPr>
+              <w:t>Datos de entrada</w:t>
+            </w:r>
+          </w:p>
+        </w:tc>
+        <w:tc>
+          <w:tcPr>
+            <w:tcW w:w="4190" w:type="dxa"/>
+            <w:tcBorders>
+              <w:top w:val="single" w:sz="2" w:space="0" w:color="CCCCCC"/>
+              <w:left w:val="single" w:sz="2" w:space="0" w:color="CCCCCC"/>
+              <w:bottom w:val="single" w:sz="2" w:space="0" w:color="CCCCCC"/>
+              <w:right w:val="single" w:sz="2" w:space="0" w:color="CCCCCC"/>
+            </w:tcBorders>
+            <w:tcMar>
+              <w:top w:w="80" w:type="dxa"/>
+              <w:left w:w="120" w:type="dxa"/>
+              <w:bottom w:w="80" w:type="dxa"/>
+              <w:right w:w="120" w:type="dxa"/>
+            </w:tcMar>
+            <w:vAlign w:val="center"/>
+          </w:tcPr>
+          <w:p>
+            <w:pPr>
+              <w:rPr>
+                <w:sz w:val="20"/>
+                <w:szCs w:val="20"/>
+              </w:rPr>
+            </w:pPr>
+            <w:r>
+              <w:rPr>
+                <w:color w:val="000000"/>
+                <w:sz w:val="20"/>
+                <w:szCs w:val="20"/>
+              </w:rPr>
+              <w:t>"12345678z"</w:t>
+            </w:r>
+          </w:p>
+        </w:tc>
+      </w:tr>
+      <w:tr>
+        <w:tc>
+          <w:tcPr>
+            <w:tcW w:w="5448" w:type="dxa"/>
+            <w:tcBorders>
+              <w:top w:val="single" w:sz="1" w:space="0" w:color="CCCCCC"/>
+              <w:left w:val="single" w:sz="1" w:space="0" w:color="CCCCCC"/>
+              <w:bottom w:val="single" w:sz="1" w:space="0" w:color="CCCCCC"/>
+              <w:right w:val="single" w:sz="1" w:space="0" w:color="CCCCCC"/>
+            </w:tcBorders>
+            <w:shd w:val="clear" w:color="auto" w:fill="D6E4F0"/>
+            <w:tcMar>
+              <w:top w:w="80" w:type="dxa"/>
+              <w:left w:w="120" w:type="dxa"/>
+              <w:bottom w:w="80" w:type="dxa"/>
+              <w:right w:w="120" w:type="dxa"/>
+            </w:tcMar>
+          </w:tcPr>
+          <w:p>
+            <w:r>
+              <w:rPr>
+                <w:b/>
+                <w:bCs/>
+                <w:color w:val="1A1A2E"/>
+                <w:sz w:val="20"/>
+                <w:szCs w:val="20"/>
+              </w:rPr>
+              <w:t>Resultado esperado</w:t>
+            </w:r>
+          </w:p>
+        </w:tc>
+        <w:tc>
+          <w:tcPr>
+            <w:tcW w:w="4190" w:type="dxa"/>
+            <w:tcBorders>
+              <w:top w:val="single" w:sz="2" w:space="0" w:color="CCCCCC"/>
+              <w:left w:val="single" w:sz="2" w:space="0" w:color="CCCCCC"/>
+              <w:bottom w:val="single" w:sz="2" w:space="0" w:color="CCCCCC"/>
+              <w:right w:val="single" w:sz="2" w:space="0" w:color="CCCCCC"/>
+            </w:tcBorders>
+            <w:tcMar>
+              <w:top w:w="80" w:type="dxa"/>
+              <w:left w:w="120" w:type="dxa"/>
+              <w:bottom w:w="80" w:type="dxa"/>
+              <w:right w:w="120" w:type="dxa"/>
+            </w:tcMar>
+            <w:vAlign w:val="center"/>
+          </w:tcPr>
+          <w:p>
+            <w:pPr>
+              <w:rPr>
+                <w:sz w:val="20"/>
+                <w:szCs w:val="20"/>
+              </w:rPr>
+            </w:pPr>
+            <w:r>
+              <w:rPr>
+                <w:color w:val="000000"/>
+                <w:sz w:val="20"/>
+                <w:szCs w:val="20"/>
+              </w:rPr>
+              <w:t>true</w:t>
+            </w:r>
+          </w:p>
+        </w:tc>
+      </w:tr>
+      <w:tr>
+        <w:tc>
+          <w:tcPr>
+            <w:tcW w:w="5448" w:type="dxa"/>
+            <w:tcBorders>
+              <w:top w:val="single" w:sz="1" w:space="0" w:color="CCCCCC"/>
+              <w:left w:val="single" w:sz="1" w:space="0" w:color="CCCCCC"/>
+              <w:bottom w:val="single" w:sz="1" w:space="0" w:color="CCCCCC"/>
+              <w:right w:val="single" w:sz="1" w:space="0" w:color="CCCCCC"/>
+            </w:tcBorders>
+            <w:shd w:val="clear" w:color="auto" w:fill="D6E4F0"/>
+            <w:tcMar>
+              <w:top w:w="80" w:type="dxa"/>
+              <w:left w:w="120" w:type="dxa"/>
+              <w:bottom w:w="80" w:type="dxa"/>
+              <w:right w:w="120" w:type="dxa"/>
+            </w:tcMar>
+          </w:tcPr>
+          <w:p>
+            <w:r>
+              <w:rPr>
+                <w:b/>
+                <w:bCs/>
+                <w:color w:val="1A1A2E"/>
+                <w:sz w:val="20"/>
+                <w:szCs w:val="20"/>
+              </w:rPr>
+              <w:t>Resultado obtenido</w:t>
+            </w:r>
+          </w:p>
+        </w:tc>
+        <w:tc>
+          <w:tcPr>
+            <w:tcW w:w="4190" w:type="dxa"/>
+            <w:tcBorders>
+              <w:top w:val="single" w:sz="2" w:space="0" w:color="CCCCCC"/>
+              <w:left w:val="single" w:sz="2" w:space="0" w:color="CCCCCC"/>
+              <w:bottom w:val="single" w:sz="2" w:space="0" w:color="CCCCCC"/>
+              <w:right w:val="single" w:sz="2" w:space="0" w:color="CCCCCC"/>
+            </w:tcBorders>
+            <w:tcMar>
+              <w:top w:w="80" w:type="dxa"/>
+              <w:left w:w="120" w:type="dxa"/>
+              <w:bottom w:w="80" w:type="dxa"/>
+              <w:right w:w="120" w:type="dxa"/>
+            </w:tcMar>
+            <w:vAlign w:val="center"/>
+          </w:tcPr>
+          <w:p>
+            <w:pPr>
+              <w:rPr>
+                <w:sz w:val="20"/>
+                <w:szCs w:val="20"/>
+              </w:rPr>
+            </w:pPr>
+            <w:r>
+              <w:rPr>
+                <w:color w:val="000000"/>
+                <w:sz w:val="20"/>
+                <w:szCs w:val="20"/>
+              </w:rPr>
+              <w:t>true</w:t>
+            </w:r>
+          </w:p>
+        </w:tc>
+      </w:tr>
+      <w:tr>
+        <w:tc>
+          <w:tcPr>
+            <w:tcW w:w="5448" w:type="dxa"/>
+            <w:tcBorders>
+              <w:top w:val="single" w:sz="1" w:space="0" w:color="CCCCCC"/>
+              <w:left w:val="single" w:sz="1" w:space="0" w:color="CCCCCC"/>
+              <w:bottom w:val="single" w:sz="1" w:space="0" w:color="CCCCCC"/>
+              <w:right w:val="single" w:sz="1" w:space="0" w:color="CCCCCC"/>
+            </w:tcBorders>
+            <w:shd w:val="clear" w:color="auto" w:fill="D6E4F0"/>
+            <w:tcMar>
+              <w:top w:w="80" w:type="dxa"/>
+              <w:left w:w="120" w:type="dxa"/>
+              <w:bottom w:w="80" w:type="dxa"/>
+              <w:right w:w="120" w:type="dxa"/>
+            </w:tcMar>
+          </w:tcPr>
+          <w:p>
+            <w:r>
+              <w:rPr>
+                <w:b/>
+                <w:bCs/>
+                <w:color w:val="1A1A2E"/>
+                <w:sz w:val="20"/>
+                <w:szCs w:val="20"/>
+              </w:rPr>
+              <w:t>Estado ( Pasa /  Falla)</w:t>
+            </w:r>
+          </w:p>
+        </w:tc>
+        <w:tc>
+          <w:tcPr>
+            <w:tcW w:w="4190" w:type="dxa"/>
+            <w:tcBorders>
+              <w:top w:val="single" w:sz="2" w:space="0" w:color="CCCCCC"/>
+              <w:left w:val="single" w:sz="2" w:space="0" w:color="CCCCCC"/>
+              <w:bottom w:val="single" w:sz="2" w:space="0" w:color="CCCCCC"/>
+              <w:right w:val="single" w:sz="2" w:space="0" w:color="CCCCCC"/>
+            </w:tcBorders>
+            <w:tcMar>
+              <w:top w:w="80" w:type="dxa"/>
+              <w:left w:w="120" w:type="dxa"/>
+              <w:bottom w:w="80" w:type="dxa"/>
+              <w:right w:w="120" w:type="dxa"/>
+            </w:tcMar>
+            <w:vAlign w:val="center"/>
+          </w:tcPr>
+          <w:p>
+            <w:pPr>
+              <w:rPr>
+                <w:sz w:val="20"/>
+                <w:szCs w:val="20"/>
+              </w:rPr>
+            </w:pPr>
+            <w:r>
+              <w:rPr>
+                <w:color w:val="000000"/>
+                <w:sz w:val="20"/>
+                <w:szCs w:val="20"/>
+              </w:rPr>
+              <w:t>Pasa</w:t>
+            </w:r>
+          </w:p>
+        </w:tc>
+      </w:tr>
+      <w:tr>
+        <w:tc>
+          <w:tcPr>
+            <w:tcW w:w="5448" w:type="dxa"/>
+            <w:tcBorders>
+              <w:top w:val="single" w:sz="1" w:space="0" w:color="CCCCCC"/>
+              <w:left w:val="single" w:sz="1" w:space="0" w:color="CCCCCC"/>
+              <w:bottom w:val="single" w:sz="1" w:space="0" w:color="CCCCCC"/>
+              <w:right w:val="single" w:sz="1" w:space="0" w:color="CCCCCC"/>
+            </w:tcBorders>
+            <w:shd w:val="clear" w:color="auto" w:fill="D6E4F0"/>
+            <w:tcMar>
+              <w:top w:w="80" w:type="dxa"/>
+              <w:left w:w="120" w:type="dxa"/>
+              <w:bottom w:w="80" w:type="dxa"/>
+              <w:right w:w="120" w:type="dxa"/>
+            </w:tcMar>
+          </w:tcPr>
+          <w:p>
+            <w:r>
+              <w:rPr>
+                <w:b/>
+                <w:bCs/>
+                <w:color w:val="1A1A2E"/>
+                <w:sz w:val="20"/>
+                <w:szCs w:val="20"/>
+              </w:rPr>
+              <w:t>Observaciones / Defecto encontrado</w:t>
+            </w:r>
+          </w:p>
+        </w:tc>
+        <w:tc>
+          <w:tcPr>
+            <w:tcW w:w="4190" w:type="dxa"/>
+            <w:tcBorders>
+              <w:top w:val="single" w:sz="2" w:space="0" w:color="CCCCCC"/>
+              <w:left w:val="single" w:sz="2" w:space="0" w:color="CCCCCC"/>
+              <w:bottom w:val="single" w:sz="2" w:space="0" w:color="CCCCCC"/>
+              <w:right w:val="single" w:sz="2" w:space="0" w:color="CCCCCC"/>
+            </w:tcBorders>
+            <w:tcMar>
+              <w:top w:w="80" w:type="dxa"/>
+              <w:left w:w="120" w:type="dxa"/>
+              <w:bottom w:w="80" w:type="dxa"/>
+              <w:right w:w="120" w:type="dxa"/>
+            </w:tcMar>
+            <w:vAlign w:val="center"/>
+          </w:tcPr>
+          <w:p>
+            <w:pPr>
+              <w:spacing w:after="80"/>
+              <w:rPr>
+                <w:sz w:val="20"/>
+                <w:szCs w:val="20"/>
+              </w:rPr>
+            </w:pPr>
+            <w:r>
+              <w:rPr>
+                <w:color w:val="000000"/>
+                <w:sz w:val="20"/>
+                <w:szCs w:val="20"/>
+              </w:rPr>
+              <w:t xml:space="preserve">El código aplica </w:t>
+            </w:r>
+            <w:proofErr w:type="spellStart"/>
+            <w:r>
+              <w:rPr>
+                <w:color w:val="000000"/>
+                <w:sz w:val="20"/>
+                <w:szCs w:val="20"/>
+              </w:rPr>
+              <w:t>Character.toUpperCase</w:t>
+            </w:r>
+            <w:proofErr w:type="spellEnd"/>
+            <w:r>
+              <w:rPr>
+                <w:color w:val="000000"/>
+                <w:sz w:val="20"/>
+                <w:szCs w:val="20"/>
+              </w:rPr>
+              <w:t>() antes de comparar — comportamiento correcto</w:t>
+            </w:r>
+          </w:p>
+        </w:tc>
+      </w:tr>
+    </w:tbl>
     <w:p/>
     <w:p>
       <w:pPr>
@@ -23351,7 +24136,6 @@
             </w:tcMar>
           </w:tcPr>
           <w:p>
-            <w:proofErr w:type="gramStart"/>
             <w:r>
               <w:rPr>
                 <w:b/>
@@ -23360,18 +24144,7 @@
                 <w:sz w:val="20"/>
                 <w:szCs w:val="20"/>
               </w:rPr>
-              <w:t>Total</w:t>
-            </w:r>
-            <w:proofErr w:type="gramEnd"/>
-            <w:r>
-              <w:rPr>
-                <w:b/>
-                <w:bCs/>
-                <w:color w:val="1A1A2E"/>
-                <w:sz w:val="20"/>
-                <w:szCs w:val="20"/>
-              </w:rPr>
-              <w:t xml:space="preserve"> </w:t>
+              <w:t xml:space="preserve">Total </w:t>
             </w:r>
             <w:proofErr w:type="spellStart"/>
             <w:r>
@@ -24875,18 +25648,8 @@
                 <w:iCs/>
                 <w:color w:val="AAAAAA"/>
               </w:rPr>
-              <w:t xml:space="preserve">[ INSERTAR CAPTURA DE PANTALLA DE JUNIT </w:t>
-            </w:r>
-            <w:proofErr w:type="gramStart"/>
-            <w:r>
-              <w:rPr>
-                <w:i/>
-                <w:iCs/>
-                <w:color w:val="AAAAAA"/>
-              </w:rPr>
-              <w:t>AQUÍ ]</w:t>
-            </w:r>
-            <w:proofErr w:type="gramEnd"/>
+              <w:t>[ INSERTAR CAPTURA DE PANTALLA DE JUNIT AQUÍ ]</w:t>
+            </w:r>
           </w:p>
         </w:tc>
       </w:tr>
@@ -24969,25 +25732,7 @@
                 <w:sz w:val="20"/>
                 <w:szCs w:val="20"/>
               </w:rPr>
-              <w:t xml:space="preserve"> Un 'defecto' o 'bug' es cuando el software hace algo diferente a lo que debería. </w:t>
-            </w:r>
-            <w:proofErr w:type="gramStart"/>
-            <w:r>
-              <w:rPr>
-                <w:color w:val="6D4C00"/>
-                <w:sz w:val="20"/>
-                <w:szCs w:val="20"/>
-              </w:rPr>
-              <w:t>Documentadlo</w:t>
-            </w:r>
-            <w:proofErr w:type="gramEnd"/>
-            <w:r>
-              <w:rPr>
-                <w:color w:val="6D4C00"/>
-                <w:sz w:val="20"/>
-                <w:szCs w:val="20"/>
-              </w:rPr>
-              <w:t xml:space="preserve"> aunque lo hayáis corregido.</w:t>
+              <w:t xml:space="preserve"> Un 'defecto' o 'bug' es cuando el software hace algo diferente a lo que debería. Documentadlo aunque lo hayáis corregido.</w:t>
             </w:r>
           </w:p>
         </w:tc>
@@ -25051,25 +25796,7 @@
                 <w:bCs/>
                 <w:color w:val="FFFFFF"/>
               </w:rPr>
-              <w:t>INCIDENCIA IR-</w:t>
-            </w:r>
-            <w:proofErr w:type="gramStart"/>
-            <w:r>
-              <w:rPr>
-                <w:b/>
-                <w:bCs/>
-                <w:color w:val="FFFFFF"/>
-              </w:rPr>
-              <w:t>001  (</w:t>
-            </w:r>
-            <w:proofErr w:type="gramEnd"/>
-            <w:r>
-              <w:rPr>
-                <w:b/>
-                <w:bCs/>
-                <w:color w:val="FFFFFF"/>
-              </w:rPr>
-              <w:t>Ejemplo – reemplazad)</w:t>
+              <w:t>INCIDENCIA IR-001  (Ejemplo – reemplazad)</w:t>
             </w:r>
           </w:p>
         </w:tc>
@@ -27811,7 +28538,6 @@
             </w:tcMar>
           </w:tcPr>
           <w:p>
-            <w:proofErr w:type="gramStart"/>
             <w:r>
               <w:rPr>
                 <w:b/>
@@ -27820,9 +28546,49 @@
                 <w:sz w:val="20"/>
                 <w:szCs w:val="20"/>
               </w:rPr>
-              <w:t>Total</w:t>
-            </w:r>
-            <w:proofErr w:type="gramEnd"/>
+              <w:t>Total de casos de prueba diseñados</w:t>
+            </w:r>
+          </w:p>
+        </w:tc>
+        <w:tc>
+          <w:tcPr>
+            <w:tcW w:w="6638" w:type="dxa"/>
+            <w:tcBorders>
+              <w:top w:val="single" w:sz="1" w:space="0" w:color="CCCCCC"/>
+              <w:left w:val="single" w:sz="1" w:space="0" w:color="CCCCCC"/>
+              <w:bottom w:val="single" w:sz="1" w:space="0" w:color="CCCCCC"/>
+              <w:right w:val="single" w:sz="1" w:space="0" w:color="CCCCCC"/>
+            </w:tcBorders>
+            <w:shd w:val="clear" w:color="auto" w:fill="FFFFFF"/>
+            <w:tcMar>
+              <w:top w:w="80" w:type="dxa"/>
+              <w:left w:w="120" w:type="dxa"/>
+              <w:bottom w:w="80" w:type="dxa"/>
+              <w:right w:w="120" w:type="dxa"/>
+            </w:tcMar>
+          </w:tcPr>
+          <w:p/>
+        </w:tc>
+      </w:tr>
+      <w:tr>
+        <w:tc>
+          <w:tcPr>
+            <w:tcW w:w="3000" w:type="dxa"/>
+            <w:tcBorders>
+              <w:top w:val="single" w:sz="1" w:space="0" w:color="CCCCCC"/>
+              <w:left w:val="single" w:sz="1" w:space="0" w:color="CCCCCC"/>
+              <w:bottom w:val="single" w:sz="1" w:space="0" w:color="CCCCCC"/>
+              <w:right w:val="single" w:sz="1" w:space="0" w:color="CCCCCC"/>
+            </w:tcBorders>
+            <w:shd w:val="clear" w:color="auto" w:fill="D6E4F0"/>
+            <w:tcMar>
+              <w:top w:w="80" w:type="dxa"/>
+              <w:left w:w="120" w:type="dxa"/>
+              <w:bottom w:w="80" w:type="dxa"/>
+              <w:right w:w="120" w:type="dxa"/>
+            </w:tcMar>
+          </w:tcPr>
+          <w:p>
             <w:r>
               <w:rPr>
                 <w:b/>
@@ -27831,70 +28597,7 @@
                 <w:sz w:val="20"/>
                 <w:szCs w:val="20"/>
               </w:rPr>
-              <w:t xml:space="preserve"> de casos de prueba diseñados</w:t>
-            </w:r>
-          </w:p>
-        </w:tc>
-        <w:tc>
-          <w:tcPr>
-            <w:tcW w:w="6638" w:type="dxa"/>
-            <w:tcBorders>
-              <w:top w:val="single" w:sz="1" w:space="0" w:color="CCCCCC"/>
-              <w:left w:val="single" w:sz="1" w:space="0" w:color="CCCCCC"/>
-              <w:bottom w:val="single" w:sz="1" w:space="0" w:color="CCCCCC"/>
-              <w:right w:val="single" w:sz="1" w:space="0" w:color="CCCCCC"/>
-            </w:tcBorders>
-            <w:shd w:val="clear" w:color="auto" w:fill="FFFFFF"/>
-            <w:tcMar>
-              <w:top w:w="80" w:type="dxa"/>
-              <w:left w:w="120" w:type="dxa"/>
-              <w:bottom w:w="80" w:type="dxa"/>
-              <w:right w:w="120" w:type="dxa"/>
-            </w:tcMar>
-          </w:tcPr>
-          <w:p/>
-        </w:tc>
-      </w:tr>
-      <w:tr>
-        <w:tc>
-          <w:tcPr>
-            <w:tcW w:w="3000" w:type="dxa"/>
-            <w:tcBorders>
-              <w:top w:val="single" w:sz="1" w:space="0" w:color="CCCCCC"/>
-              <w:left w:val="single" w:sz="1" w:space="0" w:color="CCCCCC"/>
-              <w:bottom w:val="single" w:sz="1" w:space="0" w:color="CCCCCC"/>
-              <w:right w:val="single" w:sz="1" w:space="0" w:color="CCCCCC"/>
-            </w:tcBorders>
-            <w:shd w:val="clear" w:color="auto" w:fill="D6E4F0"/>
-            <w:tcMar>
-              <w:top w:w="80" w:type="dxa"/>
-              <w:left w:w="120" w:type="dxa"/>
-              <w:bottom w:w="80" w:type="dxa"/>
-              <w:right w:w="120" w:type="dxa"/>
-            </w:tcMar>
-          </w:tcPr>
-          <w:p>
-            <w:proofErr w:type="gramStart"/>
-            <w:r>
-              <w:rPr>
-                <w:b/>
-                <w:bCs/>
-                <w:color w:val="1A1A2E"/>
-                <w:sz w:val="20"/>
-                <w:szCs w:val="20"/>
-              </w:rPr>
-              <w:t>Total</w:t>
-            </w:r>
-            <w:proofErr w:type="gramEnd"/>
-            <w:r>
-              <w:rPr>
-                <w:b/>
-                <w:bCs/>
-                <w:color w:val="1A1A2E"/>
-                <w:sz w:val="20"/>
-                <w:szCs w:val="20"/>
-              </w:rPr>
-              <w:t xml:space="preserve"> de casos de prueba ejecutados</w:t>
+              <w:t>Total de casos de prueba ejecutados</w:t>
             </w:r>
           </w:p>
         </w:tc>
@@ -28541,18 +29244,8 @@
                 <w:color w:val="AAAAAA"/>
               </w:rPr>
               <w:lastRenderedPageBreak/>
-              <w:t xml:space="preserve">[ INSERTAR CAPTURA DEL INFORME JACOCO </w:t>
-            </w:r>
-            <w:proofErr w:type="gramStart"/>
-            <w:r>
-              <w:rPr>
-                <w:i/>
-                <w:iCs/>
-                <w:color w:val="AAAAAA"/>
-              </w:rPr>
-              <w:t>AQUÍ ]</w:t>
-            </w:r>
-            <w:proofErr w:type="gramEnd"/>
+              <w:t>[ INSERTAR CAPTURA DEL INFORME JACOCO AQUÍ ]</w:t>
+            </w:r>
           </w:p>
         </w:tc>
       </w:tr>
@@ -29650,29 +30343,7 @@
               <w:sz w:val="18"/>
               <w:szCs w:val="18"/>
             </w:rPr>
-            <w:t xml:space="preserve">INFORME DE PRUEBAS – ISO/IEC </w:t>
-          </w:r>
-          <w:proofErr w:type="gramStart"/>
-          <w:r>
-            <w:rPr>
-              <w:b/>
-              <w:bCs/>
-              <w:color w:val="1F5C8B"/>
-              <w:sz w:val="18"/>
-              <w:szCs w:val="18"/>
-            </w:rPr>
-            <w:t>29119  |</w:t>
-          </w:r>
-          <w:proofErr w:type="gramEnd"/>
-          <w:r>
-            <w:rPr>
-              <w:b/>
-              <w:bCs/>
-              <w:color w:val="1F5C8B"/>
-              <w:sz w:val="18"/>
-              <w:szCs w:val="18"/>
-            </w:rPr>
-            <w:t xml:space="preserve">  Plantilla Alumno</w:t>
+            <w:t>INFORME DE PRUEBAS – ISO/IEC 29119  |  Plantilla Alumno</w:t>
           </w:r>
         </w:p>
       </w:tc>

</xml_diff>

<commit_message>
docs: completar informe ISO 29119 completo y presentación
</commit_message>
<xml_diff>
--- a/plantilla_iso29119.docx
+++ b/plantilla_iso29119.docx
@@ -23708,6 +23708,58 @@
               </w:drawing>
             </w:r>
           </w:p>
+          <w:p>
+            <w:pPr>
+              <w:spacing w:before="600" w:after="600"/>
+              <w:jc w:val="center"/>
+            </w:pPr>
+            <w:r>
+              <w:t>Tras corregir:</w:t>
+            </w:r>
+          </w:p>
+          <w:p>
+            <w:pPr>
+              <w:spacing w:before="600" w:after="600"/>
+              <w:jc w:val="center"/>
+            </w:pPr>
+            <w:r>
+              <w:drawing>
+                <wp:inline distT="0" distB="0" distL="0" distR="0" wp14:anchorId="2D6DEFFA" wp14:editId="6D9C14E5">
+                  <wp:extent cx="6120130" cy="3679825"/>
+                  <wp:effectExtent l="0" t="0" r="0" b="0"/>
+                  <wp:docPr id="602805762" name="Imagen 1"/>
+                  <wp:cNvGraphicFramePr>
+                    <a:graphicFrameLocks xmlns:a="http://schemas.openxmlformats.org/drawingml/2006/main" noChangeAspect="1"/>
+                  </wp:cNvGraphicFramePr>
+                  <a:graphic xmlns:a="http://schemas.openxmlformats.org/drawingml/2006/main">
+                    <a:graphicData uri="http://schemas.openxmlformats.org/drawingml/2006/picture">
+                      <pic:pic xmlns:pic="http://schemas.openxmlformats.org/drawingml/2006/picture">
+                        <pic:nvPicPr>
+                          <pic:cNvPr id="602805762" name=""/>
+                          <pic:cNvPicPr/>
+                        </pic:nvPicPr>
+                        <pic:blipFill>
+                          <a:blip r:embed="rId9"/>
+                          <a:stretch>
+                            <a:fillRect/>
+                          </a:stretch>
+                        </pic:blipFill>
+                        <pic:spPr>
+                          <a:xfrm>
+                            <a:off x="0" y="0"/>
+                            <a:ext cx="6120130" cy="3679825"/>
+                          </a:xfrm>
+                          <a:prstGeom prst="rect">
+                            <a:avLst/>
+                          </a:prstGeom>
+                        </pic:spPr>
+                      </pic:pic>
+                    </a:graphicData>
+                  </a:graphic>
+                </wp:inline>
+              </w:drawing>
+            </w:r>
+          </w:p>
         </w:tc>
       </w:tr>
     </w:tbl>
@@ -23877,6 +23929,12 @@
             </w:tcMar>
           </w:tcPr>
           <w:p>
+            <w:pPr>
+              <w:rPr>
+                <w:b/>
+                <w:bCs/>
+              </w:rPr>
+            </w:pPr>
             <w:r>
               <w:rPr>
                 <w:b/>
@@ -23893,44 +23951,34 @@
           <w:tcPr>
             <w:tcW w:w="4290" w:type="dxa"/>
             <w:tcBorders>
-              <w:top w:val="single" w:sz="1" w:space="0" w:color="CCCCCC"/>
-              <w:left w:val="single" w:sz="1" w:space="0" w:color="CCCCCC"/>
-              <w:bottom w:val="single" w:sz="1" w:space="0" w:color="CCCCCC"/>
-              <w:right w:val="single" w:sz="1" w:space="0" w:color="CCCCCC"/>
-            </w:tcBorders>
-            <w:shd w:val="clear" w:color="auto" w:fill="FFFFFF"/>
-            <w:tcMar>
-              <w:top w:w="80" w:type="dxa"/>
-              <w:left w:w="120" w:type="dxa"/>
-              <w:bottom w:w="80" w:type="dxa"/>
-              <w:right w:w="120" w:type="dxa"/>
-            </w:tcMar>
-          </w:tcPr>
-          <w:p>
-            <w:pPr>
-              <w:rPr>
-                <w:color w:val="000000" w:themeColor="text1"/>
-              </w:rPr>
-            </w:pPr>
-            <w:r>
-              <w:rPr>
-                <w:i/>
-                <w:iCs/>
-                <w:color w:val="AAAAAA"/>
-                <w:sz w:val="20"/>
-                <w:szCs w:val="20"/>
-              </w:rPr>
-              <w:t>IR-00</w:t>
-            </w:r>
-            <w:r>
-              <w:rPr>
-                <w:i/>
-                <w:iCs/>
-                <w:color w:val="AAAAAA"/>
-                <w:sz w:val="20"/>
-                <w:szCs w:val="20"/>
-              </w:rPr>
-              <w:t>1</w:t>
+              <w:top w:val="single" w:sz="2" w:space="0" w:color="CCCCCC"/>
+              <w:left w:val="single" w:sz="2" w:space="0" w:color="CCCCCC"/>
+              <w:bottom w:val="single" w:sz="2" w:space="0" w:color="CCCCCC"/>
+              <w:right w:val="single" w:sz="2" w:space="0" w:color="CCCCCC"/>
+            </w:tcBorders>
+            <w:tcMar>
+              <w:top w:w="80" w:type="dxa"/>
+              <w:left w:w="120" w:type="dxa"/>
+              <w:bottom w:w="80" w:type="dxa"/>
+              <w:right w:w="120" w:type="dxa"/>
+            </w:tcMar>
+            <w:vAlign w:val="center"/>
+          </w:tcPr>
+          <w:p>
+            <w:pPr>
+              <w:rPr>
+                <w:color w:val="000000" w:themeColor="text1"/>
+                <w:sz w:val="20"/>
+                <w:szCs w:val="20"/>
+              </w:rPr>
+            </w:pPr>
+            <w:r>
+              <w:rPr>
+                <w:color w:val="000000"/>
+                <w:sz w:val="20"/>
+                <w:szCs w:val="20"/>
+              </w:rPr>
+              <w:t>IR-001</w:t>
             </w:r>
           </w:p>
         </w:tc>
@@ -23954,6 +24002,12 @@
             </w:tcMar>
           </w:tcPr>
           <w:p>
+            <w:pPr>
+              <w:rPr>
+                <w:b/>
+                <w:bCs/>
+              </w:rPr>
+            </w:pPr>
             <w:r>
               <w:rPr>
                 <w:b/>
@@ -23970,34 +24024,34 @@
           <w:tcPr>
             <w:tcW w:w="4290" w:type="dxa"/>
             <w:tcBorders>
-              <w:top w:val="single" w:sz="1" w:space="0" w:color="CCCCCC"/>
-              <w:left w:val="single" w:sz="1" w:space="0" w:color="CCCCCC"/>
-              <w:bottom w:val="single" w:sz="1" w:space="0" w:color="CCCCCC"/>
-              <w:right w:val="single" w:sz="1" w:space="0" w:color="CCCCCC"/>
-            </w:tcBorders>
-            <w:shd w:val="clear" w:color="auto" w:fill="FFFFFF"/>
-            <w:tcMar>
-              <w:top w:w="80" w:type="dxa"/>
-              <w:left w:w="120" w:type="dxa"/>
-              <w:bottom w:w="80" w:type="dxa"/>
-              <w:right w:w="120" w:type="dxa"/>
-            </w:tcMar>
-          </w:tcPr>
-          <w:p>
-            <w:pPr>
-              <w:rPr>
-                <w:color w:val="000000" w:themeColor="text1"/>
-              </w:rPr>
-            </w:pPr>
-            <w:r>
-              <w:rPr>
-                <w:i/>
-                <w:iCs/>
-                <w:color w:val="AAAAAA"/>
-                <w:sz w:val="20"/>
-                <w:szCs w:val="20"/>
-              </w:rPr>
-              <w:t>DD/MM/AAAA</w:t>
+              <w:top w:val="single" w:sz="2" w:space="0" w:color="CCCCCC"/>
+              <w:left w:val="single" w:sz="2" w:space="0" w:color="CCCCCC"/>
+              <w:bottom w:val="single" w:sz="2" w:space="0" w:color="CCCCCC"/>
+              <w:right w:val="single" w:sz="2" w:space="0" w:color="CCCCCC"/>
+            </w:tcBorders>
+            <w:tcMar>
+              <w:top w:w="80" w:type="dxa"/>
+              <w:left w:w="120" w:type="dxa"/>
+              <w:bottom w:w="80" w:type="dxa"/>
+              <w:right w:w="120" w:type="dxa"/>
+            </w:tcMar>
+            <w:vAlign w:val="center"/>
+          </w:tcPr>
+          <w:p>
+            <w:pPr>
+              <w:rPr>
+                <w:color w:val="000000" w:themeColor="text1"/>
+                <w:sz w:val="20"/>
+                <w:szCs w:val="20"/>
+              </w:rPr>
+            </w:pPr>
+            <w:r>
+              <w:rPr>
+                <w:color w:val="000000"/>
+                <w:sz w:val="20"/>
+                <w:szCs w:val="20"/>
+              </w:rPr>
+              <w:t>25/05/2026</w:t>
             </w:r>
           </w:p>
         </w:tc>
@@ -24021,6 +24075,12 @@
             </w:tcMar>
           </w:tcPr>
           <w:p>
+            <w:pPr>
+              <w:rPr>
+                <w:b/>
+                <w:bCs/>
+              </w:rPr>
+            </w:pPr>
             <w:r>
               <w:rPr>
                 <w:b/>
@@ -24037,34 +24097,42 @@
           <w:tcPr>
             <w:tcW w:w="4290" w:type="dxa"/>
             <w:tcBorders>
-              <w:top w:val="single" w:sz="1" w:space="0" w:color="CCCCCC"/>
-              <w:left w:val="single" w:sz="1" w:space="0" w:color="CCCCCC"/>
-              <w:bottom w:val="single" w:sz="1" w:space="0" w:color="CCCCCC"/>
-              <w:right w:val="single" w:sz="1" w:space="0" w:color="CCCCCC"/>
-            </w:tcBorders>
-            <w:shd w:val="clear" w:color="auto" w:fill="FFFFFF"/>
-            <w:tcMar>
-              <w:top w:w="80" w:type="dxa"/>
-              <w:left w:w="120" w:type="dxa"/>
-              <w:bottom w:w="80" w:type="dxa"/>
-              <w:right w:w="120" w:type="dxa"/>
-            </w:tcMar>
-          </w:tcPr>
-          <w:p>
-            <w:pPr>
-              <w:rPr>
-                <w:color w:val="000000" w:themeColor="text1"/>
-              </w:rPr>
-            </w:pPr>
-            <w:r>
-              <w:rPr>
-                <w:i/>
-                <w:iCs/>
-                <w:color w:val="AAAAAA"/>
-                <w:sz w:val="20"/>
-                <w:szCs w:val="20"/>
-              </w:rPr>
-              <w:t>TC-XXX</w:t>
+              <w:top w:val="single" w:sz="2" w:space="0" w:color="CCCCCC"/>
+              <w:left w:val="single" w:sz="2" w:space="0" w:color="CCCCCC"/>
+              <w:bottom w:val="single" w:sz="2" w:space="0" w:color="CCCCCC"/>
+              <w:right w:val="single" w:sz="2" w:space="0" w:color="CCCCCC"/>
+            </w:tcBorders>
+            <w:tcMar>
+              <w:top w:w="80" w:type="dxa"/>
+              <w:left w:w="120" w:type="dxa"/>
+              <w:bottom w:w="80" w:type="dxa"/>
+              <w:right w:w="120" w:type="dxa"/>
+            </w:tcMar>
+            <w:vAlign w:val="center"/>
+          </w:tcPr>
+          <w:p>
+            <w:pPr>
+              <w:rPr>
+                <w:color w:val="000000" w:themeColor="text1"/>
+                <w:sz w:val="20"/>
+                <w:szCs w:val="20"/>
+              </w:rPr>
+            </w:pPr>
+            <w:r>
+              <w:rPr>
+                <w:color w:val="000000"/>
+                <w:sz w:val="20"/>
+                <w:szCs w:val="20"/>
+              </w:rPr>
+              <w:t xml:space="preserve">TC-005 </w:t>
+            </w:r>
+            <w:r>
+              <w:rPr>
+                <w:color w:val="000000"/>
+                <w:sz w:val="20"/>
+                <w:szCs w:val="20"/>
+              </w:rPr>
+              <w:t>- 008</w:t>
             </w:r>
           </w:p>
         </w:tc>
@@ -24088,6 +24156,12 @@
             </w:tcMar>
           </w:tcPr>
           <w:p>
+            <w:pPr>
+              <w:rPr>
+                <w:b/>
+                <w:bCs/>
+              </w:rPr>
+            </w:pPr>
             <w:r>
               <w:rPr>
                 <w:b/>
@@ -24104,34 +24178,34 @@
           <w:tcPr>
             <w:tcW w:w="4290" w:type="dxa"/>
             <w:tcBorders>
-              <w:top w:val="single" w:sz="1" w:space="0" w:color="CCCCCC"/>
-              <w:left w:val="single" w:sz="1" w:space="0" w:color="CCCCCC"/>
-              <w:bottom w:val="single" w:sz="1" w:space="0" w:color="CCCCCC"/>
-              <w:right w:val="single" w:sz="1" w:space="0" w:color="CCCCCC"/>
-            </w:tcBorders>
-            <w:shd w:val="clear" w:color="auto" w:fill="FFFFFF"/>
-            <w:tcMar>
-              <w:top w:w="80" w:type="dxa"/>
-              <w:left w:w="120" w:type="dxa"/>
-              <w:bottom w:w="80" w:type="dxa"/>
-              <w:right w:w="120" w:type="dxa"/>
-            </w:tcMar>
-          </w:tcPr>
-          <w:p>
-            <w:pPr>
-              <w:rPr>
-                <w:color w:val="000000" w:themeColor="text1"/>
-              </w:rPr>
-            </w:pPr>
-            <w:r>
-              <w:rPr>
-                <w:i/>
-                <w:iCs/>
-                <w:color w:val="AAAAAA"/>
-                <w:sz w:val="20"/>
-                <w:szCs w:val="20"/>
-              </w:rPr>
-              <w:t>Ej: Calculadora.maximo()</w:t>
+              <w:top w:val="single" w:sz="2" w:space="0" w:color="CCCCCC"/>
+              <w:left w:val="single" w:sz="2" w:space="0" w:color="CCCCCC"/>
+              <w:bottom w:val="single" w:sz="2" w:space="0" w:color="CCCCCC"/>
+              <w:right w:val="single" w:sz="2" w:space="0" w:color="CCCCCC"/>
+            </w:tcBorders>
+            <w:tcMar>
+              <w:top w:w="80" w:type="dxa"/>
+              <w:left w:w="120" w:type="dxa"/>
+              <w:bottom w:w="80" w:type="dxa"/>
+              <w:right w:w="120" w:type="dxa"/>
+            </w:tcMar>
+            <w:vAlign w:val="center"/>
+          </w:tcPr>
+          <w:p>
+            <w:pPr>
+              <w:rPr>
+                <w:color w:val="000000" w:themeColor="text1"/>
+                <w:sz w:val="20"/>
+                <w:szCs w:val="20"/>
+              </w:rPr>
+            </w:pPr>
+            <w:r>
+              <w:rPr>
+                <w:color w:val="000000"/>
+                <w:sz w:val="20"/>
+                <w:szCs w:val="20"/>
+              </w:rPr>
+              <w:t>ValidadorFormulario.validarEmail(String email)</w:t>
             </w:r>
           </w:p>
         </w:tc>
@@ -24155,6 +24229,12 @@
             </w:tcMar>
           </w:tcPr>
           <w:p>
+            <w:pPr>
+              <w:rPr>
+                <w:b/>
+                <w:bCs/>
+              </w:rPr>
+            </w:pPr>
             <w:r>
               <w:rPr>
                 <w:b/>
@@ -24171,34 +24251,82 @@
           <w:tcPr>
             <w:tcW w:w="4290" w:type="dxa"/>
             <w:tcBorders>
-              <w:top w:val="single" w:sz="1" w:space="0" w:color="CCCCCC"/>
-              <w:left w:val="single" w:sz="1" w:space="0" w:color="CCCCCC"/>
-              <w:bottom w:val="single" w:sz="1" w:space="0" w:color="CCCCCC"/>
-              <w:right w:val="single" w:sz="1" w:space="0" w:color="CCCCCC"/>
-            </w:tcBorders>
-            <w:shd w:val="clear" w:color="auto" w:fill="FFFFFF"/>
-            <w:tcMar>
-              <w:top w:w="80" w:type="dxa"/>
-              <w:left w:w="120" w:type="dxa"/>
-              <w:bottom w:w="80" w:type="dxa"/>
-              <w:right w:w="120" w:type="dxa"/>
-            </w:tcMar>
-          </w:tcPr>
-          <w:p>
-            <w:pPr>
-              <w:rPr>
-                <w:color w:val="000000" w:themeColor="text1"/>
-              </w:rPr>
-            </w:pPr>
-            <w:r>
-              <w:rPr>
-                <w:i/>
-                <w:iCs/>
-                <w:color w:val="AAAAAA"/>
-                <w:sz w:val="20"/>
-                <w:szCs w:val="20"/>
-              </w:rPr>
-              <w:t>Qué hace mal el código: describid el comportamiento real vs el esperado</w:t>
+              <w:top w:val="single" w:sz="2" w:space="0" w:color="CCCCCC"/>
+              <w:left w:val="single" w:sz="2" w:space="0" w:color="CCCCCC"/>
+              <w:bottom w:val="single" w:sz="2" w:space="0" w:color="CCCCCC"/>
+              <w:right w:val="single" w:sz="2" w:space="0" w:color="CCCCCC"/>
+            </w:tcBorders>
+            <w:tcMar>
+              <w:top w:w="80" w:type="dxa"/>
+              <w:left w:w="120" w:type="dxa"/>
+              <w:bottom w:w="80" w:type="dxa"/>
+              <w:right w:w="120" w:type="dxa"/>
+            </w:tcMar>
+            <w:vAlign w:val="center"/>
+          </w:tcPr>
+          <w:p>
+            <w:pPr>
+              <w:rPr>
+                <w:sz w:val="20"/>
+                <w:szCs w:val="20"/>
+              </w:rPr>
+            </w:pPr>
+            <w:r>
+              <w:rPr>
+                <w:color w:val="000000"/>
+                <w:sz w:val="20"/>
+                <w:szCs w:val="20"/>
+              </w:rPr>
+              <w:t>Comportamiento real: el método devuelve true para cualquier cadena que contenga el carácter '@', independientemente de si tiene un dominio válido o un punto tras el '@'.</w:t>
+            </w:r>
+          </w:p>
+          <w:p>
+            <w:pPr>
+              <w:rPr>
+                <w:sz w:val="20"/>
+                <w:szCs w:val="20"/>
+              </w:rPr>
+            </w:pPr>
+          </w:p>
+          <w:p>
+            <w:pPr>
+              <w:rPr>
+                <w:sz w:val="20"/>
+                <w:szCs w:val="20"/>
+              </w:rPr>
+            </w:pPr>
+            <w:r>
+              <w:rPr>
+                <w:color w:val="000000"/>
+                <w:sz w:val="20"/>
+                <w:szCs w:val="20"/>
+              </w:rPr>
+              <w:t>Comportamiento esperado: solo debería devolver true si el email tiene el formato correcto (parte local + '@' + dominio + '.' + extensión), por ejemplo 'usuario@gmail.com'.</w:t>
+            </w:r>
+          </w:p>
+          <w:p>
+            <w:pPr>
+              <w:rPr>
+                <w:sz w:val="20"/>
+                <w:szCs w:val="20"/>
+              </w:rPr>
+            </w:pPr>
+          </w:p>
+          <w:p>
+            <w:pPr>
+              <w:rPr>
+                <w:color w:val="000000" w:themeColor="text1"/>
+                <w:sz w:val="20"/>
+                <w:szCs w:val="20"/>
+              </w:rPr>
+            </w:pPr>
+            <w:r>
+              <w:rPr>
+                <w:color w:val="000000"/>
+                <w:sz w:val="20"/>
+                <w:szCs w:val="20"/>
+              </w:rPr>
+              <w:t>Ejemplos que el código acepta incorrectamente: 'usuario@', '@dominio.com', '@', 'a@b@c'.</w:t>
             </w:r>
           </w:p>
         </w:tc>
@@ -24222,6 +24350,12 @@
             </w:tcMar>
           </w:tcPr>
           <w:p>
+            <w:pPr>
+              <w:rPr>
+                <w:b/>
+                <w:bCs/>
+              </w:rPr>
+            </w:pPr>
             <w:r>
               <w:rPr>
                 <w:b/>
@@ -24238,34 +24372,34 @@
           <w:tcPr>
             <w:tcW w:w="4290" w:type="dxa"/>
             <w:tcBorders>
-              <w:top w:val="single" w:sz="1" w:space="0" w:color="CCCCCC"/>
-              <w:left w:val="single" w:sz="1" w:space="0" w:color="CCCCCC"/>
-              <w:bottom w:val="single" w:sz="1" w:space="0" w:color="CCCCCC"/>
-              <w:right w:val="single" w:sz="1" w:space="0" w:color="CCCCCC"/>
-            </w:tcBorders>
-            <w:shd w:val="clear" w:color="auto" w:fill="FFFFFF"/>
-            <w:tcMar>
-              <w:top w:w="80" w:type="dxa"/>
-              <w:left w:w="120" w:type="dxa"/>
-              <w:bottom w:w="80" w:type="dxa"/>
-              <w:right w:w="120" w:type="dxa"/>
-            </w:tcMar>
-          </w:tcPr>
-          <w:p>
-            <w:pPr>
-              <w:rPr>
-                <w:color w:val="000000" w:themeColor="text1"/>
-              </w:rPr>
-            </w:pPr>
-            <w:r>
-              <w:rPr>
-                <w:i/>
-                <w:iCs/>
-                <w:color w:val="AAAAAA"/>
-                <w:sz w:val="20"/>
-                <w:szCs w:val="20"/>
-              </w:rPr>
-              <w:t>Crítica / Alta / Media / Baja</w:t>
+              <w:top w:val="single" w:sz="2" w:space="0" w:color="CCCCCC"/>
+              <w:left w:val="single" w:sz="2" w:space="0" w:color="CCCCCC"/>
+              <w:bottom w:val="single" w:sz="2" w:space="0" w:color="CCCCCC"/>
+              <w:right w:val="single" w:sz="2" w:space="0" w:color="CCCCCC"/>
+            </w:tcBorders>
+            <w:tcMar>
+              <w:top w:w="80" w:type="dxa"/>
+              <w:left w:w="120" w:type="dxa"/>
+              <w:bottom w:w="80" w:type="dxa"/>
+              <w:right w:w="120" w:type="dxa"/>
+            </w:tcMar>
+            <w:vAlign w:val="center"/>
+          </w:tcPr>
+          <w:p>
+            <w:pPr>
+              <w:rPr>
+                <w:color w:val="000000" w:themeColor="text1"/>
+                <w:sz w:val="20"/>
+                <w:szCs w:val="20"/>
+              </w:rPr>
+            </w:pPr>
+            <w:r>
+              <w:rPr>
+                <w:color w:val="000000"/>
+                <w:sz w:val="20"/>
+                <w:szCs w:val="20"/>
+              </w:rPr>
+              <w:t>Alta — en un sistema real permitiría registrar usuarios con emails inválidos</w:t>
             </w:r>
           </w:p>
         </w:tc>
@@ -24289,6 +24423,12 @@
             </w:tcMar>
           </w:tcPr>
           <w:p>
+            <w:pPr>
+              <w:rPr>
+                <w:b/>
+                <w:bCs/>
+              </w:rPr>
+            </w:pPr>
             <w:r>
               <w:rPr>
                 <w:b/>
@@ -24305,34 +24445,34 @@
           <w:tcPr>
             <w:tcW w:w="4290" w:type="dxa"/>
             <w:tcBorders>
-              <w:top w:val="single" w:sz="1" w:space="0" w:color="CCCCCC"/>
-              <w:left w:val="single" w:sz="1" w:space="0" w:color="CCCCCC"/>
-              <w:bottom w:val="single" w:sz="1" w:space="0" w:color="CCCCCC"/>
-              <w:right w:val="single" w:sz="1" w:space="0" w:color="CCCCCC"/>
-            </w:tcBorders>
-            <w:shd w:val="clear" w:color="auto" w:fill="FFFFFF"/>
-            <w:tcMar>
-              <w:top w:w="80" w:type="dxa"/>
-              <w:left w:w="120" w:type="dxa"/>
-              <w:bottom w:w="80" w:type="dxa"/>
-              <w:right w:w="120" w:type="dxa"/>
-            </w:tcMar>
-          </w:tcPr>
-          <w:p>
-            <w:pPr>
-              <w:rPr>
-                <w:color w:val="000000" w:themeColor="text1"/>
-              </w:rPr>
-            </w:pPr>
-            <w:r>
-              <w:rPr>
-                <w:i/>
-                <w:iCs/>
-                <w:color w:val="AAAAAA"/>
-                <w:sz w:val="20"/>
-                <w:szCs w:val="20"/>
-              </w:rPr>
-              <w:t>Alta / Media / Baja</w:t>
+              <w:top w:val="single" w:sz="2" w:space="0" w:color="CCCCCC"/>
+              <w:left w:val="single" w:sz="2" w:space="0" w:color="CCCCCC"/>
+              <w:bottom w:val="single" w:sz="2" w:space="0" w:color="CCCCCC"/>
+              <w:right w:val="single" w:sz="2" w:space="0" w:color="CCCCCC"/>
+            </w:tcBorders>
+            <w:tcMar>
+              <w:top w:w="80" w:type="dxa"/>
+              <w:left w:w="120" w:type="dxa"/>
+              <w:bottom w:w="80" w:type="dxa"/>
+              <w:right w:w="120" w:type="dxa"/>
+            </w:tcMar>
+            <w:vAlign w:val="center"/>
+          </w:tcPr>
+          <w:p>
+            <w:pPr>
+              <w:rPr>
+                <w:color w:val="000000" w:themeColor="text1"/>
+                <w:sz w:val="20"/>
+                <w:szCs w:val="20"/>
+              </w:rPr>
+            </w:pPr>
+            <w:r>
+              <w:rPr>
+                <w:color w:val="000000"/>
+                <w:sz w:val="20"/>
+                <w:szCs w:val="20"/>
+              </w:rPr>
+              <w:t>Alta</w:t>
             </w:r>
           </w:p>
         </w:tc>
@@ -24356,6 +24496,12 @@
             </w:tcMar>
           </w:tcPr>
           <w:p>
+            <w:pPr>
+              <w:rPr>
+                <w:b/>
+                <w:bCs/>
+              </w:rPr>
+            </w:pPr>
             <w:r>
               <w:rPr>
                 <w:b/>
@@ -24372,34 +24518,34 @@
           <w:tcPr>
             <w:tcW w:w="4290" w:type="dxa"/>
             <w:tcBorders>
-              <w:top w:val="single" w:sz="1" w:space="0" w:color="CCCCCC"/>
-              <w:left w:val="single" w:sz="1" w:space="0" w:color="CCCCCC"/>
-              <w:bottom w:val="single" w:sz="1" w:space="0" w:color="CCCCCC"/>
-              <w:right w:val="single" w:sz="1" w:space="0" w:color="CCCCCC"/>
-            </w:tcBorders>
-            <w:shd w:val="clear" w:color="auto" w:fill="FFFFFF"/>
-            <w:tcMar>
-              <w:top w:w="80" w:type="dxa"/>
-              <w:left w:w="120" w:type="dxa"/>
-              <w:bottom w:w="80" w:type="dxa"/>
-              <w:right w:w="120" w:type="dxa"/>
-            </w:tcMar>
-          </w:tcPr>
-          <w:p>
-            <w:pPr>
-              <w:rPr>
-                <w:color w:val="000000" w:themeColor="text1"/>
-              </w:rPr>
-            </w:pPr>
-            <w:r>
-              <w:rPr>
-                <w:i/>
-                <w:iCs/>
-                <w:color w:val="AAAAAA"/>
-                <w:sz w:val="20"/>
-                <w:szCs w:val="20"/>
-              </w:rPr>
-              <w:t>Sí / No</w:t>
+              <w:top w:val="single" w:sz="2" w:space="0" w:color="CCCCCC"/>
+              <w:left w:val="single" w:sz="2" w:space="0" w:color="CCCCCC"/>
+              <w:bottom w:val="single" w:sz="2" w:space="0" w:color="CCCCCC"/>
+              <w:right w:val="single" w:sz="2" w:space="0" w:color="CCCCCC"/>
+            </w:tcBorders>
+            <w:tcMar>
+              <w:top w:w="80" w:type="dxa"/>
+              <w:left w:w="120" w:type="dxa"/>
+              <w:bottom w:w="80" w:type="dxa"/>
+              <w:right w:w="120" w:type="dxa"/>
+            </w:tcMar>
+            <w:vAlign w:val="center"/>
+          </w:tcPr>
+          <w:p>
+            <w:pPr>
+              <w:rPr>
+                <w:color w:val="000000" w:themeColor="text1"/>
+                <w:sz w:val="20"/>
+                <w:szCs w:val="20"/>
+              </w:rPr>
+            </w:pPr>
+            <w:r>
+              <w:rPr>
+                <w:color w:val="000000"/>
+                <w:sz w:val="20"/>
+                <w:szCs w:val="20"/>
+              </w:rPr>
+              <w:t>Sí, siempre. Cualquier cadena con '@' pasa la validación.</w:t>
             </w:r>
           </w:p>
         </w:tc>
@@ -24423,6 +24569,12 @@
             </w:tcMar>
           </w:tcPr>
           <w:p>
+            <w:pPr>
+              <w:rPr>
+                <w:b/>
+                <w:bCs/>
+              </w:rPr>
+            </w:pPr>
             <w:r>
               <w:rPr>
                 <w:b/>
@@ -24439,34 +24591,34 @@
           <w:tcPr>
             <w:tcW w:w="4290" w:type="dxa"/>
             <w:tcBorders>
-              <w:top w:val="single" w:sz="1" w:space="0" w:color="CCCCCC"/>
-              <w:left w:val="single" w:sz="1" w:space="0" w:color="CCCCCC"/>
-              <w:bottom w:val="single" w:sz="1" w:space="0" w:color="CCCCCC"/>
-              <w:right w:val="single" w:sz="1" w:space="0" w:color="CCCCCC"/>
-            </w:tcBorders>
-            <w:shd w:val="clear" w:color="auto" w:fill="FFFFFF"/>
-            <w:tcMar>
-              <w:top w:w="80" w:type="dxa"/>
-              <w:left w:w="120" w:type="dxa"/>
-              <w:bottom w:w="80" w:type="dxa"/>
-              <w:right w:w="120" w:type="dxa"/>
-            </w:tcMar>
-          </w:tcPr>
-          <w:p>
-            <w:pPr>
-              <w:rPr>
-                <w:color w:val="000000" w:themeColor="text1"/>
-              </w:rPr>
-            </w:pPr>
-            <w:r>
-              <w:rPr>
-                <w:i/>
-                <w:iCs/>
-                <w:color w:val="AAAAAA"/>
-                <w:sz w:val="20"/>
-                <w:szCs w:val="20"/>
-              </w:rPr>
-              <w:t>Abierto / Corregido / Descartado</w:t>
+              <w:top w:val="single" w:sz="2" w:space="0" w:color="CCCCCC"/>
+              <w:left w:val="single" w:sz="2" w:space="0" w:color="CCCCCC"/>
+              <w:bottom w:val="single" w:sz="2" w:space="0" w:color="CCCCCC"/>
+              <w:right w:val="single" w:sz="2" w:space="0" w:color="CCCCCC"/>
+            </w:tcBorders>
+            <w:tcMar>
+              <w:top w:w="80" w:type="dxa"/>
+              <w:left w:w="120" w:type="dxa"/>
+              <w:bottom w:w="80" w:type="dxa"/>
+              <w:right w:w="120" w:type="dxa"/>
+            </w:tcMar>
+            <w:vAlign w:val="center"/>
+          </w:tcPr>
+          <w:p>
+            <w:pPr>
+              <w:rPr>
+                <w:color w:val="000000" w:themeColor="text1"/>
+                <w:sz w:val="20"/>
+                <w:szCs w:val="20"/>
+              </w:rPr>
+            </w:pPr>
+            <w:r>
+              <w:rPr>
+                <w:color w:val="000000" w:themeColor="text1"/>
+                <w:sz w:val="20"/>
+                <w:szCs w:val="20"/>
+              </w:rPr>
+              <w:t>Corregido</w:t>
             </w:r>
           </w:p>
         </w:tc>
@@ -24490,6 +24642,12 @@
             </w:tcMar>
           </w:tcPr>
           <w:p>
+            <w:pPr>
+              <w:rPr>
+                <w:b/>
+                <w:bCs/>
+              </w:rPr>
+            </w:pPr>
             <w:r>
               <w:rPr>
                 <w:b/>
@@ -24506,34 +24664,90 @@
           <w:tcPr>
             <w:tcW w:w="4290" w:type="dxa"/>
             <w:tcBorders>
-              <w:top w:val="single" w:sz="1" w:space="0" w:color="CCCCCC"/>
-              <w:left w:val="single" w:sz="1" w:space="0" w:color="CCCCCC"/>
-              <w:bottom w:val="single" w:sz="1" w:space="0" w:color="CCCCCC"/>
-              <w:right w:val="single" w:sz="1" w:space="0" w:color="CCCCCC"/>
-            </w:tcBorders>
-            <w:shd w:val="clear" w:color="auto" w:fill="FFFFFF"/>
-            <w:tcMar>
-              <w:top w:w="80" w:type="dxa"/>
-              <w:left w:w="120" w:type="dxa"/>
-              <w:bottom w:w="80" w:type="dxa"/>
-              <w:right w:w="120" w:type="dxa"/>
-            </w:tcMar>
-          </w:tcPr>
-          <w:p>
-            <w:pPr>
-              <w:rPr>
-                <w:color w:val="000000" w:themeColor="text1"/>
-              </w:rPr>
-            </w:pPr>
-            <w:r>
-              <w:rPr>
-                <w:i/>
-                <w:iCs/>
-                <w:color w:val="AAAAAA"/>
-                <w:sz w:val="20"/>
-                <w:szCs w:val="20"/>
-              </w:rPr>
-              <w:t>Si lo corregisteis: describid qué cambiasteis en el código. Si no: explicad por qué no.</w:t>
+              <w:top w:val="single" w:sz="2" w:space="0" w:color="CCCCCC"/>
+              <w:left w:val="single" w:sz="2" w:space="0" w:color="CCCCCC"/>
+              <w:bottom w:val="single" w:sz="2" w:space="0" w:color="CCCCCC"/>
+              <w:right w:val="single" w:sz="2" w:space="0" w:color="CCCCCC"/>
+            </w:tcBorders>
+            <w:tcMar>
+              <w:top w:w="80" w:type="dxa"/>
+              <w:left w:w="120" w:type="dxa"/>
+              <w:bottom w:w="80" w:type="dxa"/>
+              <w:right w:w="120" w:type="dxa"/>
+            </w:tcMar>
+            <w:vAlign w:val="center"/>
+          </w:tcPr>
+          <w:p>
+            <w:pPr>
+              <w:rPr>
+                <w:sz w:val="20"/>
+                <w:szCs w:val="20"/>
+              </w:rPr>
+            </w:pPr>
+            <w:r>
+              <w:rPr>
+                <w:color w:val="000000"/>
+                <w:sz w:val="20"/>
+                <w:szCs w:val="20"/>
+              </w:rPr>
+              <w:t>Sustituir la línea:</w:t>
+            </w:r>
+          </w:p>
+          <w:p>
+            <w:pPr>
+              <w:rPr>
+                <w:sz w:val="20"/>
+                <w:szCs w:val="20"/>
+              </w:rPr>
+            </w:pPr>
+            <w:r>
+              <w:rPr>
+                <w:color w:val="000000"/>
+                <w:sz w:val="20"/>
+                <w:szCs w:val="20"/>
+              </w:rPr>
+              <w:t xml:space="preserve">    return email.contains("@");</w:t>
+            </w:r>
+          </w:p>
+          <w:p>
+            <w:pPr>
+              <w:rPr>
+                <w:sz w:val="20"/>
+                <w:szCs w:val="20"/>
+              </w:rPr>
+            </w:pPr>
+          </w:p>
+          <w:p>
+            <w:pPr>
+              <w:rPr>
+                <w:sz w:val="20"/>
+                <w:szCs w:val="20"/>
+              </w:rPr>
+            </w:pPr>
+            <w:r>
+              <w:rPr>
+                <w:color w:val="000000"/>
+                <w:sz w:val="20"/>
+                <w:szCs w:val="20"/>
+              </w:rPr>
+              <w:t>por una validación con regex:</w:t>
+            </w:r>
+          </w:p>
+          <w:p>
+            <w:pPr>
+              <w:rPr>
+                <w:color w:val="000000" w:themeColor="text1"/>
+                <w:sz w:val="20"/>
+                <w:szCs w:val="20"/>
+              </w:rPr>
+            </w:pPr>
+            <w:r>
+              <w:rPr>
+                <w:color w:val="000000"/>
+                <w:sz w:val="20"/>
+                <w:szCs w:val="20"/>
+              </w:rPr>
+              <w:t xml:space="preserve">    return email.matches("^[\\w._%+\\-]+@[\\w.\\-]+\\.[a-zA-Z]{2,}$");</w:t>
             </w:r>
           </w:p>
         </w:tc>
@@ -24557,6 +24771,12 @@
             </w:tcMar>
           </w:tcPr>
           <w:p>
+            <w:pPr>
+              <w:rPr>
+                <w:b/>
+                <w:bCs/>
+              </w:rPr>
+            </w:pPr>
             <w:r>
               <w:rPr>
                 <w:b/>
@@ -24573,34 +24793,42 @@
           <w:tcPr>
             <w:tcW w:w="4290" w:type="dxa"/>
             <w:tcBorders>
-              <w:top w:val="single" w:sz="1" w:space="0" w:color="CCCCCC"/>
-              <w:left w:val="single" w:sz="1" w:space="0" w:color="CCCCCC"/>
-              <w:bottom w:val="single" w:sz="1" w:space="0" w:color="CCCCCC"/>
-              <w:right w:val="single" w:sz="1" w:space="0" w:color="CCCCCC"/>
-            </w:tcBorders>
-            <w:shd w:val="clear" w:color="auto" w:fill="FFFFFF"/>
-            <w:tcMar>
-              <w:top w:w="80" w:type="dxa"/>
-              <w:left w:w="120" w:type="dxa"/>
-              <w:bottom w:w="80" w:type="dxa"/>
-              <w:right w:w="120" w:type="dxa"/>
-            </w:tcMar>
-          </w:tcPr>
-          <w:p>
-            <w:pPr>
-              <w:rPr>
-                <w:color w:val="000000" w:themeColor="text1"/>
-              </w:rPr>
-            </w:pPr>
-            <w:r>
-              <w:rPr>
-                <w:i/>
-                <w:iCs/>
-                <w:color w:val="AAAAAA"/>
-                <w:sz w:val="20"/>
-                <w:szCs w:val="20"/>
-              </w:rPr>
-              <w:t>SHA del commit con el fix (si lo hay)</w:t>
+              <w:top w:val="single" w:sz="2" w:space="0" w:color="CCCCCC"/>
+              <w:left w:val="single" w:sz="2" w:space="0" w:color="CCCCCC"/>
+              <w:bottom w:val="single" w:sz="2" w:space="0" w:color="CCCCCC"/>
+              <w:right w:val="single" w:sz="2" w:space="0" w:color="CCCCCC"/>
+            </w:tcBorders>
+            <w:tcMar>
+              <w:top w:w="80" w:type="dxa"/>
+              <w:left w:w="120" w:type="dxa"/>
+              <w:bottom w:w="80" w:type="dxa"/>
+              <w:right w:w="120" w:type="dxa"/>
+            </w:tcMar>
+            <w:vAlign w:val="center"/>
+          </w:tcPr>
+          <w:p>
+            <w:pPr>
+              <w:rPr>
+                <w:color w:val="000000" w:themeColor="text1"/>
+                <w:sz w:val="20"/>
+                <w:szCs w:val="20"/>
+              </w:rPr>
+            </w:pPr>
+            <w:r>
+              <w:rPr>
+                <w:color w:val="000000"/>
+                <w:sz w:val="20"/>
+                <w:szCs w:val="20"/>
+              </w:rPr>
+              <w:t>a</w:t>
+            </w:r>
+            <w:r>
+              <w:rPr>
+                <w:color w:val="000000"/>
+                <w:sz w:val="20"/>
+                <w:szCs w:val="20"/>
+              </w:rPr>
+              <w:t>9fad91</w:t>
             </w:r>
           </w:p>
         </w:tc>
@@ -24609,8 +24837,16 @@
     <w:p>
       <w:pPr>
         <w:spacing w:before="60" w:after="60"/>
+        <w:rPr>
+          <w:b/>
+          <w:bCs/>
+        </w:rPr>
       </w:pPr>
       <w:r>
+        <w:rPr>
+          <w:b/>
+          <w:bCs/>
+        </w:rPr>
         <w:t xml:space="preserve"> </w:t>
       </w:r>
     </w:p>
@@ -24638,11 +24874,11 @@
       <w:tr>
         <w:trPr>
           <w:gridAfter w:val="1"/>
-          <w:wAfter w:w="6638" w:type="dxa"/>
+          <w:wAfter w:w="4290" w:type="dxa"/>
         </w:trPr>
         <w:tc>
           <w:tcPr>
-            <w:tcW w:w="9638" w:type="dxa"/>
+            <w:tcW w:w="5348" w:type="dxa"/>
             <w:tcBorders>
               <w:top w:val="single" w:sz="1" w:space="0" w:color="CCCCCC"/>
               <w:left w:val="single" w:sz="1" w:space="0" w:color="CCCCCC"/>
@@ -24672,7 +24908,7 @@
       <w:tr>
         <w:tc>
           <w:tcPr>
-            <w:tcW w:w="3000" w:type="dxa"/>
+            <w:tcW w:w="5348" w:type="dxa"/>
             <w:tcBorders>
               <w:top w:val="single" w:sz="1" w:space="0" w:color="CCCCCC"/>
               <w:left w:val="single" w:sz="1" w:space="0" w:color="CCCCCC"/>
@@ -24702,27 +24938,31 @@
         </w:tc>
         <w:tc>
           <w:tcPr>
-            <w:tcW w:w="6638" w:type="dxa"/>
-            <w:tcBorders>
-              <w:top w:val="single" w:sz="1" w:space="0" w:color="CCCCCC"/>
-              <w:left w:val="single" w:sz="1" w:space="0" w:color="CCCCCC"/>
-              <w:bottom w:val="single" w:sz="1" w:space="0" w:color="CCCCCC"/>
-              <w:right w:val="single" w:sz="1" w:space="0" w:color="CCCCCC"/>
-            </w:tcBorders>
-            <w:shd w:val="clear" w:color="auto" w:fill="FFFFFF"/>
-            <w:tcMar>
-              <w:top w:w="80" w:type="dxa"/>
-              <w:left w:w="120" w:type="dxa"/>
-              <w:bottom w:w="80" w:type="dxa"/>
-              <w:right w:w="120" w:type="dxa"/>
-            </w:tcMar>
-          </w:tcPr>
-          <w:p>
-            <w:r>
-              <w:rPr>
-                <w:i/>
-                <w:iCs/>
-                <w:color w:val="AAAAAA"/>
+            <w:tcW w:w="4290" w:type="dxa"/>
+            <w:tcBorders>
+              <w:top w:val="single" w:sz="2" w:space="0" w:color="CCCCCC"/>
+              <w:left w:val="single" w:sz="2" w:space="0" w:color="CCCCCC"/>
+              <w:bottom w:val="single" w:sz="2" w:space="0" w:color="CCCCCC"/>
+              <w:right w:val="single" w:sz="2" w:space="0" w:color="CCCCCC"/>
+            </w:tcBorders>
+            <w:tcMar>
+              <w:top w:w="80" w:type="dxa"/>
+              <w:left w:w="120" w:type="dxa"/>
+              <w:bottom w:w="80" w:type="dxa"/>
+              <w:right w:w="120" w:type="dxa"/>
+            </w:tcMar>
+            <w:vAlign w:val="center"/>
+          </w:tcPr>
+          <w:p>
+            <w:pPr>
+              <w:rPr>
+                <w:sz w:val="20"/>
+                <w:szCs w:val="20"/>
+              </w:rPr>
+            </w:pPr>
+            <w:r>
+              <w:rPr>
+                <w:color w:val="000000"/>
                 <w:sz w:val="20"/>
                 <w:szCs w:val="20"/>
               </w:rPr>
@@ -24734,7 +24974,7 @@
       <w:tr>
         <w:tc>
           <w:tcPr>
-            <w:tcW w:w="3000" w:type="dxa"/>
+            <w:tcW w:w="5348" w:type="dxa"/>
             <w:tcBorders>
               <w:top w:val="single" w:sz="1" w:space="0" w:color="CCCCCC"/>
               <w:left w:val="single" w:sz="1" w:space="0" w:color="CCCCCC"/>
@@ -24764,39 +25004,43 @@
         </w:tc>
         <w:tc>
           <w:tcPr>
-            <w:tcW w:w="6638" w:type="dxa"/>
-            <w:tcBorders>
-              <w:top w:val="single" w:sz="1" w:space="0" w:color="CCCCCC"/>
-              <w:left w:val="single" w:sz="1" w:space="0" w:color="CCCCCC"/>
-              <w:bottom w:val="single" w:sz="1" w:space="0" w:color="CCCCCC"/>
-              <w:right w:val="single" w:sz="1" w:space="0" w:color="CCCCCC"/>
-            </w:tcBorders>
-            <w:shd w:val="clear" w:color="auto" w:fill="FFFFFF"/>
-            <w:tcMar>
-              <w:top w:w="80" w:type="dxa"/>
-              <w:left w:w="120" w:type="dxa"/>
-              <w:bottom w:w="80" w:type="dxa"/>
-              <w:right w:w="120" w:type="dxa"/>
-            </w:tcMar>
-          </w:tcPr>
-          <w:p>
-            <w:r>
-              <w:rPr>
-                <w:i/>
-                <w:iCs/>
-                <w:color w:val="AAAAAA"/>
-                <w:sz w:val="20"/>
-                <w:szCs w:val="20"/>
-              </w:rPr>
-              <w:t>DD/MM/AAAA</w:t>
-            </w:r>
-          </w:p>
-        </w:tc>
-      </w:tr>
-      <w:tr>
-        <w:tc>
-          <w:tcPr>
-            <w:tcW w:w="3000" w:type="dxa"/>
+            <w:tcW w:w="4290" w:type="dxa"/>
+            <w:tcBorders>
+              <w:top w:val="single" w:sz="2" w:space="0" w:color="CCCCCC"/>
+              <w:left w:val="single" w:sz="2" w:space="0" w:color="CCCCCC"/>
+              <w:bottom w:val="single" w:sz="2" w:space="0" w:color="CCCCCC"/>
+              <w:right w:val="single" w:sz="2" w:space="0" w:color="CCCCCC"/>
+            </w:tcBorders>
+            <w:tcMar>
+              <w:top w:w="80" w:type="dxa"/>
+              <w:left w:w="120" w:type="dxa"/>
+              <w:bottom w:w="80" w:type="dxa"/>
+              <w:right w:w="120" w:type="dxa"/>
+            </w:tcMar>
+            <w:vAlign w:val="center"/>
+          </w:tcPr>
+          <w:p>
+            <w:pPr>
+              <w:rPr>
+                <w:sz w:val="20"/>
+                <w:szCs w:val="20"/>
+              </w:rPr>
+            </w:pPr>
+            <w:r>
+              <w:rPr>
+                <w:color w:val="000000"/>
+                <w:sz w:val="20"/>
+                <w:szCs w:val="20"/>
+              </w:rPr>
+              <w:t>25/05/2026</w:t>
+            </w:r>
+          </w:p>
+        </w:tc>
+      </w:tr>
+      <w:tr>
+        <w:tc>
+          <w:tcPr>
+            <w:tcW w:w="5348" w:type="dxa"/>
             <w:tcBorders>
               <w:top w:val="single" w:sz="1" w:space="0" w:color="CCCCCC"/>
               <w:left w:val="single" w:sz="1" w:space="0" w:color="CCCCCC"/>
@@ -24826,39 +25070,43 @@
         </w:tc>
         <w:tc>
           <w:tcPr>
-            <w:tcW w:w="6638" w:type="dxa"/>
-            <w:tcBorders>
-              <w:top w:val="single" w:sz="1" w:space="0" w:color="CCCCCC"/>
-              <w:left w:val="single" w:sz="1" w:space="0" w:color="CCCCCC"/>
-              <w:bottom w:val="single" w:sz="1" w:space="0" w:color="CCCCCC"/>
-              <w:right w:val="single" w:sz="1" w:space="0" w:color="CCCCCC"/>
-            </w:tcBorders>
-            <w:shd w:val="clear" w:color="auto" w:fill="FFFFFF"/>
-            <w:tcMar>
-              <w:top w:w="80" w:type="dxa"/>
-              <w:left w:w="120" w:type="dxa"/>
-              <w:bottom w:w="80" w:type="dxa"/>
-              <w:right w:w="120" w:type="dxa"/>
-            </w:tcMar>
-          </w:tcPr>
-          <w:p>
-            <w:r>
-              <w:rPr>
-                <w:i/>
-                <w:iCs/>
-                <w:color w:val="AAAAAA"/>
-                <w:sz w:val="20"/>
-                <w:szCs w:val="20"/>
-              </w:rPr>
-              <w:t>TC-XXX</w:t>
-            </w:r>
-          </w:p>
-        </w:tc>
-      </w:tr>
-      <w:tr>
-        <w:tc>
-          <w:tcPr>
-            <w:tcW w:w="3000" w:type="dxa"/>
+            <w:tcW w:w="4290" w:type="dxa"/>
+            <w:tcBorders>
+              <w:top w:val="single" w:sz="2" w:space="0" w:color="CCCCCC"/>
+              <w:left w:val="single" w:sz="2" w:space="0" w:color="CCCCCC"/>
+              <w:bottom w:val="single" w:sz="2" w:space="0" w:color="CCCCCC"/>
+              <w:right w:val="single" w:sz="2" w:space="0" w:color="CCCCCC"/>
+            </w:tcBorders>
+            <w:tcMar>
+              <w:top w:w="80" w:type="dxa"/>
+              <w:left w:w="120" w:type="dxa"/>
+              <w:bottom w:w="80" w:type="dxa"/>
+              <w:right w:w="120" w:type="dxa"/>
+            </w:tcMar>
+            <w:vAlign w:val="center"/>
+          </w:tcPr>
+          <w:p>
+            <w:pPr>
+              <w:rPr>
+                <w:sz w:val="20"/>
+                <w:szCs w:val="20"/>
+              </w:rPr>
+            </w:pPr>
+            <w:r>
+              <w:rPr>
+                <w:color w:val="000000"/>
+                <w:sz w:val="20"/>
+                <w:szCs w:val="20"/>
+              </w:rPr>
+              <w:t>TC-017 (testNombreConTildes)</w:t>
+            </w:r>
+          </w:p>
+        </w:tc>
+      </w:tr>
+      <w:tr>
+        <w:tc>
+          <w:tcPr>
+            <w:tcW w:w="5348" w:type="dxa"/>
             <w:tcBorders>
               <w:top w:val="single" w:sz="1" w:space="0" w:color="CCCCCC"/>
               <w:left w:val="single" w:sz="1" w:space="0" w:color="CCCCCC"/>
@@ -24888,39 +25136,43 @@
         </w:tc>
         <w:tc>
           <w:tcPr>
-            <w:tcW w:w="6638" w:type="dxa"/>
-            <w:tcBorders>
-              <w:top w:val="single" w:sz="1" w:space="0" w:color="CCCCCC"/>
-              <w:left w:val="single" w:sz="1" w:space="0" w:color="CCCCCC"/>
-              <w:bottom w:val="single" w:sz="1" w:space="0" w:color="CCCCCC"/>
-              <w:right w:val="single" w:sz="1" w:space="0" w:color="CCCCCC"/>
-            </w:tcBorders>
-            <w:shd w:val="clear" w:color="auto" w:fill="FFFFFF"/>
-            <w:tcMar>
-              <w:top w:w="80" w:type="dxa"/>
-              <w:left w:w="120" w:type="dxa"/>
-              <w:bottom w:w="80" w:type="dxa"/>
-              <w:right w:w="120" w:type="dxa"/>
-            </w:tcMar>
-          </w:tcPr>
-          <w:p>
-            <w:r>
-              <w:rPr>
-                <w:i/>
-                <w:iCs/>
-                <w:color w:val="AAAAAA"/>
-                <w:sz w:val="20"/>
-                <w:szCs w:val="20"/>
-              </w:rPr>
-              <w:t>Ej: Calculadora.maximo()</w:t>
-            </w:r>
-          </w:p>
-        </w:tc>
-      </w:tr>
-      <w:tr>
-        <w:tc>
-          <w:tcPr>
-            <w:tcW w:w="3000" w:type="dxa"/>
+            <w:tcW w:w="4290" w:type="dxa"/>
+            <w:tcBorders>
+              <w:top w:val="single" w:sz="2" w:space="0" w:color="CCCCCC"/>
+              <w:left w:val="single" w:sz="2" w:space="0" w:color="CCCCCC"/>
+              <w:bottom w:val="single" w:sz="2" w:space="0" w:color="CCCCCC"/>
+              <w:right w:val="single" w:sz="2" w:space="0" w:color="CCCCCC"/>
+            </w:tcBorders>
+            <w:tcMar>
+              <w:top w:w="80" w:type="dxa"/>
+              <w:left w:w="120" w:type="dxa"/>
+              <w:bottom w:w="80" w:type="dxa"/>
+              <w:right w:w="120" w:type="dxa"/>
+            </w:tcMar>
+            <w:vAlign w:val="center"/>
+          </w:tcPr>
+          <w:p>
+            <w:pPr>
+              <w:rPr>
+                <w:sz w:val="20"/>
+                <w:szCs w:val="20"/>
+              </w:rPr>
+            </w:pPr>
+            <w:r>
+              <w:rPr>
+                <w:color w:val="000000"/>
+                <w:sz w:val="20"/>
+                <w:szCs w:val="20"/>
+              </w:rPr>
+              <w:t>ValidadorFormulario.validarNombre(String nombre)</w:t>
+            </w:r>
+          </w:p>
+        </w:tc>
+      </w:tr>
+      <w:tr>
+        <w:tc>
+          <w:tcPr>
+            <w:tcW w:w="5348" w:type="dxa"/>
             <w:tcBorders>
               <w:top w:val="single" w:sz="1" w:space="0" w:color="CCCCCC"/>
               <w:left w:val="single" w:sz="1" w:space="0" w:color="CCCCCC"/>
@@ -24944,45 +25196,66 @@
                 <w:sz w:val="20"/>
                 <w:szCs w:val="20"/>
               </w:rPr>
+              <w:lastRenderedPageBreak/>
               <w:t>Descripción del defecto</w:t>
             </w:r>
           </w:p>
         </w:tc>
         <w:tc>
           <w:tcPr>
-            <w:tcW w:w="6638" w:type="dxa"/>
-            <w:tcBorders>
-              <w:top w:val="single" w:sz="1" w:space="0" w:color="CCCCCC"/>
-              <w:left w:val="single" w:sz="1" w:space="0" w:color="CCCCCC"/>
-              <w:bottom w:val="single" w:sz="1" w:space="0" w:color="CCCCCC"/>
-              <w:right w:val="single" w:sz="1" w:space="0" w:color="CCCCCC"/>
-            </w:tcBorders>
-            <w:shd w:val="clear" w:color="auto" w:fill="FFFFFF"/>
-            <w:tcMar>
-              <w:top w:w="80" w:type="dxa"/>
-              <w:left w:w="120" w:type="dxa"/>
-              <w:bottom w:w="80" w:type="dxa"/>
-              <w:right w:w="120" w:type="dxa"/>
-            </w:tcMar>
-          </w:tcPr>
-          <w:p>
-            <w:r>
-              <w:rPr>
-                <w:i/>
-                <w:iCs/>
-                <w:color w:val="AAAAAA"/>
-                <w:sz w:val="20"/>
-                <w:szCs w:val="20"/>
-              </w:rPr>
-              <w:t>Qué hace mal el código: describid el comportamiento real vs el esperado</w:t>
-            </w:r>
-          </w:p>
-        </w:tc>
-      </w:tr>
-      <w:tr>
-        <w:tc>
-          <w:tcPr>
-            <w:tcW w:w="3000" w:type="dxa"/>
+            <w:tcW w:w="4290" w:type="dxa"/>
+            <w:tcBorders>
+              <w:top w:val="single" w:sz="2" w:space="0" w:color="CCCCCC"/>
+              <w:left w:val="single" w:sz="2" w:space="0" w:color="CCCCCC"/>
+              <w:bottom w:val="single" w:sz="2" w:space="0" w:color="CCCCCC"/>
+              <w:right w:val="single" w:sz="2" w:space="0" w:color="CCCCCC"/>
+            </w:tcBorders>
+            <w:tcMar>
+              <w:top w:w="80" w:type="dxa"/>
+              <w:left w:w="120" w:type="dxa"/>
+              <w:bottom w:w="80" w:type="dxa"/>
+              <w:right w:w="120" w:type="dxa"/>
+            </w:tcMar>
+            <w:vAlign w:val="center"/>
+          </w:tcPr>
+          <w:p>
+            <w:pPr>
+              <w:rPr>
+                <w:sz w:val="20"/>
+                <w:szCs w:val="20"/>
+              </w:rPr>
+            </w:pPr>
+            <w:r>
+              <w:rPr>
+                <w:color w:val="000000"/>
+                <w:sz w:val="20"/>
+                <w:szCs w:val="20"/>
+              </w:rPr>
+              <w:t>Comportamiento real: devuelve false para nombres con caracteres acentuados (á, é, í, ó, ú, ü) o la letra ñ/Ñ, porque el regex [a-zA-Z ] no los contempla.</w:t>
+            </w:r>
+            <w:r>
+              <w:rPr>
+                <w:color w:val="000000"/>
+                <w:sz w:val="20"/>
+                <w:szCs w:val="20"/>
+              </w:rPr>
+              <w:t xml:space="preserve"> N</w:t>
+            </w:r>
+            <w:r>
+              <w:rPr>
+                <w:color w:val="000000"/>
+                <w:sz w:val="20"/>
+                <w:szCs w:val="20"/>
+              </w:rPr>
+              <w:t>ombres españoles como 'María José' o 'Ángel' deberían devolver true al ser nombres completamente válidos.</w:t>
+            </w:r>
+          </w:p>
+        </w:tc>
+      </w:tr>
+      <w:tr>
+        <w:tc>
+          <w:tcPr>
+            <w:tcW w:w="5348" w:type="dxa"/>
             <w:tcBorders>
               <w:top w:val="single" w:sz="1" w:space="0" w:color="CCCCCC"/>
               <w:left w:val="single" w:sz="1" w:space="0" w:color="CCCCCC"/>
@@ -25012,39 +25285,43 @@
         </w:tc>
         <w:tc>
           <w:tcPr>
-            <w:tcW w:w="6638" w:type="dxa"/>
-            <w:tcBorders>
-              <w:top w:val="single" w:sz="1" w:space="0" w:color="CCCCCC"/>
-              <w:left w:val="single" w:sz="1" w:space="0" w:color="CCCCCC"/>
-              <w:bottom w:val="single" w:sz="1" w:space="0" w:color="CCCCCC"/>
-              <w:right w:val="single" w:sz="1" w:space="0" w:color="CCCCCC"/>
-            </w:tcBorders>
-            <w:shd w:val="clear" w:color="auto" w:fill="FFFFFF"/>
-            <w:tcMar>
-              <w:top w:w="80" w:type="dxa"/>
-              <w:left w:w="120" w:type="dxa"/>
-              <w:bottom w:w="80" w:type="dxa"/>
-              <w:right w:w="120" w:type="dxa"/>
-            </w:tcMar>
-          </w:tcPr>
-          <w:p>
-            <w:r>
-              <w:rPr>
-                <w:i/>
-                <w:iCs/>
-                <w:color w:val="AAAAAA"/>
-                <w:sz w:val="20"/>
-                <w:szCs w:val="20"/>
-              </w:rPr>
-              <w:t>Crítica / Alta / Media / Baja</w:t>
-            </w:r>
-          </w:p>
-        </w:tc>
-      </w:tr>
-      <w:tr>
-        <w:tc>
-          <w:tcPr>
-            <w:tcW w:w="3000" w:type="dxa"/>
+            <w:tcW w:w="4290" w:type="dxa"/>
+            <w:tcBorders>
+              <w:top w:val="single" w:sz="2" w:space="0" w:color="CCCCCC"/>
+              <w:left w:val="single" w:sz="2" w:space="0" w:color="CCCCCC"/>
+              <w:bottom w:val="single" w:sz="2" w:space="0" w:color="CCCCCC"/>
+              <w:right w:val="single" w:sz="2" w:space="0" w:color="CCCCCC"/>
+            </w:tcBorders>
+            <w:tcMar>
+              <w:top w:w="80" w:type="dxa"/>
+              <w:left w:w="120" w:type="dxa"/>
+              <w:bottom w:w="80" w:type="dxa"/>
+              <w:right w:w="120" w:type="dxa"/>
+            </w:tcMar>
+            <w:vAlign w:val="center"/>
+          </w:tcPr>
+          <w:p>
+            <w:pPr>
+              <w:rPr>
+                <w:sz w:val="20"/>
+                <w:szCs w:val="20"/>
+              </w:rPr>
+            </w:pPr>
+            <w:r>
+              <w:rPr>
+                <w:color w:val="000000"/>
+                <w:sz w:val="20"/>
+                <w:szCs w:val="20"/>
+              </w:rPr>
+              <w:t>Alta — rechaza la mayoría de nombres españoles reales</w:t>
+            </w:r>
+          </w:p>
+        </w:tc>
+      </w:tr>
+      <w:tr>
+        <w:tc>
+          <w:tcPr>
+            <w:tcW w:w="5348" w:type="dxa"/>
             <w:tcBorders>
               <w:top w:val="single" w:sz="1" w:space="0" w:color="CCCCCC"/>
               <w:left w:val="single" w:sz="1" w:space="0" w:color="CCCCCC"/>
@@ -25074,39 +25351,43 @@
         </w:tc>
         <w:tc>
           <w:tcPr>
-            <w:tcW w:w="6638" w:type="dxa"/>
-            <w:tcBorders>
-              <w:top w:val="single" w:sz="1" w:space="0" w:color="CCCCCC"/>
-              <w:left w:val="single" w:sz="1" w:space="0" w:color="CCCCCC"/>
-              <w:bottom w:val="single" w:sz="1" w:space="0" w:color="CCCCCC"/>
-              <w:right w:val="single" w:sz="1" w:space="0" w:color="CCCCCC"/>
-            </w:tcBorders>
-            <w:shd w:val="clear" w:color="auto" w:fill="FFFFFF"/>
-            <w:tcMar>
-              <w:top w:w="80" w:type="dxa"/>
-              <w:left w:w="120" w:type="dxa"/>
-              <w:bottom w:w="80" w:type="dxa"/>
-              <w:right w:w="120" w:type="dxa"/>
-            </w:tcMar>
-          </w:tcPr>
-          <w:p>
-            <w:r>
-              <w:rPr>
-                <w:i/>
-                <w:iCs/>
-                <w:color w:val="AAAAAA"/>
-                <w:sz w:val="20"/>
-                <w:szCs w:val="20"/>
-              </w:rPr>
-              <w:t>Alta / Media / Baja</w:t>
-            </w:r>
-          </w:p>
-        </w:tc>
-      </w:tr>
-      <w:tr>
-        <w:tc>
-          <w:tcPr>
-            <w:tcW w:w="3000" w:type="dxa"/>
+            <w:tcW w:w="4290" w:type="dxa"/>
+            <w:tcBorders>
+              <w:top w:val="single" w:sz="2" w:space="0" w:color="CCCCCC"/>
+              <w:left w:val="single" w:sz="2" w:space="0" w:color="CCCCCC"/>
+              <w:bottom w:val="single" w:sz="2" w:space="0" w:color="CCCCCC"/>
+              <w:right w:val="single" w:sz="2" w:space="0" w:color="CCCCCC"/>
+            </w:tcBorders>
+            <w:tcMar>
+              <w:top w:w="80" w:type="dxa"/>
+              <w:left w:w="120" w:type="dxa"/>
+              <w:bottom w:w="80" w:type="dxa"/>
+              <w:right w:w="120" w:type="dxa"/>
+            </w:tcMar>
+            <w:vAlign w:val="center"/>
+          </w:tcPr>
+          <w:p>
+            <w:pPr>
+              <w:rPr>
+                <w:sz w:val="20"/>
+                <w:szCs w:val="20"/>
+              </w:rPr>
+            </w:pPr>
+            <w:r>
+              <w:rPr>
+                <w:color w:val="000000"/>
+                <w:sz w:val="20"/>
+                <w:szCs w:val="20"/>
+              </w:rPr>
+              <w:t>Alta</w:t>
+            </w:r>
+          </w:p>
+        </w:tc>
+      </w:tr>
+      <w:tr>
+        <w:tc>
+          <w:tcPr>
+            <w:tcW w:w="5348" w:type="dxa"/>
             <w:tcBorders>
               <w:top w:val="single" w:sz="1" w:space="0" w:color="CCCCCC"/>
               <w:left w:val="single" w:sz="1" w:space="0" w:color="CCCCCC"/>
@@ -25136,39 +25417,43 @@
         </w:tc>
         <w:tc>
           <w:tcPr>
-            <w:tcW w:w="6638" w:type="dxa"/>
-            <w:tcBorders>
-              <w:top w:val="single" w:sz="1" w:space="0" w:color="CCCCCC"/>
-              <w:left w:val="single" w:sz="1" w:space="0" w:color="CCCCCC"/>
-              <w:bottom w:val="single" w:sz="1" w:space="0" w:color="CCCCCC"/>
-              <w:right w:val="single" w:sz="1" w:space="0" w:color="CCCCCC"/>
-            </w:tcBorders>
-            <w:shd w:val="clear" w:color="auto" w:fill="FFFFFF"/>
-            <w:tcMar>
-              <w:top w:w="80" w:type="dxa"/>
-              <w:left w:w="120" w:type="dxa"/>
-              <w:bottom w:w="80" w:type="dxa"/>
-              <w:right w:w="120" w:type="dxa"/>
-            </w:tcMar>
-          </w:tcPr>
-          <w:p>
-            <w:r>
-              <w:rPr>
-                <w:i/>
-                <w:iCs/>
-                <w:color w:val="AAAAAA"/>
-                <w:sz w:val="20"/>
-                <w:szCs w:val="20"/>
-              </w:rPr>
-              <w:t>Sí / No</w:t>
-            </w:r>
-          </w:p>
-        </w:tc>
-      </w:tr>
-      <w:tr>
-        <w:tc>
-          <w:tcPr>
-            <w:tcW w:w="3000" w:type="dxa"/>
+            <w:tcW w:w="4290" w:type="dxa"/>
+            <w:tcBorders>
+              <w:top w:val="single" w:sz="2" w:space="0" w:color="CCCCCC"/>
+              <w:left w:val="single" w:sz="2" w:space="0" w:color="CCCCCC"/>
+              <w:bottom w:val="single" w:sz="2" w:space="0" w:color="CCCCCC"/>
+              <w:right w:val="single" w:sz="2" w:space="0" w:color="CCCCCC"/>
+            </w:tcBorders>
+            <w:tcMar>
+              <w:top w:w="80" w:type="dxa"/>
+              <w:left w:w="120" w:type="dxa"/>
+              <w:bottom w:w="80" w:type="dxa"/>
+              <w:right w:w="120" w:type="dxa"/>
+            </w:tcMar>
+            <w:vAlign w:val="center"/>
+          </w:tcPr>
+          <w:p>
+            <w:pPr>
+              <w:rPr>
+                <w:sz w:val="20"/>
+                <w:szCs w:val="20"/>
+              </w:rPr>
+            </w:pPr>
+            <w:r>
+              <w:rPr>
+                <w:color w:val="000000"/>
+                <w:sz w:val="20"/>
+                <w:szCs w:val="20"/>
+              </w:rPr>
+              <w:t>Sí, siempre. Cualquier nombre con tilde o ñ devolvía false.</w:t>
+            </w:r>
+          </w:p>
+        </w:tc>
+      </w:tr>
+      <w:tr>
+        <w:tc>
+          <w:tcPr>
+            <w:tcW w:w="5348" w:type="dxa"/>
             <w:tcBorders>
               <w:top w:val="single" w:sz="1" w:space="0" w:color="CCCCCC"/>
               <w:left w:val="single" w:sz="1" w:space="0" w:color="CCCCCC"/>
@@ -25198,39 +25483,43 @@
         </w:tc>
         <w:tc>
           <w:tcPr>
-            <w:tcW w:w="6638" w:type="dxa"/>
-            <w:tcBorders>
-              <w:top w:val="single" w:sz="1" w:space="0" w:color="CCCCCC"/>
-              <w:left w:val="single" w:sz="1" w:space="0" w:color="CCCCCC"/>
-              <w:bottom w:val="single" w:sz="1" w:space="0" w:color="CCCCCC"/>
-              <w:right w:val="single" w:sz="1" w:space="0" w:color="CCCCCC"/>
-            </w:tcBorders>
-            <w:shd w:val="clear" w:color="auto" w:fill="FFFFFF"/>
-            <w:tcMar>
-              <w:top w:w="80" w:type="dxa"/>
-              <w:left w:w="120" w:type="dxa"/>
-              <w:bottom w:w="80" w:type="dxa"/>
-              <w:right w:w="120" w:type="dxa"/>
-            </w:tcMar>
-          </w:tcPr>
-          <w:p>
-            <w:r>
-              <w:rPr>
-                <w:i/>
-                <w:iCs/>
-                <w:color w:val="AAAAAA"/>
-                <w:sz w:val="20"/>
-                <w:szCs w:val="20"/>
-              </w:rPr>
-              <w:t>Abierto / Corregido / Descartado</w:t>
-            </w:r>
-          </w:p>
-        </w:tc>
-      </w:tr>
-      <w:tr>
-        <w:tc>
-          <w:tcPr>
-            <w:tcW w:w="3000" w:type="dxa"/>
+            <w:tcW w:w="4290" w:type="dxa"/>
+            <w:tcBorders>
+              <w:top w:val="single" w:sz="2" w:space="0" w:color="CCCCCC"/>
+              <w:left w:val="single" w:sz="2" w:space="0" w:color="CCCCCC"/>
+              <w:bottom w:val="single" w:sz="2" w:space="0" w:color="CCCCCC"/>
+              <w:right w:val="single" w:sz="2" w:space="0" w:color="CCCCCC"/>
+            </w:tcBorders>
+            <w:tcMar>
+              <w:top w:w="80" w:type="dxa"/>
+              <w:left w:w="120" w:type="dxa"/>
+              <w:bottom w:w="80" w:type="dxa"/>
+              <w:right w:w="120" w:type="dxa"/>
+            </w:tcMar>
+            <w:vAlign w:val="center"/>
+          </w:tcPr>
+          <w:p>
+            <w:pPr>
+              <w:rPr>
+                <w:sz w:val="20"/>
+                <w:szCs w:val="20"/>
+              </w:rPr>
+            </w:pPr>
+            <w:r>
+              <w:rPr>
+                <w:color w:val="000000"/>
+                <w:sz w:val="20"/>
+                <w:szCs w:val="20"/>
+              </w:rPr>
+              <w:t>Corregido</w:t>
+            </w:r>
+          </w:p>
+        </w:tc>
+      </w:tr>
+      <w:tr>
+        <w:tc>
+          <w:tcPr>
+            <w:tcW w:w="5348" w:type="dxa"/>
             <w:tcBorders>
               <w:top w:val="single" w:sz="1" w:space="0" w:color="CCCCCC"/>
               <w:left w:val="single" w:sz="1" w:space="0" w:color="CCCCCC"/>
@@ -25260,39 +25549,115 @@
         </w:tc>
         <w:tc>
           <w:tcPr>
-            <w:tcW w:w="6638" w:type="dxa"/>
-            <w:tcBorders>
-              <w:top w:val="single" w:sz="1" w:space="0" w:color="CCCCCC"/>
-              <w:left w:val="single" w:sz="1" w:space="0" w:color="CCCCCC"/>
-              <w:bottom w:val="single" w:sz="1" w:space="0" w:color="CCCCCC"/>
-              <w:right w:val="single" w:sz="1" w:space="0" w:color="CCCCCC"/>
-            </w:tcBorders>
-            <w:shd w:val="clear" w:color="auto" w:fill="FFFFFF"/>
-            <w:tcMar>
-              <w:top w:w="80" w:type="dxa"/>
-              <w:left w:w="120" w:type="dxa"/>
-              <w:bottom w:w="80" w:type="dxa"/>
-              <w:right w:w="120" w:type="dxa"/>
-            </w:tcMar>
-          </w:tcPr>
-          <w:p>
-            <w:r>
-              <w:rPr>
-                <w:i/>
-                <w:iCs/>
-                <w:color w:val="AAAAAA"/>
-                <w:sz w:val="20"/>
-                <w:szCs w:val="20"/>
-              </w:rPr>
-              <w:t>Si lo corregisteis: describid qué cambiasteis en el código. Si no: explicad por qué no.</w:t>
-            </w:r>
-          </w:p>
-        </w:tc>
-      </w:tr>
-      <w:tr>
-        <w:tc>
-          <w:tcPr>
-            <w:tcW w:w="3000" w:type="dxa"/>
+            <w:tcW w:w="4290" w:type="dxa"/>
+            <w:tcBorders>
+              <w:top w:val="single" w:sz="2" w:space="0" w:color="CCCCCC"/>
+              <w:left w:val="single" w:sz="2" w:space="0" w:color="CCCCCC"/>
+              <w:bottom w:val="single" w:sz="2" w:space="0" w:color="CCCCCC"/>
+              <w:right w:val="single" w:sz="2" w:space="0" w:color="CCCCCC"/>
+            </w:tcBorders>
+            <w:tcMar>
+              <w:top w:w="80" w:type="dxa"/>
+              <w:left w:w="120" w:type="dxa"/>
+              <w:bottom w:w="80" w:type="dxa"/>
+              <w:right w:w="120" w:type="dxa"/>
+            </w:tcMar>
+            <w:vAlign w:val="center"/>
+          </w:tcPr>
+          <w:p>
+            <w:pPr>
+              <w:rPr>
+                <w:sz w:val="20"/>
+                <w:szCs w:val="20"/>
+              </w:rPr>
+            </w:pPr>
+            <w:r>
+              <w:rPr>
+                <w:color w:val="000000"/>
+                <w:sz w:val="20"/>
+                <w:szCs w:val="20"/>
+              </w:rPr>
+              <w:t>Línea original:</w:t>
+            </w:r>
+          </w:p>
+          <w:p>
+            <w:pPr>
+              <w:rPr>
+                <w:sz w:val="20"/>
+                <w:szCs w:val="20"/>
+              </w:rPr>
+            </w:pPr>
+            <w:r>
+              <w:rPr>
+                <w:color w:val="000000"/>
+                <w:sz w:val="20"/>
+                <w:szCs w:val="20"/>
+              </w:rPr>
+              <w:t xml:space="preserve">    return nombre.</w:t>
+            </w:r>
+            <w:r>
+              <w:rPr>
+                <w:color w:val="000000"/>
+                <w:sz w:val="20"/>
+                <w:szCs w:val="20"/>
+              </w:rPr>
+              <w:t>matches</w:t>
+            </w:r>
+            <w:r>
+              <w:rPr>
+                <w:color w:val="000000"/>
+                <w:sz w:val="20"/>
+                <w:szCs w:val="20"/>
+              </w:rPr>
+              <w:t>("[a-zA-Z ]+");</w:t>
+            </w:r>
+          </w:p>
+          <w:p>
+            <w:pPr>
+              <w:rPr>
+                <w:sz w:val="20"/>
+                <w:szCs w:val="20"/>
+              </w:rPr>
+            </w:pPr>
+          </w:p>
+          <w:p>
+            <w:pPr>
+              <w:rPr>
+                <w:sz w:val="20"/>
+                <w:szCs w:val="20"/>
+              </w:rPr>
+            </w:pPr>
+            <w:r>
+              <w:rPr>
+                <w:color w:val="000000"/>
+                <w:sz w:val="20"/>
+                <w:szCs w:val="20"/>
+              </w:rPr>
+              <w:t>Línea corregida:</w:t>
+            </w:r>
+          </w:p>
+          <w:p>
+            <w:pPr>
+              <w:rPr>
+                <w:sz w:val="20"/>
+                <w:szCs w:val="20"/>
+              </w:rPr>
+            </w:pPr>
+            <w:r>
+              <w:rPr>
+                <w:color w:val="000000"/>
+                <w:sz w:val="20"/>
+                <w:szCs w:val="20"/>
+              </w:rPr>
+              <w:t xml:space="preserve">    return nombre.matches("[\\p{L} ]+");</w:t>
+            </w:r>
+          </w:p>
+        </w:tc>
+      </w:tr>
+      <w:tr>
+        <w:tc>
+          <w:tcPr>
+            <w:tcW w:w="5348" w:type="dxa"/>
             <w:tcBorders>
               <w:top w:val="single" w:sz="1" w:space="0" w:color="CCCCCC"/>
               <w:left w:val="single" w:sz="1" w:space="0" w:color="CCCCCC"/>
@@ -25322,778 +25687,35 @@
         </w:tc>
         <w:tc>
           <w:tcPr>
-            <w:tcW w:w="6638" w:type="dxa"/>
-            <w:tcBorders>
-              <w:top w:val="single" w:sz="1" w:space="0" w:color="CCCCCC"/>
-              <w:left w:val="single" w:sz="1" w:space="0" w:color="CCCCCC"/>
-              <w:bottom w:val="single" w:sz="1" w:space="0" w:color="CCCCCC"/>
-              <w:right w:val="single" w:sz="1" w:space="0" w:color="CCCCCC"/>
-            </w:tcBorders>
-            <w:shd w:val="clear" w:color="auto" w:fill="FFFFFF"/>
-            <w:tcMar>
-              <w:top w:w="80" w:type="dxa"/>
-              <w:left w:w="120" w:type="dxa"/>
-              <w:bottom w:w="80" w:type="dxa"/>
-              <w:right w:w="120" w:type="dxa"/>
-            </w:tcMar>
-          </w:tcPr>
-          <w:p>
-            <w:r>
-              <w:rPr>
-                <w:i/>
-                <w:iCs/>
-                <w:color w:val="AAAAAA"/>
-                <w:sz w:val="20"/>
-                <w:szCs w:val="20"/>
-              </w:rPr>
-              <w:t>SHA del commit con el fix (si lo hay)</w:t>
-            </w:r>
-          </w:p>
-        </w:tc>
-      </w:tr>
-    </w:tbl>
-    <w:p>
-      <w:pPr>
-        <w:spacing w:before="60" w:after="60"/>
-      </w:pPr>
-      <w:r>
-        <w:t xml:space="preserve"> </w:t>
-      </w:r>
-    </w:p>
-    <w:tbl>
-      <w:tblPr>
-        <w:tblW w:w="9638" w:type="dxa"/>
-        <w:tblBorders>
-          <w:top w:val="single" w:sz="4" w:space="0" w:color="auto"/>
-          <w:left w:val="single" w:sz="4" w:space="0" w:color="auto"/>
-          <w:bottom w:val="single" w:sz="4" w:space="0" w:color="auto"/>
-          <w:right w:val="single" w:sz="4" w:space="0" w:color="auto"/>
-          <w:insideH w:val="single" w:sz="4" w:space="0" w:color="auto"/>
-          <w:insideV w:val="single" w:sz="4" w:space="0" w:color="auto"/>
-        </w:tblBorders>
-        <w:tblCellMar>
-          <w:left w:w="10" w:type="dxa"/>
-          <w:right w:w="10" w:type="dxa"/>
-        </w:tblCellMar>
-        <w:tblLook w:val="04A0" w:firstRow="1" w:lastRow="0" w:firstColumn="1" w:lastColumn="0" w:noHBand="0" w:noVBand="1"/>
-      </w:tblPr>
-      <w:tblGrid>
-        <w:gridCol w:w="5348"/>
-        <w:gridCol w:w="4290"/>
-      </w:tblGrid>
-      <w:tr>
-        <w:trPr>
-          <w:gridAfter w:val="1"/>
-          <w:wAfter w:w="6638" w:type="dxa"/>
-        </w:trPr>
-        <w:tc>
-          <w:tcPr>
-            <w:tcW w:w="9638" w:type="dxa"/>
-            <w:tcBorders>
-              <w:top w:val="single" w:sz="1" w:space="0" w:color="CCCCCC"/>
-              <w:left w:val="single" w:sz="1" w:space="0" w:color="CCCCCC"/>
-              <w:bottom w:val="single" w:sz="1" w:space="0" w:color="CCCCCC"/>
-              <w:right w:val="single" w:sz="1" w:space="0" w:color="CCCCCC"/>
-            </w:tcBorders>
-            <w:shd w:val="clear" w:color="auto" w:fill="558B2F"/>
-            <w:tcMar>
-              <w:top w:w="80" w:type="dxa"/>
-              <w:left w:w="120" w:type="dxa"/>
-              <w:bottom w:w="80" w:type="dxa"/>
-              <w:right w:w="120" w:type="dxa"/>
-            </w:tcMar>
-          </w:tcPr>
-          <w:p>
-            <w:r>
-              <w:rPr>
-                <w:b/>
-                <w:bCs/>
-                <w:color w:val="FFFFFF"/>
-              </w:rPr>
-              <w:t xml:space="preserve">INCIDENCIA IR-003  </w:t>
-            </w:r>
-          </w:p>
-        </w:tc>
-      </w:tr>
-      <w:tr>
-        <w:tc>
-          <w:tcPr>
-            <w:tcW w:w="3000" w:type="dxa"/>
-            <w:tcBorders>
-              <w:top w:val="single" w:sz="1" w:space="0" w:color="CCCCCC"/>
-              <w:left w:val="single" w:sz="1" w:space="0" w:color="CCCCCC"/>
-              <w:bottom w:val="single" w:sz="1" w:space="0" w:color="CCCCCC"/>
-              <w:right w:val="single" w:sz="1" w:space="0" w:color="CCCCCC"/>
-            </w:tcBorders>
-            <w:shd w:val="clear" w:color="auto" w:fill="D6E4F0"/>
-            <w:tcMar>
-              <w:top w:w="80" w:type="dxa"/>
-              <w:left w:w="120" w:type="dxa"/>
-              <w:bottom w:w="80" w:type="dxa"/>
-              <w:right w:w="120" w:type="dxa"/>
-            </w:tcMar>
-          </w:tcPr>
-          <w:p>
-            <w:r>
-              <w:rPr>
-                <w:b/>
-                <w:bCs/>
-                <w:color w:val="1A1A2E"/>
-                <w:sz w:val="20"/>
-                <w:szCs w:val="20"/>
-              </w:rPr>
-              <w:t>Identificador</w:t>
-            </w:r>
-          </w:p>
-        </w:tc>
-        <w:tc>
-          <w:tcPr>
-            <w:tcW w:w="6638" w:type="dxa"/>
-            <w:tcBorders>
-              <w:top w:val="single" w:sz="1" w:space="0" w:color="CCCCCC"/>
-              <w:left w:val="single" w:sz="1" w:space="0" w:color="CCCCCC"/>
-              <w:bottom w:val="single" w:sz="1" w:space="0" w:color="CCCCCC"/>
-              <w:right w:val="single" w:sz="1" w:space="0" w:color="CCCCCC"/>
-            </w:tcBorders>
-            <w:shd w:val="clear" w:color="auto" w:fill="FFFFFF"/>
-            <w:tcMar>
-              <w:top w:w="80" w:type="dxa"/>
-              <w:left w:w="120" w:type="dxa"/>
-              <w:bottom w:w="80" w:type="dxa"/>
-              <w:right w:w="120" w:type="dxa"/>
-            </w:tcMar>
-          </w:tcPr>
-          <w:p>
-            <w:r>
-              <w:rPr>
-                <w:i/>
-                <w:iCs/>
-                <w:color w:val="AAAAAA"/>
-                <w:sz w:val="20"/>
-                <w:szCs w:val="20"/>
-              </w:rPr>
-              <w:t>IR-003</w:t>
-            </w:r>
-          </w:p>
-        </w:tc>
-      </w:tr>
-      <w:tr>
-        <w:tc>
-          <w:tcPr>
-            <w:tcW w:w="3000" w:type="dxa"/>
-            <w:tcBorders>
-              <w:top w:val="single" w:sz="1" w:space="0" w:color="CCCCCC"/>
-              <w:left w:val="single" w:sz="1" w:space="0" w:color="CCCCCC"/>
-              <w:bottom w:val="single" w:sz="1" w:space="0" w:color="CCCCCC"/>
-              <w:right w:val="single" w:sz="1" w:space="0" w:color="CCCCCC"/>
-            </w:tcBorders>
-            <w:shd w:val="clear" w:color="auto" w:fill="D6E4F0"/>
-            <w:tcMar>
-              <w:top w:w="80" w:type="dxa"/>
-              <w:left w:w="120" w:type="dxa"/>
-              <w:bottom w:w="80" w:type="dxa"/>
-              <w:right w:w="120" w:type="dxa"/>
-            </w:tcMar>
-          </w:tcPr>
-          <w:p>
-            <w:r>
-              <w:rPr>
-                <w:b/>
-                <w:bCs/>
-                <w:color w:val="1A1A2E"/>
-                <w:sz w:val="20"/>
-                <w:szCs w:val="20"/>
-              </w:rPr>
-              <w:lastRenderedPageBreak/>
-              <w:t>Fecha de detección</w:t>
-            </w:r>
-          </w:p>
-        </w:tc>
-        <w:tc>
-          <w:tcPr>
-            <w:tcW w:w="6638" w:type="dxa"/>
-            <w:tcBorders>
-              <w:top w:val="single" w:sz="1" w:space="0" w:color="CCCCCC"/>
-              <w:left w:val="single" w:sz="1" w:space="0" w:color="CCCCCC"/>
-              <w:bottom w:val="single" w:sz="1" w:space="0" w:color="CCCCCC"/>
-              <w:right w:val="single" w:sz="1" w:space="0" w:color="CCCCCC"/>
-            </w:tcBorders>
-            <w:shd w:val="clear" w:color="auto" w:fill="FFFFFF"/>
-            <w:tcMar>
-              <w:top w:w="80" w:type="dxa"/>
-              <w:left w:w="120" w:type="dxa"/>
-              <w:bottom w:w="80" w:type="dxa"/>
-              <w:right w:w="120" w:type="dxa"/>
-            </w:tcMar>
-          </w:tcPr>
-          <w:p>
-            <w:r>
-              <w:rPr>
-                <w:i/>
-                <w:iCs/>
-                <w:color w:val="AAAAAA"/>
-                <w:sz w:val="20"/>
-                <w:szCs w:val="20"/>
-              </w:rPr>
-              <w:t>DD/MM/AAAA</w:t>
-            </w:r>
-          </w:p>
-        </w:tc>
-      </w:tr>
-      <w:tr>
-        <w:tc>
-          <w:tcPr>
-            <w:tcW w:w="3000" w:type="dxa"/>
-            <w:tcBorders>
-              <w:top w:val="single" w:sz="1" w:space="0" w:color="CCCCCC"/>
-              <w:left w:val="single" w:sz="1" w:space="0" w:color="CCCCCC"/>
-              <w:bottom w:val="single" w:sz="1" w:space="0" w:color="CCCCCC"/>
-              <w:right w:val="single" w:sz="1" w:space="0" w:color="CCCCCC"/>
-            </w:tcBorders>
-            <w:shd w:val="clear" w:color="auto" w:fill="D6E4F0"/>
-            <w:tcMar>
-              <w:top w:w="80" w:type="dxa"/>
-              <w:left w:w="120" w:type="dxa"/>
-              <w:bottom w:w="80" w:type="dxa"/>
-              <w:right w:w="120" w:type="dxa"/>
-            </w:tcMar>
-          </w:tcPr>
-          <w:p>
-            <w:r>
-              <w:rPr>
-                <w:b/>
-                <w:bCs/>
-                <w:color w:val="1A1A2E"/>
-                <w:sz w:val="20"/>
-                <w:szCs w:val="20"/>
-              </w:rPr>
-              <w:t>Detectado en el caso de prueba</w:t>
-            </w:r>
-          </w:p>
-        </w:tc>
-        <w:tc>
-          <w:tcPr>
-            <w:tcW w:w="6638" w:type="dxa"/>
-            <w:tcBorders>
-              <w:top w:val="single" w:sz="1" w:space="0" w:color="CCCCCC"/>
-              <w:left w:val="single" w:sz="1" w:space="0" w:color="CCCCCC"/>
-              <w:bottom w:val="single" w:sz="1" w:space="0" w:color="CCCCCC"/>
-              <w:right w:val="single" w:sz="1" w:space="0" w:color="CCCCCC"/>
-            </w:tcBorders>
-            <w:shd w:val="clear" w:color="auto" w:fill="FFFFFF"/>
-            <w:tcMar>
-              <w:top w:w="80" w:type="dxa"/>
-              <w:left w:w="120" w:type="dxa"/>
-              <w:bottom w:w="80" w:type="dxa"/>
-              <w:right w:w="120" w:type="dxa"/>
-            </w:tcMar>
-          </w:tcPr>
-          <w:p>
-            <w:r>
-              <w:rPr>
-                <w:i/>
-                <w:iCs/>
-                <w:color w:val="AAAAAA"/>
-                <w:sz w:val="20"/>
-                <w:szCs w:val="20"/>
-              </w:rPr>
-              <w:t>TC-XXX</w:t>
-            </w:r>
-          </w:p>
-        </w:tc>
-      </w:tr>
-      <w:tr>
-        <w:tc>
-          <w:tcPr>
-            <w:tcW w:w="3000" w:type="dxa"/>
-            <w:tcBorders>
-              <w:top w:val="single" w:sz="1" w:space="0" w:color="CCCCCC"/>
-              <w:left w:val="single" w:sz="1" w:space="0" w:color="CCCCCC"/>
-              <w:bottom w:val="single" w:sz="1" w:space="0" w:color="CCCCCC"/>
-              <w:right w:val="single" w:sz="1" w:space="0" w:color="CCCCCC"/>
-            </w:tcBorders>
-            <w:shd w:val="clear" w:color="auto" w:fill="D6E4F0"/>
-            <w:tcMar>
-              <w:top w:w="80" w:type="dxa"/>
-              <w:left w:w="120" w:type="dxa"/>
-              <w:bottom w:w="80" w:type="dxa"/>
-              <w:right w:w="120" w:type="dxa"/>
-            </w:tcMar>
-          </w:tcPr>
-          <w:p>
-            <w:r>
-              <w:rPr>
-                <w:b/>
-                <w:bCs/>
-                <w:color w:val="1A1A2E"/>
-                <w:sz w:val="20"/>
-                <w:szCs w:val="20"/>
-              </w:rPr>
-              <w:t>Clase / Método afectado</w:t>
-            </w:r>
-          </w:p>
-        </w:tc>
-        <w:tc>
-          <w:tcPr>
-            <w:tcW w:w="6638" w:type="dxa"/>
-            <w:tcBorders>
-              <w:top w:val="single" w:sz="1" w:space="0" w:color="CCCCCC"/>
-              <w:left w:val="single" w:sz="1" w:space="0" w:color="CCCCCC"/>
-              <w:bottom w:val="single" w:sz="1" w:space="0" w:color="CCCCCC"/>
-              <w:right w:val="single" w:sz="1" w:space="0" w:color="CCCCCC"/>
-            </w:tcBorders>
-            <w:shd w:val="clear" w:color="auto" w:fill="FFFFFF"/>
-            <w:tcMar>
-              <w:top w:w="80" w:type="dxa"/>
-              <w:left w:w="120" w:type="dxa"/>
-              <w:bottom w:w="80" w:type="dxa"/>
-              <w:right w:w="120" w:type="dxa"/>
-            </w:tcMar>
-          </w:tcPr>
-          <w:p>
-            <w:r>
-              <w:rPr>
-                <w:i/>
-                <w:iCs/>
-                <w:color w:val="AAAAAA"/>
-                <w:sz w:val="20"/>
-                <w:szCs w:val="20"/>
-              </w:rPr>
-              <w:t>Ej: Calculadora.maximo()</w:t>
-            </w:r>
-          </w:p>
-        </w:tc>
-      </w:tr>
-      <w:tr>
-        <w:tc>
-          <w:tcPr>
-            <w:tcW w:w="3000" w:type="dxa"/>
-            <w:tcBorders>
-              <w:top w:val="single" w:sz="1" w:space="0" w:color="CCCCCC"/>
-              <w:left w:val="single" w:sz="1" w:space="0" w:color="CCCCCC"/>
-              <w:bottom w:val="single" w:sz="1" w:space="0" w:color="CCCCCC"/>
-              <w:right w:val="single" w:sz="1" w:space="0" w:color="CCCCCC"/>
-            </w:tcBorders>
-            <w:shd w:val="clear" w:color="auto" w:fill="D6E4F0"/>
-            <w:tcMar>
-              <w:top w:w="80" w:type="dxa"/>
-              <w:left w:w="120" w:type="dxa"/>
-              <w:bottom w:w="80" w:type="dxa"/>
-              <w:right w:w="120" w:type="dxa"/>
-            </w:tcMar>
-          </w:tcPr>
-          <w:p>
-            <w:r>
-              <w:rPr>
-                <w:b/>
-                <w:bCs/>
-                <w:color w:val="1A1A2E"/>
-                <w:sz w:val="20"/>
-                <w:szCs w:val="20"/>
-              </w:rPr>
-              <w:t>Descripción del defecto</w:t>
-            </w:r>
-          </w:p>
-        </w:tc>
-        <w:tc>
-          <w:tcPr>
-            <w:tcW w:w="6638" w:type="dxa"/>
-            <w:tcBorders>
-              <w:top w:val="single" w:sz="1" w:space="0" w:color="CCCCCC"/>
-              <w:left w:val="single" w:sz="1" w:space="0" w:color="CCCCCC"/>
-              <w:bottom w:val="single" w:sz="1" w:space="0" w:color="CCCCCC"/>
-              <w:right w:val="single" w:sz="1" w:space="0" w:color="CCCCCC"/>
-            </w:tcBorders>
-            <w:shd w:val="clear" w:color="auto" w:fill="FFFFFF"/>
-            <w:tcMar>
-              <w:top w:w="80" w:type="dxa"/>
-              <w:left w:w="120" w:type="dxa"/>
-              <w:bottom w:w="80" w:type="dxa"/>
-              <w:right w:w="120" w:type="dxa"/>
-            </w:tcMar>
-          </w:tcPr>
-          <w:p>
-            <w:r>
-              <w:rPr>
-                <w:i/>
-                <w:iCs/>
-                <w:color w:val="AAAAAA"/>
-                <w:sz w:val="20"/>
-                <w:szCs w:val="20"/>
-              </w:rPr>
-              <w:t>Qué hace mal el código: describid el comportamiento real vs el esperado</w:t>
-            </w:r>
-          </w:p>
-        </w:tc>
-      </w:tr>
-      <w:tr>
-        <w:tc>
-          <w:tcPr>
-            <w:tcW w:w="3000" w:type="dxa"/>
-            <w:tcBorders>
-              <w:top w:val="single" w:sz="1" w:space="0" w:color="CCCCCC"/>
-              <w:left w:val="single" w:sz="1" w:space="0" w:color="CCCCCC"/>
-              <w:bottom w:val="single" w:sz="1" w:space="0" w:color="CCCCCC"/>
-              <w:right w:val="single" w:sz="1" w:space="0" w:color="CCCCCC"/>
-            </w:tcBorders>
-            <w:shd w:val="clear" w:color="auto" w:fill="D6E4F0"/>
-            <w:tcMar>
-              <w:top w:w="80" w:type="dxa"/>
-              <w:left w:w="120" w:type="dxa"/>
-              <w:bottom w:w="80" w:type="dxa"/>
-              <w:right w:w="120" w:type="dxa"/>
-            </w:tcMar>
-          </w:tcPr>
-          <w:p>
-            <w:r>
-              <w:rPr>
-                <w:b/>
-                <w:bCs/>
-                <w:color w:val="1A1A2E"/>
-                <w:sz w:val="20"/>
-                <w:szCs w:val="20"/>
-              </w:rPr>
-              <w:t>Severidad</w:t>
-            </w:r>
-          </w:p>
-        </w:tc>
-        <w:tc>
-          <w:tcPr>
-            <w:tcW w:w="6638" w:type="dxa"/>
-            <w:tcBorders>
-              <w:top w:val="single" w:sz="1" w:space="0" w:color="CCCCCC"/>
-              <w:left w:val="single" w:sz="1" w:space="0" w:color="CCCCCC"/>
-              <w:bottom w:val="single" w:sz="1" w:space="0" w:color="CCCCCC"/>
-              <w:right w:val="single" w:sz="1" w:space="0" w:color="CCCCCC"/>
-            </w:tcBorders>
-            <w:shd w:val="clear" w:color="auto" w:fill="FFFFFF"/>
-            <w:tcMar>
-              <w:top w:w="80" w:type="dxa"/>
-              <w:left w:w="120" w:type="dxa"/>
-              <w:bottom w:w="80" w:type="dxa"/>
-              <w:right w:w="120" w:type="dxa"/>
-            </w:tcMar>
-          </w:tcPr>
-          <w:p>
-            <w:r>
-              <w:rPr>
-                <w:i/>
-                <w:iCs/>
-                <w:color w:val="AAAAAA"/>
-                <w:sz w:val="20"/>
-                <w:szCs w:val="20"/>
-              </w:rPr>
-              <w:t>Crítica / Alta / Media / Baja</w:t>
-            </w:r>
-          </w:p>
-        </w:tc>
-      </w:tr>
-      <w:tr>
-        <w:tc>
-          <w:tcPr>
-            <w:tcW w:w="3000" w:type="dxa"/>
-            <w:tcBorders>
-              <w:top w:val="single" w:sz="1" w:space="0" w:color="CCCCCC"/>
-              <w:left w:val="single" w:sz="1" w:space="0" w:color="CCCCCC"/>
-              <w:bottom w:val="single" w:sz="1" w:space="0" w:color="CCCCCC"/>
-              <w:right w:val="single" w:sz="1" w:space="0" w:color="CCCCCC"/>
-            </w:tcBorders>
-            <w:shd w:val="clear" w:color="auto" w:fill="D6E4F0"/>
-            <w:tcMar>
-              <w:top w:w="80" w:type="dxa"/>
-              <w:left w:w="120" w:type="dxa"/>
-              <w:bottom w:w="80" w:type="dxa"/>
-              <w:right w:w="120" w:type="dxa"/>
-            </w:tcMar>
-          </w:tcPr>
-          <w:p>
-            <w:r>
-              <w:rPr>
-                <w:b/>
-                <w:bCs/>
-                <w:color w:val="1A1A2E"/>
-                <w:sz w:val="20"/>
-                <w:szCs w:val="20"/>
-              </w:rPr>
-              <w:t>Prioridad de corrección</w:t>
-            </w:r>
-          </w:p>
-        </w:tc>
-        <w:tc>
-          <w:tcPr>
-            <w:tcW w:w="6638" w:type="dxa"/>
-            <w:tcBorders>
-              <w:top w:val="single" w:sz="1" w:space="0" w:color="CCCCCC"/>
-              <w:left w:val="single" w:sz="1" w:space="0" w:color="CCCCCC"/>
-              <w:bottom w:val="single" w:sz="1" w:space="0" w:color="CCCCCC"/>
-              <w:right w:val="single" w:sz="1" w:space="0" w:color="CCCCCC"/>
-            </w:tcBorders>
-            <w:shd w:val="clear" w:color="auto" w:fill="FFFFFF"/>
-            <w:tcMar>
-              <w:top w:w="80" w:type="dxa"/>
-              <w:left w:w="120" w:type="dxa"/>
-              <w:bottom w:w="80" w:type="dxa"/>
-              <w:right w:w="120" w:type="dxa"/>
-            </w:tcMar>
-          </w:tcPr>
-          <w:p>
-            <w:r>
-              <w:rPr>
-                <w:i/>
-                <w:iCs/>
-                <w:color w:val="AAAAAA"/>
-                <w:sz w:val="20"/>
-                <w:szCs w:val="20"/>
-              </w:rPr>
-              <w:t>Alta / Media / Baja</w:t>
-            </w:r>
-          </w:p>
-        </w:tc>
-      </w:tr>
-      <w:tr>
-        <w:tc>
-          <w:tcPr>
-            <w:tcW w:w="3000" w:type="dxa"/>
-            <w:tcBorders>
-              <w:top w:val="single" w:sz="1" w:space="0" w:color="CCCCCC"/>
-              <w:left w:val="single" w:sz="1" w:space="0" w:color="CCCCCC"/>
-              <w:bottom w:val="single" w:sz="1" w:space="0" w:color="CCCCCC"/>
-              <w:right w:val="single" w:sz="1" w:space="0" w:color="CCCCCC"/>
-            </w:tcBorders>
-            <w:shd w:val="clear" w:color="auto" w:fill="D6E4F0"/>
-            <w:tcMar>
-              <w:top w:w="80" w:type="dxa"/>
-              <w:left w:w="120" w:type="dxa"/>
-              <w:bottom w:w="80" w:type="dxa"/>
-              <w:right w:w="120" w:type="dxa"/>
-            </w:tcMar>
-          </w:tcPr>
-          <w:p>
-            <w:r>
-              <w:rPr>
-                <w:b/>
-                <w:bCs/>
-                <w:color w:val="1A1A2E"/>
-                <w:sz w:val="20"/>
-                <w:szCs w:val="20"/>
-              </w:rPr>
-              <w:t>Reproducible</w:t>
-            </w:r>
-          </w:p>
-        </w:tc>
-        <w:tc>
-          <w:tcPr>
-            <w:tcW w:w="6638" w:type="dxa"/>
-            <w:tcBorders>
-              <w:top w:val="single" w:sz="1" w:space="0" w:color="CCCCCC"/>
-              <w:left w:val="single" w:sz="1" w:space="0" w:color="CCCCCC"/>
-              <w:bottom w:val="single" w:sz="1" w:space="0" w:color="CCCCCC"/>
-              <w:right w:val="single" w:sz="1" w:space="0" w:color="CCCCCC"/>
-            </w:tcBorders>
-            <w:shd w:val="clear" w:color="auto" w:fill="FFFFFF"/>
-            <w:tcMar>
-              <w:top w:w="80" w:type="dxa"/>
-              <w:left w:w="120" w:type="dxa"/>
-              <w:bottom w:w="80" w:type="dxa"/>
-              <w:right w:w="120" w:type="dxa"/>
-            </w:tcMar>
-          </w:tcPr>
-          <w:p>
-            <w:r>
-              <w:rPr>
-                <w:i/>
-                <w:iCs/>
-                <w:color w:val="AAAAAA"/>
-                <w:sz w:val="20"/>
-                <w:szCs w:val="20"/>
-              </w:rPr>
-              <w:t>Sí / No</w:t>
-            </w:r>
-          </w:p>
-        </w:tc>
-      </w:tr>
-      <w:tr>
-        <w:tc>
-          <w:tcPr>
-            <w:tcW w:w="3000" w:type="dxa"/>
-            <w:tcBorders>
-              <w:top w:val="single" w:sz="1" w:space="0" w:color="CCCCCC"/>
-              <w:left w:val="single" w:sz="1" w:space="0" w:color="CCCCCC"/>
-              <w:bottom w:val="single" w:sz="1" w:space="0" w:color="CCCCCC"/>
-              <w:right w:val="single" w:sz="1" w:space="0" w:color="CCCCCC"/>
-            </w:tcBorders>
-            <w:shd w:val="clear" w:color="auto" w:fill="D6E4F0"/>
-            <w:tcMar>
-              <w:top w:w="80" w:type="dxa"/>
-              <w:left w:w="120" w:type="dxa"/>
-              <w:bottom w:w="80" w:type="dxa"/>
-              <w:right w:w="120" w:type="dxa"/>
-            </w:tcMar>
-          </w:tcPr>
-          <w:p>
-            <w:r>
-              <w:rPr>
-                <w:b/>
-                <w:bCs/>
-                <w:color w:val="1A1A2E"/>
-                <w:sz w:val="20"/>
-                <w:szCs w:val="20"/>
-              </w:rPr>
-              <w:t>Estado</w:t>
-            </w:r>
-          </w:p>
-        </w:tc>
-        <w:tc>
-          <w:tcPr>
-            <w:tcW w:w="6638" w:type="dxa"/>
-            <w:tcBorders>
-              <w:top w:val="single" w:sz="1" w:space="0" w:color="CCCCCC"/>
-              <w:left w:val="single" w:sz="1" w:space="0" w:color="CCCCCC"/>
-              <w:bottom w:val="single" w:sz="1" w:space="0" w:color="CCCCCC"/>
-              <w:right w:val="single" w:sz="1" w:space="0" w:color="CCCCCC"/>
-            </w:tcBorders>
-            <w:shd w:val="clear" w:color="auto" w:fill="FFFFFF"/>
-            <w:tcMar>
-              <w:top w:w="80" w:type="dxa"/>
-              <w:left w:w="120" w:type="dxa"/>
-              <w:bottom w:w="80" w:type="dxa"/>
-              <w:right w:w="120" w:type="dxa"/>
-            </w:tcMar>
-          </w:tcPr>
-          <w:p>
-            <w:r>
-              <w:rPr>
-                <w:i/>
-                <w:iCs/>
-                <w:color w:val="AAAAAA"/>
-                <w:sz w:val="20"/>
-                <w:szCs w:val="20"/>
-              </w:rPr>
-              <w:t>Abierto / Corregido / Descartado</w:t>
-            </w:r>
-          </w:p>
-        </w:tc>
-      </w:tr>
-      <w:tr>
-        <w:tc>
-          <w:tcPr>
-            <w:tcW w:w="3000" w:type="dxa"/>
-            <w:tcBorders>
-              <w:top w:val="single" w:sz="1" w:space="0" w:color="CCCCCC"/>
-              <w:left w:val="single" w:sz="1" w:space="0" w:color="CCCCCC"/>
-              <w:bottom w:val="single" w:sz="1" w:space="0" w:color="CCCCCC"/>
-              <w:right w:val="single" w:sz="1" w:space="0" w:color="CCCCCC"/>
-            </w:tcBorders>
-            <w:shd w:val="clear" w:color="auto" w:fill="D6E4F0"/>
-            <w:tcMar>
-              <w:top w:w="80" w:type="dxa"/>
-              <w:left w:w="120" w:type="dxa"/>
-              <w:bottom w:w="80" w:type="dxa"/>
-              <w:right w:w="120" w:type="dxa"/>
-            </w:tcMar>
-          </w:tcPr>
-          <w:p>
-            <w:r>
-              <w:rPr>
-                <w:b/>
-                <w:bCs/>
-                <w:color w:val="1A1A2E"/>
-                <w:sz w:val="20"/>
-                <w:szCs w:val="20"/>
-              </w:rPr>
-              <w:t>Corrección aplicada</w:t>
-            </w:r>
-          </w:p>
-        </w:tc>
-        <w:tc>
-          <w:tcPr>
-            <w:tcW w:w="6638" w:type="dxa"/>
-            <w:tcBorders>
-              <w:top w:val="single" w:sz="1" w:space="0" w:color="CCCCCC"/>
-              <w:left w:val="single" w:sz="1" w:space="0" w:color="CCCCCC"/>
-              <w:bottom w:val="single" w:sz="1" w:space="0" w:color="CCCCCC"/>
-              <w:right w:val="single" w:sz="1" w:space="0" w:color="CCCCCC"/>
-            </w:tcBorders>
-            <w:shd w:val="clear" w:color="auto" w:fill="FFFFFF"/>
-            <w:tcMar>
-              <w:top w:w="80" w:type="dxa"/>
-              <w:left w:w="120" w:type="dxa"/>
-              <w:bottom w:w="80" w:type="dxa"/>
-              <w:right w:w="120" w:type="dxa"/>
-            </w:tcMar>
-          </w:tcPr>
-          <w:p>
-            <w:r>
-              <w:rPr>
-                <w:i/>
-                <w:iCs/>
-                <w:color w:val="AAAAAA"/>
-                <w:sz w:val="20"/>
-                <w:szCs w:val="20"/>
-              </w:rPr>
-              <w:t>Si lo corregisteis: describid qué cambiasteis en el código. Si no: explicad por qué no.</w:t>
-            </w:r>
-          </w:p>
-        </w:tc>
-      </w:tr>
-      <w:tr>
-        <w:tc>
-          <w:tcPr>
-            <w:tcW w:w="3000" w:type="dxa"/>
-            <w:tcBorders>
-              <w:top w:val="single" w:sz="1" w:space="0" w:color="CCCCCC"/>
-              <w:left w:val="single" w:sz="1" w:space="0" w:color="CCCCCC"/>
-              <w:bottom w:val="single" w:sz="1" w:space="0" w:color="CCCCCC"/>
-              <w:right w:val="single" w:sz="1" w:space="0" w:color="CCCCCC"/>
-            </w:tcBorders>
-            <w:shd w:val="clear" w:color="auto" w:fill="D6E4F0"/>
-            <w:tcMar>
-              <w:top w:w="80" w:type="dxa"/>
-              <w:left w:w="120" w:type="dxa"/>
-              <w:bottom w:w="80" w:type="dxa"/>
-              <w:right w:w="120" w:type="dxa"/>
-            </w:tcMar>
-          </w:tcPr>
-          <w:p>
-            <w:r>
-              <w:rPr>
-                <w:b/>
-                <w:bCs/>
-                <w:color w:val="1A1A2E"/>
-                <w:sz w:val="20"/>
-                <w:szCs w:val="20"/>
-              </w:rPr>
-              <w:t>Commit de la corrección</w:t>
-            </w:r>
-          </w:p>
-        </w:tc>
-        <w:tc>
-          <w:tcPr>
-            <w:tcW w:w="6638" w:type="dxa"/>
-            <w:tcBorders>
-              <w:top w:val="single" w:sz="1" w:space="0" w:color="CCCCCC"/>
-              <w:left w:val="single" w:sz="1" w:space="0" w:color="CCCCCC"/>
-              <w:bottom w:val="single" w:sz="1" w:space="0" w:color="CCCCCC"/>
-              <w:right w:val="single" w:sz="1" w:space="0" w:color="CCCCCC"/>
-            </w:tcBorders>
-            <w:shd w:val="clear" w:color="auto" w:fill="FFFFFF"/>
-            <w:tcMar>
-              <w:top w:w="80" w:type="dxa"/>
-              <w:left w:w="120" w:type="dxa"/>
-              <w:bottom w:w="80" w:type="dxa"/>
-              <w:right w:w="120" w:type="dxa"/>
-            </w:tcMar>
-          </w:tcPr>
-          <w:p>
-            <w:r>
-              <w:rPr>
-                <w:i/>
-                <w:iCs/>
-                <w:color w:val="AAAAAA"/>
-                <w:sz w:val="20"/>
-                <w:szCs w:val="20"/>
-              </w:rPr>
-              <w:t>SHA del commit con el fix (si lo hay)</w:t>
+            <w:tcW w:w="4290" w:type="dxa"/>
+            <w:tcBorders>
+              <w:top w:val="single" w:sz="2" w:space="0" w:color="CCCCCC"/>
+              <w:left w:val="single" w:sz="2" w:space="0" w:color="CCCCCC"/>
+              <w:bottom w:val="single" w:sz="2" w:space="0" w:color="CCCCCC"/>
+              <w:right w:val="single" w:sz="2" w:space="0" w:color="CCCCCC"/>
+            </w:tcBorders>
+            <w:tcMar>
+              <w:top w:w="80" w:type="dxa"/>
+              <w:left w:w="120" w:type="dxa"/>
+              <w:bottom w:w="80" w:type="dxa"/>
+              <w:right w:w="120" w:type="dxa"/>
+            </w:tcMar>
+            <w:vAlign w:val="center"/>
+          </w:tcPr>
+          <w:p>
+            <w:pPr>
+              <w:rPr>
+                <w:sz w:val="20"/>
+                <w:szCs w:val="20"/>
+              </w:rPr>
+            </w:pPr>
+            <w:r>
+              <w:rPr>
+                <w:color w:val="000000"/>
+                <w:sz w:val="20"/>
+                <w:szCs w:val="20"/>
+              </w:rPr>
+              <w:t>a9fad91</w:t>
             </w:r>
           </w:p>
         </w:tc>
@@ -26108,11 +25730,6 @@
       </w:r>
     </w:p>
     <w:p>
-      <w:r>
-        <w:br w:type="page"/>
-      </w:r>
-    </w:p>
-    <w:p>
       <w:pPr>
         <w:pStyle w:val="Ttulo1"/>
         <w:pBdr>
@@ -26120,7 +25737,6 @@
         </w:pBdr>
       </w:pPr>
       <w:r>
-        <w:lastRenderedPageBreak/>
         <w:t>PARTE 6 – Informe de Resumen de Pruebas (ISO/IEC 29119-3 §15)</w:t>
       </w:r>
     </w:p>
@@ -26166,7 +25782,7 @@
         <w:tblLook w:val="04A0" w:firstRow="1" w:lastRow="0" w:firstColumn="1" w:lastColumn="0" w:noHBand="0" w:noVBand="1"/>
       </w:tblPr>
       <w:tblGrid>
-        <w:gridCol w:w="9638"/>
+        <w:gridCol w:w="9870"/>
       </w:tblGrid>
       <w:tr>
         <w:tc>
@@ -26267,50 +25883,56 @@
             </w:pPr>
             <w:r>
               <w:rPr>
-                <w:color w:val="AAAAAA"/>
-                <w:sz w:val="20"/>
-                <w:szCs w:val="20"/>
-              </w:rPr>
-              <w:t xml:space="preserve"> </w:t>
-            </w:r>
-          </w:p>
-          <w:p>
-            <w:pPr>
-              <w:spacing w:after="80"/>
-            </w:pPr>
-            <w:r>
-              <w:rPr>
-                <w:color w:val="AAAAAA"/>
-                <w:sz w:val="20"/>
-                <w:szCs w:val="20"/>
-              </w:rPr>
-              <w:t xml:space="preserve"> </w:t>
-            </w:r>
-          </w:p>
-          <w:p>
-            <w:pPr>
-              <w:spacing w:after="80"/>
-            </w:pPr>
-            <w:r>
-              <w:rPr>
-                <w:color w:val="AAAAAA"/>
-                <w:sz w:val="20"/>
-                <w:szCs w:val="20"/>
-              </w:rPr>
-              <w:t xml:space="preserve"> </w:t>
-            </w:r>
-          </w:p>
-          <w:p>
-            <w:pPr>
-              <w:spacing w:after="80"/>
-            </w:pPr>
-            <w:r>
-              <w:rPr>
-                <w:color w:val="AAAAAA"/>
-                <w:sz w:val="20"/>
-                <w:szCs w:val="20"/>
-              </w:rPr>
-              <w:t xml:space="preserve"> </w:t>
+                <w:noProof/>
+              </w:rPr>
+              <w:drawing>
+                <wp:inline distT="0" distB="0" distL="0" distR="0" wp14:anchorId="4E473A82" wp14:editId="28517593">
+                  <wp:extent cx="6115050" cy="581025"/>
+                  <wp:effectExtent l="0" t="0" r="0" b="9525"/>
+                  <wp:docPr id="268951994" name="Imagen 1"/>
+                  <wp:cNvGraphicFramePr>
+                    <a:graphicFrameLocks xmlns:a="http://schemas.openxmlformats.org/drawingml/2006/main" noChangeAspect="1"/>
+                  </wp:cNvGraphicFramePr>
+                  <a:graphic xmlns:a="http://schemas.openxmlformats.org/drawingml/2006/main">
+                    <a:graphicData uri="http://schemas.openxmlformats.org/drawingml/2006/picture">
+                      <pic:pic xmlns:pic="http://schemas.openxmlformats.org/drawingml/2006/picture">
+                        <pic:nvPicPr>
+                          <pic:cNvPr id="0" name="Picture 1"/>
+                          <pic:cNvPicPr>
+                            <a:picLocks noChangeAspect="1" noChangeArrowheads="1"/>
+                          </pic:cNvPicPr>
+                        </pic:nvPicPr>
+                        <pic:blipFill>
+                          <a:blip r:embed="rId10">
+                            <a:extLst>
+                              <a:ext uri="{28A0092B-C50C-407E-A947-70E740481C1C}">
+                                <a14:useLocalDpi xmlns:a14="http://schemas.microsoft.com/office/drawing/2010/main" val="0"/>
+                              </a:ext>
+                            </a:extLst>
+                          </a:blip>
+                          <a:srcRect/>
+                          <a:stretch>
+                            <a:fillRect/>
+                          </a:stretch>
+                        </pic:blipFill>
+                        <pic:spPr bwMode="auto">
+                          <a:xfrm>
+                            <a:off x="0" y="0"/>
+                            <a:ext cx="6115050" cy="581025"/>
+                          </a:xfrm>
+                          <a:prstGeom prst="rect">
+                            <a:avLst/>
+                          </a:prstGeom>
+                          <a:noFill/>
+                          <a:ln>
+                            <a:noFill/>
+                          </a:ln>
+                        </pic:spPr>
+                      </pic:pic>
+                    </a:graphicData>
+                  </a:graphic>
+                </wp:inline>
+              </w:drawing>
             </w:r>
           </w:p>
         </w:tc>
@@ -26401,7 +26023,14 @@
               <w:right w:w="120" w:type="dxa"/>
             </w:tcMar>
           </w:tcPr>
-          <w:p/>
+          <w:p>
+            <w:r>
+              <w:t>2</w:t>
+            </w:r>
+            <w:r>
+              <w:t>9</w:t>
+            </w:r>
+          </w:p>
         </w:tc>
       </w:tr>
       <w:tr>
@@ -26452,7 +26081,14 @@
               <w:right w:w="120" w:type="dxa"/>
             </w:tcMar>
           </w:tcPr>
-          <w:p/>
+          <w:p>
+            <w:r>
+              <w:t>2</w:t>
+            </w:r>
+            <w:r>
+              <w:t>9</w:t>
+            </w:r>
+          </w:p>
         </w:tc>
       </w:tr>
       <w:tr>
@@ -26503,7 +26139,14 @@
               <w:right w:w="120" w:type="dxa"/>
             </w:tcMar>
           </w:tcPr>
-          <w:p/>
+          <w:p>
+            <w:r>
+              <w:t>2</w:t>
+            </w:r>
+            <w:r>
+              <w:t>9</w:t>
+            </w:r>
+          </w:p>
         </w:tc>
       </w:tr>
       <w:tr>
@@ -26554,7 +26197,11 @@
               <w:right w:w="120" w:type="dxa"/>
             </w:tcMar>
           </w:tcPr>
-          <w:p/>
+          <w:p>
+            <w:r>
+              <w:t>0</w:t>
+            </w:r>
+          </w:p>
         </w:tc>
       </w:tr>
       <w:tr>
@@ -26606,139 +26253,40 @@
             </w:tcMar>
           </w:tcPr>
           <w:p>
+            <w:pPr>
+              <w:rPr>
+                <w:color w:val="000000" w:themeColor="text1"/>
+              </w:rPr>
+            </w:pPr>
             <w:r>
               <w:rPr>
                 <w:i/>
                 <w:iCs/>
-                <w:color w:val="AAAAAA"/>
-                <w:sz w:val="20"/>
-                <w:szCs w:val="20"/>
-              </w:rPr>
-              <w:t>(pasados / total) × 100 = _____ %</w:t>
-            </w:r>
-          </w:p>
-        </w:tc>
-      </w:tr>
-      <w:tr>
-        <w:tc>
-          <w:tcPr>
-            <w:tcW w:w="3000" w:type="dxa"/>
-            <w:tcBorders>
-              <w:top w:val="single" w:sz="1" w:space="0" w:color="CCCCCC"/>
-              <w:left w:val="single" w:sz="1" w:space="0" w:color="CCCCCC"/>
-              <w:bottom w:val="single" w:sz="1" w:space="0" w:color="CCCCCC"/>
-              <w:right w:val="single" w:sz="1" w:space="0" w:color="CCCCCC"/>
-            </w:tcBorders>
-            <w:shd w:val="clear" w:color="auto" w:fill="D6E4F0"/>
-            <w:tcMar>
-              <w:top w:w="80" w:type="dxa"/>
-              <w:left w:w="120" w:type="dxa"/>
-              <w:bottom w:w="80" w:type="dxa"/>
-              <w:right w:w="120" w:type="dxa"/>
-            </w:tcMar>
-          </w:tcPr>
-          <w:p>
-            <w:r>
-              <w:rPr>
-                <w:b/>
-                <w:bCs/>
-                <w:color w:val="1A1A2E"/>
-                <w:sz w:val="20"/>
-                <w:szCs w:val="20"/>
-              </w:rPr>
-              <w:t>Cobertura de líneas (JaCoCo)</w:t>
-            </w:r>
-          </w:p>
-        </w:tc>
-        <w:tc>
-          <w:tcPr>
-            <w:tcW w:w="6638" w:type="dxa"/>
-            <w:tcBorders>
-              <w:top w:val="single" w:sz="1" w:space="0" w:color="CCCCCC"/>
-              <w:left w:val="single" w:sz="1" w:space="0" w:color="CCCCCC"/>
-              <w:bottom w:val="single" w:sz="1" w:space="0" w:color="CCCCCC"/>
-              <w:right w:val="single" w:sz="1" w:space="0" w:color="CCCCCC"/>
-            </w:tcBorders>
-            <w:shd w:val="clear" w:color="auto" w:fill="FFFFFF"/>
-            <w:tcMar>
-              <w:top w:w="80" w:type="dxa"/>
-              <w:left w:w="120" w:type="dxa"/>
-              <w:bottom w:w="80" w:type="dxa"/>
-              <w:right w:w="120" w:type="dxa"/>
-            </w:tcMar>
-          </w:tcPr>
-          <w:p>
+                <w:color w:val="000000" w:themeColor="text1"/>
+                <w:sz w:val="20"/>
+                <w:szCs w:val="20"/>
+              </w:rPr>
+              <w:t xml:space="preserve">(pasados / total) × 100 = </w:t>
+            </w:r>
             <w:r>
               <w:rPr>
                 <w:i/>
                 <w:iCs/>
-                <w:color w:val="AAAAAA"/>
-                <w:sz w:val="20"/>
-                <w:szCs w:val="20"/>
-              </w:rPr>
-              <w:t>______ %</w:t>
-            </w:r>
-          </w:p>
-        </w:tc>
-      </w:tr>
-      <w:tr>
-        <w:tc>
-          <w:tcPr>
-            <w:tcW w:w="3000" w:type="dxa"/>
-            <w:tcBorders>
-              <w:top w:val="single" w:sz="1" w:space="0" w:color="CCCCCC"/>
-              <w:left w:val="single" w:sz="1" w:space="0" w:color="CCCCCC"/>
-              <w:bottom w:val="single" w:sz="1" w:space="0" w:color="CCCCCC"/>
-              <w:right w:val="single" w:sz="1" w:space="0" w:color="CCCCCC"/>
-            </w:tcBorders>
-            <w:shd w:val="clear" w:color="auto" w:fill="D6E4F0"/>
-            <w:tcMar>
-              <w:top w:w="80" w:type="dxa"/>
-              <w:left w:w="120" w:type="dxa"/>
-              <w:bottom w:w="80" w:type="dxa"/>
-              <w:right w:w="120" w:type="dxa"/>
-            </w:tcMar>
-          </w:tcPr>
-          <w:p>
-            <w:r>
-              <w:rPr>
-                <w:b/>
-                <w:bCs/>
-                <w:color w:val="1A1A2E"/>
-                <w:sz w:val="20"/>
-                <w:szCs w:val="20"/>
-              </w:rPr>
-              <w:t>Cobertura de ramas (JaCoCo)</w:t>
-            </w:r>
-          </w:p>
-        </w:tc>
-        <w:tc>
-          <w:tcPr>
-            <w:tcW w:w="6638" w:type="dxa"/>
-            <w:tcBorders>
-              <w:top w:val="single" w:sz="1" w:space="0" w:color="CCCCCC"/>
-              <w:left w:val="single" w:sz="1" w:space="0" w:color="CCCCCC"/>
-              <w:bottom w:val="single" w:sz="1" w:space="0" w:color="CCCCCC"/>
-              <w:right w:val="single" w:sz="1" w:space="0" w:color="CCCCCC"/>
-            </w:tcBorders>
-            <w:shd w:val="clear" w:color="auto" w:fill="FFFFFF"/>
-            <w:tcMar>
-              <w:top w:w="80" w:type="dxa"/>
-              <w:left w:w="120" w:type="dxa"/>
-              <w:bottom w:w="80" w:type="dxa"/>
-              <w:right w:w="120" w:type="dxa"/>
-            </w:tcMar>
-          </w:tcPr>
-          <w:p>
+                <w:color w:val="000000" w:themeColor="text1"/>
+                <w:sz w:val="20"/>
+                <w:szCs w:val="20"/>
+              </w:rPr>
+              <w:t>100</w:t>
+            </w:r>
             <w:r>
               <w:rPr>
                 <w:i/>
                 <w:iCs/>
-                <w:color w:val="AAAAAA"/>
-                <w:sz w:val="20"/>
-                <w:szCs w:val="20"/>
-              </w:rPr>
-              <w:t>______ %</w:t>
+                <w:color w:val="000000" w:themeColor="text1"/>
+                <w:sz w:val="20"/>
+                <w:szCs w:val="20"/>
+              </w:rPr>
+              <w:t xml:space="preserve"> %</w:t>
             </w:r>
           </w:p>
         </w:tc>
@@ -26770,6 +26318,161 @@
                 <w:sz w:val="20"/>
                 <w:szCs w:val="20"/>
               </w:rPr>
+              <w:lastRenderedPageBreak/>
+              <w:t>Cobertura de líneas (JaCoCo)</w:t>
+            </w:r>
+          </w:p>
+        </w:tc>
+        <w:tc>
+          <w:tcPr>
+            <w:tcW w:w="6638" w:type="dxa"/>
+            <w:tcBorders>
+              <w:top w:val="single" w:sz="1" w:space="0" w:color="CCCCCC"/>
+              <w:left w:val="single" w:sz="1" w:space="0" w:color="CCCCCC"/>
+              <w:bottom w:val="single" w:sz="1" w:space="0" w:color="CCCCCC"/>
+              <w:right w:val="single" w:sz="1" w:space="0" w:color="CCCCCC"/>
+            </w:tcBorders>
+            <w:shd w:val="clear" w:color="auto" w:fill="FFFFFF"/>
+            <w:tcMar>
+              <w:top w:w="80" w:type="dxa"/>
+              <w:left w:w="120" w:type="dxa"/>
+              <w:bottom w:w="80" w:type="dxa"/>
+              <w:right w:w="120" w:type="dxa"/>
+            </w:tcMar>
+          </w:tcPr>
+          <w:p>
+            <w:pPr>
+              <w:rPr>
+                <w:color w:val="000000" w:themeColor="text1"/>
+              </w:rPr>
+            </w:pPr>
+            <w:r>
+              <w:rPr>
+                <w:i/>
+                <w:iCs/>
+                <w:color w:val="000000" w:themeColor="text1"/>
+                <w:sz w:val="20"/>
+                <w:szCs w:val="20"/>
+              </w:rPr>
+              <w:t>97</w:t>
+            </w:r>
+            <w:r>
+              <w:rPr>
+                <w:i/>
+                <w:iCs/>
+                <w:color w:val="000000" w:themeColor="text1"/>
+                <w:sz w:val="20"/>
+                <w:szCs w:val="20"/>
+              </w:rPr>
+              <w:t xml:space="preserve"> %</w:t>
+            </w:r>
+          </w:p>
+        </w:tc>
+      </w:tr>
+      <w:tr>
+        <w:tc>
+          <w:tcPr>
+            <w:tcW w:w="3000" w:type="dxa"/>
+            <w:tcBorders>
+              <w:top w:val="single" w:sz="1" w:space="0" w:color="CCCCCC"/>
+              <w:left w:val="single" w:sz="1" w:space="0" w:color="CCCCCC"/>
+              <w:bottom w:val="single" w:sz="1" w:space="0" w:color="CCCCCC"/>
+              <w:right w:val="single" w:sz="1" w:space="0" w:color="CCCCCC"/>
+            </w:tcBorders>
+            <w:shd w:val="clear" w:color="auto" w:fill="D6E4F0"/>
+            <w:tcMar>
+              <w:top w:w="80" w:type="dxa"/>
+              <w:left w:w="120" w:type="dxa"/>
+              <w:bottom w:w="80" w:type="dxa"/>
+              <w:right w:w="120" w:type="dxa"/>
+            </w:tcMar>
+          </w:tcPr>
+          <w:p>
+            <w:r>
+              <w:rPr>
+                <w:b/>
+                <w:bCs/>
+                <w:color w:val="1A1A2E"/>
+                <w:sz w:val="20"/>
+                <w:szCs w:val="20"/>
+              </w:rPr>
+              <w:t>Cobertura de ramas (JaCoCo)</w:t>
+            </w:r>
+          </w:p>
+        </w:tc>
+        <w:tc>
+          <w:tcPr>
+            <w:tcW w:w="6638" w:type="dxa"/>
+            <w:tcBorders>
+              <w:top w:val="single" w:sz="1" w:space="0" w:color="CCCCCC"/>
+              <w:left w:val="single" w:sz="1" w:space="0" w:color="CCCCCC"/>
+              <w:bottom w:val="single" w:sz="1" w:space="0" w:color="CCCCCC"/>
+              <w:right w:val="single" w:sz="1" w:space="0" w:color="CCCCCC"/>
+            </w:tcBorders>
+            <w:shd w:val="clear" w:color="auto" w:fill="FFFFFF"/>
+            <w:tcMar>
+              <w:top w:w="80" w:type="dxa"/>
+              <w:left w:w="120" w:type="dxa"/>
+              <w:bottom w:w="80" w:type="dxa"/>
+              <w:right w:w="120" w:type="dxa"/>
+            </w:tcMar>
+          </w:tcPr>
+          <w:p>
+            <w:pPr>
+              <w:rPr>
+                <w:color w:val="000000" w:themeColor="text1"/>
+              </w:rPr>
+            </w:pPr>
+            <w:r>
+              <w:rPr>
+                <w:i/>
+                <w:iCs/>
+                <w:color w:val="000000" w:themeColor="text1"/>
+                <w:sz w:val="20"/>
+                <w:szCs w:val="20"/>
+              </w:rPr>
+              <w:t>90</w:t>
+            </w:r>
+            <w:r>
+              <w:rPr>
+                <w:i/>
+                <w:iCs/>
+                <w:color w:val="000000" w:themeColor="text1"/>
+                <w:sz w:val="20"/>
+                <w:szCs w:val="20"/>
+              </w:rPr>
+              <w:t xml:space="preserve"> %</w:t>
+            </w:r>
+          </w:p>
+        </w:tc>
+      </w:tr>
+      <w:tr>
+        <w:tc>
+          <w:tcPr>
+            <w:tcW w:w="3000" w:type="dxa"/>
+            <w:tcBorders>
+              <w:top w:val="single" w:sz="1" w:space="0" w:color="CCCCCC"/>
+              <w:left w:val="single" w:sz="1" w:space="0" w:color="CCCCCC"/>
+              <w:bottom w:val="single" w:sz="1" w:space="0" w:color="CCCCCC"/>
+              <w:right w:val="single" w:sz="1" w:space="0" w:color="CCCCCC"/>
+            </w:tcBorders>
+            <w:shd w:val="clear" w:color="auto" w:fill="D6E4F0"/>
+            <w:tcMar>
+              <w:top w:w="80" w:type="dxa"/>
+              <w:left w:w="120" w:type="dxa"/>
+              <w:bottom w:w="80" w:type="dxa"/>
+              <w:right w:w="120" w:type="dxa"/>
+            </w:tcMar>
+          </w:tcPr>
+          <w:p>
+            <w:r>
+              <w:rPr>
+                <w:b/>
+                <w:bCs/>
+                <w:color w:val="1A1A2E"/>
+                <w:sz w:val="20"/>
+                <w:szCs w:val="20"/>
+              </w:rPr>
               <w:t>Defectos encontrados</w:t>
             </w:r>
           </w:p>
@@ -26791,7 +26494,19 @@
               <w:right w:w="120" w:type="dxa"/>
             </w:tcMar>
           </w:tcPr>
-          <w:p/>
+          <w:p>
+            <w:pPr>
+              <w:rPr>
+                <w:color w:val="000000" w:themeColor="text1"/>
+              </w:rPr>
+            </w:pPr>
+            <w:r>
+              <w:rPr>
+                <w:color w:val="000000" w:themeColor="text1"/>
+              </w:rPr>
+              <w:t>2</w:t>
+            </w:r>
+          </w:p>
         </w:tc>
       </w:tr>
       <w:tr>
@@ -26842,7 +26557,19 @@
               <w:right w:w="120" w:type="dxa"/>
             </w:tcMar>
           </w:tcPr>
-          <w:p/>
+          <w:p>
+            <w:pPr>
+              <w:rPr>
+                <w:color w:val="000000" w:themeColor="text1"/>
+              </w:rPr>
+            </w:pPr>
+            <w:r>
+              <w:rPr>
+                <w:color w:val="000000" w:themeColor="text1"/>
+              </w:rPr>
+              <w:t>2</w:t>
+            </w:r>
+          </w:p>
         </w:tc>
       </w:tr>
       <w:tr>
@@ -26893,7 +26620,19 @@
               <w:right w:w="120" w:type="dxa"/>
             </w:tcMar>
           </w:tcPr>
-          <w:p/>
+          <w:p>
+            <w:pPr>
+              <w:rPr>
+                <w:color w:val="000000" w:themeColor="text1"/>
+              </w:rPr>
+            </w:pPr>
+            <w:r>
+              <w:rPr>
+                <w:color w:val="000000" w:themeColor="text1"/>
+              </w:rPr>
+              <w:t>0</w:t>
+            </w:r>
+          </w:p>
         </w:tc>
       </w:tr>
     </w:tbl>
@@ -26993,7 +26732,6 @@
                 <w:noProof/>
                 <w:color w:val="AAAAAA"/>
               </w:rPr>
-              <w:lastRenderedPageBreak/>
               <w:drawing>
                 <wp:inline distT="0" distB="0" distL="0" distR="0" wp14:anchorId="12E9942D" wp14:editId="25E63081">
                   <wp:extent cx="6120130" cy="1250315"/>
@@ -27010,7 +26748,7 @@
                           <pic:cNvPicPr/>
                         </pic:nvPicPr>
                         <pic:blipFill>
-                          <a:blip r:embed="rId9"/>
+                          <a:blip r:embed="rId11"/>
                           <a:stretch>
                             <a:fillRect/>
                           </a:stretch>
@@ -27166,53 +26904,192 @@
           <w:p>
             <w:pPr>
               <w:spacing w:after="80"/>
-            </w:pPr>
-            <w:r>
-              <w:rPr>
-                <w:color w:val="AAAAAA"/>
+              <w:rPr>
+                <w:color w:val="000000" w:themeColor="text1"/>
+                <w:sz w:val="20"/>
+                <w:szCs w:val="20"/>
+              </w:rPr>
+            </w:pPr>
+            <w:r>
+              <w:rPr>
+                <w:color w:val="000000" w:themeColor="text1"/>
                 <w:sz w:val="20"/>
                 <w:szCs w:val="20"/>
               </w:rPr>
               <w:t xml:space="preserve"> </w:t>
             </w:r>
+            <w:r>
+              <w:rPr>
+                <w:color w:val="000000" w:themeColor="text1"/>
+                <w:sz w:val="20"/>
+                <w:szCs w:val="20"/>
+              </w:rPr>
+              <w:t xml:space="preserve">El software, en su estado original, </w:t>
+            </w:r>
+            <w:r>
+              <w:rPr>
+                <w:color w:val="000000" w:themeColor="text1"/>
+                <w:sz w:val="20"/>
+                <w:szCs w:val="20"/>
+              </w:rPr>
+              <w:t>no</w:t>
+            </w:r>
+            <w:r>
+              <w:rPr>
+                <w:color w:val="000000" w:themeColor="text1"/>
+                <w:sz w:val="20"/>
+                <w:szCs w:val="20"/>
+              </w:rPr>
+              <w:t xml:space="preserve"> era apto para </w:t>
+            </w:r>
+            <w:r>
+              <w:rPr>
+                <w:color w:val="000000" w:themeColor="text1"/>
+                <w:sz w:val="20"/>
+                <w:szCs w:val="20"/>
+              </w:rPr>
+              <w:t>usarse en producci</w:t>
+            </w:r>
+            <w:r>
+              <w:rPr>
+                <w:color w:val="000000" w:themeColor="text1"/>
+                <w:sz w:val="20"/>
+                <w:szCs w:val="20"/>
+              </w:rPr>
+              <w:t>ón</w:t>
+            </w:r>
+            <w:r>
+              <w:rPr>
+                <w:color w:val="000000" w:themeColor="text1"/>
+                <w:sz w:val="20"/>
+                <w:szCs w:val="20"/>
+              </w:rPr>
+              <w:t xml:space="preserve"> debido a dos </w:t>
+            </w:r>
+            <w:r>
+              <w:rPr>
+                <w:color w:val="000000" w:themeColor="text1"/>
+                <w:sz w:val="20"/>
+                <w:szCs w:val="20"/>
+              </w:rPr>
+              <w:t>problemas</w:t>
+            </w:r>
+            <w:r>
+              <w:rPr>
+                <w:color w:val="000000" w:themeColor="text1"/>
+                <w:sz w:val="20"/>
+                <w:szCs w:val="20"/>
+              </w:rPr>
+              <w:t>:</w:t>
+            </w:r>
           </w:p>
           <w:p>
             <w:pPr>
               <w:spacing w:after="80"/>
-            </w:pPr>
-            <w:r>
-              <w:rPr>
-                <w:color w:val="AAAAAA"/>
+              <w:rPr>
+                <w:color w:val="000000" w:themeColor="text1"/>
+                <w:sz w:val="20"/>
+                <w:szCs w:val="20"/>
+              </w:rPr>
+            </w:pPr>
+          </w:p>
+          <w:p>
+            <w:pPr>
+              <w:spacing w:after="80"/>
+              <w:rPr>
+                <w:color w:val="000000" w:themeColor="text1"/>
+                <w:sz w:val="20"/>
+                <w:szCs w:val="20"/>
+              </w:rPr>
+            </w:pPr>
+            <w:r>
+              <w:rPr>
+                <w:color w:val="000000" w:themeColor="text1"/>
+                <w:sz w:val="20"/>
+                <w:szCs w:val="20"/>
+              </w:rPr>
+              <w:t>• IR-001: la validación de email era insuficiente, lo que permitiría registrar usuarios con emails inválidos en un sistema real, causando problemas de comunicación y seguridad.</w:t>
+            </w:r>
+          </w:p>
+          <w:p>
+            <w:pPr>
+              <w:spacing w:after="80"/>
+              <w:rPr>
+                <w:color w:val="000000" w:themeColor="text1"/>
+                <w:sz w:val="20"/>
+                <w:szCs w:val="20"/>
+              </w:rPr>
+            </w:pPr>
+          </w:p>
+          <w:p>
+            <w:pPr>
+              <w:spacing w:after="80"/>
+              <w:rPr>
+                <w:color w:val="000000" w:themeColor="text1"/>
+                <w:sz w:val="20"/>
+                <w:szCs w:val="20"/>
+              </w:rPr>
+            </w:pPr>
+            <w:r>
+              <w:rPr>
+                <w:color w:val="000000" w:themeColor="text1"/>
+                <w:sz w:val="20"/>
+                <w:szCs w:val="20"/>
+              </w:rPr>
+              <w:t>• IR-002: la validación de nombre rechazaba caracteres acentuados y la ñ, haciendo el formulario inutilizable para la inmensa mayoría de usuarios españoles.</w:t>
+            </w:r>
+          </w:p>
+          <w:p>
+            <w:pPr>
+              <w:spacing w:after="80"/>
+              <w:rPr>
+                <w:color w:val="000000" w:themeColor="text1"/>
+              </w:rPr>
+            </w:pPr>
+          </w:p>
+          <w:p>
+            <w:pPr>
+              <w:spacing w:after="80"/>
+            </w:pPr>
+            <w:r>
+              <w:rPr>
+                <w:color w:val="000000" w:themeColor="text1"/>
                 <w:sz w:val="20"/>
                 <w:szCs w:val="20"/>
               </w:rPr>
               <w:t xml:space="preserve"> </w:t>
             </w:r>
-          </w:p>
-          <w:p>
-            <w:pPr>
-              <w:spacing w:after="80"/>
-            </w:pPr>
-            <w:r>
-              <w:rPr>
-                <w:color w:val="AAAAAA"/>
-                <w:sz w:val="20"/>
-                <w:szCs w:val="20"/>
-              </w:rPr>
-              <w:t xml:space="preserve"> </w:t>
-            </w:r>
-          </w:p>
-          <w:p>
-            <w:pPr>
-              <w:spacing w:after="80"/>
-            </w:pPr>
-            <w:r>
-              <w:rPr>
-                <w:color w:val="AAAAAA"/>
-                <w:sz w:val="20"/>
-                <w:szCs w:val="20"/>
-              </w:rPr>
-              <w:t xml:space="preserve"> </w:t>
+            <w:r>
+              <w:rPr>
+                <w:color w:val="000000" w:themeColor="text1"/>
+                <w:sz w:val="20"/>
+                <w:szCs w:val="20"/>
+              </w:rPr>
+              <w:t xml:space="preserve">Ahora </w:t>
+            </w:r>
+            <w:r>
+              <w:rPr>
+                <w:color w:val="000000" w:themeColor="text1"/>
+                <w:sz w:val="20"/>
+                <w:szCs w:val="20"/>
+              </w:rPr>
+              <w:t xml:space="preserve">después de corregir los errores </w:t>
+            </w:r>
+            <w:r>
+              <w:rPr>
+                <w:color w:val="000000" w:themeColor="text1"/>
+                <w:sz w:val="20"/>
+                <w:szCs w:val="20"/>
+              </w:rPr>
+              <w:t>sí</w:t>
+            </w:r>
+            <w:r>
+              <w:rPr>
+                <w:color w:val="000000" w:themeColor="text1"/>
+                <w:sz w:val="20"/>
+                <w:szCs w:val="20"/>
+              </w:rPr>
+              <w:t>.</w:t>
             </w:r>
           </w:p>
         </w:tc>
@@ -27279,6 +27156,7 @@
                 <w:bCs/>
                 <w:color w:val="FFFFFF"/>
               </w:rPr>
+              <w:lastRenderedPageBreak/>
               <w:t>Diferencias entre lo planificado y lo ejecutado</w:t>
             </w:r>
           </w:p>
@@ -27320,14 +27198,41 @@
           <w:p>
             <w:pPr>
               <w:spacing w:after="80"/>
-            </w:pPr>
-            <w:r>
-              <w:rPr>
-                <w:color w:val="AAAAAA"/>
-                <w:sz w:val="20"/>
-                <w:szCs w:val="20"/>
-              </w:rPr>
-              <w:t xml:space="preserve"> </w:t>
+              <w:rPr>
+                <w:color w:val="000000" w:themeColor="text1"/>
+              </w:rPr>
+            </w:pPr>
+            <w:r>
+              <w:rPr>
+                <w:color w:val="000000" w:themeColor="text1"/>
+                <w:sz w:val="20"/>
+                <w:szCs w:val="20"/>
+              </w:rPr>
+              <w:t>Todo según lo planeado</w:t>
+            </w:r>
+            <w:r>
+              <w:rPr>
+                <w:color w:val="000000" w:themeColor="text1"/>
+                <w:sz w:val="20"/>
+                <w:szCs w:val="20"/>
+              </w:rPr>
+              <w:t xml:space="preserve">. Excepto que se ha tenido que instalar Maven en el ordenador cuando en teoría viene </w:t>
+            </w:r>
+            <w:r>
+              <w:rPr>
+                <w:color w:val="000000" w:themeColor="text1"/>
+                <w:sz w:val="20"/>
+                <w:szCs w:val="20"/>
+              </w:rPr>
+              <w:t>predeterminado</w:t>
+            </w:r>
+            <w:r>
+              <w:rPr>
+                <w:color w:val="000000" w:themeColor="text1"/>
+                <w:sz w:val="20"/>
+                <w:szCs w:val="20"/>
+              </w:rPr>
+              <w:t>.</w:t>
             </w:r>
           </w:p>
           <w:p>
@@ -27446,8 +27351,6 @@
           <w:p>
             <w:pPr>
               <w:spacing w:after="80"/>
-            </w:pPr>
-            <w:r>
               <w:rPr>
                 <w:i/>
                 <w:iCs/>
@@ -27455,59 +27358,188 @@
                 <w:sz w:val="20"/>
                 <w:szCs w:val="20"/>
               </w:rPr>
+            </w:pPr>
+            <w:r>
+              <w:rPr>
+                <w:i/>
+                <w:iCs/>
+                <w:color w:val="AAAAAA"/>
+                <w:sz w:val="20"/>
+                <w:szCs w:val="20"/>
+              </w:rPr>
               <w:t>Describid todos los cambios que realizasteis en el código original: qué líneas modificasteis, por qué, y el SHA del commit correspondiente. Si NO realizasteis ningún cambio, escribid 'No se realizaron cambios en el código fuente' y justificad por qué.</w:t>
             </w:r>
           </w:p>
           <w:p>
             <w:pPr>
               <w:spacing w:after="80"/>
-            </w:pPr>
-            <w:r>
-              <w:rPr>
-                <w:color w:val="AAAAAA"/>
-                <w:sz w:val="20"/>
-                <w:szCs w:val="20"/>
-              </w:rPr>
-              <w:t xml:space="preserve"> </w:t>
+              <w:rPr>
+                <w:color w:val="000000" w:themeColor="text1"/>
+                <w:sz w:val="20"/>
+                <w:szCs w:val="20"/>
+              </w:rPr>
+            </w:pPr>
+            <w:r>
+              <w:rPr>
+                <w:color w:val="000000" w:themeColor="text1"/>
+                <w:sz w:val="20"/>
+                <w:szCs w:val="20"/>
+              </w:rPr>
+              <w:t>Cambio</w:t>
+            </w:r>
+            <w:r>
+              <w:rPr>
+                <w:color w:val="000000" w:themeColor="text1"/>
+                <w:sz w:val="20"/>
+                <w:szCs w:val="20"/>
+              </w:rPr>
+              <w:t xml:space="preserve"> IR-001 – ValidadorFormulario.validarEmail():</w:t>
             </w:r>
           </w:p>
           <w:p>
             <w:pPr>
               <w:spacing w:after="80"/>
-            </w:pPr>
-            <w:r>
-              <w:rPr>
-                <w:color w:val="AAAAAA"/>
-                <w:sz w:val="20"/>
-                <w:szCs w:val="20"/>
-              </w:rPr>
-              <w:t xml:space="preserve"> </w:t>
+              <w:rPr>
+                <w:color w:val="000000" w:themeColor="text1"/>
+                <w:sz w:val="20"/>
+                <w:szCs w:val="20"/>
+              </w:rPr>
+            </w:pPr>
+            <w:r>
+              <w:rPr>
+                <w:color w:val="000000" w:themeColor="text1"/>
+                <w:sz w:val="20"/>
+                <w:szCs w:val="20"/>
+              </w:rPr>
+              <w:t xml:space="preserve">Se sustituyó 'return email.contains("@")' por una validación con </w:t>
+            </w:r>
+            <w:r>
+              <w:rPr>
+                <w:color w:val="000000" w:themeColor="text1"/>
+                <w:sz w:val="20"/>
+                <w:szCs w:val="20"/>
+              </w:rPr>
+              <w:t>una secuencia de caracteres</w:t>
+            </w:r>
+            <w:r>
+              <w:rPr>
+                <w:color w:val="000000" w:themeColor="text1"/>
+                <w:sz w:val="20"/>
+                <w:szCs w:val="20"/>
+              </w:rPr>
+              <w:t xml:space="preserve"> completa.</w:t>
             </w:r>
           </w:p>
           <w:p>
             <w:pPr>
               <w:spacing w:after="80"/>
-            </w:pPr>
-            <w:r>
-              <w:rPr>
-                <w:color w:val="AAAAAA"/>
-                <w:sz w:val="20"/>
-                <w:szCs w:val="20"/>
-              </w:rPr>
-              <w:t xml:space="preserve"> </w:t>
-            </w:r>
-          </w:p>
-          <w:p>
-            <w:pPr>
+              <w:rPr>
+                <w:color w:val="000000" w:themeColor="text1"/>
+                <w:sz w:val="20"/>
+                <w:szCs w:val="20"/>
+              </w:rPr>
+            </w:pPr>
+            <w:r>
+              <w:rPr>
+                <w:color w:val="000000" w:themeColor="text1"/>
+                <w:sz w:val="20"/>
+                <w:szCs w:val="20"/>
+              </w:rPr>
+              <w:t>Cambio</w:t>
+            </w:r>
+            <w:r>
+              <w:rPr>
+                <w:color w:val="000000" w:themeColor="text1"/>
+                <w:sz w:val="20"/>
+                <w:szCs w:val="20"/>
+              </w:rPr>
+              <w:t xml:space="preserve"> IR-002 – ValidadorFormulario.validarNombre():</w:t>
+            </w:r>
+          </w:p>
+          <w:p>
+            <w:pPr>
+              <w:tabs>
+                <w:tab w:val="left" w:pos="7725"/>
+              </w:tabs>
               <w:spacing w:after="80"/>
-            </w:pPr>
-            <w:r>
-              <w:rPr>
-                <w:color w:val="AAAAAA"/>
-                <w:sz w:val="20"/>
-                <w:szCs w:val="20"/>
-              </w:rPr>
-              <w:lastRenderedPageBreak/>
+              <w:rPr>
+                <w:color w:val="000000" w:themeColor="text1"/>
+                <w:sz w:val="20"/>
+                <w:szCs w:val="20"/>
+              </w:rPr>
+            </w:pPr>
+            <w:r>
+              <w:rPr>
+                <w:color w:val="000000" w:themeColor="text1"/>
+                <w:sz w:val="20"/>
+                <w:szCs w:val="20"/>
+              </w:rPr>
+              <w:t>Se actualizó el regex de [a-zA-Z ]+ a [\p{L} ]+ para aceptar caracteres</w:t>
+            </w:r>
+            <w:r>
+              <w:rPr>
+                <w:color w:val="000000" w:themeColor="text1"/>
+                <w:sz w:val="20"/>
+                <w:szCs w:val="20"/>
+              </w:rPr>
+              <w:t xml:space="preserve"> adicionales</w:t>
+            </w:r>
+            <w:r>
+              <w:rPr>
+                <w:color w:val="000000" w:themeColor="text1"/>
+                <w:sz w:val="20"/>
+                <w:szCs w:val="20"/>
+              </w:rPr>
+              <w:t>.</w:t>
+            </w:r>
+            <w:r>
+              <w:rPr>
+                <w:color w:val="000000" w:themeColor="text1"/>
+                <w:sz w:val="20"/>
+                <w:szCs w:val="20"/>
+              </w:rPr>
+              <w:tab/>
+            </w:r>
+          </w:p>
+          <w:p>
+            <w:pPr>
+              <w:tabs>
+                <w:tab w:val="left" w:pos="7725"/>
+              </w:tabs>
+              <w:spacing w:after="80"/>
+              <w:rPr>
+                <w:color w:val="000000" w:themeColor="text1"/>
+                <w:sz w:val="20"/>
+                <w:szCs w:val="20"/>
+              </w:rPr>
+            </w:pPr>
+            <w:r>
+              <w:rPr>
+                <w:color w:val="000000" w:themeColor="text1"/>
+                <w:sz w:val="20"/>
+                <w:szCs w:val="20"/>
+              </w:rPr>
+              <w:t xml:space="preserve">SHA commit: </w:t>
+            </w:r>
+            <w:r>
+              <w:rPr>
+                <w:color w:val="000000" w:themeColor="text1"/>
+                <w:sz w:val="20"/>
+                <w:szCs w:val="20"/>
+              </w:rPr>
+              <w:t>a9fad91</w:t>
+            </w:r>
+          </w:p>
+          <w:p>
+            <w:pPr>
+              <w:spacing w:after="80"/>
+            </w:pPr>
+            <w:r>
+              <w:rPr>
+                <w:color w:val="000000" w:themeColor="text1"/>
+                <w:sz w:val="20"/>
+                <w:szCs w:val="20"/>
+              </w:rPr>
               <w:t xml:space="preserve"> </w:t>
             </w:r>
           </w:p>
@@ -27519,7 +27551,6 @@
         <w:spacing w:before="60" w:after="60"/>
       </w:pPr>
       <w:r>
-        <w:lastRenderedPageBreak/>
         <w:t xml:space="preserve"> </w:t>
       </w:r>
     </w:p>
@@ -27617,67 +27648,39 @@
           <w:p>
             <w:pPr>
               <w:spacing w:after="80"/>
-            </w:pPr>
-            <w:r>
-              <w:rPr>
-                <w:color w:val="AAAAAA"/>
-                <w:sz w:val="20"/>
-                <w:szCs w:val="20"/>
-              </w:rPr>
-              <w:t xml:space="preserve"> </w:t>
+              <w:rPr>
+                <w:color w:val="000000" w:themeColor="text1"/>
+              </w:rPr>
+            </w:pPr>
+            <w:r>
+              <w:rPr>
+                <w:color w:val="000000" w:themeColor="text1"/>
+                <w:sz w:val="20"/>
+                <w:szCs w:val="20"/>
+              </w:rPr>
+              <w:t xml:space="preserve">Hemos aprendido que probar el software no es solo ver si funciona al final del proyecto, sino un proceso estructurado. Aplicar la norma ISO 29119 nos ha servido para entender la importancia de documentar cada paso (desde el diseño de los casos de prueba hasta el registro de fallos), lo que ayuda a que todo el equipo sepa qué se ha probado y qué falta por corregir. También hemos </w:t>
+            </w:r>
+            <w:r>
+              <w:rPr>
+                <w:color w:val="000000" w:themeColor="text1"/>
+                <w:sz w:val="20"/>
+                <w:szCs w:val="20"/>
+              </w:rPr>
+              <w:t>utilizado</w:t>
+            </w:r>
+            <w:r>
+              <w:rPr>
+                <w:color w:val="000000" w:themeColor="text1"/>
+                <w:sz w:val="20"/>
+                <w:szCs w:val="20"/>
+              </w:rPr>
+              <w:t xml:space="preserve"> herramientas como Maven (mvn test) para automatizar las pruebas unitarias y asegurar que el código es estable antes de subirlo al repositorio.</w:t>
             </w:r>
           </w:p>
           <w:p>
             <w:pPr>
               <w:spacing w:after="80"/>
             </w:pPr>
-            <w:r>
-              <w:rPr>
-                <w:color w:val="AAAAAA"/>
-                <w:sz w:val="20"/>
-                <w:szCs w:val="20"/>
-              </w:rPr>
-              <w:t xml:space="preserve"> </w:t>
-            </w:r>
-          </w:p>
-          <w:p>
-            <w:pPr>
-              <w:spacing w:after="80"/>
-            </w:pPr>
-            <w:r>
-              <w:rPr>
-                <w:color w:val="AAAAAA"/>
-                <w:sz w:val="20"/>
-                <w:szCs w:val="20"/>
-              </w:rPr>
-              <w:t xml:space="preserve"> </w:t>
-            </w:r>
-          </w:p>
-          <w:p>
-            <w:pPr>
-              <w:spacing w:after="80"/>
-            </w:pPr>
-            <w:r>
-              <w:rPr>
-                <w:color w:val="AAAAAA"/>
-                <w:sz w:val="20"/>
-                <w:szCs w:val="20"/>
-              </w:rPr>
-              <w:t xml:space="preserve"> </w:t>
-            </w:r>
-          </w:p>
-          <w:p>
-            <w:pPr>
-              <w:spacing w:after="80"/>
-            </w:pPr>
-            <w:r>
-              <w:rPr>
-                <w:color w:val="AAAAAA"/>
-                <w:sz w:val="20"/>
-                <w:szCs w:val="20"/>
-              </w:rPr>
-              <w:t xml:space="preserve"> </w:t>
-            </w:r>
           </w:p>
         </w:tc>
       </w:tr>
@@ -27817,8 +27820,8 @@
     </w:tbl>
     <w:p/>
     <w:sectPr>
-      <w:headerReference w:type="default" r:id="rId10"/>
-      <w:footerReference w:type="default" r:id="rId11"/>
+      <w:headerReference w:type="default" r:id="rId12"/>
+      <w:footerReference w:type="default" r:id="rId13"/>
       <w:pgSz w:w="11906" w:h="16838"/>
       <w:pgMar w:top="1134" w:right="1134" w:bottom="1134" w:left="1134" w:header="708" w:footer="708" w:gutter="0"/>
       <w:cols w:space="720"/>
@@ -29111,7 +29114,6 @@
   <w:style w:type="character" w:default="1" w:styleId="Fuentedeprrafopredeter">
     <w:name w:val="Default Paragraph Font"/>
     <w:uiPriority w:val="1"/>
-    <w:semiHidden/>
     <w:unhideWhenUsed/>
   </w:style>
   <w:style w:type="table" w:default="1" w:styleId="Tablanormal">

</xml_diff>